<commit_message>
Add project overview and background
</commit_message>
<xml_diff>
--- a/BIT 216 Assignment 1 (Task 1).docx
+++ b/BIT 216 Assignment 1 (Task 1).docx
@@ -11,8 +11,6 @@
       <w:r>
         <w:t xml:space="preserve">                                                                                                                          Assignment No.: 1</w:t>
       </w:r>
-      <w:bookmarkStart w:id="0" w:name="_GoBack"/>
-      <w:bookmarkEnd w:id="0"/>
       <w:r>
         <w:rPr>
           <w:noProof/>
@@ -35,7 +33,7 @@
                     </pic:cNvPicPr>
                   </pic:nvPicPr>
                   <pic:blipFill>
-                    <a:blip r:embed="rId4">
+                    <a:blip r:embed="rId5">
                       <a:extLst>
                         <a:ext uri="{28A0092B-C50C-407E-A947-70E740481C1C}">
                           <a14:useLocalDpi xmlns:a14="http://schemas.microsoft.com/office/drawing/2010/main" val="0"/>
@@ -2408,6 +2406,485 @@
       </w:r>
     </w:p>
     <w:p/>
+    <w:p/>
+    <w:p/>
+    <w:p/>
+    <w:p/>
+    <w:p/>
+    <w:p/>
+    <w:p/>
+    <w:p/>
+    <w:p/>
+    <w:p/>
+    <w:p/>
+    <w:p/>
+    <w:p/>
+    <w:p/>
+    <w:p/>
+    <w:p/>
+    <w:p/>
+    <w:p/>
+    <w:p/>
+    <w:p/>
+    <w:p/>
+    <w:p/>
+    <w:p/>
+    <w:p/>
+    <w:p/>
+    <w:p/>
+    <w:p/>
+    <w:p/>
+    <w:p/>
+    <w:p/>
+    <w:p/>
+    <w:p/>
+    <w:p/>
+    <w:p/>
+    <w:p/>
+    <w:p/>
+    <w:p/>
+    <w:p/>
+    <w:p/>
+    <w:p/>
+    <w:p/>
+    <w:p/>
+    <w:p/>
+    <w:p/>
+    <w:p/>
+    <w:p/>
+    <w:p/>
+    <w:p/>
+    <w:p/>
+    <w:p/>
+    <w:p/>
+    <w:p/>
+    <w:p/>
+    <w:p/>
+    <w:p/>
+    <w:p/>
+    <w:p/>
+    <w:p/>
+    <w:p/>
+    <w:p/>
+    <w:p/>
+    <w:p/>
+    <w:p/>
+    <w:p/>
+    <w:p/>
+    <w:p/>
+    <w:p/>
+    <w:p/>
+    <w:p/>
+    <w:p/>
+    <w:p/>
+    <w:p/>
+    <w:p/>
+    <w:p/>
+    <w:p/>
+    <w:p/>
+    <w:p/>
+    <w:p/>
+    <w:p/>
+    <w:p/>
+    <w:p/>
+    <w:p/>
+    <w:p/>
+    <w:p/>
+    <w:p/>
+    <w:p/>
+    <w:p/>
+    <w:p/>
+    <w:p>
+      <w:pPr>
+        <w:pStyle w:val="Heading1"/>
+        <w:rPr>
+          <w:color w:val="auto"/>
+        </w:rPr>
+      </w:pPr>
+      <w:bookmarkStart w:id="0" w:name="_Toc232158107"/>
+      <w:bookmarkStart w:id="1" w:name="_Toc232158717"/>
+      <w:bookmarkStart w:id="2" w:name="_Toc232158875"/>
+      <w:r>
+        <w:rPr>
+          <w:color w:val="auto"/>
+        </w:rPr>
+        <w:t>1.0  Overview</w:t>
+      </w:r>
+      <w:bookmarkEnd w:id="0"/>
+      <w:bookmarkEnd w:id="1"/>
+      <w:bookmarkEnd w:id="2"/>
+    </w:p>
+    <w:p>
+      <w:pPr>
+        <w:spacing w:line="360" w:lineRule="auto"/>
+        <w:jc w:val="both"/>
+      </w:pPr>
+      <w:r>
+        <w:t>This part outlines a brief management overview of the SavePlate initiative with details of its mission, main users, the products, costs, and timetable. SavePlate is a web platform for food waste and home food stuff management that aids households to not only control food items in an effective way but also to minimize the food wastage part and practice the environmentally-friendly consumption. The platform helps users with monitoring the food items, alerting on the expiry, meal preparation based on the ingredient availability and first use or donation of the food stuff to other users and the community.The system main users are individuals and families who are managing their personal food supplies.</w:t>
+      </w:r>
+    </w:p>
+    <w:p>
+      <w:pPr>
+        <w:spacing w:line="360" w:lineRule="auto"/>
+        <w:jc w:val="both"/>
+      </w:pPr>
+    </w:p>
+    <w:p>
+      <w:pPr>
+        <w:spacing w:line="360" w:lineRule="auto"/>
+        <w:jc w:val="both"/>
+      </w:pPr>
+      <w:r>
+        <w:t>However, food banks and community organisations will be the secondary users. As interventions, this project will comprise the management documents like the Project Plan and Proposal, Requirements Specification and Design Document, system prototype, GitHub repository, and project scheduling documents.The application will be based on the latest web technology stack like React.js, Node.js, Express.js, and PostgreSQL.</w:t>
+      </w:r>
+    </w:p>
+    <w:p>
+      <w:pPr>
+        <w:spacing w:line="360" w:lineRule="auto"/>
+        <w:jc w:val="both"/>
+        <w:rPr>
+          <w:b/>
+          <w:bCs/>
+        </w:rPr>
+      </w:pPr>
+      <w:r>
+        <w:t>Besides, the development kit and environment are freely available, so the overall cost of the project is NPR 0.00. The project uses Iterative and Incremental development method in six weeks from 18 May 2026 to 26 June 2026 which ensures a schedule for systematic planning, design, and documentation throughout the project life cycle.</w:t>
+      </w:r>
+    </w:p>
+    <w:p>
+      <w:pPr>
+        <w:pStyle w:val="Heading2"/>
+        <w:rPr>
+          <w:color w:val="auto"/>
+        </w:rPr>
+      </w:pPr>
+      <w:bookmarkStart w:id="3" w:name="_Toc232158108"/>
+      <w:bookmarkStart w:id="4" w:name="_Toc232158718"/>
+      <w:bookmarkStart w:id="5" w:name="_Toc232158876"/>
+      <w:r>
+        <w:rPr>
+          <w:color w:val="auto"/>
+        </w:rPr>
+        <w:t xml:space="preserve">1.1  </w:t>
+      </w:r>
+      <w:r>
+        <w:rPr>
+          <w:color w:val="auto"/>
+        </w:rPr>
+        <w:t xml:space="preserve">Background of </w:t>
+      </w:r>
+      <w:bookmarkEnd w:id="3"/>
+      <w:bookmarkEnd w:id="4"/>
+      <w:r>
+        <w:rPr>
+          <w:color w:val="auto"/>
+        </w:rPr>
+        <w:t>the poroject</w:t>
+      </w:r>
+      <w:bookmarkEnd w:id="5"/>
+    </w:p>
+    <w:p>
+      <w:pPr>
+        <w:spacing w:line="360" w:lineRule="auto"/>
+        <w:jc w:val="both"/>
+      </w:pPr>
+      <w:r>
+        <w:t>Food wastage is one of the critical issues faced in the modern world, as it impacts the broader perspectives of economic, environmental and social sustainability. The FAO (FAO, 2019) stated that about a third of food that was produced globally each year was wasted.</w:t>
+      </w:r>
+    </w:p>
+    <w:p>
+      <w:pPr>
+        <w:spacing w:line="360" w:lineRule="auto"/>
+        <w:jc w:val="both"/>
+      </w:pPr>
+    </w:p>
+    <w:p>
+      <w:pPr>
+        <w:spacing w:line="360" w:lineRule="auto"/>
+        <w:jc w:val="both"/>
+      </w:pPr>
+      <w:r>
+        <w:t>Considerable wastage was also reported at residence level, where consumers often squander food due to poor inventory control, expiry date negligence and poor planning of meals.Despite food insecurity being a prevalent problem in many South Asian countries, food wastage is becoming an issue of increasing concern in places like Nepal. Excess food is bought and seldom monitored for remaining, rotting items which leads to economic losses while excess food that could be donated is thrown away due to the absence of an easy means through which that excess food can be sourced to those who need it.New developing digital technology offers a solution to some of the stated problems.</w:t>
+      </w:r>
+    </w:p>
+    <w:p>
+      <w:pPr>
+        <w:spacing w:line="360" w:lineRule="auto"/>
+        <w:jc w:val="both"/>
+      </w:pPr>
+    </w:p>
+    <w:p>
+      <w:pPr>
+        <w:spacing w:line="360" w:lineRule="auto"/>
+        <w:jc w:val="both"/>
+      </w:pPr>
+      <w:r>
+        <w:t>SavePlate aims to be a web application offering consumers smart food management. It helps users keep an inventory of their food, it offers expiry alerts, helps it identify inappropriate purchases and assists in planning meals based on foods that are already available.And, the system supports community initiatives by providing a platform that aids in the donation of excess food.</w:t>
+      </w:r>
+    </w:p>
+    <w:p>
+      <w:pPr>
+        <w:spacing w:line="360" w:lineRule="auto"/>
+        <w:jc w:val="both"/>
+      </w:pPr>
+    </w:p>
+    <w:p>
+      <w:pPr>
+        <w:spacing w:line="360" w:lineRule="auto"/>
+        <w:jc w:val="both"/>
+      </w:pPr>
+      <w:r>
+        <w:t>In addition, SavePlate also supports the aims of the SDG 12 (United Nations: Sustainable Development Goals), which focuses on more efficient utilisation of resources via responsible procurement and consumption, by encouraging customers to use technology in saving money and reducing excess waste.</w:t>
+      </w:r>
+    </w:p>
+    <w:p/>
+    <w:p>
+      <w:pPr>
+        <w:pStyle w:val="Heading2"/>
+        <w:rPr>
+          <w:color w:val="auto"/>
+        </w:rPr>
+      </w:pPr>
+      <w:bookmarkStart w:id="6" w:name="_Toc232158109"/>
+      <w:bookmarkStart w:id="7" w:name="_Toc232158719"/>
+      <w:bookmarkStart w:id="8" w:name="_Toc232158877"/>
+      <w:r>
+        <w:rPr>
+          <w:color w:val="auto"/>
+        </w:rPr>
+        <w:t>1.2  Customer and User Profile</w:t>
+      </w:r>
+      <w:bookmarkEnd w:id="6"/>
+      <w:bookmarkEnd w:id="7"/>
+      <w:bookmarkEnd w:id="8"/>
+    </w:p>
+    <w:p>
+      <w:pPr>
+        <w:spacing w:line="360" w:lineRule="auto"/>
+        <w:jc w:val="both"/>
+        <w:rPr>
+          <w:b/>
+          <w:bCs/>
+        </w:rPr>
+      </w:pPr>
+      <w:r>
+        <w:t>The main customers and users of the SavePlate app are household users, individuals and families controlling purchases and consumption of food at home. Community organisations and food banks receiving donated items through the platform constitute the secondary beneficiaries. The app is planned to be easy enough for even the less tech-savvy, presenting a user-friendly interface suitable for adults with different levels of digital literacy.</w:t>
+      </w:r>
+    </w:p>
+    <w:p>
+      <w:pPr>
+        <w:pStyle w:val="Heading2"/>
+        <w:rPr>
+          <w:color w:val="auto"/>
+        </w:rPr>
+      </w:pPr>
+      <w:bookmarkStart w:id="9" w:name="_Toc232158110"/>
+      <w:bookmarkStart w:id="10" w:name="_Toc232158720"/>
+      <w:bookmarkStart w:id="11" w:name="_Toc232158878"/>
+      <w:r>
+        <w:rPr>
+          <w:color w:val="auto"/>
+        </w:rPr>
+        <w:t>1.3  Project Deliverables</w:t>
+      </w:r>
+      <w:bookmarkEnd w:id="9"/>
+      <w:bookmarkEnd w:id="10"/>
+      <w:bookmarkEnd w:id="11"/>
+    </w:p>
+    <w:p>
+      <w:pPr>
+        <w:spacing w:after="160" w:line="360" w:lineRule="auto"/>
+        <w:jc w:val="both"/>
+      </w:pPr>
+      <w:r>
+        <w:t>The SavePlate project will deliver the following artefacts:</w:t>
+      </w:r>
+    </w:p>
+    <w:p>
+      <w:pPr>
+        <w:pStyle w:val="ListParagraph"/>
+        <w:numPr>
+          <w:ilvl w:val="0"/>
+          <w:numId w:val="1"/>
+        </w:numPr>
+        <w:spacing w:line="360" w:lineRule="auto"/>
+        <w:jc w:val="both"/>
+        <w:rPr>
+          <w:b/>
+          <w:bCs/>
+        </w:rPr>
+      </w:pPr>
+      <w:r>
+        <w:t xml:space="preserve">A fully documented Project Plan and Proposal (Task 1 due 12 June 2026); </w:t>
+      </w:r>
+    </w:p>
+    <w:p>
+      <w:pPr>
+        <w:pStyle w:val="ListParagraph"/>
+        <w:numPr>
+          <w:ilvl w:val="0"/>
+          <w:numId w:val="1"/>
+        </w:numPr>
+        <w:spacing w:line="360" w:lineRule="auto"/>
+        <w:jc w:val="both"/>
+        <w:rPr>
+          <w:b/>
+          <w:bCs/>
+        </w:rPr>
+      </w:pPr>
+      <w:r>
+        <w:t xml:space="preserve">Complete the Requirements Specification and Design Document (Task 2 – due 26 June 2026) - deliver a functional prototype or design of the SavePlate web-based application </w:t>
+      </w:r>
+    </w:p>
+    <w:p>
+      <w:pPr>
+        <w:pStyle w:val="ListParagraph"/>
+        <w:numPr>
+          <w:ilvl w:val="0"/>
+          <w:numId w:val="1"/>
+        </w:numPr>
+        <w:spacing w:line="360" w:lineRule="auto"/>
+        <w:jc w:val="both"/>
+      </w:pPr>
+      <w:r>
+        <w:t>A GitHub repo with all source code used in project and every cha</w:t>
+      </w:r>
+      <w:r>
+        <w:t xml:space="preserve">nge in version control system </w:t>
+      </w:r>
+    </w:p>
+    <w:p>
+      <w:pPr>
+        <w:pStyle w:val="ListParagraph"/>
+        <w:numPr>
+          <w:ilvl w:val="0"/>
+          <w:numId w:val="1"/>
+        </w:numPr>
+        <w:spacing w:line="360" w:lineRule="auto"/>
+        <w:jc w:val="both"/>
+        <w:rPr>
+          <w:b/>
+          <w:bCs/>
+        </w:rPr>
+      </w:pPr>
+      <w:r>
+        <w:t>A GanttProject file showing the schedule, resources and milestones.</w:t>
+      </w:r>
+    </w:p>
+    <w:p>
+      <w:pPr>
+        <w:pStyle w:val="Heading2"/>
+        <w:rPr>
+          <w:color w:val="auto"/>
+        </w:rPr>
+      </w:pPr>
+      <w:bookmarkStart w:id="12" w:name="_Toc232158111"/>
+      <w:bookmarkStart w:id="13" w:name="_Toc232158721"/>
+      <w:bookmarkStart w:id="14" w:name="_Toc232158879"/>
+      <w:r>
+        <w:rPr>
+          <w:color w:val="auto"/>
+        </w:rPr>
+        <w:t>1.4  Product Type</w:t>
+      </w:r>
+      <w:bookmarkEnd w:id="12"/>
+      <w:bookmarkEnd w:id="13"/>
+      <w:bookmarkEnd w:id="14"/>
+    </w:p>
+    <w:p>
+      <w:pPr>
+        <w:spacing w:line="360" w:lineRule="auto"/>
+        <w:jc w:val="both"/>
+        <w:rPr>
+          <w:b/>
+          <w:bCs/>
+        </w:rPr>
+      </w:pPr>
+      <w:r>
+        <w:t>SavePlate is a completely new product that has been created from the ground up. It is not a continuation of an existing system, yet it takes some conceptual ideas from existing apps like OLIO and Too Good To Go (Yeong, 2024). The first version of the app will be a web platform, but it can be later developed as a native mobile app.</w:t>
+      </w:r>
+    </w:p>
+    <w:p>
+      <w:pPr>
+        <w:pStyle w:val="Heading2"/>
+        <w:rPr>
+          <w:color w:val="auto"/>
+        </w:rPr>
+      </w:pPr>
+      <w:bookmarkStart w:id="15" w:name="_Toc232158112"/>
+      <w:bookmarkStart w:id="16" w:name="_Toc232158722"/>
+      <w:bookmarkStart w:id="17" w:name="_Toc232158880"/>
+      <w:r>
+        <w:rPr>
+          <w:color w:val="auto"/>
+        </w:rPr>
+        <w:t>1.5  Estimated Cost</w:t>
+      </w:r>
+      <w:bookmarkEnd w:id="15"/>
+      <w:bookmarkEnd w:id="16"/>
+      <w:bookmarkEnd w:id="17"/>
+    </w:p>
+    <w:p>
+      <w:pPr>
+        <w:spacing w:line="360" w:lineRule="auto"/>
+        <w:jc w:val="both"/>
+        <w:rPr>
+          <w:b/>
+          <w:bCs/>
+        </w:rPr>
+      </w:pPr>
+      <w:r>
+        <w:t>The team will develop the project using only open-source and freely available tools through the personal notebooks of team me</w:t>
+      </w:r>
+      <w:r>
+        <w:t>mbers; hence, a cost of NPR 0.00</w:t>
+      </w:r>
+      <w:r>
+        <w:t xml:space="preserve"> is immediately derived as the budget. There are no licensing fees associated with the employed frameworks, design tools, and collaborative platforms.</w:t>
+      </w:r>
+    </w:p>
+    <w:p>
+      <w:pPr>
+        <w:pStyle w:val="Heading2"/>
+        <w:rPr>
+          <w:color w:val="auto"/>
+        </w:rPr>
+      </w:pPr>
+      <w:bookmarkStart w:id="18" w:name="_Toc232158113"/>
+      <w:bookmarkStart w:id="19" w:name="_Toc232158723"/>
+      <w:bookmarkStart w:id="20" w:name="_Toc232158881"/>
+      <w:r>
+        <w:rPr>
+          <w:color w:val="auto"/>
+        </w:rPr>
+        <w:t>1.6  Timeline</w:t>
+      </w:r>
+      <w:bookmarkEnd w:id="18"/>
+      <w:bookmarkEnd w:id="19"/>
+      <w:bookmarkEnd w:id="20"/>
+    </w:p>
+    <w:p>
+      <w:pPr>
+        <w:spacing w:line="360" w:lineRule="auto"/>
+        <w:jc w:val="both"/>
+      </w:pPr>
+      <w:r>
+        <w:t>The SavePlate project will take place over a period of six weeks from 18 May 2026 until 26 June 2026. It is a two-phase project mainly aligning with two sets of submissions for assignments.</w:t>
+      </w:r>
+    </w:p>
+    <w:p>
+      <w:pPr>
+        <w:spacing w:line="360" w:lineRule="auto"/>
+        <w:jc w:val="both"/>
+      </w:pPr>
+    </w:p>
+    <w:p>
+      <w:r>
+        <w:t>The first task (Project Plan and Proposal) is scheduled to be done by 12 June 2026, whereas the second task (Requirements Specification and Design Document) is planned to be handed in on 26 June 2026.We have chosen Iterative and Incremental Development Method to be able to achieve continued progress and enhancement during the entire project. This method allows the members of the team to do the planning, requirements analysis, system design, and documentation in separate parts that they can handle easily while at the same time accomplishing all project milestones within the given period.</w:t>
+      </w:r>
+      <w:bookmarkStart w:id="21" w:name="_GoBack"/>
+      <w:bookmarkEnd w:id="21"/>
+    </w:p>
     <w:sectPr>
       <w:pgSz w:w="12240" w:h="15840"/>
       <w:pgMar w:top="1440" w:right="1440" w:bottom="1440" w:left="1440" w:header="720" w:footer="720" w:gutter="0"/>
@@ -2416,6 +2893,127 @@
     </w:sectPr>
   </w:body>
 </w:document>
+</file>
+
+<file path=word/numbering.xml><?xml version="1.0" encoding="utf-8"?>
+<w:numbering xmlns:wpc="http://schemas.microsoft.com/office/word/2010/wordprocessingCanvas" xmlns:cx="http://schemas.microsoft.com/office/drawing/2014/chartex" xmlns:mc="http://schemas.openxmlformats.org/markup-compatibility/2006" xmlns:o="urn:schemas-microsoft-com:office:office" xmlns:r="http://schemas.openxmlformats.org/officeDocument/2006/relationships" xmlns:m="http://schemas.openxmlformats.org/officeDocument/2006/math" xmlns:v="urn:schemas-microsoft-com:vml" xmlns:wp14="http://schemas.microsoft.com/office/word/2010/wordprocessingDrawing" xmlns:wp="http://schemas.openxmlformats.org/drawingml/2006/wordprocessingDrawing" xmlns:w10="urn:schemas-microsoft-com:office:word" xmlns:w="http://schemas.openxmlformats.org/wordprocessingml/2006/main" xmlns:w14="http://schemas.microsoft.com/office/word/2010/wordml" xmlns:w15="http://schemas.microsoft.com/office/word/2012/wordml" xmlns:w16se="http://schemas.microsoft.com/office/word/2015/wordml/symex" xmlns:wpg="http://schemas.microsoft.com/office/word/2010/wordprocessingGroup" xmlns:wpi="http://schemas.microsoft.com/office/word/2010/wordprocessingInk" xmlns:wne="http://schemas.microsoft.com/office/word/2006/wordml" xmlns:wps="http://schemas.microsoft.com/office/word/2010/wordprocessingShape" mc:Ignorable="w14 w15 w16se wp14">
+  <w:abstractNum w:abstractNumId="0" w15:restartNumberingAfterBreak="0">
+    <w:nsid w:val="67AF720D"/>
+    <w:multiLevelType w:val="hybridMultilevel"/>
+    <w:tmpl w:val="534AB6C4"/>
+    <w:lvl w:ilvl="0" w:tplc="04090001">
+      <w:start w:val="1"/>
+      <w:numFmt w:val="bullet"/>
+      <w:lvlText w:val=""/>
+      <w:lvlJc w:val="left"/>
+      <w:pPr>
+        <w:ind w:left="720" w:hanging="360"/>
+      </w:pPr>
+      <w:rPr>
+        <w:rFonts w:ascii="Symbol" w:hAnsi="Symbol" w:hint="default"/>
+      </w:rPr>
+    </w:lvl>
+    <w:lvl w:ilvl="1" w:tplc="04090003" w:tentative="1">
+      <w:start w:val="1"/>
+      <w:numFmt w:val="bullet"/>
+      <w:lvlText w:val="o"/>
+      <w:lvlJc w:val="left"/>
+      <w:pPr>
+        <w:ind w:left="1440" w:hanging="360"/>
+      </w:pPr>
+      <w:rPr>
+        <w:rFonts w:ascii="Courier New" w:hAnsi="Courier New" w:cs="Courier New" w:hint="default"/>
+      </w:rPr>
+    </w:lvl>
+    <w:lvl w:ilvl="2" w:tplc="04090005" w:tentative="1">
+      <w:start w:val="1"/>
+      <w:numFmt w:val="bullet"/>
+      <w:lvlText w:val=""/>
+      <w:lvlJc w:val="left"/>
+      <w:pPr>
+        <w:ind w:left="2160" w:hanging="360"/>
+      </w:pPr>
+      <w:rPr>
+        <w:rFonts w:ascii="Wingdings" w:hAnsi="Wingdings" w:hint="default"/>
+      </w:rPr>
+    </w:lvl>
+    <w:lvl w:ilvl="3" w:tplc="04090001" w:tentative="1">
+      <w:start w:val="1"/>
+      <w:numFmt w:val="bullet"/>
+      <w:lvlText w:val=""/>
+      <w:lvlJc w:val="left"/>
+      <w:pPr>
+        <w:ind w:left="2880" w:hanging="360"/>
+      </w:pPr>
+      <w:rPr>
+        <w:rFonts w:ascii="Symbol" w:hAnsi="Symbol" w:hint="default"/>
+      </w:rPr>
+    </w:lvl>
+    <w:lvl w:ilvl="4" w:tplc="04090003" w:tentative="1">
+      <w:start w:val="1"/>
+      <w:numFmt w:val="bullet"/>
+      <w:lvlText w:val="o"/>
+      <w:lvlJc w:val="left"/>
+      <w:pPr>
+        <w:ind w:left="3600" w:hanging="360"/>
+      </w:pPr>
+      <w:rPr>
+        <w:rFonts w:ascii="Courier New" w:hAnsi="Courier New" w:cs="Courier New" w:hint="default"/>
+      </w:rPr>
+    </w:lvl>
+    <w:lvl w:ilvl="5" w:tplc="04090005" w:tentative="1">
+      <w:start w:val="1"/>
+      <w:numFmt w:val="bullet"/>
+      <w:lvlText w:val=""/>
+      <w:lvlJc w:val="left"/>
+      <w:pPr>
+        <w:ind w:left="4320" w:hanging="360"/>
+      </w:pPr>
+      <w:rPr>
+        <w:rFonts w:ascii="Wingdings" w:hAnsi="Wingdings" w:hint="default"/>
+      </w:rPr>
+    </w:lvl>
+    <w:lvl w:ilvl="6" w:tplc="04090001" w:tentative="1">
+      <w:start w:val="1"/>
+      <w:numFmt w:val="bullet"/>
+      <w:lvlText w:val=""/>
+      <w:lvlJc w:val="left"/>
+      <w:pPr>
+        <w:ind w:left="5040" w:hanging="360"/>
+      </w:pPr>
+      <w:rPr>
+        <w:rFonts w:ascii="Symbol" w:hAnsi="Symbol" w:hint="default"/>
+      </w:rPr>
+    </w:lvl>
+    <w:lvl w:ilvl="7" w:tplc="04090003" w:tentative="1">
+      <w:start w:val="1"/>
+      <w:numFmt w:val="bullet"/>
+      <w:lvlText w:val="o"/>
+      <w:lvlJc w:val="left"/>
+      <w:pPr>
+        <w:ind w:left="5760" w:hanging="360"/>
+      </w:pPr>
+      <w:rPr>
+        <w:rFonts w:ascii="Courier New" w:hAnsi="Courier New" w:cs="Courier New" w:hint="default"/>
+      </w:rPr>
+    </w:lvl>
+    <w:lvl w:ilvl="8" w:tplc="04090005" w:tentative="1">
+      <w:start w:val="1"/>
+      <w:numFmt w:val="bullet"/>
+      <w:lvlText w:val=""/>
+      <w:lvlJc w:val="left"/>
+      <w:pPr>
+        <w:ind w:left="6480" w:hanging="360"/>
+      </w:pPr>
+      <w:rPr>
+        <w:rFonts w:ascii="Wingdings" w:hAnsi="Wingdings" w:hint="default"/>
+      </w:rPr>
+    </w:lvl>
+  </w:abstractNum>
+  <w:num w:numId="1">
+    <w:abstractNumId w:val="0"/>
+  </w:num>
+</w:numbering>
 </file>
 
 <file path=word/styles.xml><?xml version="1.0" encoding="utf-8"?>
@@ -2437,8 +3035,8 @@
   </w:docDefaults>
   <w:latentStyles w:defLockedState="0" w:defUIPriority="99" w:defSemiHidden="0" w:defUnhideWhenUsed="0" w:defQFormat="0" w:count="371">
     <w:lsdException w:name="Normal" w:uiPriority="0" w:qFormat="1"/>
-    <w:lsdException w:name="heading 1" w:uiPriority="9" w:qFormat="1"/>
-    <w:lsdException w:name="heading 2" w:semiHidden="1" w:uiPriority="9" w:unhideWhenUsed="1" w:qFormat="1"/>
+    <w:lsdException w:name="heading 1" w:uiPriority="0" w:qFormat="1"/>
+    <w:lsdException w:name="heading 2" w:semiHidden="1" w:uiPriority="0" w:unhideWhenUsed="1" w:qFormat="1"/>
     <w:lsdException w:name="heading 3" w:semiHidden="1" w:uiPriority="9" w:unhideWhenUsed="1" w:qFormat="1"/>
     <w:lsdException w:name="heading 4" w:semiHidden="1" w:uiPriority="9" w:unhideWhenUsed="1" w:qFormat="1"/>
     <w:lsdException w:name="heading 5" w:semiHidden="1" w:uiPriority="9" w:unhideWhenUsed="1" w:qFormat="1"/>
@@ -2821,6 +3419,42 @@
       <w:szCs w:val="24"/>
     </w:rPr>
   </w:style>
+  <w:style w:type="paragraph" w:styleId="Heading1">
+    <w:name w:val="heading 1"/>
+    <w:link w:val="Heading1Char"/>
+    <w:qFormat/>
+    <w:rsid w:val="003E415C"/>
+    <w:pPr>
+      <w:spacing w:before="360" w:after="180" w:line="240" w:lineRule="auto"/>
+      <w:outlineLvl w:val="0"/>
+    </w:pPr>
+    <w:rPr>
+      <w:rFonts w:ascii="Times New Roman" w:eastAsia="Times New Roman" w:hAnsi="Times New Roman" w:cs="Times New Roman"/>
+      <w:b/>
+      <w:bCs/>
+      <w:color w:val="1A3C5E"/>
+      <w:sz w:val="32"/>
+      <w:szCs w:val="32"/>
+    </w:rPr>
+  </w:style>
+  <w:style w:type="paragraph" w:styleId="Heading2">
+    <w:name w:val="heading 2"/>
+    <w:link w:val="Heading2Char"/>
+    <w:qFormat/>
+    <w:rsid w:val="003E415C"/>
+    <w:pPr>
+      <w:spacing w:before="280" w:after="140" w:line="240" w:lineRule="auto"/>
+      <w:outlineLvl w:val="1"/>
+    </w:pPr>
+    <w:rPr>
+      <w:rFonts w:ascii="Times New Roman" w:eastAsia="Times New Roman" w:hAnsi="Times New Roman" w:cs="Times New Roman"/>
+      <w:b/>
+      <w:bCs/>
+      <w:color w:val="2C5F8A"/>
+      <w:sz w:val="28"/>
+      <w:szCs w:val="28"/>
+    </w:rPr>
+  </w:style>
   <w:style w:type="character" w:default="1" w:styleId="DefaultParagraphFont">
     <w:name w:val="Default Paragraph Font"/>
     <w:uiPriority w:val="1"/>
@@ -2860,6 +3494,34 @@
       <w:rFonts w:ascii="Times New Roman" w:eastAsia="Times New Roman" w:hAnsi="Times New Roman" w:cs="Times New Roman"/>
       <w:sz w:val="24"/>
       <w:szCs w:val="24"/>
+    </w:rPr>
+  </w:style>
+  <w:style w:type="character" w:customStyle="1" w:styleId="Heading1Char">
+    <w:name w:val="Heading 1 Char"/>
+    <w:basedOn w:val="DefaultParagraphFont"/>
+    <w:link w:val="Heading1"/>
+    <w:rsid w:val="003E415C"/>
+    <w:rPr>
+      <w:rFonts w:ascii="Times New Roman" w:eastAsia="Times New Roman" w:hAnsi="Times New Roman" w:cs="Times New Roman"/>
+      <w:b/>
+      <w:bCs/>
+      <w:color w:val="1A3C5E"/>
+      <w:sz w:val="32"/>
+      <w:szCs w:val="32"/>
+    </w:rPr>
+  </w:style>
+  <w:style w:type="character" w:customStyle="1" w:styleId="Heading2Char">
+    <w:name w:val="Heading 2 Char"/>
+    <w:basedOn w:val="DefaultParagraphFont"/>
+    <w:link w:val="Heading2"/>
+    <w:rsid w:val="003E415C"/>
+    <w:rPr>
+      <w:rFonts w:ascii="Times New Roman" w:eastAsia="Times New Roman" w:hAnsi="Times New Roman" w:cs="Times New Roman"/>
+      <w:b/>
+      <w:bCs/>
+      <w:color w:val="2C5F8A"/>
+      <w:sz w:val="28"/>
+      <w:szCs w:val="28"/>
     </w:rPr>
   </w:style>
 </w:styles>

</xml_diff>

<commit_message>
added Customer and User Profile, Project Deliverables, Product Type, Estimated Cost, Timeline, Project Aims, Project Objectives
</commit_message>
<xml_diff>
--- a/BIT 216 Assignment 1 (Task 1).docx
+++ b/BIT 216 Assignment 1 (Task 1).docx
@@ -2882,9 +2882,264 @@
       <w:r>
         <w:t>The first task (Project Plan and Proposal) is scheduled to be done by 12 June 2026, whereas the second task (Requirements Specification and Design Document) is planned to be handed in on 26 June 2026.We have chosen Iterative and Incremental Development Method to be able to achieve continued progress and enhancement during the entire project. This method allows the members of the team to do the planning, requirements analysis, system design, and documentation in separate parts that they can handle easily while at the same time accomplishing all project milestones within the given period.</w:t>
       </w:r>
-      <w:bookmarkStart w:id="21" w:name="_GoBack"/>
+    </w:p>
+    <w:p/>
+    <w:p/>
+    <w:p>
+      <w:pPr>
+        <w:pStyle w:val="Heading1"/>
+        <w:rPr>
+          <w:color w:val="auto"/>
+        </w:rPr>
+      </w:pPr>
+      <w:bookmarkStart w:id="21" w:name="_Toc232158114"/>
+      <w:bookmarkStart w:id="22" w:name="_Toc232158724"/>
+      <w:bookmarkStart w:id="23" w:name="_Toc232158882"/>
+      <w:r>
+        <w:rPr>
+          <w:color w:val="auto"/>
+        </w:rPr>
+        <w:t>2.0  Project Aims</w:t>
+      </w:r>
       <w:bookmarkEnd w:id="21"/>
-    </w:p>
+      <w:bookmarkEnd w:id="22"/>
+      <w:bookmarkEnd w:id="23"/>
+    </w:p>
+    <w:p>
+      <w:pPr>
+        <w:spacing w:after="160" w:line="360" w:lineRule="auto"/>
+        <w:jc w:val="both"/>
+      </w:pPr>
+      <w:r>
+        <w:t>The aims of the SavePlate project represent the broad strategic intentions that guide the overall direction of the development effort. These aims are as follows:</w:t>
+      </w:r>
+    </w:p>
+    <w:p>
+      <w:pPr>
+        <w:pStyle w:val="ListParagraph"/>
+        <w:numPr>
+          <w:ilvl w:val="0"/>
+          <w:numId w:val="2"/>
+        </w:numPr>
+        <w:spacing w:line="360" w:lineRule="auto"/>
+        <w:jc w:val="both"/>
+      </w:pPr>
+      <w:r>
+        <w:t>This project aims at creating and implementing a user-friendly, web-based application that will help households keep track of their food inventory and reduce food wastage by sending intelligent alerts and offering organizational tools.</w:t>
+      </w:r>
+    </w:p>
+    <w:p>
+      <w:pPr>
+        <w:pStyle w:val="ListParagraph"/>
+        <w:numPr>
+          <w:ilvl w:val="0"/>
+          <w:numId w:val="2"/>
+        </w:numPr>
+        <w:spacing w:line="360" w:lineRule="auto"/>
+        <w:jc w:val="both"/>
+      </w:pPr>
+      <w:r>
+        <w:t>Community-level food sharing and donation will be assisted by developing a platform where users will be able to list the food items they do not need for other households or community organizations to collect.</w:t>
+      </w:r>
+    </w:p>
+    <w:p>
+      <w:pPr>
+        <w:pStyle w:val="ListParagraph"/>
+        <w:numPr>
+          <w:ilvl w:val="0"/>
+          <w:numId w:val="2"/>
+        </w:numPr>
+        <w:spacing w:line="360" w:lineRule="auto"/>
+        <w:jc w:val="both"/>
+      </w:pPr>
+      <w:r>
+        <w:t>To enable users to take control, the application will present visual analytics that depict the food-saving efforts of users and their impact on a personal level throughout the time.</w:t>
+      </w:r>
+    </w:p>
+    <w:p>
+      <w:pPr>
+        <w:pStyle w:val="ListParagraph"/>
+        <w:numPr>
+          <w:ilvl w:val="0"/>
+          <w:numId w:val="2"/>
+        </w:numPr>
+        <w:spacing w:line="360" w:lineRule="auto"/>
+        <w:jc w:val="both"/>
+      </w:pPr>
+      <w:r>
+        <w:t>The planning of meals in a responsible manner will be encouraged by the integration of meal suggestion features that will be based on ingredients and will help users to consume their existing inventory before the products expire.</w:t>
+      </w:r>
+    </w:p>
+    <w:p>
+      <w:pPr>
+        <w:pStyle w:val="ListParagraph"/>
+        <w:numPr>
+          <w:ilvl w:val="0"/>
+          <w:numId w:val="2"/>
+        </w:numPr>
+        <w:spacing w:line="360" w:lineRule="auto"/>
+        <w:jc w:val="both"/>
+      </w:pPr>
+      <w:r>
+        <w:t>The implementation of widely accepted methods for user authentication and data protection will be carried out, including two-factor authentication (2FA), to safeguard the privacy and security of user data.</w:t>
+      </w:r>
+    </w:p>
+    <w:p>
+      <w:pPr>
+        <w:pStyle w:val="ListParagraph"/>
+        <w:numPr>
+          <w:ilvl w:val="0"/>
+          <w:numId w:val="2"/>
+        </w:numPr>
+        <w:spacing w:line="360" w:lineRule="auto"/>
+        <w:jc w:val="both"/>
+      </w:pPr>
+      <w:r>
+        <w:t>To provide a reliable and well-documented software system that complies with the best practices of software</w:t>
+      </w:r>
+      <w:bookmarkStart w:id="24" w:name="_GoBack"/>
+      <w:bookmarkEnd w:id="24"/>
+      <w:r>
+        <w:t xml:space="preserve"> engineering, and which is easy to maintain and extend in the future.</w:t>
+      </w:r>
+      <w:r>
+        <w:br w:type="page"/>
+      </w:r>
+    </w:p>
+    <w:p>
+      <w:pPr>
+        <w:pStyle w:val="Heading1"/>
+        <w:rPr>
+          <w:color w:val="auto"/>
+        </w:rPr>
+      </w:pPr>
+      <w:bookmarkStart w:id="25" w:name="_Toc232158115"/>
+      <w:bookmarkStart w:id="26" w:name="_Toc232158725"/>
+      <w:bookmarkStart w:id="27" w:name="_Toc232158883"/>
+      <w:r>
+        <w:rPr>
+          <w:color w:val="auto"/>
+        </w:rPr>
+        <w:t>3.0  Project Objectives</w:t>
+      </w:r>
+      <w:bookmarkEnd w:id="25"/>
+      <w:bookmarkEnd w:id="26"/>
+      <w:bookmarkEnd w:id="27"/>
+    </w:p>
+    <w:p>
+      <w:pPr>
+        <w:spacing w:after="160" w:line="360" w:lineRule="auto"/>
+        <w:jc w:val="both"/>
+      </w:pPr>
+      <w:r>
+        <w:t>The project objectives are specific, measurable outcomes that operationalise the project aims. Unlike the use cases described in the case study, the following objectives define the success criteria for the project as a whole:</w:t>
+      </w:r>
+    </w:p>
+    <w:p>
+      <w:pPr>
+        <w:pStyle w:val="ListParagraph"/>
+        <w:numPr>
+          <w:ilvl w:val="0"/>
+          <w:numId w:val="3"/>
+        </w:numPr>
+        <w:spacing w:line="360" w:lineRule="auto"/>
+        <w:jc w:val="both"/>
+      </w:pPr>
+      <w:r>
+        <w:t>Complete a food inventory management tool that presents users with a dashboard to add delete update and categorise food items including details like expiry dates and storage locations. These minimum functionalities must be delivered by the first development iteration (12 June 2026).</w:t>
+      </w:r>
+    </w:p>
+    <w:p>
+      <w:pPr>
+        <w:pStyle w:val="ListParagraph"/>
+        <w:numPr>
+          <w:ilvl w:val="0"/>
+          <w:numId w:val="3"/>
+        </w:numPr>
+        <w:spacing w:line="360" w:lineRule="auto"/>
+        <w:jc w:val="both"/>
+      </w:pPr>
+      <w:r>
+        <w:t>Design an expiry alert system that notifies users 48 hours in advance of any product expiry. The expiry alert system should reach 100% notification delivery accuracy rate for the whole item database.</w:t>
+      </w:r>
+    </w:p>
+    <w:p>
+      <w:pPr>
+        <w:pStyle w:val="ListParagraph"/>
+        <w:numPr>
+          <w:ilvl w:val="0"/>
+          <w:numId w:val="3"/>
+        </w:numPr>
+        <w:spacing w:line="360" w:lineRule="auto"/>
+        <w:jc w:val="both"/>
+      </w:pPr>
+      <w:r>
+        <w:t>Create a donation facilitation process whereby users are able to change inventory items into donation listings within three user actions. And, listing should be visible to other registered users by geolocation.</w:t>
+      </w:r>
+    </w:p>
+    <w:p>
+      <w:pPr>
+        <w:pStyle w:val="ListParagraph"/>
+        <w:numPr>
+          <w:ilvl w:val="0"/>
+          <w:numId w:val="3"/>
+        </w:numPr>
+        <w:spacing w:line="360" w:lineRule="auto"/>
+        <w:jc w:val="both"/>
+      </w:pPr>
+      <w:r>
+        <w:t>Set up a food data insights panel that produces visual reports (e.g. charts and progress indicators) illustrating a user's food-saving and donation performance records over customizable date ranges.</w:t>
+      </w:r>
+    </w:p>
+    <w:p>
+      <w:pPr>
+        <w:pStyle w:val="ListParagraph"/>
+        <w:numPr>
+          <w:ilvl w:val="0"/>
+          <w:numId w:val="3"/>
+        </w:numPr>
+        <w:spacing w:line="360" w:lineRule="auto"/>
+        <w:jc w:val="both"/>
+      </w:pPr>
+      <w:r>
+        <w:t>Design an interactive meal planner that would allow users to plan their meals through scheduling for a full one-week period keeping in mind their current inventory items available, and system can provide automatic recommendations of items nearing expiration.</w:t>
+      </w:r>
+    </w:p>
+    <w:p>
+      <w:pPr>
+        <w:pStyle w:val="ListParagraph"/>
+        <w:numPr>
+          <w:ilvl w:val="0"/>
+          <w:numId w:val="3"/>
+        </w:numPr>
+        <w:spacing w:line="360" w:lineRule="auto"/>
+        <w:jc w:val="both"/>
+      </w:pPr>
+      <w:r>
+        <w:t>Meet the data protection compliance standards by rolling out 2FA, encrypted password storage, and user-friendly privacy settings that can be accesse</w:t>
+      </w:r>
+      <w:r>
+        <w:t>d from the account dashboard.</w:t>
+      </w:r>
+    </w:p>
+    <w:p>
+      <w:pPr>
+        <w:pStyle w:val="ListParagraph"/>
+        <w:numPr>
+          <w:ilvl w:val="0"/>
+          <w:numId w:val="3"/>
+        </w:numPr>
+        <w:spacing w:line="360" w:lineRule="auto"/>
+        <w:jc w:val="both"/>
+      </w:pPr>
+      <w:r>
+        <w:t>Generate a robust system design documentation set - including ERD, site map, wireframes, and data dictionary - that will function as a master plan for complete development in subsequent project phases.</w:t>
+      </w:r>
+      <w:r>
+        <w:br w:type="page"/>
+      </w:r>
+    </w:p>
+    <w:p/>
     <w:sectPr>
       <w:pgSz w:w="12240" w:h="15840"/>
       <w:pgMar w:top="1440" w:right="1440" w:bottom="1440" w:left="1440" w:header="720" w:footer="720" w:gutter="0"/>
@@ -2898,6 +3153,92 @@
 <file path=word/numbering.xml><?xml version="1.0" encoding="utf-8"?>
 <w:numbering xmlns:wpc="http://schemas.microsoft.com/office/word/2010/wordprocessingCanvas" xmlns:cx="http://schemas.microsoft.com/office/drawing/2014/chartex" xmlns:mc="http://schemas.openxmlformats.org/markup-compatibility/2006" xmlns:o="urn:schemas-microsoft-com:office:office" xmlns:r="http://schemas.openxmlformats.org/officeDocument/2006/relationships" xmlns:m="http://schemas.openxmlformats.org/officeDocument/2006/math" xmlns:v="urn:schemas-microsoft-com:vml" xmlns:wp14="http://schemas.microsoft.com/office/word/2010/wordprocessingDrawing" xmlns:wp="http://schemas.openxmlformats.org/drawingml/2006/wordprocessingDrawing" xmlns:w10="urn:schemas-microsoft-com:office:word" xmlns:w="http://schemas.openxmlformats.org/wordprocessingml/2006/main" xmlns:w14="http://schemas.microsoft.com/office/word/2010/wordml" xmlns:w15="http://schemas.microsoft.com/office/word/2012/wordml" xmlns:w16se="http://schemas.microsoft.com/office/word/2015/wordml/symex" xmlns:wpg="http://schemas.microsoft.com/office/word/2010/wordprocessingGroup" xmlns:wpi="http://schemas.microsoft.com/office/word/2010/wordprocessingInk" xmlns:wne="http://schemas.microsoft.com/office/word/2006/wordml" xmlns:wps="http://schemas.microsoft.com/office/word/2010/wordprocessingShape" mc:Ignorable="w14 w15 w16se wp14">
   <w:abstractNum w:abstractNumId="0" w15:restartNumberingAfterBreak="0">
+    <w:nsid w:val="08903B20"/>
+    <w:multiLevelType w:val="hybridMultilevel"/>
+    <w:tmpl w:val="19EA8380"/>
+    <w:lvl w:ilvl="0" w:tplc="0409000F">
+      <w:start w:val="1"/>
+      <w:numFmt w:val="decimal"/>
+      <w:lvlText w:val="%1."/>
+      <w:lvlJc w:val="left"/>
+      <w:pPr>
+        <w:ind w:left="720" w:hanging="360"/>
+      </w:pPr>
+    </w:lvl>
+    <w:lvl w:ilvl="1" w:tplc="04090019" w:tentative="1">
+      <w:start w:val="1"/>
+      <w:numFmt w:val="lowerLetter"/>
+      <w:lvlText w:val="%2."/>
+      <w:lvlJc w:val="left"/>
+      <w:pPr>
+        <w:ind w:left="1440" w:hanging="360"/>
+      </w:pPr>
+    </w:lvl>
+    <w:lvl w:ilvl="2" w:tplc="0409001B" w:tentative="1">
+      <w:start w:val="1"/>
+      <w:numFmt w:val="lowerRoman"/>
+      <w:lvlText w:val="%3."/>
+      <w:lvlJc w:val="right"/>
+      <w:pPr>
+        <w:ind w:left="2160" w:hanging="180"/>
+      </w:pPr>
+    </w:lvl>
+    <w:lvl w:ilvl="3" w:tplc="0409000F" w:tentative="1">
+      <w:start w:val="1"/>
+      <w:numFmt w:val="decimal"/>
+      <w:lvlText w:val="%4."/>
+      <w:lvlJc w:val="left"/>
+      <w:pPr>
+        <w:ind w:left="2880" w:hanging="360"/>
+      </w:pPr>
+    </w:lvl>
+    <w:lvl w:ilvl="4" w:tplc="04090019" w:tentative="1">
+      <w:start w:val="1"/>
+      <w:numFmt w:val="lowerLetter"/>
+      <w:lvlText w:val="%5."/>
+      <w:lvlJc w:val="left"/>
+      <w:pPr>
+        <w:ind w:left="3600" w:hanging="360"/>
+      </w:pPr>
+    </w:lvl>
+    <w:lvl w:ilvl="5" w:tplc="0409001B" w:tentative="1">
+      <w:start w:val="1"/>
+      <w:numFmt w:val="lowerRoman"/>
+      <w:lvlText w:val="%6."/>
+      <w:lvlJc w:val="right"/>
+      <w:pPr>
+        <w:ind w:left="4320" w:hanging="180"/>
+      </w:pPr>
+    </w:lvl>
+    <w:lvl w:ilvl="6" w:tplc="0409000F" w:tentative="1">
+      <w:start w:val="1"/>
+      <w:numFmt w:val="decimal"/>
+      <w:lvlText w:val="%7."/>
+      <w:lvlJc w:val="left"/>
+      <w:pPr>
+        <w:ind w:left="5040" w:hanging="360"/>
+      </w:pPr>
+    </w:lvl>
+    <w:lvl w:ilvl="7" w:tplc="04090019" w:tentative="1">
+      <w:start w:val="1"/>
+      <w:numFmt w:val="lowerLetter"/>
+      <w:lvlText w:val="%8."/>
+      <w:lvlJc w:val="left"/>
+      <w:pPr>
+        <w:ind w:left="5760" w:hanging="360"/>
+      </w:pPr>
+    </w:lvl>
+    <w:lvl w:ilvl="8" w:tplc="0409001B" w:tentative="1">
+      <w:start w:val="1"/>
+      <w:numFmt w:val="lowerRoman"/>
+      <w:lvlText w:val="%9."/>
+      <w:lvlJc w:val="right"/>
+      <w:pPr>
+        <w:ind w:left="6480" w:hanging="180"/>
+      </w:pPr>
+    </w:lvl>
+  </w:abstractNum>
+  <w:abstractNum w:abstractNumId="1" w15:restartNumberingAfterBreak="0">
     <w:nsid w:val="67AF720D"/>
     <w:multiLevelType w:val="hybridMultilevel"/>
     <w:tmpl w:val="534AB6C4"/>
@@ -3010,7 +3351,126 @@
       </w:rPr>
     </w:lvl>
   </w:abstractNum>
+  <w:abstractNum w:abstractNumId="2" w15:restartNumberingAfterBreak="0">
+    <w:nsid w:val="77C75B59"/>
+    <w:multiLevelType w:val="hybridMultilevel"/>
+    <w:tmpl w:val="616A8506"/>
+    <w:lvl w:ilvl="0" w:tplc="04090001">
+      <w:start w:val="1"/>
+      <w:numFmt w:val="bullet"/>
+      <w:lvlText w:val=""/>
+      <w:lvlJc w:val="left"/>
+      <w:pPr>
+        <w:ind w:left="720" w:hanging="360"/>
+      </w:pPr>
+      <w:rPr>
+        <w:rFonts w:ascii="Symbol" w:hAnsi="Symbol" w:hint="default"/>
+      </w:rPr>
+    </w:lvl>
+    <w:lvl w:ilvl="1" w:tplc="04090003" w:tentative="1">
+      <w:start w:val="1"/>
+      <w:numFmt w:val="bullet"/>
+      <w:lvlText w:val="o"/>
+      <w:lvlJc w:val="left"/>
+      <w:pPr>
+        <w:ind w:left="1440" w:hanging="360"/>
+      </w:pPr>
+      <w:rPr>
+        <w:rFonts w:ascii="Courier New" w:hAnsi="Courier New" w:cs="Courier New" w:hint="default"/>
+      </w:rPr>
+    </w:lvl>
+    <w:lvl w:ilvl="2" w:tplc="04090005" w:tentative="1">
+      <w:start w:val="1"/>
+      <w:numFmt w:val="bullet"/>
+      <w:lvlText w:val=""/>
+      <w:lvlJc w:val="left"/>
+      <w:pPr>
+        <w:ind w:left="2160" w:hanging="360"/>
+      </w:pPr>
+      <w:rPr>
+        <w:rFonts w:ascii="Wingdings" w:hAnsi="Wingdings" w:hint="default"/>
+      </w:rPr>
+    </w:lvl>
+    <w:lvl w:ilvl="3" w:tplc="04090001" w:tentative="1">
+      <w:start w:val="1"/>
+      <w:numFmt w:val="bullet"/>
+      <w:lvlText w:val=""/>
+      <w:lvlJc w:val="left"/>
+      <w:pPr>
+        <w:ind w:left="2880" w:hanging="360"/>
+      </w:pPr>
+      <w:rPr>
+        <w:rFonts w:ascii="Symbol" w:hAnsi="Symbol" w:hint="default"/>
+      </w:rPr>
+    </w:lvl>
+    <w:lvl w:ilvl="4" w:tplc="04090003" w:tentative="1">
+      <w:start w:val="1"/>
+      <w:numFmt w:val="bullet"/>
+      <w:lvlText w:val="o"/>
+      <w:lvlJc w:val="left"/>
+      <w:pPr>
+        <w:ind w:left="3600" w:hanging="360"/>
+      </w:pPr>
+      <w:rPr>
+        <w:rFonts w:ascii="Courier New" w:hAnsi="Courier New" w:cs="Courier New" w:hint="default"/>
+      </w:rPr>
+    </w:lvl>
+    <w:lvl w:ilvl="5" w:tplc="04090005" w:tentative="1">
+      <w:start w:val="1"/>
+      <w:numFmt w:val="bullet"/>
+      <w:lvlText w:val=""/>
+      <w:lvlJc w:val="left"/>
+      <w:pPr>
+        <w:ind w:left="4320" w:hanging="360"/>
+      </w:pPr>
+      <w:rPr>
+        <w:rFonts w:ascii="Wingdings" w:hAnsi="Wingdings" w:hint="default"/>
+      </w:rPr>
+    </w:lvl>
+    <w:lvl w:ilvl="6" w:tplc="04090001" w:tentative="1">
+      <w:start w:val="1"/>
+      <w:numFmt w:val="bullet"/>
+      <w:lvlText w:val=""/>
+      <w:lvlJc w:val="left"/>
+      <w:pPr>
+        <w:ind w:left="5040" w:hanging="360"/>
+      </w:pPr>
+      <w:rPr>
+        <w:rFonts w:ascii="Symbol" w:hAnsi="Symbol" w:hint="default"/>
+      </w:rPr>
+    </w:lvl>
+    <w:lvl w:ilvl="7" w:tplc="04090003" w:tentative="1">
+      <w:start w:val="1"/>
+      <w:numFmt w:val="bullet"/>
+      <w:lvlText w:val="o"/>
+      <w:lvlJc w:val="left"/>
+      <w:pPr>
+        <w:ind w:left="5760" w:hanging="360"/>
+      </w:pPr>
+      <w:rPr>
+        <w:rFonts w:ascii="Courier New" w:hAnsi="Courier New" w:cs="Courier New" w:hint="default"/>
+      </w:rPr>
+    </w:lvl>
+    <w:lvl w:ilvl="8" w:tplc="04090005" w:tentative="1">
+      <w:start w:val="1"/>
+      <w:numFmt w:val="bullet"/>
+      <w:lvlText w:val=""/>
+      <w:lvlJc w:val="left"/>
+      <w:pPr>
+        <w:ind w:left="6480" w:hanging="360"/>
+      </w:pPr>
+      <w:rPr>
+        <w:rFonts w:ascii="Wingdings" w:hAnsi="Wingdings" w:hint="default"/>
+      </w:rPr>
+    </w:lvl>
+  </w:abstractNum>
   <w:num w:numId="1">
+    <w:abstractNumId w:val="1"/>
+  </w:num>
+  <w:num w:numId="2">
+    <w:abstractNumId w:val="2"/>
+  </w:num>
+  <w:num w:numId="3">
     <w:abstractNumId w:val="0"/>
   </w:num>
 </w:numbering>

</xml_diff>

<commit_message>
Added project scope features and scope justification
</commit_message>
<xml_diff>
--- a/BIT 216 Assignment 1 (Task 1).docx
+++ b/BIT 216 Assignment 1 (Task 1).docx
@@ -3337,8 +3337,326 @@
         <w:spacing w:line="360" w:lineRule="auto"/>
         <w:jc w:val="both"/>
       </w:pPr>
-      <w:bookmarkStart w:id="40" w:name="_GoBack"/>
+      <w:r>
+        <w:br w:type="page"/>
+      </w:r>
+    </w:p>
+    <w:p>
+      <w:pPr>
+        <w:pStyle w:val="Heading2"/>
+        <w:rPr>
+          <w:color w:val="auto"/>
+        </w:rPr>
+      </w:pPr>
+      <w:bookmarkStart w:id="40" w:name="_Toc232158125"/>
+      <w:bookmarkStart w:id="41" w:name="_Toc232158728"/>
+      <w:bookmarkStart w:id="42" w:name="_Toc232158886"/>
+      <w:r>
+        <w:rPr>
+          <w:color w:val="auto"/>
+        </w:rPr>
+        <w:t>4.2  Out-of-Scope Features</w:t>
+      </w:r>
       <w:bookmarkEnd w:id="40"/>
+      <w:bookmarkEnd w:id="41"/>
+      <w:bookmarkEnd w:id="42"/>
+    </w:p>
+    <w:p>
+      <w:pPr>
+        <w:spacing w:line="360" w:lineRule="auto"/>
+        <w:jc w:val="both"/>
+        <w:rPr>
+          <w:b/>
+          <w:bCs/>
+        </w:rPr>
+      </w:pPr>
+      <w:r>
+        <w:t>The following items will not be a part of the current project and are not planned to be finished within the set time frame:</w:t>
+      </w:r>
+    </w:p>
+    <w:p>
+      <w:pPr>
+        <w:pStyle w:val="ListParagraph"/>
+        <w:numPr>
+          <w:ilvl w:val="0"/>
+          <w:numId w:val="5"/>
+        </w:numPr>
+        <w:spacing w:line="360" w:lineRule="auto"/>
+        <w:jc w:val="both"/>
+        <w:rPr>
+          <w:b/>
+          <w:bCs/>
+        </w:rPr>
+      </w:pPr>
+      <w:r>
+        <w:t>A native mobile application for iOS or Android. Currently, the project is planned only for a web-based platform. Mobile apps can be a subject in the next phase.</w:t>
+      </w:r>
+    </w:p>
+    <w:p>
+      <w:pPr>
+        <w:pStyle w:val="ListParagraph"/>
+        <w:numPr>
+          <w:ilvl w:val="0"/>
+          <w:numId w:val="5"/>
+        </w:numPr>
+        <w:spacing w:line="360" w:lineRule="auto"/>
+        <w:jc w:val="both"/>
+        <w:rPr>
+          <w:b/>
+          <w:bCs/>
+        </w:rPr>
+      </w:pPr>
+      <w:r>
+        <w:t>Contacting a payment gateway through third-party.SavePlate at the moment does not perform any financial operations.</w:t>
+      </w:r>
+    </w:p>
+    <w:p>
+      <w:pPr>
+        <w:pStyle w:val="ListParagraph"/>
+        <w:numPr>
+          <w:ilvl w:val="0"/>
+          <w:numId w:val="5"/>
+        </w:numPr>
+        <w:spacing w:line="360" w:lineRule="auto"/>
+        <w:jc w:val="both"/>
+        <w:rPr>
+          <w:b/>
+          <w:bCs/>
+        </w:rPr>
+      </w:pPr>
+      <w:r>
+        <w:t>Linking with external grocery store APIs or barcode scanning to automate inventory input.</w:t>
+      </w:r>
+    </w:p>
+    <w:p>
+      <w:pPr>
+        <w:pStyle w:val="ListParagraph"/>
+        <w:numPr>
+          <w:ilvl w:val="0"/>
+          <w:numId w:val="5"/>
+        </w:numPr>
+        <w:spacing w:line="360" w:lineRule="auto"/>
+        <w:jc w:val="both"/>
+        <w:rPr>
+          <w:b/>
+          <w:bCs/>
+        </w:rPr>
+      </w:pPr>
+      <w:r>
+        <w:t>Personalized recipe recommendation engine using machine learning.There will be basic ingredient-based suggestions, but machine learning-driven personalisation is excluded.</w:t>
+      </w:r>
+    </w:p>
+    <w:p>
+      <w:pPr>
+        <w:pStyle w:val="ListParagraph"/>
+        <w:numPr>
+          <w:ilvl w:val="0"/>
+          <w:numId w:val="5"/>
+        </w:numPr>
+        <w:spacing w:line="360" w:lineRule="auto"/>
+        <w:jc w:val="both"/>
+        <w:rPr>
+          <w:b/>
+          <w:bCs/>
+        </w:rPr>
+      </w:pPr>
+      <w:r>
+        <w:t>More than one language besides English.</w:t>
+      </w:r>
+    </w:p>
+    <w:p>
+      <w:pPr>
+        <w:pStyle w:val="ListParagraph"/>
+        <w:numPr>
+          <w:ilvl w:val="0"/>
+          <w:numId w:val="5"/>
+        </w:numPr>
+        <w:spacing w:line="360" w:lineRule="auto"/>
+        <w:jc w:val="both"/>
+        <w:rPr>
+          <w:b/>
+          <w:bCs/>
+        </w:rPr>
+      </w:pPr>
+      <w:r>
+        <w:t>Instant messaging web chat between donors and recipients.</w:t>
+      </w:r>
+    </w:p>
+    <w:p/>
+    <w:p>
+      <w:pPr>
+        <w:pStyle w:val="Heading2"/>
+        <w:rPr>
+          <w:color w:val="auto"/>
+        </w:rPr>
+      </w:pPr>
+      <w:r>
+        <w:rPr>
+          <w:color w:val="auto"/>
+        </w:rPr>
+        <w:t>4.2  Out-of-Scope Features</w:t>
+      </w:r>
+    </w:p>
+    <w:p>
+      <w:pPr>
+        <w:spacing w:line="360" w:lineRule="auto"/>
+        <w:jc w:val="both"/>
+        <w:rPr>
+          <w:b/>
+          <w:bCs/>
+        </w:rPr>
+      </w:pPr>
+      <w:r>
+        <w:t>The following items will not be a part of the current project and are not planned to be finished within the set time frame:</w:t>
+      </w:r>
+    </w:p>
+    <w:p>
+      <w:pPr>
+        <w:pStyle w:val="ListParagraph"/>
+        <w:numPr>
+          <w:ilvl w:val="0"/>
+          <w:numId w:val="5"/>
+        </w:numPr>
+        <w:spacing w:line="360" w:lineRule="auto"/>
+        <w:jc w:val="both"/>
+        <w:rPr>
+          <w:b/>
+          <w:bCs/>
+        </w:rPr>
+      </w:pPr>
+      <w:r>
+        <w:t>A native mobile application for iOS or Android. Currently, the project is planned only for a web-based platform. Mobile apps can be a subject in the next phase.</w:t>
+      </w:r>
+    </w:p>
+    <w:p>
+      <w:pPr>
+        <w:pStyle w:val="ListParagraph"/>
+        <w:numPr>
+          <w:ilvl w:val="0"/>
+          <w:numId w:val="5"/>
+        </w:numPr>
+        <w:spacing w:line="360" w:lineRule="auto"/>
+        <w:jc w:val="both"/>
+        <w:rPr>
+          <w:b/>
+          <w:bCs/>
+        </w:rPr>
+      </w:pPr>
+      <w:r>
+        <w:t>Contacting a payment gateway through third-party.SavePlate at the moment does not perform any financial operations.</w:t>
+      </w:r>
+    </w:p>
+    <w:p>
+      <w:pPr>
+        <w:pStyle w:val="ListParagraph"/>
+        <w:numPr>
+          <w:ilvl w:val="0"/>
+          <w:numId w:val="5"/>
+        </w:numPr>
+        <w:spacing w:line="360" w:lineRule="auto"/>
+        <w:jc w:val="both"/>
+        <w:rPr>
+          <w:b/>
+          <w:bCs/>
+        </w:rPr>
+      </w:pPr>
+      <w:r>
+        <w:t>Linking with external grocery store APIs or barcode scanning to automate inventory input.</w:t>
+      </w:r>
+    </w:p>
+    <w:p>
+      <w:pPr>
+        <w:pStyle w:val="ListParagraph"/>
+        <w:numPr>
+          <w:ilvl w:val="0"/>
+          <w:numId w:val="5"/>
+        </w:numPr>
+        <w:spacing w:line="360" w:lineRule="auto"/>
+        <w:jc w:val="both"/>
+        <w:rPr>
+          <w:b/>
+          <w:bCs/>
+        </w:rPr>
+      </w:pPr>
+      <w:r>
+        <w:t>Personalized recipe recommendation engine using machine learning.There will be basic ingredient-based suggestions, but machine learning-driven personalisation is excluded.</w:t>
+      </w:r>
+    </w:p>
+    <w:p>
+      <w:pPr>
+        <w:pStyle w:val="ListParagraph"/>
+        <w:numPr>
+          <w:ilvl w:val="0"/>
+          <w:numId w:val="5"/>
+        </w:numPr>
+        <w:spacing w:line="360" w:lineRule="auto"/>
+        <w:jc w:val="both"/>
+        <w:rPr>
+          <w:b/>
+          <w:bCs/>
+        </w:rPr>
+      </w:pPr>
+      <w:r>
+        <w:t>More than one language besides English.</w:t>
+      </w:r>
+    </w:p>
+    <w:p>
+      <w:pPr>
+        <w:pStyle w:val="ListParagraph"/>
+        <w:numPr>
+          <w:ilvl w:val="0"/>
+          <w:numId w:val="5"/>
+        </w:numPr>
+        <w:spacing w:line="360" w:lineRule="auto"/>
+        <w:jc w:val="both"/>
+        <w:rPr>
+          <w:b/>
+          <w:bCs/>
+        </w:rPr>
+      </w:pPr>
+      <w:r>
+        <w:t>Instant messaging web chat between donors and recipients.</w:t>
+      </w:r>
+    </w:p>
+    <w:p>
+      <w:pPr>
+        <w:pStyle w:val="Heading2"/>
+        <w:rPr>
+          <w:color w:val="auto"/>
+        </w:rPr>
+      </w:pPr>
+      <w:bookmarkStart w:id="43" w:name="_Toc232158126"/>
+      <w:bookmarkStart w:id="44" w:name="_Toc232158729"/>
+      <w:bookmarkStart w:id="45" w:name="_Toc232158887"/>
+      <w:r>
+        <w:rPr>
+          <w:color w:val="auto"/>
+        </w:rPr>
+        <w:t>4.3  Scope Justification</w:t>
+      </w:r>
+      <w:bookmarkEnd w:id="43"/>
+      <w:bookmarkEnd w:id="44"/>
+      <w:bookmarkEnd w:id="45"/>
+    </w:p>
+    <w:p>
+      <w:pPr>
+        <w:spacing w:line="360" w:lineRule="auto"/>
+        <w:jc w:val="both"/>
+      </w:pPr>
+      <w:r>
+        <w:t>The scope definition above draws on the six use cases outlined in the SavePlate Common Case Study. The scope has purposely been</w:t>
+      </w:r>
+      <w:bookmarkStart w:id="46" w:name="_GoBack"/>
+      <w:bookmarkEnd w:id="46"/>
+      <w:r>
+        <w:t xml:space="preserve"> limited so that it is feasible to be delivered during the six-week project time frame</w:t>
+      </w:r>
+      <w:r>
+        <w:t xml:space="preserve">. Those features labeled as out of </w:t>
+      </w:r>
+      <w:r>
+        <w:t>scope have been postponed to avoid scope creep, which is one of the major project risks mentioned in Section 7 of this paper. The limited scope will make it possible for the team to produce a full, functional, and well-documented system without sacrificing quality or academic rigour.</w:t>
+      </w:r>
       <w:r>
         <w:br w:type="page"/>
       </w:r>
@@ -3669,9 +3987,9 @@
     </w:lvl>
   </w:abstractNum>
   <w:abstractNum w:abstractNumId="3" w15:restartNumberingAfterBreak="0">
-    <w:nsid w:val="77C75B59"/>
+    <w:nsid w:val="757D0EBB"/>
     <w:multiLevelType w:val="hybridMultilevel"/>
-    <w:tmpl w:val="616A8506"/>
+    <w:tmpl w:val="BA5274AE"/>
     <w:lvl w:ilvl="0" w:tplc="04090001">
       <w:start w:val="1"/>
       <w:numFmt w:val="bullet"/>
@@ -3781,17 +4099,133 @@
       </w:rPr>
     </w:lvl>
   </w:abstractNum>
+  <w:abstractNum w:abstractNumId="4" w15:restartNumberingAfterBreak="0">
+    <w:nsid w:val="77C75B59"/>
+    <w:multiLevelType w:val="hybridMultilevel"/>
+    <w:tmpl w:val="616A8506"/>
+    <w:lvl w:ilvl="0" w:tplc="04090001">
+      <w:start w:val="1"/>
+      <w:numFmt w:val="bullet"/>
+      <w:lvlText w:val=""/>
+      <w:lvlJc w:val="left"/>
+      <w:pPr>
+        <w:ind w:left="720" w:hanging="360"/>
+      </w:pPr>
+      <w:rPr>
+        <w:rFonts w:ascii="Symbol" w:hAnsi="Symbol" w:hint="default"/>
+      </w:rPr>
+    </w:lvl>
+    <w:lvl w:ilvl="1" w:tplc="04090003" w:tentative="1">
+      <w:start w:val="1"/>
+      <w:numFmt w:val="bullet"/>
+      <w:lvlText w:val="o"/>
+      <w:lvlJc w:val="left"/>
+      <w:pPr>
+        <w:ind w:left="1440" w:hanging="360"/>
+      </w:pPr>
+      <w:rPr>
+        <w:rFonts w:ascii="Courier New" w:hAnsi="Courier New" w:cs="Courier New" w:hint="default"/>
+      </w:rPr>
+    </w:lvl>
+    <w:lvl w:ilvl="2" w:tplc="04090005" w:tentative="1">
+      <w:start w:val="1"/>
+      <w:numFmt w:val="bullet"/>
+      <w:lvlText w:val=""/>
+      <w:lvlJc w:val="left"/>
+      <w:pPr>
+        <w:ind w:left="2160" w:hanging="360"/>
+      </w:pPr>
+      <w:rPr>
+        <w:rFonts w:ascii="Wingdings" w:hAnsi="Wingdings" w:hint="default"/>
+      </w:rPr>
+    </w:lvl>
+    <w:lvl w:ilvl="3" w:tplc="04090001" w:tentative="1">
+      <w:start w:val="1"/>
+      <w:numFmt w:val="bullet"/>
+      <w:lvlText w:val=""/>
+      <w:lvlJc w:val="left"/>
+      <w:pPr>
+        <w:ind w:left="2880" w:hanging="360"/>
+      </w:pPr>
+      <w:rPr>
+        <w:rFonts w:ascii="Symbol" w:hAnsi="Symbol" w:hint="default"/>
+      </w:rPr>
+    </w:lvl>
+    <w:lvl w:ilvl="4" w:tplc="04090003" w:tentative="1">
+      <w:start w:val="1"/>
+      <w:numFmt w:val="bullet"/>
+      <w:lvlText w:val="o"/>
+      <w:lvlJc w:val="left"/>
+      <w:pPr>
+        <w:ind w:left="3600" w:hanging="360"/>
+      </w:pPr>
+      <w:rPr>
+        <w:rFonts w:ascii="Courier New" w:hAnsi="Courier New" w:cs="Courier New" w:hint="default"/>
+      </w:rPr>
+    </w:lvl>
+    <w:lvl w:ilvl="5" w:tplc="04090005" w:tentative="1">
+      <w:start w:val="1"/>
+      <w:numFmt w:val="bullet"/>
+      <w:lvlText w:val=""/>
+      <w:lvlJc w:val="left"/>
+      <w:pPr>
+        <w:ind w:left="4320" w:hanging="360"/>
+      </w:pPr>
+      <w:rPr>
+        <w:rFonts w:ascii="Wingdings" w:hAnsi="Wingdings" w:hint="default"/>
+      </w:rPr>
+    </w:lvl>
+    <w:lvl w:ilvl="6" w:tplc="04090001" w:tentative="1">
+      <w:start w:val="1"/>
+      <w:numFmt w:val="bullet"/>
+      <w:lvlText w:val=""/>
+      <w:lvlJc w:val="left"/>
+      <w:pPr>
+        <w:ind w:left="5040" w:hanging="360"/>
+      </w:pPr>
+      <w:rPr>
+        <w:rFonts w:ascii="Symbol" w:hAnsi="Symbol" w:hint="default"/>
+      </w:rPr>
+    </w:lvl>
+    <w:lvl w:ilvl="7" w:tplc="04090003" w:tentative="1">
+      <w:start w:val="1"/>
+      <w:numFmt w:val="bullet"/>
+      <w:lvlText w:val="o"/>
+      <w:lvlJc w:val="left"/>
+      <w:pPr>
+        <w:ind w:left="5760" w:hanging="360"/>
+      </w:pPr>
+      <w:rPr>
+        <w:rFonts w:ascii="Courier New" w:hAnsi="Courier New" w:cs="Courier New" w:hint="default"/>
+      </w:rPr>
+    </w:lvl>
+    <w:lvl w:ilvl="8" w:tplc="04090005" w:tentative="1">
+      <w:start w:val="1"/>
+      <w:numFmt w:val="bullet"/>
+      <w:lvlText w:val=""/>
+      <w:lvlJc w:val="left"/>
+      <w:pPr>
+        <w:ind w:left="6480" w:hanging="360"/>
+      </w:pPr>
+      <w:rPr>
+        <w:rFonts w:ascii="Wingdings" w:hAnsi="Wingdings" w:hint="default"/>
+      </w:rPr>
+    </w:lvl>
+  </w:abstractNum>
   <w:num w:numId="1">
     <w:abstractNumId w:val="2"/>
   </w:num>
   <w:num w:numId="2">
-    <w:abstractNumId w:val="3"/>
+    <w:abstractNumId w:val="4"/>
   </w:num>
   <w:num w:numId="3">
     <w:abstractNumId w:val="0"/>
   </w:num>
   <w:num w:numId="4">
     <w:abstractNumId w:val="1"/>
+  </w:num>
+  <w:num w:numId="5">
+    <w:abstractNumId w:val="3"/>
   </w:num>
 </w:numbering>
 </file>

</xml_diff>

<commit_message>
Added Milestones and Deliverables
</commit_message>
<xml_diff>
--- a/BIT 216 Assignment 1 (Task 1).docx
+++ b/BIT 216 Assignment 1 (Task 1).docx
@@ -9444,19 +9444,999 @@
         <w:jc w:val="both"/>
       </w:pPr>
       <w:r>
-        <w:t>Note: "M1–M5" denote the five project mile</w:t>
-      </w:r>
-      <w:bookmarkStart w:id="53" w:name="_GoBack"/>
-      <w:bookmarkEnd w:id="53"/>
-      <w:r>
-        <w:t>stones. Details are elaborated in Section 5.2.</w:t>
+        <w:t>Note: "M1–M5" denote the five project milestones. Details are elaborated in Section 5.2.</w:t>
       </w:r>
     </w:p>
     <w:p>
       <w:pPr>
+        <w:pStyle w:val="Heading2"/>
+        <w:rPr>
+          <w:color w:val="auto"/>
+        </w:rPr>
+      </w:pPr>
+      <w:bookmarkStart w:id="53" w:name="_Toc232158130"/>
+      <w:bookmarkStart w:id="54" w:name="_Toc232158732"/>
+      <w:bookmarkStart w:id="55" w:name="_Toc232158890"/>
+      <w:r>
+        <w:rPr>
+          <w:color w:val="auto"/>
+        </w:rPr>
+        <w:t>5.2  Milestones and Deliverables</w:t>
+      </w:r>
+      <w:bookmarkEnd w:id="53"/>
+      <w:bookmarkEnd w:id="54"/>
+      <w:bookmarkEnd w:id="55"/>
+    </w:p>
+    <w:p>
+      <w:pPr>
+        <w:spacing w:after="160" w:line="360" w:lineRule="auto"/>
+      </w:pPr>
+      <w:r>
+        <w:t>The table below provides a summary of the major milestones of the project, along with their associated deliverables, target dates, and designated owners:</w:t>
+      </w:r>
+    </w:p>
+    <w:p>
+      <w:pPr>
+        <w:spacing w:after="160" w:line="360" w:lineRule="auto"/>
+      </w:pPr>
+      <w:r>
+        <w:t>Table 2: Milestones and Deliverables</w:t>
+      </w:r>
+    </w:p>
+    <w:tbl>
+      <w:tblPr>
+        <w:tblW w:w="9360" w:type="dxa"/>
+        <w:tblBorders>
+          <w:top w:val="single" w:sz="4" w:space="0" w:color="auto"/>
+          <w:left w:val="single" w:sz="4" w:space="0" w:color="auto"/>
+          <w:bottom w:val="single" w:sz="4" w:space="0" w:color="auto"/>
+          <w:right w:val="single" w:sz="4" w:space="0" w:color="auto"/>
+          <w:insideH w:val="single" w:sz="4" w:space="0" w:color="auto"/>
+          <w:insideV w:val="single" w:sz="4" w:space="0" w:color="auto"/>
+        </w:tblBorders>
+        <w:tblCellMar>
+          <w:left w:w="10" w:type="dxa"/>
+          <w:right w:w="10" w:type="dxa"/>
+        </w:tblCellMar>
+        <w:tblLook w:val="0000" w:firstRow="0" w:lastRow="0" w:firstColumn="0" w:lastColumn="0" w:noHBand="0" w:noVBand="0"/>
+      </w:tblPr>
+      <w:tblGrid>
+        <w:gridCol w:w="700"/>
+        <w:gridCol w:w="2400"/>
+        <w:gridCol w:w="3000"/>
+        <w:gridCol w:w="1660"/>
+        <w:gridCol w:w="1600"/>
+      </w:tblGrid>
+      <w:tr>
+        <w:tc>
+          <w:tcPr>
+            <w:tcW w:w="700" w:type="dxa"/>
+            <w:tcBorders>
+              <w:top w:val="single" w:sz="4" w:space="0" w:color="CCCCCC"/>
+              <w:left w:val="single" w:sz="4" w:space="0" w:color="CCCCCC"/>
+              <w:bottom w:val="single" w:sz="4" w:space="0" w:color="CCCCCC"/>
+              <w:right w:val="single" w:sz="4" w:space="0" w:color="CCCCCC"/>
+            </w:tcBorders>
+            <w:shd w:val="clear" w:color="auto" w:fill="auto"/>
+            <w:tcMar>
+              <w:top w:w="80" w:type="dxa"/>
+              <w:left w:w="120" w:type="dxa"/>
+              <w:bottom w:w="80" w:type="dxa"/>
+              <w:right w:w="120" w:type="dxa"/>
+            </w:tcMar>
+          </w:tcPr>
+          <w:p>
+            <w:pPr>
+              <w:jc w:val="both"/>
+            </w:pPr>
+            <w:r>
+              <w:rPr>
+                <w:b/>
+                <w:bCs/>
+                <w:sz w:val="22"/>
+                <w:szCs w:val="22"/>
+              </w:rPr>
+              <w:t>ID</w:t>
+            </w:r>
+          </w:p>
+        </w:tc>
+        <w:tc>
+          <w:tcPr>
+            <w:tcW w:w="2400" w:type="dxa"/>
+            <w:tcBorders>
+              <w:top w:val="single" w:sz="4" w:space="0" w:color="CCCCCC"/>
+              <w:left w:val="single" w:sz="4" w:space="0" w:color="CCCCCC"/>
+              <w:bottom w:val="single" w:sz="4" w:space="0" w:color="CCCCCC"/>
+              <w:right w:val="single" w:sz="4" w:space="0" w:color="CCCCCC"/>
+            </w:tcBorders>
+            <w:shd w:val="clear" w:color="auto" w:fill="auto"/>
+            <w:tcMar>
+              <w:top w:w="80" w:type="dxa"/>
+              <w:left w:w="120" w:type="dxa"/>
+              <w:bottom w:w="80" w:type="dxa"/>
+              <w:right w:w="120" w:type="dxa"/>
+            </w:tcMar>
+          </w:tcPr>
+          <w:p>
+            <w:pPr>
+              <w:jc w:val="both"/>
+            </w:pPr>
+            <w:r>
+              <w:rPr>
+                <w:b/>
+                <w:bCs/>
+                <w:sz w:val="22"/>
+                <w:szCs w:val="22"/>
+              </w:rPr>
+              <w:t>Milestone</w:t>
+            </w:r>
+          </w:p>
+        </w:tc>
+        <w:tc>
+          <w:tcPr>
+            <w:tcW w:w="3000" w:type="dxa"/>
+            <w:tcBorders>
+              <w:top w:val="single" w:sz="4" w:space="0" w:color="CCCCCC"/>
+              <w:left w:val="single" w:sz="4" w:space="0" w:color="CCCCCC"/>
+              <w:bottom w:val="single" w:sz="4" w:space="0" w:color="CCCCCC"/>
+              <w:right w:val="single" w:sz="4" w:space="0" w:color="CCCCCC"/>
+            </w:tcBorders>
+            <w:shd w:val="clear" w:color="auto" w:fill="auto"/>
+            <w:tcMar>
+              <w:top w:w="80" w:type="dxa"/>
+              <w:left w:w="120" w:type="dxa"/>
+              <w:bottom w:w="80" w:type="dxa"/>
+              <w:right w:w="120" w:type="dxa"/>
+            </w:tcMar>
+          </w:tcPr>
+          <w:p>
+            <w:pPr>
+              <w:jc w:val="both"/>
+            </w:pPr>
+            <w:r>
+              <w:rPr>
+                <w:b/>
+                <w:bCs/>
+                <w:sz w:val="22"/>
+                <w:szCs w:val="22"/>
+              </w:rPr>
+              <w:t>Deliverable</w:t>
+            </w:r>
+          </w:p>
+        </w:tc>
+        <w:tc>
+          <w:tcPr>
+            <w:tcW w:w="1660" w:type="dxa"/>
+            <w:tcBorders>
+              <w:top w:val="single" w:sz="4" w:space="0" w:color="CCCCCC"/>
+              <w:left w:val="single" w:sz="4" w:space="0" w:color="CCCCCC"/>
+              <w:bottom w:val="single" w:sz="4" w:space="0" w:color="CCCCCC"/>
+              <w:right w:val="single" w:sz="4" w:space="0" w:color="CCCCCC"/>
+            </w:tcBorders>
+            <w:shd w:val="clear" w:color="auto" w:fill="auto"/>
+            <w:tcMar>
+              <w:top w:w="80" w:type="dxa"/>
+              <w:left w:w="120" w:type="dxa"/>
+              <w:bottom w:w="80" w:type="dxa"/>
+              <w:right w:w="120" w:type="dxa"/>
+            </w:tcMar>
+          </w:tcPr>
+          <w:p>
+            <w:pPr>
+              <w:jc w:val="both"/>
+            </w:pPr>
+            <w:r>
+              <w:rPr>
+                <w:b/>
+                <w:bCs/>
+                <w:sz w:val="22"/>
+                <w:szCs w:val="22"/>
+              </w:rPr>
+              <w:t>Target Date</w:t>
+            </w:r>
+          </w:p>
+        </w:tc>
+        <w:tc>
+          <w:tcPr>
+            <w:tcW w:w="1600" w:type="dxa"/>
+            <w:tcBorders>
+              <w:top w:val="single" w:sz="4" w:space="0" w:color="CCCCCC"/>
+              <w:left w:val="single" w:sz="4" w:space="0" w:color="CCCCCC"/>
+              <w:bottom w:val="single" w:sz="4" w:space="0" w:color="CCCCCC"/>
+              <w:right w:val="single" w:sz="4" w:space="0" w:color="CCCCCC"/>
+            </w:tcBorders>
+            <w:shd w:val="clear" w:color="auto" w:fill="auto"/>
+            <w:tcMar>
+              <w:top w:w="80" w:type="dxa"/>
+              <w:left w:w="120" w:type="dxa"/>
+              <w:bottom w:w="80" w:type="dxa"/>
+              <w:right w:w="120" w:type="dxa"/>
+            </w:tcMar>
+          </w:tcPr>
+          <w:p>
+            <w:pPr>
+              <w:jc w:val="both"/>
+            </w:pPr>
+            <w:r>
+              <w:rPr>
+                <w:b/>
+                <w:bCs/>
+                <w:sz w:val="22"/>
+                <w:szCs w:val="22"/>
+              </w:rPr>
+              <w:t>Owner</w:t>
+            </w:r>
+          </w:p>
+        </w:tc>
+      </w:tr>
+      <w:tr>
+        <w:tc>
+          <w:tcPr>
+            <w:tcW w:w="700" w:type="dxa"/>
+            <w:tcBorders>
+              <w:top w:val="single" w:sz="4" w:space="0" w:color="CCCCCC"/>
+              <w:left w:val="single" w:sz="4" w:space="0" w:color="CCCCCC"/>
+              <w:bottom w:val="single" w:sz="4" w:space="0" w:color="CCCCCC"/>
+              <w:right w:val="single" w:sz="4" w:space="0" w:color="CCCCCC"/>
+            </w:tcBorders>
+            <w:shd w:val="clear" w:color="auto" w:fill="auto"/>
+            <w:tcMar>
+              <w:top w:w="80" w:type="dxa"/>
+              <w:left w:w="120" w:type="dxa"/>
+              <w:bottom w:w="80" w:type="dxa"/>
+              <w:right w:w="120" w:type="dxa"/>
+            </w:tcMar>
+          </w:tcPr>
+          <w:p>
+            <w:pPr>
+              <w:jc w:val="both"/>
+            </w:pPr>
+            <w:r>
+              <w:rPr>
+                <w:sz w:val="22"/>
+                <w:szCs w:val="22"/>
+              </w:rPr>
+              <w:t>M1</w:t>
+            </w:r>
+          </w:p>
+        </w:tc>
+        <w:tc>
+          <w:tcPr>
+            <w:tcW w:w="2400" w:type="dxa"/>
+            <w:tcBorders>
+              <w:top w:val="single" w:sz="4" w:space="0" w:color="CCCCCC"/>
+              <w:left w:val="single" w:sz="4" w:space="0" w:color="CCCCCC"/>
+              <w:bottom w:val="single" w:sz="4" w:space="0" w:color="CCCCCC"/>
+              <w:right w:val="single" w:sz="4" w:space="0" w:color="CCCCCC"/>
+            </w:tcBorders>
+            <w:shd w:val="clear" w:color="auto" w:fill="auto"/>
+            <w:tcMar>
+              <w:top w:w="80" w:type="dxa"/>
+              <w:left w:w="120" w:type="dxa"/>
+              <w:bottom w:w="80" w:type="dxa"/>
+              <w:right w:w="120" w:type="dxa"/>
+            </w:tcMar>
+          </w:tcPr>
+          <w:p>
+            <w:pPr>
+              <w:jc w:val="both"/>
+            </w:pPr>
+            <w:r>
+              <w:rPr>
+                <w:sz w:val="22"/>
+                <w:szCs w:val="22"/>
+              </w:rPr>
+              <w:t>Project Initiation Complete</w:t>
+            </w:r>
+          </w:p>
+        </w:tc>
+        <w:tc>
+          <w:tcPr>
+            <w:tcW w:w="3000" w:type="dxa"/>
+            <w:tcBorders>
+              <w:top w:val="single" w:sz="4" w:space="0" w:color="CCCCCC"/>
+              <w:left w:val="single" w:sz="4" w:space="0" w:color="CCCCCC"/>
+              <w:bottom w:val="single" w:sz="4" w:space="0" w:color="CCCCCC"/>
+              <w:right w:val="single" w:sz="4" w:space="0" w:color="CCCCCC"/>
+            </w:tcBorders>
+            <w:shd w:val="clear" w:color="auto" w:fill="auto"/>
+            <w:tcMar>
+              <w:top w:w="80" w:type="dxa"/>
+              <w:left w:w="120" w:type="dxa"/>
+              <w:bottom w:w="80" w:type="dxa"/>
+              <w:right w:w="120" w:type="dxa"/>
+            </w:tcMar>
+          </w:tcPr>
+          <w:p>
+            <w:pPr>
+              <w:jc w:val="both"/>
+            </w:pPr>
+            <w:r>
+              <w:rPr>
+                <w:sz w:val="22"/>
+                <w:szCs w:val="22"/>
+              </w:rPr>
+              <w:t>Roles allocated; case study examined; project brief comprehended</w:t>
+            </w:r>
+          </w:p>
+        </w:tc>
+        <w:tc>
+          <w:tcPr>
+            <w:tcW w:w="1660" w:type="dxa"/>
+            <w:tcBorders>
+              <w:top w:val="single" w:sz="4" w:space="0" w:color="CCCCCC"/>
+              <w:left w:val="single" w:sz="4" w:space="0" w:color="CCCCCC"/>
+              <w:bottom w:val="single" w:sz="4" w:space="0" w:color="CCCCCC"/>
+              <w:right w:val="single" w:sz="4" w:space="0" w:color="CCCCCC"/>
+            </w:tcBorders>
+            <w:shd w:val="clear" w:color="auto" w:fill="auto"/>
+            <w:tcMar>
+              <w:top w:w="80" w:type="dxa"/>
+              <w:left w:w="120" w:type="dxa"/>
+              <w:bottom w:w="80" w:type="dxa"/>
+              <w:right w:w="120" w:type="dxa"/>
+            </w:tcMar>
+          </w:tcPr>
+          <w:p>
+            <w:pPr>
+              <w:jc w:val="both"/>
+            </w:pPr>
+            <w:r>
+              <w:rPr>
+                <w:sz w:val="22"/>
+                <w:szCs w:val="22"/>
+              </w:rPr>
+              <w:t>22 May 2026</w:t>
+            </w:r>
+          </w:p>
+        </w:tc>
+        <w:tc>
+          <w:tcPr>
+            <w:tcW w:w="1600" w:type="dxa"/>
+            <w:tcBorders>
+              <w:top w:val="single" w:sz="4" w:space="0" w:color="CCCCCC"/>
+              <w:left w:val="single" w:sz="4" w:space="0" w:color="CCCCCC"/>
+              <w:bottom w:val="single" w:sz="4" w:space="0" w:color="CCCCCC"/>
+              <w:right w:val="single" w:sz="4" w:space="0" w:color="CCCCCC"/>
+            </w:tcBorders>
+            <w:shd w:val="clear" w:color="auto" w:fill="auto"/>
+            <w:tcMar>
+              <w:top w:w="80" w:type="dxa"/>
+              <w:left w:w="120" w:type="dxa"/>
+              <w:bottom w:w="80" w:type="dxa"/>
+              <w:right w:w="120" w:type="dxa"/>
+            </w:tcMar>
+          </w:tcPr>
+          <w:p>
+            <w:pPr>
+              <w:jc w:val="both"/>
+            </w:pPr>
+            <w:r>
+              <w:rPr>
+                <w:sz w:val="22"/>
+                <w:szCs w:val="22"/>
+              </w:rPr>
+              <w:t>All</w:t>
+            </w:r>
+          </w:p>
+        </w:tc>
+      </w:tr>
+      <w:tr>
+        <w:tc>
+          <w:tcPr>
+            <w:tcW w:w="700" w:type="dxa"/>
+            <w:tcBorders>
+              <w:top w:val="single" w:sz="4" w:space="0" w:color="CCCCCC"/>
+              <w:left w:val="single" w:sz="4" w:space="0" w:color="CCCCCC"/>
+              <w:bottom w:val="single" w:sz="4" w:space="0" w:color="CCCCCC"/>
+              <w:right w:val="single" w:sz="4" w:space="0" w:color="CCCCCC"/>
+            </w:tcBorders>
+            <w:shd w:val="clear" w:color="auto" w:fill="auto"/>
+            <w:tcMar>
+              <w:top w:w="80" w:type="dxa"/>
+              <w:left w:w="120" w:type="dxa"/>
+              <w:bottom w:w="80" w:type="dxa"/>
+              <w:right w:w="120" w:type="dxa"/>
+            </w:tcMar>
+          </w:tcPr>
+          <w:p>
+            <w:pPr>
+              <w:jc w:val="both"/>
+            </w:pPr>
+            <w:r>
+              <w:rPr>
+                <w:sz w:val="22"/>
+                <w:szCs w:val="22"/>
+              </w:rPr>
+              <w:t>M2</w:t>
+            </w:r>
+          </w:p>
+        </w:tc>
+        <w:tc>
+          <w:tcPr>
+            <w:tcW w:w="2400" w:type="dxa"/>
+            <w:tcBorders>
+              <w:top w:val="single" w:sz="4" w:space="0" w:color="CCCCCC"/>
+              <w:left w:val="single" w:sz="4" w:space="0" w:color="CCCCCC"/>
+              <w:bottom w:val="single" w:sz="4" w:space="0" w:color="CCCCCC"/>
+              <w:right w:val="single" w:sz="4" w:space="0" w:color="CCCCCC"/>
+            </w:tcBorders>
+            <w:shd w:val="clear" w:color="auto" w:fill="auto"/>
+            <w:tcMar>
+              <w:top w:w="80" w:type="dxa"/>
+              <w:left w:w="120" w:type="dxa"/>
+              <w:bottom w:w="80" w:type="dxa"/>
+              <w:right w:w="120" w:type="dxa"/>
+            </w:tcMar>
+          </w:tcPr>
+          <w:p>
+            <w:pPr>
+              <w:jc w:val="both"/>
+            </w:pPr>
+            <w:r>
+              <w:rPr>
+                <w:sz w:val="22"/>
+                <w:szCs w:val="22"/>
+              </w:rPr>
+              <w:t>Requirements Baseline</w:t>
+            </w:r>
+          </w:p>
+        </w:tc>
+        <w:tc>
+          <w:tcPr>
+            <w:tcW w:w="3000" w:type="dxa"/>
+            <w:tcBorders>
+              <w:top w:val="single" w:sz="4" w:space="0" w:color="CCCCCC"/>
+              <w:left w:val="single" w:sz="4" w:space="0" w:color="CCCCCC"/>
+              <w:bottom w:val="single" w:sz="4" w:space="0" w:color="CCCCCC"/>
+              <w:right w:val="single" w:sz="4" w:space="0" w:color="CCCCCC"/>
+            </w:tcBorders>
+            <w:shd w:val="clear" w:color="auto" w:fill="auto"/>
+            <w:tcMar>
+              <w:top w:w="80" w:type="dxa"/>
+              <w:left w:w="120" w:type="dxa"/>
+              <w:bottom w:w="80" w:type="dxa"/>
+              <w:right w:w="120" w:type="dxa"/>
+            </w:tcMar>
+          </w:tcPr>
+          <w:p>
+            <w:pPr>
+              <w:jc w:val="both"/>
+            </w:pPr>
+            <w:r>
+              <w:rPr>
+                <w:sz w:val="22"/>
+                <w:szCs w:val="22"/>
+              </w:rPr>
+              <w:t>User stories and acceptance criteria for six use cases have been drafted</w:t>
+            </w:r>
+          </w:p>
+        </w:tc>
+        <w:tc>
+          <w:tcPr>
+            <w:tcW w:w="1660" w:type="dxa"/>
+            <w:tcBorders>
+              <w:top w:val="single" w:sz="4" w:space="0" w:color="CCCCCC"/>
+              <w:left w:val="single" w:sz="4" w:space="0" w:color="CCCCCC"/>
+              <w:bottom w:val="single" w:sz="4" w:space="0" w:color="CCCCCC"/>
+              <w:right w:val="single" w:sz="4" w:space="0" w:color="CCCCCC"/>
+            </w:tcBorders>
+            <w:shd w:val="clear" w:color="auto" w:fill="auto"/>
+            <w:tcMar>
+              <w:top w:w="80" w:type="dxa"/>
+              <w:left w:w="120" w:type="dxa"/>
+              <w:bottom w:w="80" w:type="dxa"/>
+              <w:right w:w="120" w:type="dxa"/>
+            </w:tcMar>
+          </w:tcPr>
+          <w:p>
+            <w:pPr>
+              <w:jc w:val="both"/>
+            </w:pPr>
+            <w:r>
+              <w:rPr>
+                <w:sz w:val="22"/>
+                <w:szCs w:val="22"/>
+              </w:rPr>
+              <w:t>5 Jun 2026</w:t>
+            </w:r>
+          </w:p>
+        </w:tc>
+        <w:tc>
+          <w:tcPr>
+            <w:tcW w:w="1600" w:type="dxa"/>
+            <w:tcBorders>
+              <w:top w:val="single" w:sz="4" w:space="0" w:color="CCCCCC"/>
+              <w:left w:val="single" w:sz="4" w:space="0" w:color="CCCCCC"/>
+              <w:bottom w:val="single" w:sz="4" w:space="0" w:color="CCCCCC"/>
+              <w:right w:val="single" w:sz="4" w:space="0" w:color="CCCCCC"/>
+            </w:tcBorders>
+            <w:shd w:val="clear" w:color="auto" w:fill="auto"/>
+            <w:tcMar>
+              <w:top w:w="80" w:type="dxa"/>
+              <w:left w:w="120" w:type="dxa"/>
+              <w:bottom w:w="80" w:type="dxa"/>
+              <w:right w:w="120" w:type="dxa"/>
+            </w:tcMar>
+          </w:tcPr>
+          <w:p>
+            <w:pPr>
+              <w:jc w:val="both"/>
+            </w:pPr>
+            <w:r>
+              <w:rPr>
+                <w:sz w:val="22"/>
+                <w:szCs w:val="22"/>
+              </w:rPr>
+              <w:t>All</w:t>
+            </w:r>
+          </w:p>
+        </w:tc>
+      </w:tr>
+      <w:tr>
+        <w:tc>
+          <w:tcPr>
+            <w:tcW w:w="700" w:type="dxa"/>
+            <w:tcBorders>
+              <w:top w:val="single" w:sz="4" w:space="0" w:color="CCCCCC"/>
+              <w:left w:val="single" w:sz="4" w:space="0" w:color="CCCCCC"/>
+              <w:bottom w:val="single" w:sz="4" w:space="0" w:color="CCCCCC"/>
+              <w:right w:val="single" w:sz="4" w:space="0" w:color="CCCCCC"/>
+            </w:tcBorders>
+            <w:shd w:val="clear" w:color="auto" w:fill="auto"/>
+            <w:tcMar>
+              <w:top w:w="80" w:type="dxa"/>
+              <w:left w:w="120" w:type="dxa"/>
+              <w:bottom w:w="80" w:type="dxa"/>
+              <w:right w:w="120" w:type="dxa"/>
+            </w:tcMar>
+          </w:tcPr>
+          <w:p>
+            <w:pPr>
+              <w:jc w:val="both"/>
+            </w:pPr>
+            <w:r>
+              <w:rPr>
+                <w:sz w:val="22"/>
+                <w:szCs w:val="22"/>
+              </w:rPr>
+              <w:t>M3</w:t>
+            </w:r>
+          </w:p>
+        </w:tc>
+        <w:tc>
+          <w:tcPr>
+            <w:tcW w:w="2400" w:type="dxa"/>
+            <w:tcBorders>
+              <w:top w:val="single" w:sz="4" w:space="0" w:color="CCCCCC"/>
+              <w:left w:val="single" w:sz="4" w:space="0" w:color="CCCCCC"/>
+              <w:bottom w:val="single" w:sz="4" w:space="0" w:color="CCCCCC"/>
+              <w:right w:val="single" w:sz="4" w:space="0" w:color="CCCCCC"/>
+            </w:tcBorders>
+            <w:shd w:val="clear" w:color="auto" w:fill="auto"/>
+            <w:tcMar>
+              <w:top w:w="80" w:type="dxa"/>
+              <w:left w:w="120" w:type="dxa"/>
+              <w:bottom w:w="80" w:type="dxa"/>
+              <w:right w:w="120" w:type="dxa"/>
+            </w:tcMar>
+          </w:tcPr>
+          <w:p>
+            <w:pPr>
+              <w:jc w:val="both"/>
+            </w:pPr>
+            <w:r>
+              <w:rPr>
+                <w:sz w:val="22"/>
+                <w:szCs w:val="22"/>
+              </w:rPr>
+              <w:t>Task 1 Submission</w:t>
+            </w:r>
+          </w:p>
+        </w:tc>
+        <w:tc>
+          <w:tcPr>
+            <w:tcW w:w="3000" w:type="dxa"/>
+            <w:tcBorders>
+              <w:top w:val="single" w:sz="4" w:space="0" w:color="CCCCCC"/>
+              <w:left w:val="single" w:sz="4" w:space="0" w:color="CCCCCC"/>
+              <w:bottom w:val="single" w:sz="4" w:space="0" w:color="CCCCCC"/>
+              <w:right w:val="single" w:sz="4" w:space="0" w:color="CCCCCC"/>
+            </w:tcBorders>
+            <w:shd w:val="clear" w:color="auto" w:fill="auto"/>
+            <w:tcMar>
+              <w:top w:w="80" w:type="dxa"/>
+              <w:left w:w="120" w:type="dxa"/>
+              <w:bottom w:w="80" w:type="dxa"/>
+              <w:right w:w="120" w:type="dxa"/>
+            </w:tcMar>
+          </w:tcPr>
+          <w:p>
+            <w:pPr>
+              <w:jc w:val="both"/>
+            </w:pPr>
+            <w:r>
+              <w:rPr>
+                <w:sz w:val="22"/>
+                <w:szCs w:val="22"/>
+              </w:rPr>
+              <w:t>Complete project plan/proposal document has been submitted through HLMS</w:t>
+            </w:r>
+          </w:p>
+        </w:tc>
+        <w:tc>
+          <w:tcPr>
+            <w:tcW w:w="1660" w:type="dxa"/>
+            <w:tcBorders>
+              <w:top w:val="single" w:sz="4" w:space="0" w:color="CCCCCC"/>
+              <w:left w:val="single" w:sz="4" w:space="0" w:color="CCCCCC"/>
+              <w:bottom w:val="single" w:sz="4" w:space="0" w:color="CCCCCC"/>
+              <w:right w:val="single" w:sz="4" w:space="0" w:color="CCCCCC"/>
+            </w:tcBorders>
+            <w:shd w:val="clear" w:color="auto" w:fill="auto"/>
+            <w:tcMar>
+              <w:top w:w="80" w:type="dxa"/>
+              <w:left w:w="120" w:type="dxa"/>
+              <w:bottom w:w="80" w:type="dxa"/>
+              <w:right w:w="120" w:type="dxa"/>
+            </w:tcMar>
+          </w:tcPr>
+          <w:p>
+            <w:pPr>
+              <w:jc w:val="both"/>
+            </w:pPr>
+            <w:r>
+              <w:rPr>
+                <w:sz w:val="22"/>
+                <w:szCs w:val="22"/>
+              </w:rPr>
+              <w:t>12 Jun 2026</w:t>
+            </w:r>
+          </w:p>
+        </w:tc>
+        <w:tc>
+          <w:tcPr>
+            <w:tcW w:w="1600" w:type="dxa"/>
+            <w:tcBorders>
+              <w:top w:val="single" w:sz="4" w:space="0" w:color="CCCCCC"/>
+              <w:left w:val="single" w:sz="4" w:space="0" w:color="CCCCCC"/>
+              <w:bottom w:val="single" w:sz="4" w:space="0" w:color="CCCCCC"/>
+              <w:right w:val="single" w:sz="4" w:space="0" w:color="CCCCCC"/>
+            </w:tcBorders>
+            <w:shd w:val="clear" w:color="auto" w:fill="auto"/>
+            <w:tcMar>
+              <w:top w:w="80" w:type="dxa"/>
+              <w:left w:w="120" w:type="dxa"/>
+              <w:bottom w:w="80" w:type="dxa"/>
+              <w:right w:w="120" w:type="dxa"/>
+            </w:tcMar>
+          </w:tcPr>
+          <w:p>
+            <w:pPr>
+              <w:jc w:val="both"/>
+            </w:pPr>
+            <w:r>
+              <w:rPr>
+                <w:sz w:val="22"/>
+                <w:szCs w:val="22"/>
+              </w:rPr>
+              <w:t>All</w:t>
+            </w:r>
+          </w:p>
+        </w:tc>
+      </w:tr>
+      <w:tr>
+        <w:tc>
+          <w:tcPr>
+            <w:tcW w:w="700" w:type="dxa"/>
+            <w:tcBorders>
+              <w:top w:val="single" w:sz="4" w:space="0" w:color="CCCCCC"/>
+              <w:left w:val="single" w:sz="4" w:space="0" w:color="CCCCCC"/>
+              <w:bottom w:val="single" w:sz="4" w:space="0" w:color="CCCCCC"/>
+              <w:right w:val="single" w:sz="4" w:space="0" w:color="CCCCCC"/>
+            </w:tcBorders>
+            <w:shd w:val="clear" w:color="auto" w:fill="auto"/>
+            <w:tcMar>
+              <w:top w:w="80" w:type="dxa"/>
+              <w:left w:w="120" w:type="dxa"/>
+              <w:bottom w:w="80" w:type="dxa"/>
+              <w:right w:w="120" w:type="dxa"/>
+            </w:tcMar>
+          </w:tcPr>
+          <w:p>
+            <w:pPr>
+              <w:jc w:val="both"/>
+            </w:pPr>
+            <w:r>
+              <w:rPr>
+                <w:sz w:val="22"/>
+                <w:szCs w:val="22"/>
+              </w:rPr>
+              <w:t>M4</w:t>
+            </w:r>
+          </w:p>
+        </w:tc>
+        <w:tc>
+          <w:tcPr>
+            <w:tcW w:w="2400" w:type="dxa"/>
+            <w:tcBorders>
+              <w:top w:val="single" w:sz="4" w:space="0" w:color="CCCCCC"/>
+              <w:left w:val="single" w:sz="4" w:space="0" w:color="CCCCCC"/>
+              <w:bottom w:val="single" w:sz="4" w:space="0" w:color="CCCCCC"/>
+              <w:right w:val="single" w:sz="4" w:space="0" w:color="CCCCCC"/>
+            </w:tcBorders>
+            <w:shd w:val="clear" w:color="auto" w:fill="auto"/>
+            <w:tcMar>
+              <w:top w:w="80" w:type="dxa"/>
+              <w:left w:w="120" w:type="dxa"/>
+              <w:bottom w:w="80" w:type="dxa"/>
+              <w:right w:w="120" w:type="dxa"/>
+            </w:tcMar>
+          </w:tcPr>
+          <w:p>
+            <w:pPr>
+              <w:jc w:val="both"/>
+            </w:pPr>
+            <w:r>
+              <w:rPr>
+                <w:sz w:val="22"/>
+                <w:szCs w:val="22"/>
+              </w:rPr>
+              <w:t>Design Artefacts Complete</w:t>
+            </w:r>
+          </w:p>
+        </w:tc>
+        <w:tc>
+          <w:tcPr>
+            <w:tcW w:w="3000" w:type="dxa"/>
+            <w:tcBorders>
+              <w:top w:val="single" w:sz="4" w:space="0" w:color="CCCCCC"/>
+              <w:left w:val="single" w:sz="4" w:space="0" w:color="CCCCCC"/>
+              <w:bottom w:val="single" w:sz="4" w:space="0" w:color="CCCCCC"/>
+              <w:right w:val="single" w:sz="4" w:space="0" w:color="CCCCCC"/>
+            </w:tcBorders>
+            <w:shd w:val="clear" w:color="auto" w:fill="auto"/>
+            <w:tcMar>
+              <w:top w:w="80" w:type="dxa"/>
+              <w:left w:w="120" w:type="dxa"/>
+              <w:bottom w:w="80" w:type="dxa"/>
+              <w:right w:w="120" w:type="dxa"/>
+            </w:tcMar>
+          </w:tcPr>
+          <w:p>
+            <w:pPr>
+              <w:jc w:val="both"/>
+            </w:pPr>
+            <w:r>
+              <w:rPr>
+                <w:sz w:val="22"/>
+                <w:szCs w:val="22"/>
+              </w:rPr>
+              <w:t>ERD, site map, wireframes, and system design documents completed</w:t>
+            </w:r>
+          </w:p>
+        </w:tc>
+        <w:tc>
+          <w:tcPr>
+            <w:tcW w:w="1660" w:type="dxa"/>
+            <w:tcBorders>
+              <w:top w:val="single" w:sz="4" w:space="0" w:color="CCCCCC"/>
+              <w:left w:val="single" w:sz="4" w:space="0" w:color="CCCCCC"/>
+              <w:bottom w:val="single" w:sz="4" w:space="0" w:color="CCCCCC"/>
+              <w:right w:val="single" w:sz="4" w:space="0" w:color="CCCCCC"/>
+            </w:tcBorders>
+            <w:shd w:val="clear" w:color="auto" w:fill="auto"/>
+            <w:tcMar>
+              <w:top w:w="80" w:type="dxa"/>
+              <w:left w:w="120" w:type="dxa"/>
+              <w:bottom w:w="80" w:type="dxa"/>
+              <w:right w:w="120" w:type="dxa"/>
+            </w:tcMar>
+          </w:tcPr>
+          <w:p>
+            <w:pPr>
+              <w:jc w:val="both"/>
+            </w:pPr>
+            <w:r>
+              <w:rPr>
+                <w:sz w:val="22"/>
+                <w:szCs w:val="22"/>
+              </w:rPr>
+              <w:t>19 Jun 2026</w:t>
+            </w:r>
+          </w:p>
+        </w:tc>
+        <w:tc>
+          <w:tcPr>
+            <w:tcW w:w="1600" w:type="dxa"/>
+            <w:tcBorders>
+              <w:top w:val="single" w:sz="4" w:space="0" w:color="CCCCCC"/>
+              <w:left w:val="single" w:sz="4" w:space="0" w:color="CCCCCC"/>
+              <w:bottom w:val="single" w:sz="4" w:space="0" w:color="CCCCCC"/>
+              <w:right w:val="single" w:sz="4" w:space="0" w:color="CCCCCC"/>
+            </w:tcBorders>
+            <w:shd w:val="clear" w:color="auto" w:fill="auto"/>
+            <w:tcMar>
+              <w:top w:w="80" w:type="dxa"/>
+              <w:left w:w="120" w:type="dxa"/>
+              <w:bottom w:w="80" w:type="dxa"/>
+              <w:right w:w="120" w:type="dxa"/>
+            </w:tcMar>
+          </w:tcPr>
+          <w:p>
+            <w:pPr>
+              <w:jc w:val="both"/>
+            </w:pPr>
+            <w:r>
+              <w:rPr>
+                <w:sz w:val="22"/>
+                <w:szCs w:val="22"/>
+              </w:rPr>
+              <w:t>All</w:t>
+            </w:r>
+          </w:p>
+        </w:tc>
+      </w:tr>
+      <w:tr>
+        <w:tc>
+          <w:tcPr>
+            <w:tcW w:w="700" w:type="dxa"/>
+            <w:tcBorders>
+              <w:top w:val="single" w:sz="4" w:space="0" w:color="CCCCCC"/>
+              <w:left w:val="single" w:sz="4" w:space="0" w:color="CCCCCC"/>
+              <w:bottom w:val="single" w:sz="4" w:space="0" w:color="CCCCCC"/>
+              <w:right w:val="single" w:sz="4" w:space="0" w:color="CCCCCC"/>
+            </w:tcBorders>
+            <w:shd w:val="clear" w:color="auto" w:fill="auto"/>
+            <w:tcMar>
+              <w:top w:w="80" w:type="dxa"/>
+              <w:left w:w="120" w:type="dxa"/>
+              <w:bottom w:w="80" w:type="dxa"/>
+              <w:right w:w="120" w:type="dxa"/>
+            </w:tcMar>
+          </w:tcPr>
+          <w:p>
+            <w:pPr>
+              <w:jc w:val="both"/>
+            </w:pPr>
+            <w:r>
+              <w:rPr>
+                <w:sz w:val="22"/>
+                <w:szCs w:val="22"/>
+              </w:rPr>
+              <w:t>M5</w:t>
+            </w:r>
+          </w:p>
+        </w:tc>
+        <w:tc>
+          <w:tcPr>
+            <w:tcW w:w="2400" w:type="dxa"/>
+            <w:tcBorders>
+              <w:top w:val="single" w:sz="4" w:space="0" w:color="CCCCCC"/>
+              <w:left w:val="single" w:sz="4" w:space="0" w:color="CCCCCC"/>
+              <w:bottom w:val="single" w:sz="4" w:space="0" w:color="CCCCCC"/>
+              <w:right w:val="single" w:sz="4" w:space="0" w:color="CCCCCC"/>
+            </w:tcBorders>
+            <w:shd w:val="clear" w:color="auto" w:fill="auto"/>
+            <w:tcMar>
+              <w:top w:w="80" w:type="dxa"/>
+              <w:left w:w="120" w:type="dxa"/>
+              <w:bottom w:w="80" w:type="dxa"/>
+              <w:right w:w="120" w:type="dxa"/>
+            </w:tcMar>
+          </w:tcPr>
+          <w:p>
+            <w:pPr>
+              <w:jc w:val="both"/>
+            </w:pPr>
+            <w:r>
+              <w:rPr>
+                <w:sz w:val="22"/>
+                <w:szCs w:val="22"/>
+              </w:rPr>
+              <w:t>Task 2 Submission</w:t>
+            </w:r>
+          </w:p>
+        </w:tc>
+        <w:tc>
+          <w:tcPr>
+            <w:tcW w:w="3000" w:type="dxa"/>
+            <w:tcBorders>
+              <w:top w:val="single" w:sz="4" w:space="0" w:color="CCCCCC"/>
+              <w:left w:val="single" w:sz="4" w:space="0" w:color="CCCCCC"/>
+              <w:bottom w:val="single" w:sz="4" w:space="0" w:color="CCCCCC"/>
+              <w:right w:val="single" w:sz="4" w:space="0" w:color="CCCCCC"/>
+            </w:tcBorders>
+            <w:shd w:val="clear" w:color="auto" w:fill="auto"/>
+            <w:tcMar>
+              <w:top w:w="80" w:type="dxa"/>
+              <w:left w:w="120" w:type="dxa"/>
+              <w:bottom w:w="80" w:type="dxa"/>
+              <w:right w:w="120" w:type="dxa"/>
+            </w:tcMar>
+          </w:tcPr>
+          <w:p>
+            <w:pPr>
+              <w:jc w:val="both"/>
+            </w:pPr>
+            <w:r>
+              <w:rPr>
+                <w:sz w:val="22"/>
+                <w:szCs w:val="22"/>
+              </w:rPr>
+              <w:t>Prerequisites Design &amp; Specification Document sent through HLMS</w:t>
+            </w:r>
+          </w:p>
+        </w:tc>
+        <w:tc>
+          <w:tcPr>
+            <w:tcW w:w="1660" w:type="dxa"/>
+            <w:tcBorders>
+              <w:top w:val="single" w:sz="4" w:space="0" w:color="CCCCCC"/>
+              <w:left w:val="single" w:sz="4" w:space="0" w:color="CCCCCC"/>
+              <w:bottom w:val="single" w:sz="4" w:space="0" w:color="CCCCCC"/>
+              <w:right w:val="single" w:sz="4" w:space="0" w:color="CCCCCC"/>
+            </w:tcBorders>
+            <w:shd w:val="clear" w:color="auto" w:fill="auto"/>
+            <w:tcMar>
+              <w:top w:w="80" w:type="dxa"/>
+              <w:left w:w="120" w:type="dxa"/>
+              <w:bottom w:w="80" w:type="dxa"/>
+              <w:right w:w="120" w:type="dxa"/>
+            </w:tcMar>
+          </w:tcPr>
+          <w:p>
+            <w:pPr>
+              <w:jc w:val="both"/>
+            </w:pPr>
+            <w:r>
+              <w:rPr>
+                <w:sz w:val="22"/>
+                <w:szCs w:val="22"/>
+              </w:rPr>
+              <w:t>26 Jun 2026</w:t>
+            </w:r>
+          </w:p>
+        </w:tc>
+        <w:tc>
+          <w:tcPr>
+            <w:tcW w:w="1600" w:type="dxa"/>
+            <w:tcBorders>
+              <w:top w:val="single" w:sz="4" w:space="0" w:color="CCCCCC"/>
+              <w:left w:val="single" w:sz="4" w:space="0" w:color="CCCCCC"/>
+              <w:bottom w:val="single" w:sz="4" w:space="0" w:color="CCCCCC"/>
+              <w:right w:val="single" w:sz="4" w:space="0" w:color="CCCCCC"/>
+            </w:tcBorders>
+            <w:shd w:val="clear" w:color="auto" w:fill="auto"/>
+            <w:tcMar>
+              <w:top w:w="80" w:type="dxa"/>
+              <w:left w:w="120" w:type="dxa"/>
+              <w:bottom w:w="80" w:type="dxa"/>
+              <w:right w:w="120" w:type="dxa"/>
+            </w:tcMar>
+          </w:tcPr>
+          <w:p>
+            <w:pPr>
+              <w:jc w:val="both"/>
+            </w:pPr>
+            <w:r>
+              <w:rPr>
+                <w:sz w:val="22"/>
+                <w:szCs w:val="22"/>
+              </w:rPr>
+              <w:t>All</w:t>
+            </w:r>
+          </w:p>
+        </w:tc>
+      </w:tr>
+    </w:tbl>
+    <w:p>
+      <w:pPr>
         <w:spacing w:line="360" w:lineRule="auto"/>
         <w:jc w:val="both"/>
       </w:pPr>
+      <w:bookmarkStart w:id="56" w:name="_GoBack"/>
+      <w:bookmarkEnd w:id="56"/>
       <w:r>
         <w:br w:type="page"/>
       </w:r>

</xml_diff>

<commit_message>
Added Gantt Chart for this project
</commit_message>
<xml_diff>
--- a/BIT 216 Assignment 1 (Task 1).docx
+++ b/BIT 216 Assignment 1 (Task 1).docx
@@ -10437,6 +10437,247 @@
       </w:pPr>
       <w:bookmarkStart w:id="56" w:name="_GoBack"/>
       <w:bookmarkEnd w:id="56"/>
+    </w:p>
+    <w:p>
+      <w:pPr>
+        <w:pStyle w:val="Heading2"/>
+        <w:rPr>
+          <w:color w:val="auto"/>
+        </w:rPr>
+      </w:pPr>
+      <w:bookmarkStart w:id="57" w:name="_Toc232158131"/>
+      <w:bookmarkStart w:id="58" w:name="_Toc232158733"/>
+      <w:bookmarkStart w:id="59" w:name="_Toc232158891"/>
+      <w:r>
+        <w:rPr>
+          <w:color w:val="auto"/>
+        </w:rPr>
+        <w:t>5.3  Gantt Chart</w:t>
+      </w:r>
+      <w:bookmarkEnd w:id="57"/>
+      <w:bookmarkEnd w:id="58"/>
+      <w:bookmarkEnd w:id="59"/>
+    </w:p>
+    <w:p>
+      <w:pPr>
+        <w:spacing w:after="160" w:line="360" w:lineRule="auto"/>
+        <w:jc w:val="both"/>
+      </w:pPr>
+      <w:r>
+        <w:t>The following Gantt Chart illustrates the timeline of the project over a six-week period from May 18 2026 to June 26, 2026. The distribution of tasks among the team members mirrors the breakdown in the WBS. The work schedule is represented with blue bars, while the rows with red highlighting stand for the submission milestones. The distribution of resources can be found in the WBS table of Section 5.1.</w:t>
+      </w:r>
+    </w:p>
+    <w:p>
+      <w:pPr>
+        <w:spacing w:after="160" w:line="360" w:lineRule="auto"/>
+      </w:pPr>
+      <w:r>
+        <w:rPr>
+          <w:noProof/>
+        </w:rPr>
+        <w:drawing>
+          <wp:inline distT="0" distB="0" distL="0" distR="0" wp14:anchorId="1774E240" wp14:editId="7A188205">
+            <wp:extent cx="5943600" cy="1995805"/>
+            <wp:effectExtent l="0" t="0" r="0" b="4445"/>
+            <wp:docPr id="1" name="Picture 1"/>
+            <wp:cNvGraphicFramePr>
+              <a:graphicFrameLocks xmlns:a="http://schemas.openxmlformats.org/drawingml/2006/main" noChangeAspect="1"/>
+            </wp:cNvGraphicFramePr>
+            <a:graphic xmlns:a="http://schemas.openxmlformats.org/drawingml/2006/main">
+              <a:graphicData uri="http://schemas.openxmlformats.org/drawingml/2006/picture">
+                <pic:pic xmlns:pic="http://schemas.openxmlformats.org/drawingml/2006/picture">
+                  <pic:nvPicPr>
+                    <pic:cNvPr id="1" name=""/>
+                    <pic:cNvPicPr/>
+                  </pic:nvPicPr>
+                  <pic:blipFill>
+                    <a:blip r:embed="rId6"/>
+                    <a:stretch>
+                      <a:fillRect/>
+                    </a:stretch>
+                  </pic:blipFill>
+                  <pic:spPr>
+                    <a:xfrm>
+                      <a:off x="0" y="0"/>
+                      <a:ext cx="5943600" cy="1995805"/>
+                    </a:xfrm>
+                    <a:prstGeom prst="rect">
+                      <a:avLst/>
+                    </a:prstGeom>
+                  </pic:spPr>
+                </pic:pic>
+              </a:graphicData>
+            </a:graphic>
+          </wp:inline>
+        </w:drawing>
+      </w:r>
+    </w:p>
+    <w:p>
+      <w:pPr>
+        <w:spacing w:after="160" w:line="360" w:lineRule="auto"/>
+      </w:pPr>
+      <w:r>
+        <w:rPr>
+          <w:noProof/>
+        </w:rPr>
+        <w:drawing>
+          <wp:inline distT="0" distB="0" distL="0" distR="0" wp14:anchorId="1940F2AE" wp14:editId="6BAAB03C">
+            <wp:extent cx="5943600" cy="1680845"/>
+            <wp:effectExtent l="0" t="0" r="0" b="0"/>
+            <wp:docPr id="5" name="Picture 5"/>
+            <wp:cNvGraphicFramePr>
+              <a:graphicFrameLocks xmlns:a="http://schemas.openxmlformats.org/drawingml/2006/main" noChangeAspect="1"/>
+            </wp:cNvGraphicFramePr>
+            <a:graphic xmlns:a="http://schemas.openxmlformats.org/drawingml/2006/main">
+              <a:graphicData uri="http://schemas.openxmlformats.org/drawingml/2006/picture">
+                <pic:pic xmlns:pic="http://schemas.openxmlformats.org/drawingml/2006/picture">
+                  <pic:nvPicPr>
+                    <pic:cNvPr id="1" name=""/>
+                    <pic:cNvPicPr/>
+                  </pic:nvPicPr>
+                  <pic:blipFill>
+                    <a:blip r:embed="rId7"/>
+                    <a:stretch>
+                      <a:fillRect/>
+                    </a:stretch>
+                  </pic:blipFill>
+                  <pic:spPr>
+                    <a:xfrm>
+                      <a:off x="0" y="0"/>
+                      <a:ext cx="5943600" cy="1680845"/>
+                    </a:xfrm>
+                    <a:prstGeom prst="rect">
+                      <a:avLst/>
+                    </a:prstGeom>
+                  </pic:spPr>
+                </pic:pic>
+              </a:graphicData>
+            </a:graphic>
+          </wp:inline>
+        </w:drawing>
+      </w:r>
+    </w:p>
+    <w:p>
+      <w:r>
+        <w:br w:type="page"/>
+      </w:r>
+      <w:r>
+        <w:rPr>
+          <w:noProof/>
+        </w:rPr>
+        <w:drawing>
+          <wp:inline distT="0" distB="0" distL="0" distR="0" wp14:anchorId="0E37E263" wp14:editId="10F4BBB8">
+            <wp:extent cx="5943600" cy="1548765"/>
+            <wp:effectExtent l="0" t="0" r="0" b="0"/>
+            <wp:docPr id="6" name="Picture 6"/>
+            <wp:cNvGraphicFramePr>
+              <a:graphicFrameLocks xmlns:a="http://schemas.openxmlformats.org/drawingml/2006/main" noChangeAspect="1"/>
+            </wp:cNvGraphicFramePr>
+            <a:graphic xmlns:a="http://schemas.openxmlformats.org/drawingml/2006/main">
+              <a:graphicData uri="http://schemas.openxmlformats.org/drawingml/2006/picture">
+                <pic:pic xmlns:pic="http://schemas.openxmlformats.org/drawingml/2006/picture">
+                  <pic:nvPicPr>
+                    <pic:cNvPr id="1" name=""/>
+                    <pic:cNvPicPr/>
+                  </pic:nvPicPr>
+                  <pic:blipFill>
+                    <a:blip r:embed="rId8"/>
+                    <a:stretch>
+                      <a:fillRect/>
+                    </a:stretch>
+                  </pic:blipFill>
+                  <pic:spPr>
+                    <a:xfrm>
+                      <a:off x="0" y="0"/>
+                      <a:ext cx="5943600" cy="1548765"/>
+                    </a:xfrm>
+                    <a:prstGeom prst="rect">
+                      <a:avLst/>
+                    </a:prstGeom>
+                  </pic:spPr>
+                </pic:pic>
+              </a:graphicData>
+            </a:graphic>
+          </wp:inline>
+        </w:drawing>
+      </w:r>
+    </w:p>
+    <w:p>
+      <w:r>
+        <w:rPr>
+          <w:noProof/>
+        </w:rPr>
+        <w:drawing>
+          <wp:inline distT="0" distB="0" distL="0" distR="0" wp14:anchorId="17D24DD3" wp14:editId="7A00522B">
+            <wp:extent cx="5943600" cy="2062480"/>
+            <wp:effectExtent l="0" t="0" r="0" b="0"/>
+            <wp:docPr id="7" name="Picture 7"/>
+            <wp:cNvGraphicFramePr>
+              <a:graphicFrameLocks xmlns:a="http://schemas.openxmlformats.org/drawingml/2006/main" noChangeAspect="1"/>
+            </wp:cNvGraphicFramePr>
+            <a:graphic xmlns:a="http://schemas.openxmlformats.org/drawingml/2006/main">
+              <a:graphicData uri="http://schemas.openxmlformats.org/drawingml/2006/picture">
+                <pic:pic xmlns:pic="http://schemas.openxmlformats.org/drawingml/2006/picture">
+                  <pic:nvPicPr>
+                    <pic:cNvPr id="1" name=""/>
+                    <pic:cNvPicPr/>
+                  </pic:nvPicPr>
+                  <pic:blipFill>
+                    <a:blip r:embed="rId9"/>
+                    <a:stretch>
+                      <a:fillRect/>
+                    </a:stretch>
+                  </pic:blipFill>
+                  <pic:spPr>
+                    <a:xfrm>
+                      <a:off x="0" y="0"/>
+                      <a:ext cx="5943600" cy="2062480"/>
+                    </a:xfrm>
+                    <a:prstGeom prst="rect">
+                      <a:avLst/>
+                    </a:prstGeom>
+                  </pic:spPr>
+                </pic:pic>
+              </a:graphicData>
+            </a:graphic>
+          </wp:inline>
+        </w:drawing>
+      </w:r>
+    </w:p>
+    <w:p>
+      <w:pPr>
+        <w:jc w:val="center"/>
+        <w:rPr>
+          <w:i/>
+        </w:rPr>
+      </w:pPr>
+    </w:p>
+    <w:p>
+      <w:pPr>
+        <w:jc w:val="center"/>
+        <w:rPr>
+          <w:i/>
+        </w:rPr>
+      </w:pPr>
+      <w:r>
+        <w:rPr>
+          <w:i/>
+        </w:rPr>
+        <w:t>Figure: Gantt Chart</w:t>
+      </w:r>
+    </w:p>
+    <w:p>
+      <w:pPr>
+        <w:rPr>
+          <w:i/>
+        </w:rPr>
+      </w:pPr>
+    </w:p>
+    <w:p>
+      <w:pPr>
+        <w:spacing w:line="360" w:lineRule="auto"/>
+        <w:jc w:val="both"/>
+      </w:pPr>
       <w:r>
         <w:br w:type="page"/>
       </w:r>

</xml_diff>

<commit_message>
Added Technical Description of the Proposed System, Development Platform and Demonstration Platform
</commit_message>
<xml_diff>
--- a/BIT 216 Assignment 1 (Task 1).docx
+++ b/BIT 216 Assignment 1 (Task 1).docx
@@ -10435,8 +10435,6 @@
         <w:spacing w:line="360" w:lineRule="auto"/>
         <w:jc w:val="both"/>
       </w:pPr>
-      <w:bookmarkStart w:id="56" w:name="_GoBack"/>
-      <w:bookmarkEnd w:id="56"/>
     </w:p>
     <w:p>
       <w:pPr>
@@ -10445,18 +10443,18 @@
           <w:color w:val="auto"/>
         </w:rPr>
       </w:pPr>
-      <w:bookmarkStart w:id="57" w:name="_Toc232158131"/>
-      <w:bookmarkStart w:id="58" w:name="_Toc232158733"/>
-      <w:bookmarkStart w:id="59" w:name="_Toc232158891"/>
+      <w:bookmarkStart w:id="56" w:name="_Toc232158131"/>
+      <w:bookmarkStart w:id="57" w:name="_Toc232158733"/>
+      <w:bookmarkStart w:id="58" w:name="_Toc232158891"/>
       <w:r>
         <w:rPr>
           <w:color w:val="auto"/>
         </w:rPr>
         <w:t>5.3  Gantt Chart</w:t>
       </w:r>
+      <w:bookmarkEnd w:id="56"/>
       <w:bookmarkEnd w:id="57"/>
       <w:bookmarkEnd w:id="58"/>
-      <w:bookmarkEnd w:id="59"/>
     </w:p>
     <w:p>
       <w:pPr>
@@ -10678,6 +10676,3454 @@
         <w:spacing w:line="360" w:lineRule="auto"/>
         <w:jc w:val="both"/>
       </w:pPr>
+    </w:p>
+    <w:p>
+      <w:pPr>
+        <w:spacing w:line="360" w:lineRule="auto"/>
+        <w:jc w:val="both"/>
+      </w:pPr>
+    </w:p>
+    <w:p>
+      <w:pPr>
+        <w:pStyle w:val="Heading1"/>
+        <w:rPr>
+          <w:color w:val="auto"/>
+        </w:rPr>
+      </w:pPr>
+      <w:bookmarkStart w:id="59" w:name="_Toc232158132"/>
+      <w:bookmarkStart w:id="60" w:name="_Toc232158734"/>
+      <w:bookmarkStart w:id="61" w:name="_Toc232158892"/>
+      <w:r>
+        <w:rPr>
+          <w:color w:val="auto"/>
+        </w:rPr>
+        <w:t>6.0  Technical Description of the Proposed System</w:t>
+      </w:r>
+      <w:bookmarkEnd w:id="59"/>
+      <w:bookmarkEnd w:id="60"/>
+      <w:bookmarkEnd w:id="61"/>
+    </w:p>
+    <w:p>
+      <w:pPr>
+        <w:spacing w:after="160" w:line="360" w:lineRule="auto"/>
+        <w:jc w:val="both"/>
+      </w:pPr>
+      <w:r>
+        <w:t>This paragraph talks about the different technologies tools platforms methods etc. that will be used for the design documentation testing, and management of the project SavePlate. It shows the overview of the development environment and technical resources that are chosen as the supporting elements for the successful completion of the system. Individually, Aaditya Chaudhary has prepared the technical description which details the software, hardware, and development tools that will be made use of during the project lifecycle.</w:t>
+      </w:r>
+    </w:p>
+    <w:p>
+      <w:pPr>
+        <w:spacing w:after="160" w:line="360" w:lineRule="auto"/>
+        <w:jc w:val="both"/>
+      </w:pPr>
+    </w:p>
+    <w:p>
+      <w:pPr>
+        <w:spacing w:after="160" w:line="360" w:lineRule="auto"/>
+        <w:jc w:val="both"/>
+      </w:pPr>
+    </w:p>
+    <w:p>
+      <w:pPr>
+        <w:spacing w:after="160" w:line="360" w:lineRule="auto"/>
+        <w:jc w:val="both"/>
+      </w:pPr>
+    </w:p>
+    <w:p>
+      <w:pPr>
+        <w:spacing w:after="160" w:line="360" w:lineRule="auto"/>
+        <w:jc w:val="both"/>
+      </w:pPr>
+    </w:p>
+    <w:p>
+      <w:pPr>
+        <w:spacing w:after="160" w:line="360" w:lineRule="auto"/>
+        <w:jc w:val="both"/>
+      </w:pPr>
+    </w:p>
+    <w:p>
+      <w:pPr>
+        <w:pStyle w:val="Heading2"/>
+        <w:rPr>
+          <w:color w:val="auto"/>
+        </w:rPr>
+      </w:pPr>
+      <w:bookmarkStart w:id="62" w:name="_Toc232158133"/>
+      <w:bookmarkStart w:id="63" w:name="_Toc232158735"/>
+      <w:bookmarkStart w:id="64" w:name="_Toc232158893"/>
+      <w:r>
+        <w:rPr>
+          <w:color w:val="auto"/>
+        </w:rPr>
+        <w:t>6.1  Development Platform</w:t>
+      </w:r>
+      <w:bookmarkEnd w:id="62"/>
+      <w:bookmarkEnd w:id="63"/>
+      <w:bookmarkEnd w:id="64"/>
+    </w:p>
+    <w:p>
+      <w:pPr>
+        <w:spacing w:after="160" w:line="360" w:lineRule="auto"/>
+      </w:pPr>
+      <w:r>
+        <w:t>The subsequent table lists the development tools, frameworks, and hardware that will be utilized during the project lifecycle:</w:t>
+      </w:r>
+    </w:p>
+    <w:p>
+      <w:pPr>
+        <w:spacing w:after="160" w:line="360" w:lineRule="auto"/>
+      </w:pPr>
+      <w:r>
+        <w:t xml:space="preserve">Table 3: Development Platform </w:t>
+      </w:r>
+    </w:p>
+    <w:tbl>
+      <w:tblPr>
+        <w:tblW w:w="9360" w:type="dxa"/>
+        <w:tblBorders>
+          <w:top w:val="single" w:sz="4" w:space="0" w:color="auto"/>
+          <w:left w:val="single" w:sz="4" w:space="0" w:color="auto"/>
+          <w:bottom w:val="single" w:sz="4" w:space="0" w:color="auto"/>
+          <w:right w:val="single" w:sz="4" w:space="0" w:color="auto"/>
+          <w:insideH w:val="single" w:sz="4" w:space="0" w:color="auto"/>
+          <w:insideV w:val="single" w:sz="4" w:space="0" w:color="auto"/>
+        </w:tblBorders>
+        <w:shd w:val="clear" w:color="auto" w:fill="FFFFFF" w:themeFill="background1"/>
+        <w:tblCellMar>
+          <w:left w:w="10" w:type="dxa"/>
+          <w:right w:w="10" w:type="dxa"/>
+        </w:tblCellMar>
+        <w:tblLook w:val="0000" w:firstRow="0" w:lastRow="0" w:firstColumn="0" w:lastColumn="0" w:noHBand="0" w:noVBand="0"/>
+      </w:tblPr>
+      <w:tblGrid>
+        <w:gridCol w:w="1462"/>
+        <w:gridCol w:w="1966"/>
+        <w:gridCol w:w="1084"/>
+        <w:gridCol w:w="3306"/>
+        <w:gridCol w:w="1542"/>
+      </w:tblGrid>
+      <w:tr>
+        <w:tc>
+          <w:tcPr>
+            <w:tcW w:w="1400" w:type="dxa"/>
+            <w:tcBorders>
+              <w:top w:val="single" w:sz="4" w:space="0" w:color="CCCCCC"/>
+              <w:left w:val="single" w:sz="4" w:space="0" w:color="CCCCCC"/>
+              <w:bottom w:val="single" w:sz="4" w:space="0" w:color="CCCCCC"/>
+              <w:right w:val="single" w:sz="4" w:space="0" w:color="CCCCCC"/>
+            </w:tcBorders>
+            <w:shd w:val="clear" w:color="auto" w:fill="FFFFFF" w:themeFill="background1"/>
+            <w:tcMar>
+              <w:top w:w="80" w:type="dxa"/>
+              <w:left w:w="120" w:type="dxa"/>
+              <w:bottom w:w="80" w:type="dxa"/>
+              <w:right w:w="120" w:type="dxa"/>
+            </w:tcMar>
+          </w:tcPr>
+          <w:p>
+            <w:pPr>
+              <w:jc w:val="both"/>
+            </w:pPr>
+            <w:r>
+              <w:rPr>
+                <w:b/>
+                <w:bCs/>
+                <w:sz w:val="22"/>
+                <w:szCs w:val="22"/>
+              </w:rPr>
+              <w:t>Criteria</w:t>
+            </w:r>
+          </w:p>
+        </w:tc>
+        <w:tc>
+          <w:tcPr>
+            <w:tcW w:w="2000" w:type="dxa"/>
+            <w:tcBorders>
+              <w:top w:val="single" w:sz="4" w:space="0" w:color="CCCCCC"/>
+              <w:left w:val="single" w:sz="4" w:space="0" w:color="CCCCCC"/>
+              <w:bottom w:val="single" w:sz="4" w:space="0" w:color="CCCCCC"/>
+              <w:right w:val="single" w:sz="4" w:space="0" w:color="CCCCCC"/>
+            </w:tcBorders>
+            <w:shd w:val="clear" w:color="auto" w:fill="FFFFFF" w:themeFill="background1"/>
+            <w:tcMar>
+              <w:top w:w="80" w:type="dxa"/>
+              <w:left w:w="120" w:type="dxa"/>
+              <w:bottom w:w="80" w:type="dxa"/>
+              <w:right w:w="120" w:type="dxa"/>
+            </w:tcMar>
+          </w:tcPr>
+          <w:p>
+            <w:pPr>
+              <w:jc w:val="both"/>
+            </w:pPr>
+            <w:r>
+              <w:rPr>
+                <w:b/>
+                <w:bCs/>
+                <w:sz w:val="22"/>
+                <w:szCs w:val="22"/>
+              </w:rPr>
+              <w:t>Tools / Hardware</w:t>
+            </w:r>
+          </w:p>
+        </w:tc>
+        <w:tc>
+          <w:tcPr>
+            <w:tcW w:w="1000" w:type="dxa"/>
+            <w:tcBorders>
+              <w:top w:val="single" w:sz="4" w:space="0" w:color="CCCCCC"/>
+              <w:left w:val="single" w:sz="4" w:space="0" w:color="CCCCCC"/>
+              <w:bottom w:val="single" w:sz="4" w:space="0" w:color="CCCCCC"/>
+              <w:right w:val="single" w:sz="4" w:space="0" w:color="CCCCCC"/>
+            </w:tcBorders>
+            <w:shd w:val="clear" w:color="auto" w:fill="FFFFFF" w:themeFill="background1"/>
+            <w:tcMar>
+              <w:top w:w="80" w:type="dxa"/>
+              <w:left w:w="120" w:type="dxa"/>
+              <w:bottom w:w="80" w:type="dxa"/>
+              <w:right w:w="120" w:type="dxa"/>
+            </w:tcMar>
+          </w:tcPr>
+          <w:p>
+            <w:pPr>
+              <w:jc w:val="both"/>
+            </w:pPr>
+            <w:r>
+              <w:rPr>
+                <w:b/>
+                <w:bCs/>
+                <w:sz w:val="22"/>
+                <w:szCs w:val="22"/>
+              </w:rPr>
+              <w:t>Version</w:t>
+            </w:r>
+          </w:p>
+        </w:tc>
+        <w:tc>
+          <w:tcPr>
+            <w:tcW w:w="3400" w:type="dxa"/>
+            <w:tcBorders>
+              <w:top w:val="single" w:sz="4" w:space="0" w:color="CCCCCC"/>
+              <w:left w:val="single" w:sz="4" w:space="0" w:color="CCCCCC"/>
+              <w:bottom w:val="single" w:sz="4" w:space="0" w:color="CCCCCC"/>
+              <w:right w:val="single" w:sz="4" w:space="0" w:color="CCCCCC"/>
+            </w:tcBorders>
+            <w:shd w:val="clear" w:color="auto" w:fill="FFFFFF" w:themeFill="background1"/>
+            <w:tcMar>
+              <w:top w:w="80" w:type="dxa"/>
+              <w:left w:w="120" w:type="dxa"/>
+              <w:bottom w:w="80" w:type="dxa"/>
+              <w:right w:w="120" w:type="dxa"/>
+            </w:tcMar>
+          </w:tcPr>
+          <w:p>
+            <w:pPr>
+              <w:jc w:val="both"/>
+            </w:pPr>
+            <w:r>
+              <w:rPr>
+                <w:b/>
+                <w:bCs/>
+                <w:sz w:val="22"/>
+                <w:szCs w:val="22"/>
+              </w:rPr>
+              <w:t>Description</w:t>
+            </w:r>
+          </w:p>
+        </w:tc>
+        <w:tc>
+          <w:tcPr>
+            <w:tcW w:w="1560" w:type="dxa"/>
+            <w:tcBorders>
+              <w:top w:val="single" w:sz="4" w:space="0" w:color="CCCCCC"/>
+              <w:left w:val="single" w:sz="4" w:space="0" w:color="CCCCCC"/>
+              <w:bottom w:val="single" w:sz="4" w:space="0" w:color="CCCCCC"/>
+              <w:right w:val="single" w:sz="4" w:space="0" w:color="CCCCCC"/>
+            </w:tcBorders>
+            <w:shd w:val="clear" w:color="auto" w:fill="FFFFFF" w:themeFill="background1"/>
+            <w:tcMar>
+              <w:top w:w="80" w:type="dxa"/>
+              <w:left w:w="120" w:type="dxa"/>
+              <w:bottom w:w="80" w:type="dxa"/>
+              <w:right w:w="120" w:type="dxa"/>
+            </w:tcMar>
+          </w:tcPr>
+          <w:p>
+            <w:pPr>
+              <w:jc w:val="both"/>
+            </w:pPr>
+            <w:r>
+              <w:rPr>
+                <w:b/>
+                <w:bCs/>
+                <w:sz w:val="22"/>
+                <w:szCs w:val="22"/>
+              </w:rPr>
+              <w:t>Owner</w:t>
+            </w:r>
+          </w:p>
+        </w:tc>
+      </w:tr>
+      <w:tr>
+        <w:tc>
+          <w:tcPr>
+            <w:tcW w:w="9360" w:type="dxa"/>
+            <w:gridSpan w:val="5"/>
+            <w:tcBorders>
+              <w:top w:val="single" w:sz="4" w:space="0" w:color="CCCCCC"/>
+              <w:left w:val="single" w:sz="4" w:space="0" w:color="CCCCCC"/>
+              <w:bottom w:val="single" w:sz="4" w:space="0" w:color="CCCCCC"/>
+              <w:right w:val="single" w:sz="4" w:space="0" w:color="CCCCCC"/>
+            </w:tcBorders>
+            <w:shd w:val="clear" w:color="auto" w:fill="FFFFFF" w:themeFill="background1"/>
+            <w:tcMar>
+              <w:top w:w="80" w:type="dxa"/>
+              <w:left w:w="120" w:type="dxa"/>
+              <w:bottom w:w="80" w:type="dxa"/>
+              <w:right w:w="120" w:type="dxa"/>
+            </w:tcMar>
+          </w:tcPr>
+          <w:p>
+            <w:r>
+              <w:rPr>
+                <w:b/>
+                <w:bCs/>
+                <w:iCs/>
+                <w:sz w:val="22"/>
+                <w:szCs w:val="22"/>
+              </w:rPr>
+              <w:t>Documentation</w:t>
+            </w:r>
+          </w:p>
+        </w:tc>
+      </w:tr>
+      <w:tr>
+        <w:tc>
+          <w:tcPr>
+            <w:tcW w:w="1400" w:type="dxa"/>
+            <w:tcBorders>
+              <w:top w:val="single" w:sz="4" w:space="0" w:color="CCCCCC"/>
+              <w:left w:val="single" w:sz="4" w:space="0" w:color="CCCCCC"/>
+              <w:bottom w:val="single" w:sz="4" w:space="0" w:color="CCCCCC"/>
+              <w:right w:val="single" w:sz="4" w:space="0" w:color="CCCCCC"/>
+            </w:tcBorders>
+            <w:shd w:val="clear" w:color="auto" w:fill="FFFFFF" w:themeFill="background1"/>
+            <w:tcMar>
+              <w:top w:w="80" w:type="dxa"/>
+              <w:left w:w="120" w:type="dxa"/>
+              <w:bottom w:w="80" w:type="dxa"/>
+              <w:right w:w="120" w:type="dxa"/>
+            </w:tcMar>
+          </w:tcPr>
+          <w:p>
+            <w:pPr>
+              <w:jc w:val="both"/>
+            </w:pPr>
+            <w:r>
+              <w:rPr>
+                <w:sz w:val="22"/>
+                <w:szCs w:val="22"/>
+              </w:rPr>
+              <w:t>Word Processing</w:t>
+            </w:r>
+          </w:p>
+        </w:tc>
+        <w:tc>
+          <w:tcPr>
+            <w:tcW w:w="2000" w:type="dxa"/>
+            <w:tcBorders>
+              <w:top w:val="single" w:sz="4" w:space="0" w:color="CCCCCC"/>
+              <w:left w:val="single" w:sz="4" w:space="0" w:color="CCCCCC"/>
+              <w:bottom w:val="single" w:sz="4" w:space="0" w:color="CCCCCC"/>
+              <w:right w:val="single" w:sz="4" w:space="0" w:color="CCCCCC"/>
+            </w:tcBorders>
+            <w:shd w:val="clear" w:color="auto" w:fill="FFFFFF" w:themeFill="background1"/>
+            <w:tcMar>
+              <w:top w:w="80" w:type="dxa"/>
+              <w:left w:w="120" w:type="dxa"/>
+              <w:bottom w:w="80" w:type="dxa"/>
+              <w:right w:w="120" w:type="dxa"/>
+            </w:tcMar>
+          </w:tcPr>
+          <w:p>
+            <w:pPr>
+              <w:jc w:val="both"/>
+            </w:pPr>
+            <w:r>
+              <w:rPr>
+                <w:sz w:val="22"/>
+                <w:szCs w:val="22"/>
+              </w:rPr>
+              <w:t>Microsoft Word</w:t>
+            </w:r>
+          </w:p>
+        </w:tc>
+        <w:tc>
+          <w:tcPr>
+            <w:tcW w:w="1000" w:type="dxa"/>
+            <w:tcBorders>
+              <w:top w:val="single" w:sz="4" w:space="0" w:color="CCCCCC"/>
+              <w:left w:val="single" w:sz="4" w:space="0" w:color="CCCCCC"/>
+              <w:bottom w:val="single" w:sz="4" w:space="0" w:color="CCCCCC"/>
+              <w:right w:val="single" w:sz="4" w:space="0" w:color="CCCCCC"/>
+            </w:tcBorders>
+            <w:shd w:val="clear" w:color="auto" w:fill="FFFFFF" w:themeFill="background1"/>
+            <w:tcMar>
+              <w:top w:w="80" w:type="dxa"/>
+              <w:left w:w="120" w:type="dxa"/>
+              <w:bottom w:w="80" w:type="dxa"/>
+              <w:right w:w="120" w:type="dxa"/>
+            </w:tcMar>
+          </w:tcPr>
+          <w:p>
+            <w:pPr>
+              <w:jc w:val="both"/>
+            </w:pPr>
+            <w:r>
+              <w:rPr>
+                <w:sz w:val="22"/>
+                <w:szCs w:val="22"/>
+              </w:rPr>
+              <w:t>2021/365</w:t>
+            </w:r>
+          </w:p>
+        </w:tc>
+        <w:tc>
+          <w:tcPr>
+            <w:tcW w:w="3400" w:type="dxa"/>
+            <w:tcBorders>
+              <w:top w:val="single" w:sz="4" w:space="0" w:color="CCCCCC"/>
+              <w:left w:val="single" w:sz="4" w:space="0" w:color="CCCCCC"/>
+              <w:bottom w:val="single" w:sz="4" w:space="0" w:color="CCCCCC"/>
+              <w:right w:val="single" w:sz="4" w:space="0" w:color="CCCCCC"/>
+            </w:tcBorders>
+            <w:shd w:val="clear" w:color="auto" w:fill="FFFFFF" w:themeFill="background1"/>
+            <w:tcMar>
+              <w:top w:w="80" w:type="dxa"/>
+              <w:left w:w="120" w:type="dxa"/>
+              <w:bottom w:w="80" w:type="dxa"/>
+              <w:right w:w="120" w:type="dxa"/>
+            </w:tcMar>
+          </w:tcPr>
+          <w:p>
+            <w:pPr>
+              <w:jc w:val="both"/>
+            </w:pPr>
+            <w:r>
+              <w:rPr>
+                <w:sz w:val="22"/>
+                <w:szCs w:val="22"/>
+              </w:rPr>
+              <w:t>Utilized for drafting project plan, requirements specification, and design documentation.</w:t>
+            </w:r>
+          </w:p>
+        </w:tc>
+        <w:tc>
+          <w:tcPr>
+            <w:tcW w:w="1560" w:type="dxa"/>
+            <w:tcBorders>
+              <w:top w:val="single" w:sz="4" w:space="0" w:color="CCCCCC"/>
+              <w:left w:val="single" w:sz="4" w:space="0" w:color="CCCCCC"/>
+              <w:bottom w:val="single" w:sz="4" w:space="0" w:color="CCCCCC"/>
+              <w:right w:val="single" w:sz="4" w:space="0" w:color="CCCCCC"/>
+            </w:tcBorders>
+            <w:shd w:val="clear" w:color="auto" w:fill="FFFFFF" w:themeFill="background1"/>
+            <w:tcMar>
+              <w:top w:w="80" w:type="dxa"/>
+              <w:left w:w="120" w:type="dxa"/>
+              <w:bottom w:w="80" w:type="dxa"/>
+              <w:right w:w="120" w:type="dxa"/>
+            </w:tcMar>
+          </w:tcPr>
+          <w:p>
+            <w:pPr>
+              <w:jc w:val="both"/>
+            </w:pPr>
+            <w:r>
+              <w:rPr>
+                <w:sz w:val="22"/>
+                <w:szCs w:val="22"/>
+              </w:rPr>
+              <w:t>All Members</w:t>
+            </w:r>
+          </w:p>
+        </w:tc>
+      </w:tr>
+      <w:tr>
+        <w:tc>
+          <w:tcPr>
+            <w:tcW w:w="1400" w:type="dxa"/>
+            <w:tcBorders>
+              <w:top w:val="single" w:sz="4" w:space="0" w:color="CCCCCC"/>
+              <w:left w:val="single" w:sz="4" w:space="0" w:color="CCCCCC"/>
+              <w:bottom w:val="single" w:sz="4" w:space="0" w:color="CCCCCC"/>
+              <w:right w:val="single" w:sz="4" w:space="0" w:color="CCCCCC"/>
+            </w:tcBorders>
+            <w:shd w:val="clear" w:color="auto" w:fill="FFFFFF" w:themeFill="background1"/>
+            <w:tcMar>
+              <w:top w:w="80" w:type="dxa"/>
+              <w:left w:w="120" w:type="dxa"/>
+              <w:bottom w:w="80" w:type="dxa"/>
+              <w:right w:w="120" w:type="dxa"/>
+            </w:tcMar>
+          </w:tcPr>
+          <w:p>
+            <w:pPr>
+              <w:jc w:val="both"/>
+            </w:pPr>
+            <w:r>
+              <w:rPr>
+                <w:sz w:val="22"/>
+                <w:szCs w:val="22"/>
+              </w:rPr>
+              <w:t>Diagramming</w:t>
+            </w:r>
+          </w:p>
+        </w:tc>
+        <w:tc>
+          <w:tcPr>
+            <w:tcW w:w="2000" w:type="dxa"/>
+            <w:tcBorders>
+              <w:top w:val="single" w:sz="4" w:space="0" w:color="CCCCCC"/>
+              <w:left w:val="single" w:sz="4" w:space="0" w:color="CCCCCC"/>
+              <w:bottom w:val="single" w:sz="4" w:space="0" w:color="CCCCCC"/>
+              <w:right w:val="single" w:sz="4" w:space="0" w:color="CCCCCC"/>
+            </w:tcBorders>
+            <w:shd w:val="clear" w:color="auto" w:fill="FFFFFF" w:themeFill="background1"/>
+            <w:tcMar>
+              <w:top w:w="80" w:type="dxa"/>
+              <w:left w:w="120" w:type="dxa"/>
+              <w:bottom w:w="80" w:type="dxa"/>
+              <w:right w:w="120" w:type="dxa"/>
+            </w:tcMar>
+          </w:tcPr>
+          <w:p>
+            <w:pPr>
+              <w:jc w:val="both"/>
+            </w:pPr>
+            <w:r>
+              <w:rPr>
+                <w:sz w:val="22"/>
+                <w:szCs w:val="22"/>
+              </w:rPr>
+              <w:t>Draw.io / Lucidchart</w:t>
+            </w:r>
+          </w:p>
+        </w:tc>
+        <w:tc>
+          <w:tcPr>
+            <w:tcW w:w="1000" w:type="dxa"/>
+            <w:tcBorders>
+              <w:top w:val="single" w:sz="4" w:space="0" w:color="CCCCCC"/>
+              <w:left w:val="single" w:sz="4" w:space="0" w:color="CCCCCC"/>
+              <w:bottom w:val="single" w:sz="4" w:space="0" w:color="CCCCCC"/>
+              <w:right w:val="single" w:sz="4" w:space="0" w:color="CCCCCC"/>
+            </w:tcBorders>
+            <w:shd w:val="clear" w:color="auto" w:fill="FFFFFF" w:themeFill="background1"/>
+            <w:tcMar>
+              <w:top w:w="80" w:type="dxa"/>
+              <w:left w:w="120" w:type="dxa"/>
+              <w:bottom w:w="80" w:type="dxa"/>
+              <w:right w:w="120" w:type="dxa"/>
+            </w:tcMar>
+          </w:tcPr>
+          <w:p>
+            <w:pPr>
+              <w:jc w:val="both"/>
+            </w:pPr>
+            <w:r>
+              <w:rPr>
+                <w:sz w:val="22"/>
+                <w:szCs w:val="22"/>
+              </w:rPr>
+              <w:t>Web-based</w:t>
+            </w:r>
+          </w:p>
+        </w:tc>
+        <w:tc>
+          <w:tcPr>
+            <w:tcW w:w="3400" w:type="dxa"/>
+            <w:tcBorders>
+              <w:top w:val="single" w:sz="4" w:space="0" w:color="CCCCCC"/>
+              <w:left w:val="single" w:sz="4" w:space="0" w:color="CCCCCC"/>
+              <w:bottom w:val="single" w:sz="4" w:space="0" w:color="CCCCCC"/>
+              <w:right w:val="single" w:sz="4" w:space="0" w:color="CCCCCC"/>
+            </w:tcBorders>
+            <w:shd w:val="clear" w:color="auto" w:fill="FFFFFF" w:themeFill="background1"/>
+            <w:tcMar>
+              <w:top w:w="80" w:type="dxa"/>
+              <w:left w:w="120" w:type="dxa"/>
+              <w:bottom w:w="80" w:type="dxa"/>
+              <w:right w:w="120" w:type="dxa"/>
+            </w:tcMar>
+          </w:tcPr>
+          <w:p>
+            <w:pPr>
+              <w:jc w:val="both"/>
+            </w:pPr>
+            <w:r>
+              <w:rPr>
+                <w:sz w:val="22"/>
+                <w:szCs w:val="22"/>
+              </w:rPr>
+              <w:t>To create WBS, ERD, architecture diagrams, and site maps.</w:t>
+            </w:r>
+          </w:p>
+        </w:tc>
+        <w:tc>
+          <w:tcPr>
+            <w:tcW w:w="1560" w:type="dxa"/>
+            <w:tcBorders>
+              <w:top w:val="single" w:sz="4" w:space="0" w:color="CCCCCC"/>
+              <w:left w:val="single" w:sz="4" w:space="0" w:color="CCCCCC"/>
+              <w:bottom w:val="single" w:sz="4" w:space="0" w:color="CCCCCC"/>
+              <w:right w:val="single" w:sz="4" w:space="0" w:color="CCCCCC"/>
+            </w:tcBorders>
+            <w:shd w:val="clear" w:color="auto" w:fill="FFFFFF" w:themeFill="background1"/>
+            <w:tcMar>
+              <w:top w:w="80" w:type="dxa"/>
+              <w:left w:w="120" w:type="dxa"/>
+              <w:bottom w:w="80" w:type="dxa"/>
+              <w:right w:w="120" w:type="dxa"/>
+            </w:tcMar>
+          </w:tcPr>
+          <w:p>
+            <w:pPr>
+              <w:jc w:val="both"/>
+            </w:pPr>
+            <w:r>
+              <w:rPr>
+                <w:sz w:val="22"/>
+                <w:szCs w:val="22"/>
+              </w:rPr>
+              <w:t>All Members</w:t>
+            </w:r>
+          </w:p>
+        </w:tc>
+      </w:tr>
+      <w:tr>
+        <w:tc>
+          <w:tcPr>
+            <w:tcW w:w="9360" w:type="dxa"/>
+            <w:gridSpan w:val="5"/>
+            <w:tcBorders>
+              <w:top w:val="single" w:sz="4" w:space="0" w:color="CCCCCC"/>
+              <w:left w:val="single" w:sz="4" w:space="0" w:color="CCCCCC"/>
+              <w:bottom w:val="single" w:sz="4" w:space="0" w:color="CCCCCC"/>
+              <w:right w:val="single" w:sz="4" w:space="0" w:color="CCCCCC"/>
+            </w:tcBorders>
+            <w:shd w:val="clear" w:color="auto" w:fill="FFFFFF" w:themeFill="background1"/>
+            <w:tcMar>
+              <w:top w:w="80" w:type="dxa"/>
+              <w:left w:w="120" w:type="dxa"/>
+              <w:bottom w:w="80" w:type="dxa"/>
+              <w:right w:w="120" w:type="dxa"/>
+            </w:tcMar>
+          </w:tcPr>
+          <w:p>
+            <w:r>
+              <w:rPr>
+                <w:b/>
+                <w:bCs/>
+                <w:iCs/>
+                <w:sz w:val="22"/>
+                <w:szCs w:val="22"/>
+              </w:rPr>
+              <w:t>Modelling</w:t>
+            </w:r>
+          </w:p>
+        </w:tc>
+      </w:tr>
+      <w:tr>
+        <w:tc>
+          <w:tcPr>
+            <w:tcW w:w="1400" w:type="dxa"/>
+            <w:tcBorders>
+              <w:top w:val="single" w:sz="4" w:space="0" w:color="CCCCCC"/>
+              <w:left w:val="single" w:sz="4" w:space="0" w:color="CCCCCC"/>
+              <w:bottom w:val="single" w:sz="4" w:space="0" w:color="CCCCCC"/>
+              <w:right w:val="single" w:sz="4" w:space="0" w:color="CCCCCC"/>
+            </w:tcBorders>
+            <w:shd w:val="clear" w:color="auto" w:fill="FFFFFF" w:themeFill="background1"/>
+            <w:tcMar>
+              <w:top w:w="80" w:type="dxa"/>
+              <w:left w:w="120" w:type="dxa"/>
+              <w:bottom w:w="80" w:type="dxa"/>
+              <w:right w:w="120" w:type="dxa"/>
+            </w:tcMar>
+          </w:tcPr>
+          <w:p>
+            <w:pPr>
+              <w:jc w:val="both"/>
+            </w:pPr>
+            <w:r>
+              <w:rPr>
+                <w:sz w:val="22"/>
+                <w:szCs w:val="22"/>
+              </w:rPr>
+              <w:t>UML &amp; ERD</w:t>
+            </w:r>
+          </w:p>
+        </w:tc>
+        <w:tc>
+          <w:tcPr>
+            <w:tcW w:w="2000" w:type="dxa"/>
+            <w:tcBorders>
+              <w:top w:val="single" w:sz="4" w:space="0" w:color="CCCCCC"/>
+              <w:left w:val="single" w:sz="4" w:space="0" w:color="CCCCCC"/>
+              <w:bottom w:val="single" w:sz="4" w:space="0" w:color="CCCCCC"/>
+              <w:right w:val="single" w:sz="4" w:space="0" w:color="CCCCCC"/>
+            </w:tcBorders>
+            <w:shd w:val="clear" w:color="auto" w:fill="FFFFFF" w:themeFill="background1"/>
+            <w:tcMar>
+              <w:top w:w="80" w:type="dxa"/>
+              <w:left w:w="120" w:type="dxa"/>
+              <w:bottom w:w="80" w:type="dxa"/>
+              <w:right w:w="120" w:type="dxa"/>
+            </w:tcMar>
+          </w:tcPr>
+          <w:p>
+            <w:pPr>
+              <w:jc w:val="both"/>
+            </w:pPr>
+            <w:r>
+              <w:rPr>
+                <w:sz w:val="22"/>
+                <w:szCs w:val="22"/>
+              </w:rPr>
+              <w:t>draw.io</w:t>
+            </w:r>
+          </w:p>
+        </w:tc>
+        <w:tc>
+          <w:tcPr>
+            <w:tcW w:w="1000" w:type="dxa"/>
+            <w:tcBorders>
+              <w:top w:val="single" w:sz="4" w:space="0" w:color="CCCCCC"/>
+              <w:left w:val="single" w:sz="4" w:space="0" w:color="CCCCCC"/>
+              <w:bottom w:val="single" w:sz="4" w:space="0" w:color="CCCCCC"/>
+              <w:right w:val="single" w:sz="4" w:space="0" w:color="CCCCCC"/>
+            </w:tcBorders>
+            <w:shd w:val="clear" w:color="auto" w:fill="FFFFFF" w:themeFill="background1"/>
+            <w:tcMar>
+              <w:top w:w="80" w:type="dxa"/>
+              <w:left w:w="120" w:type="dxa"/>
+              <w:bottom w:w="80" w:type="dxa"/>
+              <w:right w:w="120" w:type="dxa"/>
+            </w:tcMar>
+          </w:tcPr>
+          <w:p>
+            <w:pPr>
+              <w:jc w:val="both"/>
+            </w:pPr>
+            <w:r>
+              <w:rPr>
+                <w:sz w:val="22"/>
+                <w:szCs w:val="22"/>
+              </w:rPr>
+              <w:t>Web-based</w:t>
+            </w:r>
+          </w:p>
+        </w:tc>
+        <w:tc>
+          <w:tcPr>
+            <w:tcW w:w="3400" w:type="dxa"/>
+            <w:tcBorders>
+              <w:top w:val="single" w:sz="4" w:space="0" w:color="CCCCCC"/>
+              <w:left w:val="single" w:sz="4" w:space="0" w:color="CCCCCC"/>
+              <w:bottom w:val="single" w:sz="4" w:space="0" w:color="CCCCCC"/>
+              <w:right w:val="single" w:sz="4" w:space="0" w:color="CCCCCC"/>
+            </w:tcBorders>
+            <w:shd w:val="clear" w:color="auto" w:fill="FFFFFF" w:themeFill="background1"/>
+            <w:tcMar>
+              <w:top w:w="80" w:type="dxa"/>
+              <w:left w:w="120" w:type="dxa"/>
+              <w:bottom w:w="80" w:type="dxa"/>
+              <w:right w:w="120" w:type="dxa"/>
+            </w:tcMar>
+          </w:tcPr>
+          <w:p>
+            <w:pPr>
+              <w:jc w:val="both"/>
+            </w:pPr>
+            <w:r>
+              <w:rPr>
+                <w:sz w:val="22"/>
+                <w:szCs w:val="22"/>
+              </w:rPr>
+              <w:t>Free and open-source software for UML, deployment, and ER diagrams.</w:t>
+            </w:r>
+          </w:p>
+        </w:tc>
+        <w:tc>
+          <w:tcPr>
+            <w:tcW w:w="1560" w:type="dxa"/>
+            <w:tcBorders>
+              <w:top w:val="single" w:sz="4" w:space="0" w:color="CCCCCC"/>
+              <w:left w:val="single" w:sz="4" w:space="0" w:color="CCCCCC"/>
+              <w:bottom w:val="single" w:sz="4" w:space="0" w:color="CCCCCC"/>
+              <w:right w:val="single" w:sz="4" w:space="0" w:color="CCCCCC"/>
+            </w:tcBorders>
+            <w:shd w:val="clear" w:color="auto" w:fill="FFFFFF" w:themeFill="background1"/>
+            <w:tcMar>
+              <w:top w:w="80" w:type="dxa"/>
+              <w:left w:w="120" w:type="dxa"/>
+              <w:bottom w:w="80" w:type="dxa"/>
+              <w:right w:w="120" w:type="dxa"/>
+            </w:tcMar>
+          </w:tcPr>
+          <w:p>
+            <w:pPr>
+              <w:jc w:val="both"/>
+            </w:pPr>
+            <w:r>
+              <w:rPr>
+                <w:sz w:val="22"/>
+                <w:szCs w:val="22"/>
+              </w:rPr>
+              <w:t xml:space="preserve">Aaditya Chaudhary </w:t>
+            </w:r>
+          </w:p>
+        </w:tc>
+      </w:tr>
+      <w:tr>
+        <w:tc>
+          <w:tcPr>
+            <w:tcW w:w="1400" w:type="dxa"/>
+            <w:tcBorders>
+              <w:top w:val="single" w:sz="4" w:space="0" w:color="CCCCCC"/>
+              <w:left w:val="single" w:sz="4" w:space="0" w:color="CCCCCC"/>
+              <w:bottom w:val="single" w:sz="4" w:space="0" w:color="CCCCCC"/>
+              <w:right w:val="single" w:sz="4" w:space="0" w:color="CCCCCC"/>
+            </w:tcBorders>
+            <w:shd w:val="clear" w:color="auto" w:fill="FFFFFF" w:themeFill="background1"/>
+            <w:tcMar>
+              <w:top w:w="80" w:type="dxa"/>
+              <w:left w:w="120" w:type="dxa"/>
+              <w:bottom w:w="80" w:type="dxa"/>
+              <w:right w:w="120" w:type="dxa"/>
+            </w:tcMar>
+          </w:tcPr>
+          <w:p>
+            <w:pPr>
+              <w:jc w:val="both"/>
+            </w:pPr>
+            <w:r>
+              <w:rPr>
+                <w:sz w:val="22"/>
+                <w:szCs w:val="22"/>
+              </w:rPr>
+              <w:t>Wireframing</w:t>
+            </w:r>
+          </w:p>
+        </w:tc>
+        <w:tc>
+          <w:tcPr>
+            <w:tcW w:w="2000" w:type="dxa"/>
+            <w:tcBorders>
+              <w:top w:val="single" w:sz="4" w:space="0" w:color="CCCCCC"/>
+              <w:left w:val="single" w:sz="4" w:space="0" w:color="CCCCCC"/>
+              <w:bottom w:val="single" w:sz="4" w:space="0" w:color="CCCCCC"/>
+              <w:right w:val="single" w:sz="4" w:space="0" w:color="CCCCCC"/>
+            </w:tcBorders>
+            <w:shd w:val="clear" w:color="auto" w:fill="FFFFFF" w:themeFill="background1"/>
+            <w:tcMar>
+              <w:top w:w="80" w:type="dxa"/>
+              <w:left w:w="120" w:type="dxa"/>
+              <w:bottom w:w="80" w:type="dxa"/>
+              <w:right w:w="120" w:type="dxa"/>
+            </w:tcMar>
+          </w:tcPr>
+          <w:p>
+            <w:pPr>
+              <w:jc w:val="both"/>
+            </w:pPr>
+            <w:r>
+              <w:rPr>
+                <w:sz w:val="22"/>
+                <w:szCs w:val="22"/>
+              </w:rPr>
+              <w:t>Figma</w:t>
+            </w:r>
+          </w:p>
+        </w:tc>
+        <w:tc>
+          <w:tcPr>
+            <w:tcW w:w="1000" w:type="dxa"/>
+            <w:tcBorders>
+              <w:top w:val="single" w:sz="4" w:space="0" w:color="CCCCCC"/>
+              <w:left w:val="single" w:sz="4" w:space="0" w:color="CCCCCC"/>
+              <w:bottom w:val="single" w:sz="4" w:space="0" w:color="CCCCCC"/>
+              <w:right w:val="single" w:sz="4" w:space="0" w:color="CCCCCC"/>
+            </w:tcBorders>
+            <w:shd w:val="clear" w:color="auto" w:fill="FFFFFF" w:themeFill="background1"/>
+            <w:tcMar>
+              <w:top w:w="80" w:type="dxa"/>
+              <w:left w:w="120" w:type="dxa"/>
+              <w:bottom w:w="80" w:type="dxa"/>
+              <w:right w:w="120" w:type="dxa"/>
+            </w:tcMar>
+          </w:tcPr>
+          <w:p>
+            <w:pPr>
+              <w:jc w:val="both"/>
+            </w:pPr>
+            <w:r>
+              <w:rPr>
+                <w:sz w:val="22"/>
+                <w:szCs w:val="22"/>
+              </w:rPr>
+              <w:t>Web-based</w:t>
+            </w:r>
+          </w:p>
+        </w:tc>
+        <w:tc>
+          <w:tcPr>
+            <w:tcW w:w="3400" w:type="dxa"/>
+            <w:tcBorders>
+              <w:top w:val="single" w:sz="4" w:space="0" w:color="CCCCCC"/>
+              <w:left w:val="single" w:sz="4" w:space="0" w:color="CCCCCC"/>
+              <w:bottom w:val="single" w:sz="4" w:space="0" w:color="CCCCCC"/>
+              <w:right w:val="single" w:sz="4" w:space="0" w:color="CCCCCC"/>
+            </w:tcBorders>
+            <w:shd w:val="clear" w:color="auto" w:fill="FFFFFF" w:themeFill="background1"/>
+            <w:tcMar>
+              <w:top w:w="80" w:type="dxa"/>
+              <w:left w:w="120" w:type="dxa"/>
+              <w:bottom w:w="80" w:type="dxa"/>
+              <w:right w:w="120" w:type="dxa"/>
+            </w:tcMar>
+          </w:tcPr>
+          <w:p>
+            <w:pPr>
+              <w:jc w:val="both"/>
+            </w:pPr>
+            <w:r>
+              <w:rPr>
+                <w:sz w:val="22"/>
+                <w:szCs w:val="22"/>
+              </w:rPr>
+              <w:t>SavePlate screens wireframe and prototype design for UI/UX.</w:t>
+            </w:r>
+          </w:p>
+        </w:tc>
+        <w:tc>
+          <w:tcPr>
+            <w:tcW w:w="1560" w:type="dxa"/>
+            <w:tcBorders>
+              <w:top w:val="single" w:sz="4" w:space="0" w:color="CCCCCC"/>
+              <w:left w:val="single" w:sz="4" w:space="0" w:color="CCCCCC"/>
+              <w:bottom w:val="single" w:sz="4" w:space="0" w:color="CCCCCC"/>
+              <w:right w:val="single" w:sz="4" w:space="0" w:color="CCCCCC"/>
+            </w:tcBorders>
+            <w:shd w:val="clear" w:color="auto" w:fill="FFFFFF" w:themeFill="background1"/>
+            <w:tcMar>
+              <w:top w:w="80" w:type="dxa"/>
+              <w:left w:w="120" w:type="dxa"/>
+              <w:bottom w:w="80" w:type="dxa"/>
+              <w:right w:w="120" w:type="dxa"/>
+            </w:tcMar>
+          </w:tcPr>
+          <w:p>
+            <w:pPr>
+              <w:jc w:val="both"/>
+            </w:pPr>
+            <w:r>
+              <w:rPr>
+                <w:sz w:val="22"/>
+                <w:szCs w:val="22"/>
+              </w:rPr>
+              <w:t>Aakroshan Chaudhary</w:t>
+            </w:r>
+          </w:p>
+        </w:tc>
+      </w:tr>
+      <w:tr>
+        <w:tc>
+          <w:tcPr>
+            <w:tcW w:w="9360" w:type="dxa"/>
+            <w:gridSpan w:val="5"/>
+            <w:tcBorders>
+              <w:top w:val="single" w:sz="4" w:space="0" w:color="CCCCCC"/>
+              <w:left w:val="single" w:sz="4" w:space="0" w:color="CCCCCC"/>
+              <w:bottom w:val="single" w:sz="4" w:space="0" w:color="CCCCCC"/>
+              <w:right w:val="single" w:sz="4" w:space="0" w:color="CCCCCC"/>
+            </w:tcBorders>
+            <w:shd w:val="clear" w:color="auto" w:fill="FFFFFF" w:themeFill="background1"/>
+            <w:tcMar>
+              <w:top w:w="80" w:type="dxa"/>
+              <w:left w:w="120" w:type="dxa"/>
+              <w:bottom w:w="80" w:type="dxa"/>
+              <w:right w:w="120" w:type="dxa"/>
+            </w:tcMar>
+          </w:tcPr>
+          <w:p>
+            <w:r>
+              <w:rPr>
+                <w:b/>
+                <w:bCs/>
+                <w:iCs/>
+                <w:sz w:val="22"/>
+                <w:szCs w:val="22"/>
+              </w:rPr>
+              <w:t>Project Management</w:t>
+            </w:r>
+          </w:p>
+        </w:tc>
+      </w:tr>
+      <w:tr>
+        <w:tc>
+          <w:tcPr>
+            <w:tcW w:w="1400" w:type="dxa"/>
+            <w:tcBorders>
+              <w:top w:val="single" w:sz="4" w:space="0" w:color="CCCCCC"/>
+              <w:left w:val="single" w:sz="4" w:space="0" w:color="CCCCCC"/>
+              <w:bottom w:val="single" w:sz="4" w:space="0" w:color="CCCCCC"/>
+              <w:right w:val="single" w:sz="4" w:space="0" w:color="CCCCCC"/>
+            </w:tcBorders>
+            <w:shd w:val="clear" w:color="auto" w:fill="FFFFFF" w:themeFill="background1"/>
+            <w:tcMar>
+              <w:top w:w="80" w:type="dxa"/>
+              <w:left w:w="120" w:type="dxa"/>
+              <w:bottom w:w="80" w:type="dxa"/>
+              <w:right w:w="120" w:type="dxa"/>
+            </w:tcMar>
+          </w:tcPr>
+          <w:p>
+            <w:pPr>
+              <w:jc w:val="both"/>
+            </w:pPr>
+            <w:r>
+              <w:rPr>
+                <w:sz w:val="22"/>
+                <w:szCs w:val="22"/>
+              </w:rPr>
+              <w:t>Scheduling</w:t>
+            </w:r>
+          </w:p>
+        </w:tc>
+        <w:tc>
+          <w:tcPr>
+            <w:tcW w:w="2000" w:type="dxa"/>
+            <w:tcBorders>
+              <w:top w:val="single" w:sz="4" w:space="0" w:color="CCCCCC"/>
+              <w:left w:val="single" w:sz="4" w:space="0" w:color="CCCCCC"/>
+              <w:bottom w:val="single" w:sz="4" w:space="0" w:color="CCCCCC"/>
+              <w:right w:val="single" w:sz="4" w:space="0" w:color="CCCCCC"/>
+            </w:tcBorders>
+            <w:shd w:val="clear" w:color="auto" w:fill="FFFFFF" w:themeFill="background1"/>
+            <w:tcMar>
+              <w:top w:w="80" w:type="dxa"/>
+              <w:left w:w="120" w:type="dxa"/>
+              <w:bottom w:w="80" w:type="dxa"/>
+              <w:right w:w="120" w:type="dxa"/>
+            </w:tcMar>
+          </w:tcPr>
+          <w:p>
+            <w:pPr>
+              <w:jc w:val="both"/>
+            </w:pPr>
+            <w:r>
+              <w:rPr>
+                <w:sz w:val="22"/>
+                <w:szCs w:val="22"/>
+              </w:rPr>
+              <w:t>GanttProject</w:t>
+            </w:r>
+          </w:p>
+        </w:tc>
+        <w:tc>
+          <w:tcPr>
+            <w:tcW w:w="1000" w:type="dxa"/>
+            <w:tcBorders>
+              <w:top w:val="single" w:sz="4" w:space="0" w:color="CCCCCC"/>
+              <w:left w:val="single" w:sz="4" w:space="0" w:color="CCCCCC"/>
+              <w:bottom w:val="single" w:sz="4" w:space="0" w:color="CCCCCC"/>
+              <w:right w:val="single" w:sz="4" w:space="0" w:color="CCCCCC"/>
+            </w:tcBorders>
+            <w:shd w:val="clear" w:color="auto" w:fill="FFFFFF" w:themeFill="background1"/>
+            <w:tcMar>
+              <w:top w:w="80" w:type="dxa"/>
+              <w:left w:w="120" w:type="dxa"/>
+              <w:bottom w:w="80" w:type="dxa"/>
+              <w:right w:w="120" w:type="dxa"/>
+            </w:tcMar>
+          </w:tcPr>
+          <w:p>
+            <w:pPr>
+              <w:jc w:val="both"/>
+            </w:pPr>
+            <w:r>
+              <w:rPr>
+                <w:sz w:val="22"/>
+                <w:szCs w:val="22"/>
+              </w:rPr>
+              <w:t>3.x</w:t>
+            </w:r>
+          </w:p>
+        </w:tc>
+        <w:tc>
+          <w:tcPr>
+            <w:tcW w:w="3400" w:type="dxa"/>
+            <w:tcBorders>
+              <w:top w:val="single" w:sz="4" w:space="0" w:color="CCCCCC"/>
+              <w:left w:val="single" w:sz="4" w:space="0" w:color="CCCCCC"/>
+              <w:bottom w:val="single" w:sz="4" w:space="0" w:color="CCCCCC"/>
+              <w:right w:val="single" w:sz="4" w:space="0" w:color="CCCCCC"/>
+            </w:tcBorders>
+            <w:shd w:val="clear" w:color="auto" w:fill="FFFFFF" w:themeFill="background1"/>
+            <w:tcMar>
+              <w:top w:w="80" w:type="dxa"/>
+              <w:left w:w="120" w:type="dxa"/>
+              <w:bottom w:w="80" w:type="dxa"/>
+              <w:right w:w="120" w:type="dxa"/>
+            </w:tcMar>
+          </w:tcPr>
+          <w:p>
+            <w:pPr>
+              <w:jc w:val="both"/>
+            </w:pPr>
+            <w:r>
+              <w:rPr>
+                <w:sz w:val="22"/>
+                <w:szCs w:val="22"/>
+              </w:rPr>
+              <w:t>Open-source Gantt chart application for planning, milestones, and resource distribution.</w:t>
+            </w:r>
+          </w:p>
+        </w:tc>
+        <w:tc>
+          <w:tcPr>
+            <w:tcW w:w="1560" w:type="dxa"/>
+            <w:tcBorders>
+              <w:top w:val="single" w:sz="4" w:space="0" w:color="CCCCCC"/>
+              <w:left w:val="single" w:sz="4" w:space="0" w:color="CCCCCC"/>
+              <w:bottom w:val="single" w:sz="4" w:space="0" w:color="CCCCCC"/>
+              <w:right w:val="single" w:sz="4" w:space="0" w:color="CCCCCC"/>
+            </w:tcBorders>
+            <w:shd w:val="clear" w:color="auto" w:fill="FFFFFF" w:themeFill="background1"/>
+            <w:tcMar>
+              <w:top w:w="80" w:type="dxa"/>
+              <w:left w:w="120" w:type="dxa"/>
+              <w:bottom w:w="80" w:type="dxa"/>
+              <w:right w:w="120" w:type="dxa"/>
+            </w:tcMar>
+          </w:tcPr>
+          <w:p>
+            <w:pPr>
+              <w:jc w:val="both"/>
+            </w:pPr>
+            <w:r>
+              <w:rPr>
+                <w:sz w:val="22"/>
+                <w:szCs w:val="22"/>
+              </w:rPr>
+              <w:t>Ajay Goit</w:t>
+            </w:r>
+          </w:p>
+        </w:tc>
+      </w:tr>
+      <w:tr>
+        <w:tc>
+          <w:tcPr>
+            <w:tcW w:w="1400" w:type="dxa"/>
+            <w:tcBorders>
+              <w:top w:val="single" w:sz="4" w:space="0" w:color="CCCCCC"/>
+              <w:left w:val="single" w:sz="4" w:space="0" w:color="CCCCCC"/>
+              <w:bottom w:val="single" w:sz="4" w:space="0" w:color="CCCCCC"/>
+              <w:right w:val="single" w:sz="4" w:space="0" w:color="CCCCCC"/>
+            </w:tcBorders>
+            <w:shd w:val="clear" w:color="auto" w:fill="FFFFFF" w:themeFill="background1"/>
+            <w:tcMar>
+              <w:top w:w="80" w:type="dxa"/>
+              <w:left w:w="120" w:type="dxa"/>
+              <w:bottom w:w="80" w:type="dxa"/>
+              <w:right w:w="120" w:type="dxa"/>
+            </w:tcMar>
+          </w:tcPr>
+          <w:p>
+            <w:pPr>
+              <w:jc w:val="both"/>
+            </w:pPr>
+            <w:r>
+              <w:rPr>
+                <w:sz w:val="22"/>
+                <w:szCs w:val="22"/>
+              </w:rPr>
+              <w:t>Version Control</w:t>
+            </w:r>
+          </w:p>
+        </w:tc>
+        <w:tc>
+          <w:tcPr>
+            <w:tcW w:w="2000" w:type="dxa"/>
+            <w:tcBorders>
+              <w:top w:val="single" w:sz="4" w:space="0" w:color="CCCCCC"/>
+              <w:left w:val="single" w:sz="4" w:space="0" w:color="CCCCCC"/>
+              <w:bottom w:val="single" w:sz="4" w:space="0" w:color="CCCCCC"/>
+              <w:right w:val="single" w:sz="4" w:space="0" w:color="CCCCCC"/>
+            </w:tcBorders>
+            <w:shd w:val="clear" w:color="auto" w:fill="FFFFFF" w:themeFill="background1"/>
+            <w:tcMar>
+              <w:top w:w="80" w:type="dxa"/>
+              <w:left w:w="120" w:type="dxa"/>
+              <w:bottom w:w="80" w:type="dxa"/>
+              <w:right w:w="120" w:type="dxa"/>
+            </w:tcMar>
+          </w:tcPr>
+          <w:p>
+            <w:pPr>
+              <w:jc w:val="both"/>
+            </w:pPr>
+            <w:r>
+              <w:rPr>
+                <w:sz w:val="22"/>
+                <w:szCs w:val="22"/>
+              </w:rPr>
+              <w:t>GitHub</w:t>
+            </w:r>
+          </w:p>
+        </w:tc>
+        <w:tc>
+          <w:tcPr>
+            <w:tcW w:w="1000" w:type="dxa"/>
+            <w:tcBorders>
+              <w:top w:val="single" w:sz="4" w:space="0" w:color="CCCCCC"/>
+              <w:left w:val="single" w:sz="4" w:space="0" w:color="CCCCCC"/>
+              <w:bottom w:val="single" w:sz="4" w:space="0" w:color="CCCCCC"/>
+              <w:right w:val="single" w:sz="4" w:space="0" w:color="CCCCCC"/>
+            </w:tcBorders>
+            <w:shd w:val="clear" w:color="auto" w:fill="FFFFFF" w:themeFill="background1"/>
+            <w:tcMar>
+              <w:top w:w="80" w:type="dxa"/>
+              <w:left w:w="120" w:type="dxa"/>
+              <w:bottom w:w="80" w:type="dxa"/>
+              <w:right w:w="120" w:type="dxa"/>
+            </w:tcMar>
+          </w:tcPr>
+          <w:p>
+            <w:pPr>
+              <w:jc w:val="both"/>
+            </w:pPr>
+            <w:r>
+              <w:rPr>
+                <w:sz w:val="22"/>
+                <w:szCs w:val="22"/>
+              </w:rPr>
+              <w:t>Web/CLI</w:t>
+            </w:r>
+          </w:p>
+        </w:tc>
+        <w:tc>
+          <w:tcPr>
+            <w:tcW w:w="3400" w:type="dxa"/>
+            <w:tcBorders>
+              <w:top w:val="single" w:sz="4" w:space="0" w:color="CCCCCC"/>
+              <w:left w:val="single" w:sz="4" w:space="0" w:color="CCCCCC"/>
+              <w:bottom w:val="single" w:sz="4" w:space="0" w:color="CCCCCC"/>
+              <w:right w:val="single" w:sz="4" w:space="0" w:color="CCCCCC"/>
+            </w:tcBorders>
+            <w:shd w:val="clear" w:color="auto" w:fill="FFFFFF" w:themeFill="background1"/>
+            <w:tcMar>
+              <w:top w:w="80" w:type="dxa"/>
+              <w:left w:w="120" w:type="dxa"/>
+              <w:bottom w:w="80" w:type="dxa"/>
+              <w:right w:w="120" w:type="dxa"/>
+            </w:tcMar>
+          </w:tcPr>
+          <w:p>
+            <w:pPr>
+              <w:jc w:val="both"/>
+            </w:pPr>
+            <w:r>
+              <w:rPr>
+                <w:sz w:val="22"/>
+                <w:szCs w:val="22"/>
+              </w:rPr>
+              <w:t>Documentation and source code storage; collaboration based on branches.</w:t>
+            </w:r>
+          </w:p>
+        </w:tc>
+        <w:tc>
+          <w:tcPr>
+            <w:tcW w:w="1560" w:type="dxa"/>
+            <w:tcBorders>
+              <w:top w:val="single" w:sz="4" w:space="0" w:color="CCCCCC"/>
+              <w:left w:val="single" w:sz="4" w:space="0" w:color="CCCCCC"/>
+              <w:bottom w:val="single" w:sz="4" w:space="0" w:color="CCCCCC"/>
+              <w:right w:val="single" w:sz="4" w:space="0" w:color="CCCCCC"/>
+            </w:tcBorders>
+            <w:shd w:val="clear" w:color="auto" w:fill="FFFFFF" w:themeFill="background1"/>
+            <w:tcMar>
+              <w:top w:w="80" w:type="dxa"/>
+              <w:left w:w="120" w:type="dxa"/>
+              <w:bottom w:w="80" w:type="dxa"/>
+              <w:right w:w="120" w:type="dxa"/>
+            </w:tcMar>
+          </w:tcPr>
+          <w:p>
+            <w:pPr>
+              <w:jc w:val="both"/>
+            </w:pPr>
+            <w:r>
+              <w:rPr>
+                <w:sz w:val="22"/>
+                <w:szCs w:val="22"/>
+              </w:rPr>
+              <w:t>All Members</w:t>
+            </w:r>
+          </w:p>
+        </w:tc>
+      </w:tr>
+      <w:tr>
+        <w:tc>
+          <w:tcPr>
+            <w:tcW w:w="1400" w:type="dxa"/>
+            <w:tcBorders>
+              <w:top w:val="single" w:sz="4" w:space="0" w:color="CCCCCC"/>
+              <w:left w:val="single" w:sz="4" w:space="0" w:color="CCCCCC"/>
+              <w:bottom w:val="single" w:sz="4" w:space="0" w:color="CCCCCC"/>
+              <w:right w:val="single" w:sz="4" w:space="0" w:color="CCCCCC"/>
+            </w:tcBorders>
+            <w:shd w:val="clear" w:color="auto" w:fill="FFFFFF" w:themeFill="background1"/>
+            <w:tcMar>
+              <w:top w:w="80" w:type="dxa"/>
+              <w:left w:w="120" w:type="dxa"/>
+              <w:bottom w:w="80" w:type="dxa"/>
+              <w:right w:w="120" w:type="dxa"/>
+            </w:tcMar>
+          </w:tcPr>
+          <w:p>
+            <w:pPr>
+              <w:jc w:val="both"/>
+            </w:pPr>
+            <w:r>
+              <w:rPr>
+                <w:sz w:val="22"/>
+                <w:szCs w:val="22"/>
+              </w:rPr>
+              <w:t>Collaboration</w:t>
+            </w:r>
+          </w:p>
+        </w:tc>
+        <w:tc>
+          <w:tcPr>
+            <w:tcW w:w="2000" w:type="dxa"/>
+            <w:tcBorders>
+              <w:top w:val="single" w:sz="4" w:space="0" w:color="CCCCCC"/>
+              <w:left w:val="single" w:sz="4" w:space="0" w:color="CCCCCC"/>
+              <w:bottom w:val="single" w:sz="4" w:space="0" w:color="CCCCCC"/>
+              <w:right w:val="single" w:sz="4" w:space="0" w:color="CCCCCC"/>
+            </w:tcBorders>
+            <w:shd w:val="clear" w:color="auto" w:fill="FFFFFF" w:themeFill="background1"/>
+            <w:tcMar>
+              <w:top w:w="80" w:type="dxa"/>
+              <w:left w:w="120" w:type="dxa"/>
+              <w:bottom w:w="80" w:type="dxa"/>
+              <w:right w:w="120" w:type="dxa"/>
+            </w:tcMar>
+          </w:tcPr>
+          <w:p>
+            <w:pPr>
+              <w:jc w:val="both"/>
+            </w:pPr>
+            <w:r>
+              <w:rPr>
+                <w:sz w:val="22"/>
+                <w:szCs w:val="22"/>
+              </w:rPr>
+              <w:t>Microsoft Teams / WhatsApp</w:t>
+            </w:r>
+          </w:p>
+        </w:tc>
+        <w:tc>
+          <w:tcPr>
+            <w:tcW w:w="1000" w:type="dxa"/>
+            <w:tcBorders>
+              <w:top w:val="single" w:sz="4" w:space="0" w:color="CCCCCC"/>
+              <w:left w:val="single" w:sz="4" w:space="0" w:color="CCCCCC"/>
+              <w:bottom w:val="single" w:sz="4" w:space="0" w:color="CCCCCC"/>
+              <w:right w:val="single" w:sz="4" w:space="0" w:color="CCCCCC"/>
+            </w:tcBorders>
+            <w:shd w:val="clear" w:color="auto" w:fill="FFFFFF" w:themeFill="background1"/>
+            <w:tcMar>
+              <w:top w:w="80" w:type="dxa"/>
+              <w:left w:w="120" w:type="dxa"/>
+              <w:bottom w:w="80" w:type="dxa"/>
+              <w:right w:w="120" w:type="dxa"/>
+            </w:tcMar>
+          </w:tcPr>
+          <w:p>
+            <w:pPr>
+              <w:jc w:val="both"/>
+            </w:pPr>
+            <w:r>
+              <w:rPr>
+                <w:sz w:val="22"/>
+                <w:szCs w:val="22"/>
+              </w:rPr>
+              <w:t>Latest</w:t>
+            </w:r>
+          </w:p>
+        </w:tc>
+        <w:tc>
+          <w:tcPr>
+            <w:tcW w:w="3400" w:type="dxa"/>
+            <w:tcBorders>
+              <w:top w:val="single" w:sz="4" w:space="0" w:color="CCCCCC"/>
+              <w:left w:val="single" w:sz="4" w:space="0" w:color="CCCCCC"/>
+              <w:bottom w:val="single" w:sz="4" w:space="0" w:color="CCCCCC"/>
+              <w:right w:val="single" w:sz="4" w:space="0" w:color="CCCCCC"/>
+            </w:tcBorders>
+            <w:shd w:val="clear" w:color="auto" w:fill="FFFFFF" w:themeFill="background1"/>
+            <w:tcMar>
+              <w:top w:w="80" w:type="dxa"/>
+              <w:left w:w="120" w:type="dxa"/>
+              <w:bottom w:w="80" w:type="dxa"/>
+              <w:right w:w="120" w:type="dxa"/>
+            </w:tcMar>
+          </w:tcPr>
+          <w:p>
+            <w:pPr>
+              <w:jc w:val="both"/>
+            </w:pPr>
+            <w:r>
+              <w:rPr>
+                <w:sz w:val="22"/>
+                <w:szCs w:val="22"/>
+              </w:rPr>
+              <w:t>Team messaging, file exchanging, and virtual meetings.</w:t>
+            </w:r>
+          </w:p>
+        </w:tc>
+        <w:tc>
+          <w:tcPr>
+            <w:tcW w:w="1560" w:type="dxa"/>
+            <w:tcBorders>
+              <w:top w:val="single" w:sz="4" w:space="0" w:color="CCCCCC"/>
+              <w:left w:val="single" w:sz="4" w:space="0" w:color="CCCCCC"/>
+              <w:bottom w:val="single" w:sz="4" w:space="0" w:color="CCCCCC"/>
+              <w:right w:val="single" w:sz="4" w:space="0" w:color="CCCCCC"/>
+            </w:tcBorders>
+            <w:shd w:val="clear" w:color="auto" w:fill="FFFFFF" w:themeFill="background1"/>
+            <w:tcMar>
+              <w:top w:w="80" w:type="dxa"/>
+              <w:left w:w="120" w:type="dxa"/>
+              <w:bottom w:w="80" w:type="dxa"/>
+              <w:right w:w="120" w:type="dxa"/>
+            </w:tcMar>
+          </w:tcPr>
+          <w:p>
+            <w:pPr>
+              <w:jc w:val="both"/>
+            </w:pPr>
+            <w:r>
+              <w:rPr>
+                <w:sz w:val="22"/>
+                <w:szCs w:val="22"/>
+              </w:rPr>
+              <w:t>All Members</w:t>
+            </w:r>
+          </w:p>
+        </w:tc>
+      </w:tr>
+      <w:tr>
+        <w:tc>
+          <w:tcPr>
+            <w:tcW w:w="9360" w:type="dxa"/>
+            <w:gridSpan w:val="5"/>
+            <w:tcBorders>
+              <w:top w:val="single" w:sz="4" w:space="0" w:color="CCCCCC"/>
+              <w:left w:val="single" w:sz="4" w:space="0" w:color="CCCCCC"/>
+              <w:bottom w:val="single" w:sz="4" w:space="0" w:color="CCCCCC"/>
+              <w:right w:val="single" w:sz="4" w:space="0" w:color="CCCCCC"/>
+            </w:tcBorders>
+            <w:shd w:val="clear" w:color="auto" w:fill="FFFFFF" w:themeFill="background1"/>
+            <w:tcMar>
+              <w:top w:w="80" w:type="dxa"/>
+              <w:left w:w="120" w:type="dxa"/>
+              <w:bottom w:w="80" w:type="dxa"/>
+              <w:right w:w="120" w:type="dxa"/>
+            </w:tcMar>
+          </w:tcPr>
+          <w:p>
+            <w:r>
+              <w:rPr>
+                <w:b/>
+                <w:bCs/>
+                <w:iCs/>
+                <w:sz w:val="22"/>
+                <w:szCs w:val="22"/>
+              </w:rPr>
+              <w:t>Framework</w:t>
+            </w:r>
+          </w:p>
+        </w:tc>
+      </w:tr>
+      <w:tr>
+        <w:tc>
+          <w:tcPr>
+            <w:tcW w:w="1400" w:type="dxa"/>
+            <w:tcBorders>
+              <w:top w:val="single" w:sz="4" w:space="0" w:color="CCCCCC"/>
+              <w:left w:val="single" w:sz="4" w:space="0" w:color="CCCCCC"/>
+              <w:bottom w:val="single" w:sz="4" w:space="0" w:color="CCCCCC"/>
+              <w:right w:val="single" w:sz="4" w:space="0" w:color="CCCCCC"/>
+            </w:tcBorders>
+            <w:shd w:val="clear" w:color="auto" w:fill="FFFFFF" w:themeFill="background1"/>
+            <w:tcMar>
+              <w:top w:w="80" w:type="dxa"/>
+              <w:left w:w="120" w:type="dxa"/>
+              <w:bottom w:w="80" w:type="dxa"/>
+              <w:right w:w="120" w:type="dxa"/>
+            </w:tcMar>
+          </w:tcPr>
+          <w:p>
+            <w:pPr>
+              <w:jc w:val="both"/>
+            </w:pPr>
+            <w:r>
+              <w:rPr>
+                <w:sz w:val="22"/>
+                <w:szCs w:val="22"/>
+              </w:rPr>
+              <w:t>Front End</w:t>
+            </w:r>
+          </w:p>
+        </w:tc>
+        <w:tc>
+          <w:tcPr>
+            <w:tcW w:w="2000" w:type="dxa"/>
+            <w:tcBorders>
+              <w:top w:val="single" w:sz="4" w:space="0" w:color="CCCCCC"/>
+              <w:left w:val="single" w:sz="4" w:space="0" w:color="CCCCCC"/>
+              <w:bottom w:val="single" w:sz="4" w:space="0" w:color="CCCCCC"/>
+              <w:right w:val="single" w:sz="4" w:space="0" w:color="CCCCCC"/>
+            </w:tcBorders>
+            <w:shd w:val="clear" w:color="auto" w:fill="FFFFFF" w:themeFill="background1"/>
+            <w:tcMar>
+              <w:top w:w="80" w:type="dxa"/>
+              <w:left w:w="120" w:type="dxa"/>
+              <w:bottom w:w="80" w:type="dxa"/>
+              <w:right w:w="120" w:type="dxa"/>
+            </w:tcMar>
+          </w:tcPr>
+          <w:p>
+            <w:pPr>
+              <w:jc w:val="both"/>
+            </w:pPr>
+            <w:r>
+              <w:rPr>
+                <w:sz w:val="22"/>
+                <w:szCs w:val="22"/>
+              </w:rPr>
+              <w:t>React.js</w:t>
+            </w:r>
+          </w:p>
+        </w:tc>
+        <w:tc>
+          <w:tcPr>
+            <w:tcW w:w="1000" w:type="dxa"/>
+            <w:tcBorders>
+              <w:top w:val="single" w:sz="4" w:space="0" w:color="CCCCCC"/>
+              <w:left w:val="single" w:sz="4" w:space="0" w:color="CCCCCC"/>
+              <w:bottom w:val="single" w:sz="4" w:space="0" w:color="CCCCCC"/>
+              <w:right w:val="single" w:sz="4" w:space="0" w:color="CCCCCC"/>
+            </w:tcBorders>
+            <w:shd w:val="clear" w:color="auto" w:fill="FFFFFF" w:themeFill="background1"/>
+            <w:tcMar>
+              <w:top w:w="80" w:type="dxa"/>
+              <w:left w:w="120" w:type="dxa"/>
+              <w:bottom w:w="80" w:type="dxa"/>
+              <w:right w:w="120" w:type="dxa"/>
+            </w:tcMar>
+          </w:tcPr>
+          <w:p>
+            <w:pPr>
+              <w:jc w:val="both"/>
+            </w:pPr>
+            <w:r>
+              <w:rPr>
+                <w:sz w:val="22"/>
+                <w:szCs w:val="22"/>
+              </w:rPr>
+              <w:t>18.x</w:t>
+            </w:r>
+          </w:p>
+        </w:tc>
+        <w:tc>
+          <w:tcPr>
+            <w:tcW w:w="3400" w:type="dxa"/>
+            <w:tcBorders>
+              <w:top w:val="single" w:sz="4" w:space="0" w:color="CCCCCC"/>
+              <w:left w:val="single" w:sz="4" w:space="0" w:color="CCCCCC"/>
+              <w:bottom w:val="single" w:sz="4" w:space="0" w:color="CCCCCC"/>
+              <w:right w:val="single" w:sz="4" w:space="0" w:color="CCCCCC"/>
+            </w:tcBorders>
+            <w:shd w:val="clear" w:color="auto" w:fill="FFFFFF" w:themeFill="background1"/>
+            <w:tcMar>
+              <w:top w:w="80" w:type="dxa"/>
+              <w:left w:w="120" w:type="dxa"/>
+              <w:bottom w:w="80" w:type="dxa"/>
+              <w:right w:w="120" w:type="dxa"/>
+            </w:tcMar>
+          </w:tcPr>
+          <w:p>
+            <w:pPr>
+              <w:jc w:val="both"/>
+            </w:pPr>
+            <w:r>
+              <w:rPr>
+                <w:sz w:val="22"/>
+                <w:szCs w:val="22"/>
+              </w:rPr>
+              <w:t>JavaScript library based on components for creating the SavePlate web interface.</w:t>
+            </w:r>
+          </w:p>
+        </w:tc>
+        <w:tc>
+          <w:tcPr>
+            <w:tcW w:w="1560" w:type="dxa"/>
+            <w:tcBorders>
+              <w:top w:val="single" w:sz="4" w:space="0" w:color="CCCCCC"/>
+              <w:left w:val="single" w:sz="4" w:space="0" w:color="CCCCCC"/>
+              <w:bottom w:val="single" w:sz="4" w:space="0" w:color="CCCCCC"/>
+              <w:right w:val="single" w:sz="4" w:space="0" w:color="CCCCCC"/>
+            </w:tcBorders>
+            <w:shd w:val="clear" w:color="auto" w:fill="FFFFFF" w:themeFill="background1"/>
+            <w:tcMar>
+              <w:top w:w="80" w:type="dxa"/>
+              <w:left w:w="120" w:type="dxa"/>
+              <w:bottom w:w="80" w:type="dxa"/>
+              <w:right w:w="120" w:type="dxa"/>
+            </w:tcMar>
+          </w:tcPr>
+          <w:p>
+            <w:pPr>
+              <w:jc w:val="both"/>
+            </w:pPr>
+            <w:r>
+              <w:rPr>
+                <w:sz w:val="22"/>
+                <w:szCs w:val="22"/>
+              </w:rPr>
+              <w:t>Aaditya Chaudhary</w:t>
+            </w:r>
+          </w:p>
+        </w:tc>
+      </w:tr>
+      <w:tr>
+        <w:tc>
+          <w:tcPr>
+            <w:tcW w:w="1400" w:type="dxa"/>
+            <w:tcBorders>
+              <w:top w:val="single" w:sz="4" w:space="0" w:color="CCCCCC"/>
+              <w:left w:val="single" w:sz="4" w:space="0" w:color="CCCCCC"/>
+              <w:bottom w:val="single" w:sz="4" w:space="0" w:color="CCCCCC"/>
+              <w:right w:val="single" w:sz="4" w:space="0" w:color="CCCCCC"/>
+            </w:tcBorders>
+            <w:shd w:val="clear" w:color="auto" w:fill="FFFFFF" w:themeFill="background1"/>
+            <w:tcMar>
+              <w:top w:w="80" w:type="dxa"/>
+              <w:left w:w="120" w:type="dxa"/>
+              <w:bottom w:w="80" w:type="dxa"/>
+              <w:right w:w="120" w:type="dxa"/>
+            </w:tcMar>
+          </w:tcPr>
+          <w:p>
+            <w:pPr>
+              <w:jc w:val="both"/>
+            </w:pPr>
+            <w:r>
+              <w:rPr>
+                <w:sz w:val="22"/>
+                <w:szCs w:val="22"/>
+              </w:rPr>
+              <w:t>Backend</w:t>
+            </w:r>
+          </w:p>
+        </w:tc>
+        <w:tc>
+          <w:tcPr>
+            <w:tcW w:w="2000" w:type="dxa"/>
+            <w:tcBorders>
+              <w:top w:val="single" w:sz="4" w:space="0" w:color="CCCCCC"/>
+              <w:left w:val="single" w:sz="4" w:space="0" w:color="CCCCCC"/>
+              <w:bottom w:val="single" w:sz="4" w:space="0" w:color="CCCCCC"/>
+              <w:right w:val="single" w:sz="4" w:space="0" w:color="CCCCCC"/>
+            </w:tcBorders>
+            <w:shd w:val="clear" w:color="auto" w:fill="FFFFFF" w:themeFill="background1"/>
+            <w:tcMar>
+              <w:top w:w="80" w:type="dxa"/>
+              <w:left w:w="120" w:type="dxa"/>
+              <w:bottom w:w="80" w:type="dxa"/>
+              <w:right w:w="120" w:type="dxa"/>
+            </w:tcMar>
+          </w:tcPr>
+          <w:p>
+            <w:pPr>
+              <w:jc w:val="both"/>
+            </w:pPr>
+            <w:r>
+              <w:rPr>
+                <w:sz w:val="22"/>
+                <w:szCs w:val="22"/>
+              </w:rPr>
+              <w:t>Node.js + Express.js</w:t>
+            </w:r>
+          </w:p>
+        </w:tc>
+        <w:tc>
+          <w:tcPr>
+            <w:tcW w:w="1000" w:type="dxa"/>
+            <w:tcBorders>
+              <w:top w:val="single" w:sz="4" w:space="0" w:color="CCCCCC"/>
+              <w:left w:val="single" w:sz="4" w:space="0" w:color="CCCCCC"/>
+              <w:bottom w:val="single" w:sz="4" w:space="0" w:color="CCCCCC"/>
+              <w:right w:val="single" w:sz="4" w:space="0" w:color="CCCCCC"/>
+            </w:tcBorders>
+            <w:shd w:val="clear" w:color="auto" w:fill="FFFFFF" w:themeFill="background1"/>
+            <w:tcMar>
+              <w:top w:w="80" w:type="dxa"/>
+              <w:left w:w="120" w:type="dxa"/>
+              <w:bottom w:w="80" w:type="dxa"/>
+              <w:right w:w="120" w:type="dxa"/>
+            </w:tcMar>
+          </w:tcPr>
+          <w:p>
+            <w:pPr>
+              <w:jc w:val="both"/>
+            </w:pPr>
+            <w:r>
+              <w:rPr>
+                <w:sz w:val="22"/>
+                <w:szCs w:val="22"/>
+              </w:rPr>
+              <w:t>20.x / 4.x</w:t>
+            </w:r>
+          </w:p>
+        </w:tc>
+        <w:tc>
+          <w:tcPr>
+            <w:tcW w:w="3400" w:type="dxa"/>
+            <w:tcBorders>
+              <w:top w:val="single" w:sz="4" w:space="0" w:color="CCCCCC"/>
+              <w:left w:val="single" w:sz="4" w:space="0" w:color="CCCCCC"/>
+              <w:bottom w:val="single" w:sz="4" w:space="0" w:color="CCCCCC"/>
+              <w:right w:val="single" w:sz="4" w:space="0" w:color="CCCCCC"/>
+            </w:tcBorders>
+            <w:shd w:val="clear" w:color="auto" w:fill="FFFFFF" w:themeFill="background1"/>
+            <w:tcMar>
+              <w:top w:w="80" w:type="dxa"/>
+              <w:left w:w="120" w:type="dxa"/>
+              <w:bottom w:w="80" w:type="dxa"/>
+              <w:right w:w="120" w:type="dxa"/>
+            </w:tcMar>
+          </w:tcPr>
+          <w:p>
+            <w:pPr>
+              <w:jc w:val="both"/>
+            </w:pPr>
+            <w:r>
+              <w:rPr>
+                <w:sz w:val="22"/>
+                <w:szCs w:val="22"/>
+              </w:rPr>
+              <w:t>JavaScript runtime on the server side and minimalist web framework for RESTful APIs.</w:t>
+            </w:r>
+          </w:p>
+        </w:tc>
+        <w:tc>
+          <w:tcPr>
+            <w:tcW w:w="1560" w:type="dxa"/>
+            <w:tcBorders>
+              <w:top w:val="single" w:sz="4" w:space="0" w:color="CCCCCC"/>
+              <w:left w:val="single" w:sz="4" w:space="0" w:color="CCCCCC"/>
+              <w:bottom w:val="single" w:sz="4" w:space="0" w:color="CCCCCC"/>
+              <w:right w:val="single" w:sz="4" w:space="0" w:color="CCCCCC"/>
+            </w:tcBorders>
+            <w:shd w:val="clear" w:color="auto" w:fill="FFFFFF" w:themeFill="background1"/>
+            <w:tcMar>
+              <w:top w:w="80" w:type="dxa"/>
+              <w:left w:w="120" w:type="dxa"/>
+              <w:bottom w:w="80" w:type="dxa"/>
+              <w:right w:w="120" w:type="dxa"/>
+            </w:tcMar>
+          </w:tcPr>
+          <w:p>
+            <w:pPr>
+              <w:jc w:val="both"/>
+            </w:pPr>
+            <w:r>
+              <w:rPr>
+                <w:sz w:val="22"/>
+                <w:szCs w:val="22"/>
+              </w:rPr>
+              <w:t>Aakroshan Chaudhary</w:t>
+            </w:r>
+          </w:p>
+        </w:tc>
+      </w:tr>
+      <w:tr>
+        <w:tc>
+          <w:tcPr>
+            <w:tcW w:w="1400" w:type="dxa"/>
+            <w:tcBorders>
+              <w:top w:val="single" w:sz="4" w:space="0" w:color="CCCCCC"/>
+              <w:left w:val="single" w:sz="4" w:space="0" w:color="CCCCCC"/>
+              <w:bottom w:val="single" w:sz="4" w:space="0" w:color="CCCCCC"/>
+              <w:right w:val="single" w:sz="4" w:space="0" w:color="CCCCCC"/>
+            </w:tcBorders>
+            <w:shd w:val="clear" w:color="auto" w:fill="FFFFFF" w:themeFill="background1"/>
+            <w:tcMar>
+              <w:top w:w="80" w:type="dxa"/>
+              <w:left w:w="120" w:type="dxa"/>
+              <w:bottom w:w="80" w:type="dxa"/>
+              <w:right w:w="120" w:type="dxa"/>
+            </w:tcMar>
+          </w:tcPr>
+          <w:p>
+            <w:pPr>
+              <w:jc w:val="both"/>
+            </w:pPr>
+            <w:r>
+              <w:rPr>
+                <w:sz w:val="22"/>
+                <w:szCs w:val="22"/>
+              </w:rPr>
+              <w:t>Database</w:t>
+            </w:r>
+          </w:p>
+        </w:tc>
+        <w:tc>
+          <w:tcPr>
+            <w:tcW w:w="2000" w:type="dxa"/>
+            <w:tcBorders>
+              <w:top w:val="single" w:sz="4" w:space="0" w:color="CCCCCC"/>
+              <w:left w:val="single" w:sz="4" w:space="0" w:color="CCCCCC"/>
+              <w:bottom w:val="single" w:sz="4" w:space="0" w:color="CCCCCC"/>
+              <w:right w:val="single" w:sz="4" w:space="0" w:color="CCCCCC"/>
+            </w:tcBorders>
+            <w:shd w:val="clear" w:color="auto" w:fill="FFFFFF" w:themeFill="background1"/>
+            <w:tcMar>
+              <w:top w:w="80" w:type="dxa"/>
+              <w:left w:w="120" w:type="dxa"/>
+              <w:bottom w:w="80" w:type="dxa"/>
+              <w:right w:w="120" w:type="dxa"/>
+            </w:tcMar>
+          </w:tcPr>
+          <w:p>
+            <w:pPr>
+              <w:jc w:val="both"/>
+            </w:pPr>
+            <w:r>
+              <w:rPr>
+                <w:sz w:val="22"/>
+                <w:szCs w:val="22"/>
+              </w:rPr>
+              <w:t>PostgreSQL</w:t>
+            </w:r>
+          </w:p>
+        </w:tc>
+        <w:tc>
+          <w:tcPr>
+            <w:tcW w:w="1000" w:type="dxa"/>
+            <w:tcBorders>
+              <w:top w:val="single" w:sz="4" w:space="0" w:color="CCCCCC"/>
+              <w:left w:val="single" w:sz="4" w:space="0" w:color="CCCCCC"/>
+              <w:bottom w:val="single" w:sz="4" w:space="0" w:color="CCCCCC"/>
+              <w:right w:val="single" w:sz="4" w:space="0" w:color="CCCCCC"/>
+            </w:tcBorders>
+            <w:shd w:val="clear" w:color="auto" w:fill="FFFFFF" w:themeFill="background1"/>
+            <w:tcMar>
+              <w:top w:w="80" w:type="dxa"/>
+              <w:left w:w="120" w:type="dxa"/>
+              <w:bottom w:w="80" w:type="dxa"/>
+              <w:right w:w="120" w:type="dxa"/>
+            </w:tcMar>
+          </w:tcPr>
+          <w:p>
+            <w:pPr>
+              <w:jc w:val="both"/>
+            </w:pPr>
+            <w:r>
+              <w:rPr>
+                <w:sz w:val="22"/>
+                <w:szCs w:val="22"/>
+              </w:rPr>
+              <w:t>16.x</w:t>
+            </w:r>
+          </w:p>
+        </w:tc>
+        <w:tc>
+          <w:tcPr>
+            <w:tcW w:w="3400" w:type="dxa"/>
+            <w:tcBorders>
+              <w:top w:val="single" w:sz="4" w:space="0" w:color="CCCCCC"/>
+              <w:left w:val="single" w:sz="4" w:space="0" w:color="CCCCCC"/>
+              <w:bottom w:val="single" w:sz="4" w:space="0" w:color="CCCCCC"/>
+              <w:right w:val="single" w:sz="4" w:space="0" w:color="CCCCCC"/>
+            </w:tcBorders>
+            <w:shd w:val="clear" w:color="auto" w:fill="FFFFFF" w:themeFill="background1"/>
+            <w:tcMar>
+              <w:top w:w="80" w:type="dxa"/>
+              <w:left w:w="120" w:type="dxa"/>
+              <w:bottom w:w="80" w:type="dxa"/>
+              <w:right w:w="120" w:type="dxa"/>
+            </w:tcMar>
+          </w:tcPr>
+          <w:p>
+            <w:pPr>
+              <w:jc w:val="both"/>
+            </w:pPr>
+            <w:r>
+              <w:rPr>
+                <w:sz w:val="22"/>
+                <w:szCs w:val="22"/>
+              </w:rPr>
+              <w:t>Relational database with open source code for structuring user and food data.</w:t>
+            </w:r>
+          </w:p>
+        </w:tc>
+        <w:tc>
+          <w:tcPr>
+            <w:tcW w:w="1560" w:type="dxa"/>
+            <w:tcBorders>
+              <w:top w:val="single" w:sz="4" w:space="0" w:color="CCCCCC"/>
+              <w:left w:val="single" w:sz="4" w:space="0" w:color="CCCCCC"/>
+              <w:bottom w:val="single" w:sz="4" w:space="0" w:color="CCCCCC"/>
+              <w:right w:val="single" w:sz="4" w:space="0" w:color="CCCCCC"/>
+            </w:tcBorders>
+            <w:shd w:val="clear" w:color="auto" w:fill="FFFFFF" w:themeFill="background1"/>
+            <w:tcMar>
+              <w:top w:w="80" w:type="dxa"/>
+              <w:left w:w="120" w:type="dxa"/>
+              <w:bottom w:w="80" w:type="dxa"/>
+              <w:right w:w="120" w:type="dxa"/>
+            </w:tcMar>
+          </w:tcPr>
+          <w:p>
+            <w:pPr>
+              <w:jc w:val="both"/>
+            </w:pPr>
+            <w:r>
+              <w:rPr>
+                <w:sz w:val="22"/>
+                <w:szCs w:val="22"/>
+              </w:rPr>
+              <w:t>Ajay Goit</w:t>
+            </w:r>
+          </w:p>
+        </w:tc>
+      </w:tr>
+      <w:tr>
+        <w:tc>
+          <w:tcPr>
+            <w:tcW w:w="1400" w:type="dxa"/>
+            <w:tcBorders>
+              <w:top w:val="single" w:sz="4" w:space="0" w:color="CCCCCC"/>
+              <w:left w:val="single" w:sz="4" w:space="0" w:color="CCCCCC"/>
+              <w:bottom w:val="single" w:sz="4" w:space="0" w:color="CCCCCC"/>
+              <w:right w:val="single" w:sz="4" w:space="0" w:color="CCCCCC"/>
+            </w:tcBorders>
+            <w:shd w:val="clear" w:color="auto" w:fill="FFFFFF" w:themeFill="background1"/>
+            <w:tcMar>
+              <w:top w:w="80" w:type="dxa"/>
+              <w:left w:w="120" w:type="dxa"/>
+              <w:bottom w:w="80" w:type="dxa"/>
+              <w:right w:w="120" w:type="dxa"/>
+            </w:tcMar>
+          </w:tcPr>
+          <w:p>
+            <w:pPr>
+              <w:jc w:val="both"/>
+            </w:pPr>
+            <w:r>
+              <w:rPr>
+                <w:sz w:val="22"/>
+                <w:szCs w:val="22"/>
+              </w:rPr>
+              <w:t>API Testing</w:t>
+            </w:r>
+          </w:p>
+        </w:tc>
+        <w:tc>
+          <w:tcPr>
+            <w:tcW w:w="2000" w:type="dxa"/>
+            <w:tcBorders>
+              <w:top w:val="single" w:sz="4" w:space="0" w:color="CCCCCC"/>
+              <w:left w:val="single" w:sz="4" w:space="0" w:color="CCCCCC"/>
+              <w:bottom w:val="single" w:sz="4" w:space="0" w:color="CCCCCC"/>
+              <w:right w:val="single" w:sz="4" w:space="0" w:color="CCCCCC"/>
+            </w:tcBorders>
+            <w:shd w:val="clear" w:color="auto" w:fill="FFFFFF" w:themeFill="background1"/>
+            <w:tcMar>
+              <w:top w:w="80" w:type="dxa"/>
+              <w:left w:w="120" w:type="dxa"/>
+              <w:bottom w:w="80" w:type="dxa"/>
+              <w:right w:w="120" w:type="dxa"/>
+            </w:tcMar>
+          </w:tcPr>
+          <w:p>
+            <w:pPr>
+              <w:jc w:val="both"/>
+            </w:pPr>
+            <w:r>
+              <w:rPr>
+                <w:sz w:val="22"/>
+                <w:szCs w:val="22"/>
+              </w:rPr>
+              <w:t>Postman</w:t>
+            </w:r>
+          </w:p>
+        </w:tc>
+        <w:tc>
+          <w:tcPr>
+            <w:tcW w:w="1000" w:type="dxa"/>
+            <w:tcBorders>
+              <w:top w:val="single" w:sz="4" w:space="0" w:color="CCCCCC"/>
+              <w:left w:val="single" w:sz="4" w:space="0" w:color="CCCCCC"/>
+              <w:bottom w:val="single" w:sz="4" w:space="0" w:color="CCCCCC"/>
+              <w:right w:val="single" w:sz="4" w:space="0" w:color="CCCCCC"/>
+            </w:tcBorders>
+            <w:shd w:val="clear" w:color="auto" w:fill="FFFFFF" w:themeFill="background1"/>
+            <w:tcMar>
+              <w:top w:w="80" w:type="dxa"/>
+              <w:left w:w="120" w:type="dxa"/>
+              <w:bottom w:w="80" w:type="dxa"/>
+              <w:right w:w="120" w:type="dxa"/>
+            </w:tcMar>
+          </w:tcPr>
+          <w:p>
+            <w:pPr>
+              <w:jc w:val="both"/>
+            </w:pPr>
+            <w:r>
+              <w:rPr>
+                <w:sz w:val="22"/>
+                <w:szCs w:val="22"/>
+              </w:rPr>
+              <w:t>Latest</w:t>
+            </w:r>
+          </w:p>
+        </w:tc>
+        <w:tc>
+          <w:tcPr>
+            <w:tcW w:w="3400" w:type="dxa"/>
+            <w:tcBorders>
+              <w:top w:val="single" w:sz="4" w:space="0" w:color="CCCCCC"/>
+              <w:left w:val="single" w:sz="4" w:space="0" w:color="CCCCCC"/>
+              <w:bottom w:val="single" w:sz="4" w:space="0" w:color="CCCCCC"/>
+              <w:right w:val="single" w:sz="4" w:space="0" w:color="CCCCCC"/>
+            </w:tcBorders>
+            <w:shd w:val="clear" w:color="auto" w:fill="FFFFFF" w:themeFill="background1"/>
+            <w:tcMar>
+              <w:top w:w="80" w:type="dxa"/>
+              <w:left w:w="120" w:type="dxa"/>
+              <w:bottom w:w="80" w:type="dxa"/>
+              <w:right w:w="120" w:type="dxa"/>
+            </w:tcMar>
+          </w:tcPr>
+          <w:p>
+            <w:pPr>
+              <w:jc w:val="both"/>
+            </w:pPr>
+            <w:r>
+              <w:rPr>
+                <w:sz w:val="22"/>
+                <w:szCs w:val="22"/>
+              </w:rPr>
+              <w:t>Tool for developing and testing REST APIs.</w:t>
+            </w:r>
+          </w:p>
+        </w:tc>
+        <w:tc>
+          <w:tcPr>
+            <w:tcW w:w="1560" w:type="dxa"/>
+            <w:tcBorders>
+              <w:top w:val="single" w:sz="4" w:space="0" w:color="CCCCCC"/>
+              <w:left w:val="single" w:sz="4" w:space="0" w:color="CCCCCC"/>
+              <w:bottom w:val="single" w:sz="4" w:space="0" w:color="CCCCCC"/>
+              <w:right w:val="single" w:sz="4" w:space="0" w:color="CCCCCC"/>
+            </w:tcBorders>
+            <w:shd w:val="clear" w:color="auto" w:fill="FFFFFF" w:themeFill="background1"/>
+            <w:tcMar>
+              <w:top w:w="80" w:type="dxa"/>
+              <w:left w:w="120" w:type="dxa"/>
+              <w:bottom w:w="80" w:type="dxa"/>
+              <w:right w:w="120" w:type="dxa"/>
+            </w:tcMar>
+          </w:tcPr>
+          <w:p>
+            <w:pPr>
+              <w:jc w:val="both"/>
+            </w:pPr>
+            <w:r>
+              <w:rPr>
+                <w:sz w:val="22"/>
+                <w:szCs w:val="22"/>
+              </w:rPr>
+              <w:t>All Members</w:t>
+            </w:r>
+          </w:p>
+        </w:tc>
+      </w:tr>
+      <w:tr>
+        <w:tc>
+          <w:tcPr>
+            <w:tcW w:w="9360" w:type="dxa"/>
+            <w:gridSpan w:val="5"/>
+            <w:tcBorders>
+              <w:top w:val="single" w:sz="4" w:space="0" w:color="CCCCCC"/>
+              <w:left w:val="single" w:sz="4" w:space="0" w:color="CCCCCC"/>
+              <w:bottom w:val="single" w:sz="4" w:space="0" w:color="CCCCCC"/>
+              <w:right w:val="single" w:sz="4" w:space="0" w:color="CCCCCC"/>
+            </w:tcBorders>
+            <w:shd w:val="clear" w:color="auto" w:fill="FFFFFF" w:themeFill="background1"/>
+            <w:tcMar>
+              <w:top w:w="80" w:type="dxa"/>
+              <w:left w:w="120" w:type="dxa"/>
+              <w:bottom w:w="80" w:type="dxa"/>
+              <w:right w:w="120" w:type="dxa"/>
+            </w:tcMar>
+          </w:tcPr>
+          <w:p>
+            <w:r>
+              <w:rPr>
+                <w:b/>
+                <w:bCs/>
+                <w:iCs/>
+                <w:sz w:val="22"/>
+                <w:szCs w:val="22"/>
+              </w:rPr>
+              <w:t>Hardware (Notebook)</w:t>
+            </w:r>
+          </w:p>
+        </w:tc>
+      </w:tr>
+      <w:tr>
+        <w:tc>
+          <w:tcPr>
+            <w:tcW w:w="1400" w:type="dxa"/>
+            <w:tcBorders>
+              <w:top w:val="single" w:sz="4" w:space="0" w:color="CCCCCC"/>
+              <w:left w:val="single" w:sz="4" w:space="0" w:color="CCCCCC"/>
+              <w:bottom w:val="single" w:sz="4" w:space="0" w:color="CCCCCC"/>
+              <w:right w:val="single" w:sz="4" w:space="0" w:color="CCCCCC"/>
+            </w:tcBorders>
+            <w:shd w:val="clear" w:color="auto" w:fill="FFFFFF" w:themeFill="background1"/>
+            <w:tcMar>
+              <w:top w:w="80" w:type="dxa"/>
+              <w:left w:w="120" w:type="dxa"/>
+              <w:bottom w:w="80" w:type="dxa"/>
+              <w:right w:w="120" w:type="dxa"/>
+            </w:tcMar>
+          </w:tcPr>
+          <w:p>
+            <w:pPr>
+              <w:jc w:val="both"/>
+            </w:pPr>
+            <w:r>
+              <w:rPr>
+                <w:sz w:val="22"/>
+                <w:szCs w:val="22"/>
+              </w:rPr>
+              <w:t>Aaditya Notebook</w:t>
+            </w:r>
+          </w:p>
+        </w:tc>
+        <w:tc>
+          <w:tcPr>
+            <w:tcW w:w="2000" w:type="dxa"/>
+            <w:tcBorders>
+              <w:top w:val="single" w:sz="4" w:space="0" w:color="CCCCCC"/>
+              <w:left w:val="single" w:sz="4" w:space="0" w:color="CCCCCC"/>
+              <w:bottom w:val="single" w:sz="4" w:space="0" w:color="CCCCCC"/>
+              <w:right w:val="single" w:sz="4" w:space="0" w:color="CCCCCC"/>
+            </w:tcBorders>
+            <w:shd w:val="clear" w:color="auto" w:fill="FFFFFF" w:themeFill="background1"/>
+            <w:tcMar>
+              <w:top w:w="80" w:type="dxa"/>
+              <w:left w:w="120" w:type="dxa"/>
+              <w:bottom w:w="80" w:type="dxa"/>
+              <w:right w:w="120" w:type="dxa"/>
+            </w:tcMar>
+          </w:tcPr>
+          <w:p>
+            <w:pPr>
+              <w:jc w:val="both"/>
+            </w:pPr>
+            <w:r>
+              <w:rPr>
+                <w:sz w:val="22"/>
+                <w:szCs w:val="22"/>
+              </w:rPr>
+              <w:t>Lenovo IdeaPad 3</w:t>
+            </w:r>
+          </w:p>
+        </w:tc>
+        <w:tc>
+          <w:tcPr>
+            <w:tcW w:w="1000" w:type="dxa"/>
+            <w:tcBorders>
+              <w:top w:val="single" w:sz="4" w:space="0" w:color="CCCCCC"/>
+              <w:left w:val="single" w:sz="4" w:space="0" w:color="CCCCCC"/>
+              <w:bottom w:val="single" w:sz="4" w:space="0" w:color="CCCCCC"/>
+              <w:right w:val="single" w:sz="4" w:space="0" w:color="CCCCCC"/>
+            </w:tcBorders>
+            <w:shd w:val="clear" w:color="auto" w:fill="FFFFFF" w:themeFill="background1"/>
+            <w:tcMar>
+              <w:top w:w="80" w:type="dxa"/>
+              <w:left w:w="120" w:type="dxa"/>
+              <w:bottom w:w="80" w:type="dxa"/>
+              <w:right w:w="120" w:type="dxa"/>
+            </w:tcMar>
+          </w:tcPr>
+          <w:p>
+            <w:pPr>
+              <w:jc w:val="both"/>
+            </w:pPr>
+            <w:r>
+              <w:rPr>
+                <w:sz w:val="22"/>
+                <w:szCs w:val="22"/>
+              </w:rPr>
+              <w:t>Windows 11</w:t>
+            </w:r>
+          </w:p>
+        </w:tc>
+        <w:tc>
+          <w:tcPr>
+            <w:tcW w:w="3400" w:type="dxa"/>
+            <w:tcBorders>
+              <w:top w:val="single" w:sz="4" w:space="0" w:color="CCCCCC"/>
+              <w:left w:val="single" w:sz="4" w:space="0" w:color="CCCCCC"/>
+              <w:bottom w:val="single" w:sz="4" w:space="0" w:color="CCCCCC"/>
+              <w:right w:val="single" w:sz="4" w:space="0" w:color="CCCCCC"/>
+            </w:tcBorders>
+            <w:shd w:val="clear" w:color="auto" w:fill="FFFFFF" w:themeFill="background1"/>
+            <w:tcMar>
+              <w:top w:w="80" w:type="dxa"/>
+              <w:left w:w="120" w:type="dxa"/>
+              <w:bottom w:w="80" w:type="dxa"/>
+              <w:right w:w="120" w:type="dxa"/>
+            </w:tcMar>
+          </w:tcPr>
+          <w:p>
+            <w:pPr>
+              <w:jc w:val="both"/>
+            </w:pPr>
+            <w:r>
+              <w:rPr>
+                <w:sz w:val="22"/>
+                <w:szCs w:val="22"/>
+              </w:rPr>
+              <w:t>Main development machine: Intel Core i5-1235U, 8 GB RAM, 512 GB SSD.</w:t>
+            </w:r>
+          </w:p>
+        </w:tc>
+        <w:tc>
+          <w:tcPr>
+            <w:tcW w:w="1560" w:type="dxa"/>
+            <w:tcBorders>
+              <w:top w:val="single" w:sz="4" w:space="0" w:color="CCCCCC"/>
+              <w:left w:val="single" w:sz="4" w:space="0" w:color="CCCCCC"/>
+              <w:bottom w:val="single" w:sz="4" w:space="0" w:color="CCCCCC"/>
+              <w:right w:val="single" w:sz="4" w:space="0" w:color="CCCCCC"/>
+            </w:tcBorders>
+            <w:shd w:val="clear" w:color="auto" w:fill="FFFFFF" w:themeFill="background1"/>
+            <w:tcMar>
+              <w:top w:w="80" w:type="dxa"/>
+              <w:left w:w="120" w:type="dxa"/>
+              <w:bottom w:w="80" w:type="dxa"/>
+              <w:right w:w="120" w:type="dxa"/>
+            </w:tcMar>
+          </w:tcPr>
+          <w:p>
+            <w:pPr>
+              <w:jc w:val="both"/>
+            </w:pPr>
+            <w:r>
+              <w:rPr>
+                <w:sz w:val="22"/>
+                <w:szCs w:val="22"/>
+              </w:rPr>
+              <w:t>Aaditya Chaudhary</w:t>
+            </w:r>
+          </w:p>
+        </w:tc>
+      </w:tr>
+      <w:tr>
+        <w:tc>
+          <w:tcPr>
+            <w:tcW w:w="1400" w:type="dxa"/>
+            <w:tcBorders>
+              <w:top w:val="single" w:sz="4" w:space="0" w:color="CCCCCC"/>
+              <w:left w:val="single" w:sz="4" w:space="0" w:color="CCCCCC"/>
+              <w:bottom w:val="single" w:sz="4" w:space="0" w:color="CCCCCC"/>
+              <w:right w:val="single" w:sz="4" w:space="0" w:color="CCCCCC"/>
+            </w:tcBorders>
+            <w:shd w:val="clear" w:color="auto" w:fill="FFFFFF" w:themeFill="background1"/>
+            <w:tcMar>
+              <w:top w:w="80" w:type="dxa"/>
+              <w:left w:w="120" w:type="dxa"/>
+              <w:bottom w:w="80" w:type="dxa"/>
+              <w:right w:w="120" w:type="dxa"/>
+            </w:tcMar>
+          </w:tcPr>
+          <w:p>
+            <w:pPr>
+              <w:jc w:val="both"/>
+            </w:pPr>
+            <w:r>
+              <w:rPr>
+                <w:sz w:val="22"/>
+                <w:szCs w:val="22"/>
+              </w:rPr>
+              <w:t>Aakroshan Notebook</w:t>
+            </w:r>
+          </w:p>
+        </w:tc>
+        <w:tc>
+          <w:tcPr>
+            <w:tcW w:w="2000" w:type="dxa"/>
+            <w:tcBorders>
+              <w:top w:val="single" w:sz="4" w:space="0" w:color="CCCCCC"/>
+              <w:left w:val="single" w:sz="4" w:space="0" w:color="CCCCCC"/>
+              <w:bottom w:val="single" w:sz="4" w:space="0" w:color="CCCCCC"/>
+              <w:right w:val="single" w:sz="4" w:space="0" w:color="CCCCCC"/>
+            </w:tcBorders>
+            <w:shd w:val="clear" w:color="auto" w:fill="FFFFFF" w:themeFill="background1"/>
+            <w:tcMar>
+              <w:top w:w="80" w:type="dxa"/>
+              <w:left w:w="120" w:type="dxa"/>
+              <w:bottom w:w="80" w:type="dxa"/>
+              <w:right w:w="120" w:type="dxa"/>
+            </w:tcMar>
+          </w:tcPr>
+          <w:p>
+            <w:pPr>
+              <w:jc w:val="both"/>
+            </w:pPr>
+            <w:r>
+              <w:rPr>
+                <w:sz w:val="22"/>
+                <w:szCs w:val="22"/>
+              </w:rPr>
+              <w:t>HP Pavilion 15</w:t>
+            </w:r>
+          </w:p>
+        </w:tc>
+        <w:tc>
+          <w:tcPr>
+            <w:tcW w:w="1000" w:type="dxa"/>
+            <w:tcBorders>
+              <w:top w:val="single" w:sz="4" w:space="0" w:color="CCCCCC"/>
+              <w:left w:val="single" w:sz="4" w:space="0" w:color="CCCCCC"/>
+              <w:bottom w:val="single" w:sz="4" w:space="0" w:color="CCCCCC"/>
+              <w:right w:val="single" w:sz="4" w:space="0" w:color="CCCCCC"/>
+            </w:tcBorders>
+            <w:shd w:val="clear" w:color="auto" w:fill="FFFFFF" w:themeFill="background1"/>
+            <w:tcMar>
+              <w:top w:w="80" w:type="dxa"/>
+              <w:left w:w="120" w:type="dxa"/>
+              <w:bottom w:w="80" w:type="dxa"/>
+              <w:right w:w="120" w:type="dxa"/>
+            </w:tcMar>
+          </w:tcPr>
+          <w:p>
+            <w:pPr>
+              <w:jc w:val="both"/>
+            </w:pPr>
+            <w:r>
+              <w:rPr>
+                <w:sz w:val="22"/>
+                <w:szCs w:val="22"/>
+              </w:rPr>
+              <w:t>Windows 11 Home</w:t>
+            </w:r>
+          </w:p>
+        </w:tc>
+        <w:tc>
+          <w:tcPr>
+            <w:tcW w:w="3400" w:type="dxa"/>
+            <w:tcBorders>
+              <w:top w:val="single" w:sz="4" w:space="0" w:color="CCCCCC"/>
+              <w:left w:val="single" w:sz="4" w:space="0" w:color="CCCCCC"/>
+              <w:bottom w:val="single" w:sz="4" w:space="0" w:color="CCCCCC"/>
+              <w:right w:val="single" w:sz="4" w:space="0" w:color="CCCCCC"/>
+            </w:tcBorders>
+            <w:shd w:val="clear" w:color="auto" w:fill="FFFFFF" w:themeFill="background1"/>
+            <w:tcMar>
+              <w:top w:w="80" w:type="dxa"/>
+              <w:left w:w="120" w:type="dxa"/>
+              <w:bottom w:w="80" w:type="dxa"/>
+              <w:right w:w="120" w:type="dxa"/>
+            </w:tcMar>
+          </w:tcPr>
+          <w:p>
+            <w:pPr>
+              <w:jc w:val="both"/>
+            </w:pPr>
+            <w:r>
+              <w:rPr>
+                <w:sz w:val="22"/>
+                <w:szCs w:val="22"/>
+              </w:rPr>
+              <w:t>Intel Core i</w:t>
+            </w:r>
+            <w:r>
+              <w:rPr>
+                <w:sz w:val="22"/>
+                <w:szCs w:val="22"/>
+              </w:rPr>
+              <w:t>5-1135G7, 8 GB RAM, 512 GB SSD</w:t>
+            </w:r>
+            <w:r>
+              <w:rPr>
+                <w:sz w:val="22"/>
+                <w:szCs w:val="22"/>
+              </w:rPr>
+              <w:t xml:space="preserve"> development and documentation.</w:t>
+            </w:r>
+          </w:p>
+        </w:tc>
+        <w:tc>
+          <w:tcPr>
+            <w:tcW w:w="1560" w:type="dxa"/>
+            <w:tcBorders>
+              <w:top w:val="single" w:sz="4" w:space="0" w:color="CCCCCC"/>
+              <w:left w:val="single" w:sz="4" w:space="0" w:color="CCCCCC"/>
+              <w:bottom w:val="single" w:sz="4" w:space="0" w:color="CCCCCC"/>
+              <w:right w:val="single" w:sz="4" w:space="0" w:color="CCCCCC"/>
+            </w:tcBorders>
+            <w:shd w:val="clear" w:color="auto" w:fill="FFFFFF" w:themeFill="background1"/>
+            <w:tcMar>
+              <w:top w:w="80" w:type="dxa"/>
+              <w:left w:w="120" w:type="dxa"/>
+              <w:bottom w:w="80" w:type="dxa"/>
+              <w:right w:w="120" w:type="dxa"/>
+            </w:tcMar>
+          </w:tcPr>
+          <w:p>
+            <w:pPr>
+              <w:jc w:val="both"/>
+            </w:pPr>
+            <w:r>
+              <w:rPr>
+                <w:sz w:val="22"/>
+                <w:szCs w:val="22"/>
+              </w:rPr>
+              <w:t>Aakroshan</w:t>
+            </w:r>
+          </w:p>
+        </w:tc>
+      </w:tr>
+      <w:tr>
+        <w:tc>
+          <w:tcPr>
+            <w:tcW w:w="1400" w:type="dxa"/>
+            <w:tcBorders>
+              <w:top w:val="single" w:sz="4" w:space="0" w:color="CCCCCC"/>
+              <w:left w:val="single" w:sz="4" w:space="0" w:color="CCCCCC"/>
+              <w:bottom w:val="single" w:sz="4" w:space="0" w:color="CCCCCC"/>
+              <w:right w:val="single" w:sz="4" w:space="0" w:color="CCCCCC"/>
+            </w:tcBorders>
+            <w:shd w:val="clear" w:color="auto" w:fill="FFFFFF" w:themeFill="background1"/>
+            <w:tcMar>
+              <w:top w:w="80" w:type="dxa"/>
+              <w:left w:w="120" w:type="dxa"/>
+              <w:bottom w:w="80" w:type="dxa"/>
+              <w:right w:w="120" w:type="dxa"/>
+            </w:tcMar>
+          </w:tcPr>
+          <w:p>
+            <w:pPr>
+              <w:jc w:val="both"/>
+            </w:pPr>
+            <w:r>
+              <w:rPr>
+                <w:sz w:val="22"/>
+                <w:szCs w:val="22"/>
+              </w:rPr>
+              <w:t>Ajay Notebook</w:t>
+            </w:r>
+          </w:p>
+        </w:tc>
+        <w:tc>
+          <w:tcPr>
+            <w:tcW w:w="2000" w:type="dxa"/>
+            <w:tcBorders>
+              <w:top w:val="single" w:sz="4" w:space="0" w:color="CCCCCC"/>
+              <w:left w:val="single" w:sz="4" w:space="0" w:color="CCCCCC"/>
+              <w:bottom w:val="single" w:sz="4" w:space="0" w:color="CCCCCC"/>
+              <w:right w:val="single" w:sz="4" w:space="0" w:color="CCCCCC"/>
+            </w:tcBorders>
+            <w:shd w:val="clear" w:color="auto" w:fill="FFFFFF" w:themeFill="background1"/>
+            <w:tcMar>
+              <w:top w:w="80" w:type="dxa"/>
+              <w:left w:w="120" w:type="dxa"/>
+              <w:bottom w:w="80" w:type="dxa"/>
+              <w:right w:w="120" w:type="dxa"/>
+            </w:tcMar>
+          </w:tcPr>
+          <w:p>
+            <w:pPr>
+              <w:jc w:val="both"/>
+            </w:pPr>
+            <w:r>
+              <w:rPr>
+                <w:sz w:val="22"/>
+                <w:szCs w:val="22"/>
+              </w:rPr>
+              <w:t>ASUS VivoBook 15</w:t>
+            </w:r>
+          </w:p>
+        </w:tc>
+        <w:tc>
+          <w:tcPr>
+            <w:tcW w:w="1000" w:type="dxa"/>
+            <w:tcBorders>
+              <w:top w:val="single" w:sz="4" w:space="0" w:color="CCCCCC"/>
+              <w:left w:val="single" w:sz="4" w:space="0" w:color="CCCCCC"/>
+              <w:bottom w:val="single" w:sz="4" w:space="0" w:color="CCCCCC"/>
+              <w:right w:val="single" w:sz="4" w:space="0" w:color="CCCCCC"/>
+            </w:tcBorders>
+            <w:shd w:val="clear" w:color="auto" w:fill="FFFFFF" w:themeFill="background1"/>
+            <w:tcMar>
+              <w:top w:w="80" w:type="dxa"/>
+              <w:left w:w="120" w:type="dxa"/>
+              <w:bottom w:w="80" w:type="dxa"/>
+              <w:right w:w="120" w:type="dxa"/>
+            </w:tcMar>
+          </w:tcPr>
+          <w:p>
+            <w:pPr>
+              <w:jc w:val="both"/>
+            </w:pPr>
+            <w:r>
+              <w:rPr>
+                <w:sz w:val="22"/>
+                <w:szCs w:val="22"/>
+              </w:rPr>
+              <w:t>Windows 11 Home</w:t>
+            </w:r>
+          </w:p>
+        </w:tc>
+        <w:tc>
+          <w:tcPr>
+            <w:tcW w:w="3400" w:type="dxa"/>
+            <w:tcBorders>
+              <w:top w:val="single" w:sz="4" w:space="0" w:color="CCCCCC"/>
+              <w:left w:val="single" w:sz="4" w:space="0" w:color="CCCCCC"/>
+              <w:bottom w:val="single" w:sz="4" w:space="0" w:color="CCCCCC"/>
+              <w:right w:val="single" w:sz="4" w:space="0" w:color="CCCCCC"/>
+            </w:tcBorders>
+            <w:shd w:val="clear" w:color="auto" w:fill="FFFFFF" w:themeFill="background1"/>
+            <w:tcMar>
+              <w:top w:w="80" w:type="dxa"/>
+              <w:left w:w="120" w:type="dxa"/>
+              <w:bottom w:w="80" w:type="dxa"/>
+              <w:right w:w="120" w:type="dxa"/>
+            </w:tcMar>
+          </w:tcPr>
+          <w:p>
+            <w:pPr>
+              <w:jc w:val="both"/>
+            </w:pPr>
+            <w:r>
+              <w:rPr>
+                <w:sz w:val="22"/>
+                <w:szCs w:val="22"/>
+              </w:rPr>
+              <w:t>AMD Ryzen 5 5500U, 8 GB RAM, 512 GB SSD Gantt chart and risk planning.</w:t>
+            </w:r>
+          </w:p>
+        </w:tc>
+        <w:tc>
+          <w:tcPr>
+            <w:tcW w:w="1560" w:type="dxa"/>
+            <w:tcBorders>
+              <w:top w:val="single" w:sz="4" w:space="0" w:color="CCCCCC"/>
+              <w:left w:val="single" w:sz="4" w:space="0" w:color="CCCCCC"/>
+              <w:bottom w:val="single" w:sz="4" w:space="0" w:color="CCCCCC"/>
+              <w:right w:val="single" w:sz="4" w:space="0" w:color="CCCCCC"/>
+            </w:tcBorders>
+            <w:shd w:val="clear" w:color="auto" w:fill="FFFFFF" w:themeFill="background1"/>
+            <w:tcMar>
+              <w:top w:w="80" w:type="dxa"/>
+              <w:left w:w="120" w:type="dxa"/>
+              <w:bottom w:w="80" w:type="dxa"/>
+              <w:right w:w="120" w:type="dxa"/>
+            </w:tcMar>
+          </w:tcPr>
+          <w:p>
+            <w:pPr>
+              <w:jc w:val="both"/>
+            </w:pPr>
+            <w:r>
+              <w:rPr>
+                <w:sz w:val="22"/>
+                <w:szCs w:val="22"/>
+              </w:rPr>
+              <w:t>Ajay</w:t>
+            </w:r>
+          </w:p>
+        </w:tc>
+      </w:tr>
+    </w:tbl>
+    <w:p>
+      <w:pPr>
+        <w:spacing w:after="160" w:line="360" w:lineRule="auto"/>
+      </w:pPr>
+    </w:p>
+    <w:p>
+      <w:pPr>
+        <w:spacing w:line="360" w:lineRule="auto"/>
+        <w:jc w:val="both"/>
+      </w:pPr>
+      <w:r>
+        <w:t>We will store all source codes on a GitHub repository named "saveplate-bit216" which is hosted on the team leader's GitHub account. Besides the team leader himself, all three team members will be added as collaborators to the repository. To ensure traceable development history, branches will be named f</w:t>
+      </w:r>
+      <w:r>
+        <w:t>ollowing the convention feature</w:t>
+      </w:r>
+      <w:r>
+        <w:t>.</w:t>
+      </w:r>
+      <w:r>
+        <w:br w:type="page"/>
+      </w:r>
+    </w:p>
+    <w:p>
+      <w:pPr>
+        <w:pStyle w:val="Heading2"/>
+        <w:rPr>
+          <w:color w:val="auto"/>
+        </w:rPr>
+      </w:pPr>
+      <w:bookmarkStart w:id="65" w:name="_Toc232158134"/>
+      <w:bookmarkStart w:id="66" w:name="_Toc232158736"/>
+      <w:bookmarkStart w:id="67" w:name="_Toc232158894"/>
+      <w:r>
+        <w:rPr>
+          <w:color w:val="auto"/>
+        </w:rPr>
+        <w:t>6.2  Demonstration Platform</w:t>
+      </w:r>
+      <w:bookmarkEnd w:id="65"/>
+      <w:bookmarkEnd w:id="66"/>
+      <w:bookmarkEnd w:id="67"/>
+    </w:p>
+    <w:p>
+      <w:pPr>
+        <w:spacing w:after="160" w:line="360" w:lineRule="auto"/>
+      </w:pPr>
+      <w:r>
+        <w:t>The subsequent table outlines the tools and environment to be utilized for demonstrating the SavePlate application:</w:t>
+      </w:r>
+    </w:p>
+    <w:p>
+      <w:pPr>
+        <w:spacing w:after="160" w:line="360" w:lineRule="auto"/>
+      </w:pPr>
+      <w:r>
+        <w:t>Table 4: Demostrating the saveplate application</w:t>
+      </w:r>
+    </w:p>
+    <w:tbl>
+      <w:tblPr>
+        <w:tblW w:w="9360" w:type="dxa"/>
+        <w:tblBorders>
+          <w:top w:val="single" w:sz="4" w:space="0" w:color="auto"/>
+          <w:left w:val="single" w:sz="4" w:space="0" w:color="auto"/>
+          <w:bottom w:val="single" w:sz="4" w:space="0" w:color="auto"/>
+          <w:right w:val="single" w:sz="4" w:space="0" w:color="auto"/>
+          <w:insideH w:val="single" w:sz="4" w:space="0" w:color="auto"/>
+          <w:insideV w:val="single" w:sz="4" w:space="0" w:color="auto"/>
+        </w:tblBorders>
+        <w:shd w:val="clear" w:color="auto" w:fill="FFFFFF" w:themeFill="background1"/>
+        <w:tblCellMar>
+          <w:left w:w="10" w:type="dxa"/>
+          <w:right w:w="10" w:type="dxa"/>
+        </w:tblCellMar>
+        <w:tblLook w:val="0000" w:firstRow="0" w:lastRow="0" w:firstColumn="0" w:lastColumn="0" w:noHBand="0" w:noVBand="0"/>
+      </w:tblPr>
+      <w:tblGrid>
+        <w:gridCol w:w="1399"/>
+        <w:gridCol w:w="1987"/>
+        <w:gridCol w:w="1072"/>
+        <w:gridCol w:w="4902"/>
+      </w:tblGrid>
+      <w:tr>
+        <w:tc>
+          <w:tcPr>
+            <w:tcW w:w="1400" w:type="dxa"/>
+            <w:tcBorders>
+              <w:top w:val="single" w:sz="4" w:space="0" w:color="CCCCCC"/>
+              <w:left w:val="single" w:sz="4" w:space="0" w:color="CCCCCC"/>
+              <w:bottom w:val="single" w:sz="4" w:space="0" w:color="CCCCCC"/>
+              <w:right w:val="single" w:sz="4" w:space="0" w:color="CCCCCC"/>
+            </w:tcBorders>
+            <w:shd w:val="clear" w:color="auto" w:fill="FFFFFF" w:themeFill="background1"/>
+            <w:tcMar>
+              <w:top w:w="80" w:type="dxa"/>
+              <w:left w:w="120" w:type="dxa"/>
+              <w:bottom w:w="80" w:type="dxa"/>
+              <w:right w:w="120" w:type="dxa"/>
+            </w:tcMar>
+          </w:tcPr>
+          <w:p>
+            <w:pPr>
+              <w:jc w:val="both"/>
+            </w:pPr>
+            <w:r>
+              <w:rPr>
+                <w:b/>
+                <w:bCs/>
+                <w:sz w:val="22"/>
+                <w:szCs w:val="22"/>
+              </w:rPr>
+              <w:t>Criteria</w:t>
+            </w:r>
+          </w:p>
+        </w:tc>
+        <w:tc>
+          <w:tcPr>
+            <w:tcW w:w="2000" w:type="dxa"/>
+            <w:tcBorders>
+              <w:top w:val="single" w:sz="4" w:space="0" w:color="CCCCCC"/>
+              <w:left w:val="single" w:sz="4" w:space="0" w:color="CCCCCC"/>
+              <w:bottom w:val="single" w:sz="4" w:space="0" w:color="CCCCCC"/>
+              <w:right w:val="single" w:sz="4" w:space="0" w:color="CCCCCC"/>
+            </w:tcBorders>
+            <w:shd w:val="clear" w:color="auto" w:fill="FFFFFF" w:themeFill="background1"/>
+            <w:tcMar>
+              <w:top w:w="80" w:type="dxa"/>
+              <w:left w:w="120" w:type="dxa"/>
+              <w:bottom w:w="80" w:type="dxa"/>
+              <w:right w:w="120" w:type="dxa"/>
+            </w:tcMar>
+          </w:tcPr>
+          <w:p>
+            <w:pPr>
+              <w:jc w:val="both"/>
+            </w:pPr>
+            <w:r>
+              <w:rPr>
+                <w:b/>
+                <w:bCs/>
+                <w:sz w:val="22"/>
+                <w:szCs w:val="22"/>
+              </w:rPr>
+              <w:t>Tools / Hardware</w:t>
+            </w:r>
+          </w:p>
+        </w:tc>
+        <w:tc>
+          <w:tcPr>
+            <w:tcW w:w="1000" w:type="dxa"/>
+            <w:tcBorders>
+              <w:top w:val="single" w:sz="4" w:space="0" w:color="CCCCCC"/>
+              <w:left w:val="single" w:sz="4" w:space="0" w:color="CCCCCC"/>
+              <w:bottom w:val="single" w:sz="4" w:space="0" w:color="CCCCCC"/>
+              <w:right w:val="single" w:sz="4" w:space="0" w:color="CCCCCC"/>
+            </w:tcBorders>
+            <w:shd w:val="clear" w:color="auto" w:fill="FFFFFF" w:themeFill="background1"/>
+            <w:tcMar>
+              <w:top w:w="80" w:type="dxa"/>
+              <w:left w:w="120" w:type="dxa"/>
+              <w:bottom w:w="80" w:type="dxa"/>
+              <w:right w:w="120" w:type="dxa"/>
+            </w:tcMar>
+          </w:tcPr>
+          <w:p>
+            <w:pPr>
+              <w:jc w:val="both"/>
+            </w:pPr>
+            <w:r>
+              <w:rPr>
+                <w:b/>
+                <w:bCs/>
+                <w:sz w:val="22"/>
+                <w:szCs w:val="22"/>
+              </w:rPr>
+              <w:t>Version</w:t>
+            </w:r>
+          </w:p>
+        </w:tc>
+        <w:tc>
+          <w:tcPr>
+            <w:tcW w:w="4960" w:type="dxa"/>
+            <w:tcBorders>
+              <w:top w:val="single" w:sz="4" w:space="0" w:color="CCCCCC"/>
+              <w:left w:val="single" w:sz="4" w:space="0" w:color="CCCCCC"/>
+              <w:bottom w:val="single" w:sz="4" w:space="0" w:color="CCCCCC"/>
+              <w:right w:val="single" w:sz="4" w:space="0" w:color="CCCCCC"/>
+            </w:tcBorders>
+            <w:shd w:val="clear" w:color="auto" w:fill="FFFFFF" w:themeFill="background1"/>
+            <w:tcMar>
+              <w:top w:w="80" w:type="dxa"/>
+              <w:left w:w="120" w:type="dxa"/>
+              <w:bottom w:w="80" w:type="dxa"/>
+              <w:right w:w="120" w:type="dxa"/>
+            </w:tcMar>
+          </w:tcPr>
+          <w:p>
+            <w:pPr>
+              <w:jc w:val="both"/>
+            </w:pPr>
+            <w:r>
+              <w:rPr>
+                <w:b/>
+                <w:bCs/>
+                <w:sz w:val="22"/>
+                <w:szCs w:val="22"/>
+              </w:rPr>
+              <w:t>Description</w:t>
+            </w:r>
+          </w:p>
+        </w:tc>
+      </w:tr>
+      <w:tr>
+        <w:tc>
+          <w:tcPr>
+            <w:tcW w:w="1400" w:type="dxa"/>
+            <w:tcBorders>
+              <w:top w:val="single" w:sz="4" w:space="0" w:color="CCCCCC"/>
+              <w:left w:val="single" w:sz="4" w:space="0" w:color="CCCCCC"/>
+              <w:bottom w:val="single" w:sz="4" w:space="0" w:color="CCCCCC"/>
+              <w:right w:val="single" w:sz="4" w:space="0" w:color="CCCCCC"/>
+            </w:tcBorders>
+            <w:shd w:val="clear" w:color="auto" w:fill="FFFFFF" w:themeFill="background1"/>
+            <w:tcMar>
+              <w:top w:w="80" w:type="dxa"/>
+              <w:left w:w="120" w:type="dxa"/>
+              <w:bottom w:w="80" w:type="dxa"/>
+              <w:right w:w="120" w:type="dxa"/>
+            </w:tcMar>
+          </w:tcPr>
+          <w:p>
+            <w:pPr>
+              <w:jc w:val="both"/>
+            </w:pPr>
+            <w:r>
+              <w:rPr>
+                <w:sz w:val="22"/>
+                <w:szCs w:val="22"/>
+              </w:rPr>
+              <w:t>Browser</w:t>
+            </w:r>
+          </w:p>
+        </w:tc>
+        <w:tc>
+          <w:tcPr>
+            <w:tcW w:w="2000" w:type="dxa"/>
+            <w:tcBorders>
+              <w:top w:val="single" w:sz="4" w:space="0" w:color="CCCCCC"/>
+              <w:left w:val="single" w:sz="4" w:space="0" w:color="CCCCCC"/>
+              <w:bottom w:val="single" w:sz="4" w:space="0" w:color="CCCCCC"/>
+              <w:right w:val="single" w:sz="4" w:space="0" w:color="CCCCCC"/>
+            </w:tcBorders>
+            <w:shd w:val="clear" w:color="auto" w:fill="FFFFFF" w:themeFill="background1"/>
+            <w:tcMar>
+              <w:top w:w="80" w:type="dxa"/>
+              <w:left w:w="120" w:type="dxa"/>
+              <w:bottom w:w="80" w:type="dxa"/>
+              <w:right w:w="120" w:type="dxa"/>
+            </w:tcMar>
+          </w:tcPr>
+          <w:p>
+            <w:pPr>
+              <w:jc w:val="both"/>
+            </w:pPr>
+            <w:r>
+              <w:rPr>
+                <w:sz w:val="22"/>
+                <w:szCs w:val="22"/>
+              </w:rPr>
+              <w:t>Google Chrome</w:t>
+            </w:r>
+          </w:p>
+        </w:tc>
+        <w:tc>
+          <w:tcPr>
+            <w:tcW w:w="1000" w:type="dxa"/>
+            <w:tcBorders>
+              <w:top w:val="single" w:sz="4" w:space="0" w:color="CCCCCC"/>
+              <w:left w:val="single" w:sz="4" w:space="0" w:color="CCCCCC"/>
+              <w:bottom w:val="single" w:sz="4" w:space="0" w:color="CCCCCC"/>
+              <w:right w:val="single" w:sz="4" w:space="0" w:color="CCCCCC"/>
+            </w:tcBorders>
+            <w:shd w:val="clear" w:color="auto" w:fill="FFFFFF" w:themeFill="background1"/>
+            <w:tcMar>
+              <w:top w:w="80" w:type="dxa"/>
+              <w:left w:w="120" w:type="dxa"/>
+              <w:bottom w:w="80" w:type="dxa"/>
+              <w:right w:w="120" w:type="dxa"/>
+            </w:tcMar>
+          </w:tcPr>
+          <w:p>
+            <w:pPr>
+              <w:jc w:val="both"/>
+            </w:pPr>
+            <w:r>
+              <w:rPr>
+                <w:sz w:val="22"/>
+                <w:szCs w:val="22"/>
+              </w:rPr>
+              <w:t>126.x</w:t>
+            </w:r>
+          </w:p>
+        </w:tc>
+        <w:tc>
+          <w:tcPr>
+            <w:tcW w:w="4960" w:type="dxa"/>
+            <w:tcBorders>
+              <w:top w:val="single" w:sz="4" w:space="0" w:color="CCCCCC"/>
+              <w:left w:val="single" w:sz="4" w:space="0" w:color="CCCCCC"/>
+              <w:bottom w:val="single" w:sz="4" w:space="0" w:color="CCCCCC"/>
+              <w:right w:val="single" w:sz="4" w:space="0" w:color="CCCCCC"/>
+            </w:tcBorders>
+            <w:shd w:val="clear" w:color="auto" w:fill="FFFFFF" w:themeFill="background1"/>
+            <w:tcMar>
+              <w:top w:w="80" w:type="dxa"/>
+              <w:left w:w="120" w:type="dxa"/>
+              <w:bottom w:w="80" w:type="dxa"/>
+              <w:right w:w="120" w:type="dxa"/>
+            </w:tcMar>
+          </w:tcPr>
+          <w:p>
+            <w:pPr>
+              <w:jc w:val="both"/>
+            </w:pPr>
+            <w:r>
+              <w:rPr>
+                <w:sz w:val="22"/>
+                <w:szCs w:val="22"/>
+              </w:rPr>
+              <w:t>Main demo browser. Compatible with the latest React and JavaScript standards.</w:t>
+            </w:r>
+          </w:p>
+        </w:tc>
+      </w:tr>
+      <w:tr>
+        <w:tc>
+          <w:tcPr>
+            <w:tcW w:w="1400" w:type="dxa"/>
+            <w:tcBorders>
+              <w:top w:val="single" w:sz="4" w:space="0" w:color="CCCCCC"/>
+              <w:left w:val="single" w:sz="4" w:space="0" w:color="CCCCCC"/>
+              <w:bottom w:val="single" w:sz="4" w:space="0" w:color="CCCCCC"/>
+              <w:right w:val="single" w:sz="4" w:space="0" w:color="CCCCCC"/>
+            </w:tcBorders>
+            <w:shd w:val="clear" w:color="auto" w:fill="FFFFFF" w:themeFill="background1"/>
+            <w:tcMar>
+              <w:top w:w="80" w:type="dxa"/>
+              <w:left w:w="120" w:type="dxa"/>
+              <w:bottom w:w="80" w:type="dxa"/>
+              <w:right w:w="120" w:type="dxa"/>
+            </w:tcMar>
+          </w:tcPr>
+          <w:p>
+            <w:pPr>
+              <w:jc w:val="both"/>
+            </w:pPr>
+            <w:r>
+              <w:rPr>
+                <w:sz w:val="22"/>
+                <w:szCs w:val="22"/>
+              </w:rPr>
+              <w:t>Browser</w:t>
+            </w:r>
+          </w:p>
+        </w:tc>
+        <w:tc>
+          <w:tcPr>
+            <w:tcW w:w="2000" w:type="dxa"/>
+            <w:tcBorders>
+              <w:top w:val="single" w:sz="4" w:space="0" w:color="CCCCCC"/>
+              <w:left w:val="single" w:sz="4" w:space="0" w:color="CCCCCC"/>
+              <w:bottom w:val="single" w:sz="4" w:space="0" w:color="CCCCCC"/>
+              <w:right w:val="single" w:sz="4" w:space="0" w:color="CCCCCC"/>
+            </w:tcBorders>
+            <w:shd w:val="clear" w:color="auto" w:fill="FFFFFF" w:themeFill="background1"/>
+            <w:tcMar>
+              <w:top w:w="80" w:type="dxa"/>
+              <w:left w:w="120" w:type="dxa"/>
+              <w:bottom w:w="80" w:type="dxa"/>
+              <w:right w:w="120" w:type="dxa"/>
+            </w:tcMar>
+          </w:tcPr>
+          <w:p>
+            <w:pPr>
+              <w:jc w:val="both"/>
+            </w:pPr>
+            <w:r>
+              <w:rPr>
+                <w:sz w:val="22"/>
+                <w:szCs w:val="22"/>
+              </w:rPr>
+              <w:t>Mozilla Firefox</w:t>
+            </w:r>
+          </w:p>
+        </w:tc>
+        <w:tc>
+          <w:tcPr>
+            <w:tcW w:w="1000" w:type="dxa"/>
+            <w:tcBorders>
+              <w:top w:val="single" w:sz="4" w:space="0" w:color="CCCCCC"/>
+              <w:left w:val="single" w:sz="4" w:space="0" w:color="CCCCCC"/>
+              <w:bottom w:val="single" w:sz="4" w:space="0" w:color="CCCCCC"/>
+              <w:right w:val="single" w:sz="4" w:space="0" w:color="CCCCCC"/>
+            </w:tcBorders>
+            <w:shd w:val="clear" w:color="auto" w:fill="FFFFFF" w:themeFill="background1"/>
+            <w:tcMar>
+              <w:top w:w="80" w:type="dxa"/>
+              <w:left w:w="120" w:type="dxa"/>
+              <w:bottom w:w="80" w:type="dxa"/>
+              <w:right w:w="120" w:type="dxa"/>
+            </w:tcMar>
+          </w:tcPr>
+          <w:p>
+            <w:pPr>
+              <w:jc w:val="both"/>
+            </w:pPr>
+            <w:r>
+              <w:rPr>
+                <w:sz w:val="22"/>
+                <w:szCs w:val="22"/>
+              </w:rPr>
+              <w:t>127.x</w:t>
+            </w:r>
+          </w:p>
+        </w:tc>
+        <w:tc>
+          <w:tcPr>
+            <w:tcW w:w="4960" w:type="dxa"/>
+            <w:tcBorders>
+              <w:top w:val="single" w:sz="4" w:space="0" w:color="CCCCCC"/>
+              <w:left w:val="single" w:sz="4" w:space="0" w:color="CCCCCC"/>
+              <w:bottom w:val="single" w:sz="4" w:space="0" w:color="CCCCCC"/>
+              <w:right w:val="single" w:sz="4" w:space="0" w:color="CCCCCC"/>
+            </w:tcBorders>
+            <w:shd w:val="clear" w:color="auto" w:fill="FFFFFF" w:themeFill="background1"/>
+            <w:tcMar>
+              <w:top w:w="80" w:type="dxa"/>
+              <w:left w:w="120" w:type="dxa"/>
+              <w:bottom w:w="80" w:type="dxa"/>
+              <w:right w:w="120" w:type="dxa"/>
+            </w:tcMar>
+          </w:tcPr>
+          <w:p>
+            <w:pPr>
+              <w:jc w:val="both"/>
+            </w:pPr>
+            <w:r>
+              <w:rPr>
+                <w:sz w:val="22"/>
+                <w:szCs w:val="22"/>
+              </w:rPr>
+              <w:t>Additional browser for cross-browser compatibility testing.</w:t>
+            </w:r>
+          </w:p>
+        </w:tc>
+      </w:tr>
+      <w:tr>
+        <w:tc>
+          <w:tcPr>
+            <w:tcW w:w="1400" w:type="dxa"/>
+            <w:tcBorders>
+              <w:top w:val="single" w:sz="4" w:space="0" w:color="CCCCCC"/>
+              <w:left w:val="single" w:sz="4" w:space="0" w:color="CCCCCC"/>
+              <w:bottom w:val="single" w:sz="4" w:space="0" w:color="CCCCCC"/>
+              <w:right w:val="single" w:sz="4" w:space="0" w:color="CCCCCC"/>
+            </w:tcBorders>
+            <w:shd w:val="clear" w:color="auto" w:fill="FFFFFF" w:themeFill="background1"/>
+            <w:tcMar>
+              <w:top w:w="80" w:type="dxa"/>
+              <w:left w:w="120" w:type="dxa"/>
+              <w:bottom w:w="80" w:type="dxa"/>
+              <w:right w:w="120" w:type="dxa"/>
+            </w:tcMar>
+          </w:tcPr>
+          <w:p>
+            <w:pPr>
+              <w:jc w:val="both"/>
+            </w:pPr>
+            <w:r>
+              <w:rPr>
+                <w:sz w:val="22"/>
+                <w:szCs w:val="22"/>
+              </w:rPr>
+              <w:t>Localhost Server</w:t>
+            </w:r>
+          </w:p>
+        </w:tc>
+        <w:tc>
+          <w:tcPr>
+            <w:tcW w:w="2000" w:type="dxa"/>
+            <w:tcBorders>
+              <w:top w:val="single" w:sz="4" w:space="0" w:color="CCCCCC"/>
+              <w:left w:val="single" w:sz="4" w:space="0" w:color="CCCCCC"/>
+              <w:bottom w:val="single" w:sz="4" w:space="0" w:color="CCCCCC"/>
+              <w:right w:val="single" w:sz="4" w:space="0" w:color="CCCCCC"/>
+            </w:tcBorders>
+            <w:shd w:val="clear" w:color="auto" w:fill="FFFFFF" w:themeFill="background1"/>
+            <w:tcMar>
+              <w:top w:w="80" w:type="dxa"/>
+              <w:left w:w="120" w:type="dxa"/>
+              <w:bottom w:w="80" w:type="dxa"/>
+              <w:right w:w="120" w:type="dxa"/>
+            </w:tcMar>
+          </w:tcPr>
+          <w:p>
+            <w:pPr>
+              <w:jc w:val="both"/>
+            </w:pPr>
+            <w:r>
+              <w:rPr>
+                <w:sz w:val="22"/>
+                <w:szCs w:val="22"/>
+              </w:rPr>
+              <w:t>Node.js + Express</w:t>
+            </w:r>
+          </w:p>
+        </w:tc>
+        <w:tc>
+          <w:tcPr>
+            <w:tcW w:w="1000" w:type="dxa"/>
+            <w:tcBorders>
+              <w:top w:val="single" w:sz="4" w:space="0" w:color="CCCCCC"/>
+              <w:left w:val="single" w:sz="4" w:space="0" w:color="CCCCCC"/>
+              <w:bottom w:val="single" w:sz="4" w:space="0" w:color="CCCCCC"/>
+              <w:right w:val="single" w:sz="4" w:space="0" w:color="CCCCCC"/>
+            </w:tcBorders>
+            <w:shd w:val="clear" w:color="auto" w:fill="FFFFFF" w:themeFill="background1"/>
+            <w:tcMar>
+              <w:top w:w="80" w:type="dxa"/>
+              <w:left w:w="120" w:type="dxa"/>
+              <w:bottom w:w="80" w:type="dxa"/>
+              <w:right w:w="120" w:type="dxa"/>
+            </w:tcMar>
+          </w:tcPr>
+          <w:p>
+            <w:pPr>
+              <w:jc w:val="both"/>
+            </w:pPr>
+            <w:r>
+              <w:rPr>
+                <w:sz w:val="22"/>
+                <w:szCs w:val="22"/>
+              </w:rPr>
+              <w:t>20.x / 4.x</w:t>
+            </w:r>
+          </w:p>
+        </w:tc>
+        <w:tc>
+          <w:tcPr>
+            <w:tcW w:w="4960" w:type="dxa"/>
+            <w:tcBorders>
+              <w:top w:val="single" w:sz="4" w:space="0" w:color="CCCCCC"/>
+              <w:left w:val="single" w:sz="4" w:space="0" w:color="CCCCCC"/>
+              <w:bottom w:val="single" w:sz="4" w:space="0" w:color="CCCCCC"/>
+              <w:right w:val="single" w:sz="4" w:space="0" w:color="CCCCCC"/>
+            </w:tcBorders>
+            <w:shd w:val="clear" w:color="auto" w:fill="FFFFFF" w:themeFill="background1"/>
+            <w:tcMar>
+              <w:top w:w="80" w:type="dxa"/>
+              <w:left w:w="120" w:type="dxa"/>
+              <w:bottom w:w="80" w:type="dxa"/>
+              <w:right w:w="120" w:type="dxa"/>
+            </w:tcMar>
+          </w:tcPr>
+          <w:p>
+            <w:pPr>
+              <w:jc w:val="both"/>
+            </w:pPr>
+            <w:r>
+              <w:rPr>
+                <w:sz w:val="22"/>
+                <w:szCs w:val="22"/>
+              </w:rPr>
+              <w:t>During the demonstration, the application was served locally on port 3000.</w:t>
+            </w:r>
+          </w:p>
+        </w:tc>
+      </w:tr>
+      <w:tr>
+        <w:tc>
+          <w:tcPr>
+            <w:tcW w:w="1400" w:type="dxa"/>
+            <w:tcBorders>
+              <w:top w:val="single" w:sz="4" w:space="0" w:color="CCCCCC"/>
+              <w:left w:val="single" w:sz="4" w:space="0" w:color="CCCCCC"/>
+              <w:bottom w:val="single" w:sz="4" w:space="0" w:color="CCCCCC"/>
+              <w:right w:val="single" w:sz="4" w:space="0" w:color="CCCCCC"/>
+            </w:tcBorders>
+            <w:shd w:val="clear" w:color="auto" w:fill="FFFFFF" w:themeFill="background1"/>
+            <w:tcMar>
+              <w:top w:w="80" w:type="dxa"/>
+              <w:left w:w="120" w:type="dxa"/>
+              <w:bottom w:w="80" w:type="dxa"/>
+              <w:right w:w="120" w:type="dxa"/>
+            </w:tcMar>
+          </w:tcPr>
+          <w:p>
+            <w:pPr>
+              <w:jc w:val="both"/>
+            </w:pPr>
+            <w:r>
+              <w:rPr>
+                <w:sz w:val="22"/>
+                <w:szCs w:val="22"/>
+              </w:rPr>
+              <w:t>Screen Sharing</w:t>
+            </w:r>
+          </w:p>
+        </w:tc>
+        <w:tc>
+          <w:tcPr>
+            <w:tcW w:w="2000" w:type="dxa"/>
+            <w:tcBorders>
+              <w:top w:val="single" w:sz="4" w:space="0" w:color="CCCCCC"/>
+              <w:left w:val="single" w:sz="4" w:space="0" w:color="CCCCCC"/>
+              <w:bottom w:val="single" w:sz="4" w:space="0" w:color="CCCCCC"/>
+              <w:right w:val="single" w:sz="4" w:space="0" w:color="CCCCCC"/>
+            </w:tcBorders>
+            <w:shd w:val="clear" w:color="auto" w:fill="FFFFFF" w:themeFill="background1"/>
+            <w:tcMar>
+              <w:top w:w="80" w:type="dxa"/>
+              <w:left w:w="120" w:type="dxa"/>
+              <w:bottom w:w="80" w:type="dxa"/>
+              <w:right w:w="120" w:type="dxa"/>
+            </w:tcMar>
+          </w:tcPr>
+          <w:p>
+            <w:pPr>
+              <w:jc w:val="both"/>
+            </w:pPr>
+            <w:r>
+              <w:rPr>
+                <w:sz w:val="22"/>
+                <w:szCs w:val="22"/>
+              </w:rPr>
+              <w:t>Microsoft Teams / Zoom</w:t>
+            </w:r>
+          </w:p>
+        </w:tc>
+        <w:tc>
+          <w:tcPr>
+            <w:tcW w:w="1000" w:type="dxa"/>
+            <w:tcBorders>
+              <w:top w:val="single" w:sz="4" w:space="0" w:color="CCCCCC"/>
+              <w:left w:val="single" w:sz="4" w:space="0" w:color="CCCCCC"/>
+              <w:bottom w:val="single" w:sz="4" w:space="0" w:color="CCCCCC"/>
+              <w:right w:val="single" w:sz="4" w:space="0" w:color="CCCCCC"/>
+            </w:tcBorders>
+            <w:shd w:val="clear" w:color="auto" w:fill="FFFFFF" w:themeFill="background1"/>
+            <w:tcMar>
+              <w:top w:w="80" w:type="dxa"/>
+              <w:left w:w="120" w:type="dxa"/>
+              <w:bottom w:w="80" w:type="dxa"/>
+              <w:right w:w="120" w:type="dxa"/>
+            </w:tcMar>
+          </w:tcPr>
+          <w:p>
+            <w:pPr>
+              <w:jc w:val="both"/>
+            </w:pPr>
+            <w:r>
+              <w:rPr>
+                <w:sz w:val="22"/>
+                <w:szCs w:val="22"/>
+              </w:rPr>
+              <w:t>Latest</w:t>
+            </w:r>
+          </w:p>
+        </w:tc>
+        <w:tc>
+          <w:tcPr>
+            <w:tcW w:w="4960" w:type="dxa"/>
+            <w:tcBorders>
+              <w:top w:val="single" w:sz="4" w:space="0" w:color="CCCCCC"/>
+              <w:left w:val="single" w:sz="4" w:space="0" w:color="CCCCCC"/>
+              <w:bottom w:val="single" w:sz="4" w:space="0" w:color="CCCCCC"/>
+              <w:right w:val="single" w:sz="4" w:space="0" w:color="CCCCCC"/>
+            </w:tcBorders>
+            <w:shd w:val="clear" w:color="auto" w:fill="FFFFFF" w:themeFill="background1"/>
+            <w:tcMar>
+              <w:top w:w="80" w:type="dxa"/>
+              <w:left w:w="120" w:type="dxa"/>
+              <w:bottom w:w="80" w:type="dxa"/>
+              <w:right w:w="120" w:type="dxa"/>
+            </w:tcMar>
+          </w:tcPr>
+          <w:p>
+            <w:pPr>
+              <w:jc w:val="both"/>
+            </w:pPr>
+            <w:r>
+              <w:rPr>
+                <w:sz w:val="22"/>
+                <w:szCs w:val="22"/>
+              </w:rPr>
+              <w:t>To demonstrate remotely to lecturers or stakeholders.</w:t>
+            </w:r>
+          </w:p>
+        </w:tc>
+      </w:tr>
+      <w:tr>
+        <w:tc>
+          <w:tcPr>
+            <w:tcW w:w="1400" w:type="dxa"/>
+            <w:tcBorders>
+              <w:top w:val="single" w:sz="4" w:space="0" w:color="CCCCCC"/>
+              <w:left w:val="single" w:sz="4" w:space="0" w:color="CCCCCC"/>
+              <w:bottom w:val="single" w:sz="4" w:space="0" w:color="CCCCCC"/>
+              <w:right w:val="single" w:sz="4" w:space="0" w:color="CCCCCC"/>
+            </w:tcBorders>
+            <w:shd w:val="clear" w:color="auto" w:fill="FFFFFF" w:themeFill="background1"/>
+            <w:tcMar>
+              <w:top w:w="80" w:type="dxa"/>
+              <w:left w:w="120" w:type="dxa"/>
+              <w:bottom w:w="80" w:type="dxa"/>
+              <w:right w:w="120" w:type="dxa"/>
+            </w:tcMar>
+          </w:tcPr>
+          <w:p>
+            <w:pPr>
+              <w:jc w:val="both"/>
+            </w:pPr>
+            <w:r>
+              <w:rPr>
+                <w:sz w:val="22"/>
+                <w:szCs w:val="22"/>
+              </w:rPr>
+              <w:t>Presentation</w:t>
+            </w:r>
+          </w:p>
+        </w:tc>
+        <w:tc>
+          <w:tcPr>
+            <w:tcW w:w="2000" w:type="dxa"/>
+            <w:tcBorders>
+              <w:top w:val="single" w:sz="4" w:space="0" w:color="CCCCCC"/>
+              <w:left w:val="single" w:sz="4" w:space="0" w:color="CCCCCC"/>
+              <w:bottom w:val="single" w:sz="4" w:space="0" w:color="CCCCCC"/>
+              <w:right w:val="single" w:sz="4" w:space="0" w:color="CCCCCC"/>
+            </w:tcBorders>
+            <w:shd w:val="clear" w:color="auto" w:fill="FFFFFF" w:themeFill="background1"/>
+            <w:tcMar>
+              <w:top w:w="80" w:type="dxa"/>
+              <w:left w:w="120" w:type="dxa"/>
+              <w:bottom w:w="80" w:type="dxa"/>
+              <w:right w:w="120" w:type="dxa"/>
+            </w:tcMar>
+          </w:tcPr>
+          <w:p>
+            <w:pPr>
+              <w:jc w:val="both"/>
+            </w:pPr>
+            <w:r>
+              <w:rPr>
+                <w:sz w:val="22"/>
+                <w:szCs w:val="22"/>
+              </w:rPr>
+              <w:t>Microsoft PowerPoint</w:t>
+            </w:r>
+          </w:p>
+        </w:tc>
+        <w:tc>
+          <w:tcPr>
+            <w:tcW w:w="1000" w:type="dxa"/>
+            <w:tcBorders>
+              <w:top w:val="single" w:sz="4" w:space="0" w:color="CCCCCC"/>
+              <w:left w:val="single" w:sz="4" w:space="0" w:color="CCCCCC"/>
+              <w:bottom w:val="single" w:sz="4" w:space="0" w:color="CCCCCC"/>
+              <w:right w:val="single" w:sz="4" w:space="0" w:color="CCCCCC"/>
+            </w:tcBorders>
+            <w:shd w:val="clear" w:color="auto" w:fill="FFFFFF" w:themeFill="background1"/>
+            <w:tcMar>
+              <w:top w:w="80" w:type="dxa"/>
+              <w:left w:w="120" w:type="dxa"/>
+              <w:bottom w:w="80" w:type="dxa"/>
+              <w:right w:w="120" w:type="dxa"/>
+            </w:tcMar>
+          </w:tcPr>
+          <w:p>
+            <w:pPr>
+              <w:jc w:val="both"/>
+            </w:pPr>
+            <w:r>
+              <w:rPr>
+                <w:sz w:val="22"/>
+                <w:szCs w:val="22"/>
+              </w:rPr>
+              <w:t>2021/365</w:t>
+            </w:r>
+          </w:p>
+        </w:tc>
+        <w:tc>
+          <w:tcPr>
+            <w:tcW w:w="4960" w:type="dxa"/>
+            <w:tcBorders>
+              <w:top w:val="single" w:sz="4" w:space="0" w:color="CCCCCC"/>
+              <w:left w:val="single" w:sz="4" w:space="0" w:color="CCCCCC"/>
+              <w:bottom w:val="single" w:sz="4" w:space="0" w:color="CCCCCC"/>
+              <w:right w:val="single" w:sz="4" w:space="0" w:color="CCCCCC"/>
+            </w:tcBorders>
+            <w:shd w:val="clear" w:color="auto" w:fill="FFFFFF" w:themeFill="background1"/>
+            <w:tcMar>
+              <w:top w:w="80" w:type="dxa"/>
+              <w:left w:w="120" w:type="dxa"/>
+              <w:bottom w:w="80" w:type="dxa"/>
+              <w:right w:w="120" w:type="dxa"/>
+            </w:tcMar>
+          </w:tcPr>
+          <w:p>
+            <w:pPr>
+              <w:jc w:val="both"/>
+            </w:pPr>
+            <w:r>
+              <w:rPr>
+                <w:sz w:val="22"/>
+                <w:szCs w:val="22"/>
+              </w:rPr>
+              <w:t>Slide deck that provides a summary of the project in the context of the demo.</w:t>
+            </w:r>
+          </w:p>
+        </w:tc>
+      </w:tr>
+    </w:tbl>
+    <w:p>
+      <w:pPr>
+        <w:spacing w:after="160" w:line="360" w:lineRule="auto"/>
+      </w:pPr>
+    </w:p>
+    <w:p>
+      <w:pPr>
+        <w:spacing w:after="160" w:line="360" w:lineRule="auto"/>
+        <w:jc w:val="both"/>
+      </w:pPr>
+      <w:r>
+        <w:t>For the demo, the app will run on localhost with a Node.js/Express dev server. The PostgreSQL database will contain pre-loaded sample food inventory data allowing us to show all 6 use cases in a realistic way. The demo can be held either face-to-face or remotely by sharing sc</w:t>
+      </w:r>
+      <w:r>
+        <w:t>reens</w:t>
+      </w:r>
+      <w:r>
+        <w:t>.</w:t>
+      </w:r>
+    </w:p>
+    <w:p>
+      <w:pPr>
+        <w:spacing w:line="360" w:lineRule="auto"/>
+        <w:jc w:val="both"/>
+      </w:pPr>
+      <w:bookmarkStart w:id="68" w:name="_GoBack"/>
+      <w:bookmarkEnd w:id="68"/>
       <w:r>
         <w:br w:type="page"/>
       </w:r>

</xml_diff>

<commit_message>
Added Three Risk Management Plan : Scope Creep, Team Member Unavailability and Technology Learning Curve
</commit_message>
<xml_diff>
--- a/BIT 216 Assignment 1 (Task 1).docx
+++ b/BIT 216 Assignment 1 (Task 1).docx
@@ -14122,12 +14122,821 @@
         <w:spacing w:line="360" w:lineRule="auto"/>
         <w:jc w:val="both"/>
       </w:pPr>
-      <w:bookmarkStart w:id="68" w:name="_GoBack"/>
+    </w:p>
+    <w:p>
+      <w:pPr>
+        <w:pStyle w:val="Heading1"/>
+        <w:rPr>
+          <w:color w:val="auto"/>
+        </w:rPr>
+      </w:pPr>
+      <w:bookmarkStart w:id="68" w:name="_Toc232158135"/>
+      <w:bookmarkStart w:id="69" w:name="_Toc232158737"/>
+      <w:bookmarkStart w:id="70" w:name="_Toc232158895"/>
+      <w:r>
+        <w:rPr>
+          <w:color w:val="auto"/>
+        </w:rPr>
+        <w:t>7.0  Risk Management Plan</w:t>
+      </w:r>
       <w:bookmarkEnd w:id="68"/>
+      <w:bookmarkEnd w:id="69"/>
+      <w:bookmarkEnd w:id="70"/>
+    </w:p>
+    <w:p>
+      <w:pPr>
+        <w:spacing w:after="160" w:line="360" w:lineRule="auto"/>
+        <w:jc w:val="both"/>
+      </w:pPr>
       <w:r>
-        <w:br w:type="page"/>
+        <w:t>All team members collaboratively developed a risk management plan to identify, assess, and prepare response to potential project threats that may hinder its successful completion. Risks are evaluated on their Probability (L = Low, M = Medium, H = High) and the extent of the Impact. A proactive Mitigation Strategy and a reactive Contingency Plan are prepared for each risk.</w:t>
       </w:r>
     </w:p>
+    <w:p>
+      <w:pPr>
+        <w:spacing w:after="160" w:line="360" w:lineRule="auto"/>
+        <w:jc w:val="both"/>
+      </w:pPr>
+      <w:r>
+        <w:t>Table 5: Risk Management Plan</w:t>
+      </w:r>
+    </w:p>
+    <w:tbl>
+      <w:tblPr>
+        <w:tblW w:w="9360" w:type="dxa"/>
+        <w:tblBorders>
+          <w:top w:val="single" w:sz="4" w:space="0" w:color="auto"/>
+          <w:left w:val="single" w:sz="4" w:space="0" w:color="auto"/>
+          <w:bottom w:val="single" w:sz="4" w:space="0" w:color="auto"/>
+          <w:right w:val="single" w:sz="4" w:space="0" w:color="auto"/>
+          <w:insideH w:val="single" w:sz="4" w:space="0" w:color="auto"/>
+          <w:insideV w:val="single" w:sz="4" w:space="0" w:color="auto"/>
+        </w:tblBorders>
+        <w:shd w:val="clear" w:color="auto" w:fill="FFFFFF" w:themeFill="background1"/>
+        <w:tblCellMar>
+          <w:left w:w="10" w:type="dxa"/>
+          <w:right w:w="10" w:type="dxa"/>
+        </w:tblCellMar>
+        <w:tblLook w:val="0000" w:firstRow="0" w:lastRow="0" w:firstColumn="0" w:lastColumn="0" w:noHBand="0" w:noVBand="0"/>
+      </w:tblPr>
+      <w:tblGrid>
+        <w:gridCol w:w="1511"/>
+        <w:gridCol w:w="2055"/>
+        <w:gridCol w:w="1035"/>
+        <w:gridCol w:w="986"/>
+        <w:gridCol w:w="2072"/>
+        <w:gridCol w:w="1701"/>
+      </w:tblGrid>
+      <w:tr>
+        <w:tc>
+          <w:tcPr>
+            <w:tcW w:w="1511" w:type="dxa"/>
+            <w:tcBorders>
+              <w:top w:val="single" w:sz="4" w:space="0" w:color="CCCCCC"/>
+              <w:left w:val="single" w:sz="4" w:space="0" w:color="CCCCCC"/>
+              <w:bottom w:val="single" w:sz="4" w:space="0" w:color="CCCCCC"/>
+              <w:right w:val="single" w:sz="4" w:space="0" w:color="CCCCCC"/>
+            </w:tcBorders>
+            <w:shd w:val="clear" w:color="auto" w:fill="FFFFFF" w:themeFill="background1"/>
+            <w:tcMar>
+              <w:top w:w="80" w:type="dxa"/>
+              <w:left w:w="120" w:type="dxa"/>
+              <w:bottom w:w="80" w:type="dxa"/>
+              <w:right w:w="120" w:type="dxa"/>
+            </w:tcMar>
+          </w:tcPr>
+          <w:p>
+            <w:pPr>
+              <w:jc w:val="both"/>
+            </w:pPr>
+            <w:r>
+              <w:rPr>
+                <w:b/>
+                <w:bCs/>
+                <w:sz w:val="22"/>
+                <w:szCs w:val="22"/>
+              </w:rPr>
+              <w:t>Risk Name</w:t>
+            </w:r>
+          </w:p>
+        </w:tc>
+        <w:tc>
+          <w:tcPr>
+            <w:tcW w:w="2055" w:type="dxa"/>
+            <w:tcBorders>
+              <w:top w:val="single" w:sz="4" w:space="0" w:color="CCCCCC"/>
+              <w:left w:val="single" w:sz="4" w:space="0" w:color="CCCCCC"/>
+              <w:bottom w:val="single" w:sz="4" w:space="0" w:color="CCCCCC"/>
+              <w:right w:val="single" w:sz="4" w:space="0" w:color="CCCCCC"/>
+            </w:tcBorders>
+            <w:shd w:val="clear" w:color="auto" w:fill="FFFFFF" w:themeFill="background1"/>
+            <w:tcMar>
+              <w:top w:w="80" w:type="dxa"/>
+              <w:left w:w="120" w:type="dxa"/>
+              <w:bottom w:w="80" w:type="dxa"/>
+              <w:right w:w="120" w:type="dxa"/>
+            </w:tcMar>
+          </w:tcPr>
+          <w:p>
+            <w:pPr>
+              <w:jc w:val="both"/>
+            </w:pPr>
+            <w:r>
+              <w:rPr>
+                <w:b/>
+                <w:bCs/>
+                <w:sz w:val="22"/>
+                <w:szCs w:val="22"/>
+              </w:rPr>
+              <w:t>Description</w:t>
+            </w:r>
+          </w:p>
+        </w:tc>
+        <w:tc>
+          <w:tcPr>
+            <w:tcW w:w="1035" w:type="dxa"/>
+            <w:tcBorders>
+              <w:top w:val="single" w:sz="4" w:space="0" w:color="CCCCCC"/>
+              <w:left w:val="single" w:sz="4" w:space="0" w:color="CCCCCC"/>
+              <w:bottom w:val="single" w:sz="4" w:space="0" w:color="CCCCCC"/>
+              <w:right w:val="single" w:sz="4" w:space="0" w:color="CCCCCC"/>
+            </w:tcBorders>
+            <w:shd w:val="clear" w:color="auto" w:fill="FFFFFF" w:themeFill="background1"/>
+            <w:tcMar>
+              <w:top w:w="80" w:type="dxa"/>
+              <w:left w:w="120" w:type="dxa"/>
+              <w:bottom w:w="80" w:type="dxa"/>
+              <w:right w:w="120" w:type="dxa"/>
+            </w:tcMar>
+          </w:tcPr>
+          <w:p>
+            <w:pPr>
+              <w:jc w:val="both"/>
+            </w:pPr>
+            <w:r>
+              <w:rPr>
+                <w:b/>
+                <w:bCs/>
+                <w:sz w:val="22"/>
+                <w:szCs w:val="22"/>
+              </w:rPr>
+              <w:t>Prob. (L/M/H)</w:t>
+            </w:r>
+          </w:p>
+        </w:tc>
+        <w:tc>
+          <w:tcPr>
+            <w:tcW w:w="986" w:type="dxa"/>
+            <w:tcBorders>
+              <w:top w:val="single" w:sz="4" w:space="0" w:color="CCCCCC"/>
+              <w:left w:val="single" w:sz="4" w:space="0" w:color="CCCCCC"/>
+              <w:bottom w:val="single" w:sz="4" w:space="0" w:color="CCCCCC"/>
+              <w:right w:val="single" w:sz="4" w:space="0" w:color="CCCCCC"/>
+            </w:tcBorders>
+            <w:shd w:val="clear" w:color="auto" w:fill="FFFFFF" w:themeFill="background1"/>
+            <w:tcMar>
+              <w:top w:w="80" w:type="dxa"/>
+              <w:left w:w="120" w:type="dxa"/>
+              <w:bottom w:w="80" w:type="dxa"/>
+              <w:right w:w="120" w:type="dxa"/>
+            </w:tcMar>
+          </w:tcPr>
+          <w:p>
+            <w:pPr>
+              <w:jc w:val="both"/>
+            </w:pPr>
+            <w:r>
+              <w:rPr>
+                <w:b/>
+                <w:bCs/>
+                <w:sz w:val="22"/>
+                <w:szCs w:val="22"/>
+              </w:rPr>
+              <w:t>Impact</w:t>
+            </w:r>
+          </w:p>
+        </w:tc>
+        <w:tc>
+          <w:tcPr>
+            <w:tcW w:w="2072" w:type="dxa"/>
+            <w:tcBorders>
+              <w:top w:val="single" w:sz="4" w:space="0" w:color="CCCCCC"/>
+              <w:left w:val="single" w:sz="4" w:space="0" w:color="CCCCCC"/>
+              <w:bottom w:val="single" w:sz="4" w:space="0" w:color="CCCCCC"/>
+              <w:right w:val="single" w:sz="4" w:space="0" w:color="CCCCCC"/>
+            </w:tcBorders>
+            <w:shd w:val="clear" w:color="auto" w:fill="FFFFFF" w:themeFill="background1"/>
+            <w:tcMar>
+              <w:top w:w="80" w:type="dxa"/>
+              <w:left w:w="120" w:type="dxa"/>
+              <w:bottom w:w="80" w:type="dxa"/>
+              <w:right w:w="120" w:type="dxa"/>
+            </w:tcMar>
+          </w:tcPr>
+          <w:p>
+            <w:pPr>
+              <w:jc w:val="both"/>
+            </w:pPr>
+            <w:r>
+              <w:rPr>
+                <w:b/>
+                <w:bCs/>
+                <w:sz w:val="22"/>
+                <w:szCs w:val="22"/>
+              </w:rPr>
+              <w:t>Mitigation Strategy</w:t>
+            </w:r>
+          </w:p>
+        </w:tc>
+        <w:tc>
+          <w:tcPr>
+            <w:tcW w:w="1701" w:type="dxa"/>
+            <w:tcBorders>
+              <w:top w:val="single" w:sz="4" w:space="0" w:color="CCCCCC"/>
+              <w:left w:val="single" w:sz="4" w:space="0" w:color="CCCCCC"/>
+              <w:bottom w:val="single" w:sz="4" w:space="0" w:color="CCCCCC"/>
+              <w:right w:val="single" w:sz="4" w:space="0" w:color="CCCCCC"/>
+            </w:tcBorders>
+            <w:shd w:val="clear" w:color="auto" w:fill="FFFFFF" w:themeFill="background1"/>
+            <w:tcMar>
+              <w:top w:w="80" w:type="dxa"/>
+              <w:left w:w="120" w:type="dxa"/>
+              <w:bottom w:w="80" w:type="dxa"/>
+              <w:right w:w="120" w:type="dxa"/>
+            </w:tcMar>
+          </w:tcPr>
+          <w:p>
+            <w:pPr>
+              <w:jc w:val="both"/>
+            </w:pPr>
+            <w:r>
+              <w:rPr>
+                <w:b/>
+                <w:bCs/>
+                <w:sz w:val="22"/>
+                <w:szCs w:val="22"/>
+              </w:rPr>
+              <w:t>Contingency</w:t>
+            </w:r>
+          </w:p>
+        </w:tc>
+      </w:tr>
+      <w:tr>
+        <w:tc>
+          <w:tcPr>
+            <w:tcW w:w="1511" w:type="dxa"/>
+            <w:tcBorders>
+              <w:top w:val="single" w:sz="4" w:space="0" w:color="CCCCCC"/>
+              <w:left w:val="single" w:sz="4" w:space="0" w:color="CCCCCC"/>
+              <w:bottom w:val="single" w:sz="4" w:space="0" w:color="CCCCCC"/>
+              <w:right w:val="single" w:sz="4" w:space="0" w:color="CCCCCC"/>
+            </w:tcBorders>
+            <w:shd w:val="clear" w:color="auto" w:fill="FFFFFF" w:themeFill="background1"/>
+            <w:tcMar>
+              <w:top w:w="80" w:type="dxa"/>
+              <w:left w:w="120" w:type="dxa"/>
+              <w:bottom w:w="80" w:type="dxa"/>
+              <w:right w:w="120" w:type="dxa"/>
+            </w:tcMar>
+          </w:tcPr>
+          <w:p>
+            <w:pPr>
+              <w:jc w:val="both"/>
+            </w:pPr>
+            <w:r>
+              <w:rPr>
+                <w:sz w:val="22"/>
+                <w:szCs w:val="22"/>
+              </w:rPr>
+              <w:t>Scope Creep</w:t>
+            </w:r>
+          </w:p>
+        </w:tc>
+        <w:tc>
+          <w:tcPr>
+            <w:tcW w:w="2055" w:type="dxa"/>
+            <w:tcBorders>
+              <w:top w:val="single" w:sz="4" w:space="0" w:color="CCCCCC"/>
+              <w:left w:val="single" w:sz="4" w:space="0" w:color="CCCCCC"/>
+              <w:bottom w:val="single" w:sz="4" w:space="0" w:color="CCCCCC"/>
+              <w:right w:val="single" w:sz="4" w:space="0" w:color="CCCCCC"/>
+            </w:tcBorders>
+            <w:shd w:val="clear" w:color="auto" w:fill="FFFFFF" w:themeFill="background1"/>
+            <w:tcMar>
+              <w:top w:w="80" w:type="dxa"/>
+              <w:left w:w="120" w:type="dxa"/>
+              <w:bottom w:w="80" w:type="dxa"/>
+              <w:right w:w="120" w:type="dxa"/>
+            </w:tcMar>
+          </w:tcPr>
+          <w:p>
+            <w:pPr>
+              <w:jc w:val="both"/>
+            </w:pPr>
+            <w:r>
+              <w:rPr>
+                <w:sz w:val="22"/>
+                <w:szCs w:val="22"/>
+              </w:rPr>
+              <w:t xml:space="preserve">Ongoing </w:t>
+            </w:r>
+            <w:r>
+              <w:rPr>
+                <w:sz w:val="22"/>
+                <w:szCs w:val="22"/>
+              </w:rPr>
+              <w:t>incorporation of new functionalities or demands that exceed the initial scope, resulting in delays and resource overruns.</w:t>
+            </w:r>
+          </w:p>
+        </w:tc>
+        <w:tc>
+          <w:tcPr>
+            <w:tcW w:w="1035" w:type="dxa"/>
+            <w:tcBorders>
+              <w:top w:val="single" w:sz="4" w:space="0" w:color="CCCCCC"/>
+              <w:left w:val="single" w:sz="4" w:space="0" w:color="CCCCCC"/>
+              <w:bottom w:val="single" w:sz="4" w:space="0" w:color="CCCCCC"/>
+              <w:right w:val="single" w:sz="4" w:space="0" w:color="CCCCCC"/>
+            </w:tcBorders>
+            <w:shd w:val="clear" w:color="auto" w:fill="FFFFFF" w:themeFill="background1"/>
+            <w:tcMar>
+              <w:top w:w="80" w:type="dxa"/>
+              <w:left w:w="120" w:type="dxa"/>
+              <w:bottom w:w="80" w:type="dxa"/>
+              <w:right w:w="120" w:type="dxa"/>
+            </w:tcMar>
+          </w:tcPr>
+          <w:p>
+            <w:pPr>
+              <w:jc w:val="both"/>
+            </w:pPr>
+            <w:r>
+              <w:rPr>
+                <w:sz w:val="22"/>
+                <w:szCs w:val="22"/>
+              </w:rPr>
+              <w:t>H</w:t>
+            </w:r>
+          </w:p>
+        </w:tc>
+        <w:tc>
+          <w:tcPr>
+            <w:tcW w:w="986" w:type="dxa"/>
+            <w:tcBorders>
+              <w:top w:val="single" w:sz="4" w:space="0" w:color="CCCCCC"/>
+              <w:left w:val="single" w:sz="4" w:space="0" w:color="CCCCCC"/>
+              <w:bottom w:val="single" w:sz="4" w:space="0" w:color="CCCCCC"/>
+              <w:right w:val="single" w:sz="4" w:space="0" w:color="CCCCCC"/>
+            </w:tcBorders>
+            <w:shd w:val="clear" w:color="auto" w:fill="FFFFFF" w:themeFill="background1"/>
+            <w:tcMar>
+              <w:top w:w="80" w:type="dxa"/>
+              <w:left w:w="120" w:type="dxa"/>
+              <w:bottom w:w="80" w:type="dxa"/>
+              <w:right w:w="120" w:type="dxa"/>
+            </w:tcMar>
+          </w:tcPr>
+          <w:p>
+            <w:pPr>
+              <w:jc w:val="both"/>
+            </w:pPr>
+            <w:r>
+              <w:rPr>
+                <w:sz w:val="22"/>
+                <w:szCs w:val="22"/>
+              </w:rPr>
+              <w:t>High</w:t>
+            </w:r>
+          </w:p>
+        </w:tc>
+        <w:tc>
+          <w:tcPr>
+            <w:tcW w:w="2072" w:type="dxa"/>
+            <w:tcBorders>
+              <w:top w:val="single" w:sz="4" w:space="0" w:color="CCCCCC"/>
+              <w:left w:val="single" w:sz="4" w:space="0" w:color="CCCCCC"/>
+              <w:bottom w:val="single" w:sz="4" w:space="0" w:color="CCCCCC"/>
+              <w:right w:val="single" w:sz="4" w:space="0" w:color="CCCCCC"/>
+            </w:tcBorders>
+            <w:shd w:val="clear" w:color="auto" w:fill="FFFFFF" w:themeFill="background1"/>
+            <w:tcMar>
+              <w:top w:w="80" w:type="dxa"/>
+              <w:left w:w="120" w:type="dxa"/>
+              <w:bottom w:w="80" w:type="dxa"/>
+              <w:right w:w="120" w:type="dxa"/>
+            </w:tcMar>
+          </w:tcPr>
+          <w:p>
+            <w:pPr>
+              <w:jc w:val="both"/>
+            </w:pPr>
+            <w:r>
+              <w:rPr>
+                <w:sz w:val="22"/>
+                <w:szCs w:val="22"/>
+              </w:rPr>
+              <w:t>Establish well-defined scope boundaries in the project charter and apply change control procedures for any additions to the scope.</w:t>
+            </w:r>
+          </w:p>
+        </w:tc>
+        <w:tc>
+          <w:tcPr>
+            <w:tcW w:w="1701" w:type="dxa"/>
+            <w:tcBorders>
+              <w:top w:val="single" w:sz="4" w:space="0" w:color="CCCCCC"/>
+              <w:left w:val="single" w:sz="4" w:space="0" w:color="CCCCCC"/>
+              <w:bottom w:val="single" w:sz="4" w:space="0" w:color="CCCCCC"/>
+              <w:right w:val="single" w:sz="4" w:space="0" w:color="CCCCCC"/>
+            </w:tcBorders>
+            <w:shd w:val="clear" w:color="auto" w:fill="FFFFFF" w:themeFill="background1"/>
+            <w:tcMar>
+              <w:top w:w="80" w:type="dxa"/>
+              <w:left w:w="120" w:type="dxa"/>
+              <w:bottom w:w="80" w:type="dxa"/>
+              <w:right w:w="120" w:type="dxa"/>
+            </w:tcMar>
+          </w:tcPr>
+          <w:p>
+            <w:pPr>
+              <w:jc w:val="both"/>
+            </w:pPr>
+            <w:r>
+              <w:rPr>
+                <w:sz w:val="22"/>
+                <w:szCs w:val="22"/>
+              </w:rPr>
+              <w:t>Schedule with a new baseline; postpone non-essential features to later iterations.</w:t>
+            </w:r>
+          </w:p>
+        </w:tc>
+      </w:tr>
+      <w:tr>
+        <w:tc>
+          <w:tcPr>
+            <w:tcW w:w="1511" w:type="dxa"/>
+            <w:tcBorders>
+              <w:top w:val="single" w:sz="4" w:space="0" w:color="CCCCCC"/>
+              <w:left w:val="single" w:sz="4" w:space="0" w:color="CCCCCC"/>
+              <w:bottom w:val="single" w:sz="4" w:space="0" w:color="CCCCCC"/>
+              <w:right w:val="single" w:sz="4" w:space="0" w:color="CCCCCC"/>
+            </w:tcBorders>
+            <w:shd w:val="clear" w:color="auto" w:fill="FFFFFF" w:themeFill="background1"/>
+            <w:tcMar>
+              <w:top w:w="80" w:type="dxa"/>
+              <w:left w:w="120" w:type="dxa"/>
+              <w:bottom w:w="80" w:type="dxa"/>
+              <w:right w:w="120" w:type="dxa"/>
+            </w:tcMar>
+          </w:tcPr>
+          <w:p>
+            <w:pPr>
+              <w:jc w:val="both"/>
+            </w:pPr>
+            <w:r>
+              <w:rPr>
+                <w:sz w:val="22"/>
+                <w:szCs w:val="22"/>
+              </w:rPr>
+              <w:t>Team Member Unavailability</w:t>
+            </w:r>
+          </w:p>
+        </w:tc>
+        <w:tc>
+          <w:tcPr>
+            <w:tcW w:w="2055" w:type="dxa"/>
+            <w:tcBorders>
+              <w:top w:val="single" w:sz="4" w:space="0" w:color="CCCCCC"/>
+              <w:left w:val="single" w:sz="4" w:space="0" w:color="CCCCCC"/>
+              <w:bottom w:val="single" w:sz="4" w:space="0" w:color="CCCCCC"/>
+              <w:right w:val="single" w:sz="4" w:space="0" w:color="CCCCCC"/>
+            </w:tcBorders>
+            <w:shd w:val="clear" w:color="auto" w:fill="FFFFFF" w:themeFill="background1"/>
+            <w:tcMar>
+              <w:top w:w="80" w:type="dxa"/>
+              <w:left w:w="120" w:type="dxa"/>
+              <w:bottom w:w="80" w:type="dxa"/>
+              <w:right w:w="120" w:type="dxa"/>
+            </w:tcMar>
+          </w:tcPr>
+          <w:p>
+            <w:pPr>
+              <w:jc w:val="both"/>
+            </w:pPr>
+            <w:r>
+              <w:rPr>
+                <w:sz w:val="22"/>
+                <w:szCs w:val="22"/>
+              </w:rPr>
+              <w:t>A team member might be unavailable because of health issues, academic obligations, or personal crises.</w:t>
+            </w:r>
+          </w:p>
+        </w:tc>
+        <w:tc>
+          <w:tcPr>
+            <w:tcW w:w="1035" w:type="dxa"/>
+            <w:tcBorders>
+              <w:top w:val="single" w:sz="4" w:space="0" w:color="CCCCCC"/>
+              <w:left w:val="single" w:sz="4" w:space="0" w:color="CCCCCC"/>
+              <w:bottom w:val="single" w:sz="4" w:space="0" w:color="CCCCCC"/>
+              <w:right w:val="single" w:sz="4" w:space="0" w:color="CCCCCC"/>
+            </w:tcBorders>
+            <w:shd w:val="clear" w:color="auto" w:fill="FFFFFF" w:themeFill="background1"/>
+            <w:tcMar>
+              <w:top w:w="80" w:type="dxa"/>
+              <w:left w:w="120" w:type="dxa"/>
+              <w:bottom w:w="80" w:type="dxa"/>
+              <w:right w:w="120" w:type="dxa"/>
+            </w:tcMar>
+          </w:tcPr>
+          <w:p>
+            <w:pPr>
+              <w:jc w:val="both"/>
+            </w:pPr>
+            <w:r>
+              <w:rPr>
+                <w:sz w:val="22"/>
+                <w:szCs w:val="22"/>
+              </w:rPr>
+              <w:t>M</w:t>
+            </w:r>
+          </w:p>
+        </w:tc>
+        <w:tc>
+          <w:tcPr>
+            <w:tcW w:w="986" w:type="dxa"/>
+            <w:tcBorders>
+              <w:top w:val="single" w:sz="4" w:space="0" w:color="CCCCCC"/>
+              <w:left w:val="single" w:sz="4" w:space="0" w:color="CCCCCC"/>
+              <w:bottom w:val="single" w:sz="4" w:space="0" w:color="CCCCCC"/>
+              <w:right w:val="single" w:sz="4" w:space="0" w:color="CCCCCC"/>
+            </w:tcBorders>
+            <w:shd w:val="clear" w:color="auto" w:fill="FFFFFF" w:themeFill="background1"/>
+            <w:tcMar>
+              <w:top w:w="80" w:type="dxa"/>
+              <w:left w:w="120" w:type="dxa"/>
+              <w:bottom w:w="80" w:type="dxa"/>
+              <w:right w:w="120" w:type="dxa"/>
+            </w:tcMar>
+          </w:tcPr>
+          <w:p>
+            <w:pPr>
+              <w:jc w:val="both"/>
+            </w:pPr>
+            <w:r>
+              <w:rPr>
+                <w:sz w:val="22"/>
+                <w:szCs w:val="22"/>
+              </w:rPr>
+              <w:t>High</w:t>
+            </w:r>
+          </w:p>
+        </w:tc>
+        <w:tc>
+          <w:tcPr>
+            <w:tcW w:w="2072" w:type="dxa"/>
+            <w:tcBorders>
+              <w:top w:val="single" w:sz="4" w:space="0" w:color="CCCCCC"/>
+              <w:left w:val="single" w:sz="4" w:space="0" w:color="CCCCCC"/>
+              <w:bottom w:val="single" w:sz="4" w:space="0" w:color="CCCCCC"/>
+              <w:right w:val="single" w:sz="4" w:space="0" w:color="CCCCCC"/>
+            </w:tcBorders>
+            <w:shd w:val="clear" w:color="auto" w:fill="FFFFFF" w:themeFill="background1"/>
+            <w:tcMar>
+              <w:top w:w="80" w:type="dxa"/>
+              <w:left w:w="120" w:type="dxa"/>
+              <w:bottom w:w="80" w:type="dxa"/>
+              <w:right w:w="120" w:type="dxa"/>
+            </w:tcMar>
+          </w:tcPr>
+          <w:p>
+            <w:pPr>
+              <w:jc w:val="both"/>
+            </w:pPr>
+            <w:r>
+              <w:rPr>
+                <w:sz w:val="22"/>
+                <w:szCs w:val="22"/>
+              </w:rPr>
+              <w:t>Keep shared documentation up to date; ensure team members are trained on one another's responsibilities; reallocate work at an early stage.</w:t>
+            </w:r>
+          </w:p>
+        </w:tc>
+        <w:tc>
+          <w:tcPr>
+            <w:tcW w:w="1701" w:type="dxa"/>
+            <w:tcBorders>
+              <w:top w:val="single" w:sz="4" w:space="0" w:color="CCCCCC"/>
+              <w:left w:val="single" w:sz="4" w:space="0" w:color="CCCCCC"/>
+              <w:bottom w:val="single" w:sz="4" w:space="0" w:color="CCCCCC"/>
+              <w:right w:val="single" w:sz="4" w:space="0" w:color="CCCCCC"/>
+            </w:tcBorders>
+            <w:shd w:val="clear" w:color="auto" w:fill="FFFFFF" w:themeFill="background1"/>
+            <w:tcMar>
+              <w:top w:w="80" w:type="dxa"/>
+              <w:left w:w="120" w:type="dxa"/>
+              <w:bottom w:w="80" w:type="dxa"/>
+              <w:right w:w="120" w:type="dxa"/>
+            </w:tcMar>
+          </w:tcPr>
+          <w:p>
+            <w:pPr>
+              <w:jc w:val="both"/>
+            </w:pPr>
+            <w:r>
+              <w:rPr>
+                <w:sz w:val="22"/>
+                <w:szCs w:val="22"/>
+              </w:rPr>
+              <w:t>Reallocate work tasks; ask for an extension from the lecturer if necessary.</w:t>
+            </w:r>
+          </w:p>
+        </w:tc>
+      </w:tr>
+      <w:tr>
+        <w:tc>
+          <w:tcPr>
+            <w:tcW w:w="1511" w:type="dxa"/>
+            <w:tcBorders>
+              <w:top w:val="single" w:sz="4" w:space="0" w:color="CCCCCC"/>
+              <w:left w:val="single" w:sz="4" w:space="0" w:color="CCCCCC"/>
+              <w:bottom w:val="single" w:sz="4" w:space="0" w:color="CCCCCC"/>
+              <w:right w:val="single" w:sz="4" w:space="0" w:color="CCCCCC"/>
+            </w:tcBorders>
+            <w:shd w:val="clear" w:color="auto" w:fill="FFFFFF" w:themeFill="background1"/>
+            <w:tcMar>
+              <w:top w:w="80" w:type="dxa"/>
+              <w:left w:w="120" w:type="dxa"/>
+              <w:bottom w:w="80" w:type="dxa"/>
+              <w:right w:w="120" w:type="dxa"/>
+            </w:tcMar>
+          </w:tcPr>
+          <w:p>
+            <w:pPr>
+              <w:jc w:val="both"/>
+            </w:pPr>
+            <w:r>
+              <w:rPr>
+                <w:sz w:val="22"/>
+                <w:szCs w:val="22"/>
+              </w:rPr>
+              <w:t>Technology Learning Curve</w:t>
+            </w:r>
+          </w:p>
+        </w:tc>
+        <w:tc>
+          <w:tcPr>
+            <w:tcW w:w="2055" w:type="dxa"/>
+            <w:tcBorders>
+              <w:top w:val="single" w:sz="4" w:space="0" w:color="CCCCCC"/>
+              <w:left w:val="single" w:sz="4" w:space="0" w:color="CCCCCC"/>
+              <w:bottom w:val="single" w:sz="4" w:space="0" w:color="CCCCCC"/>
+              <w:right w:val="single" w:sz="4" w:space="0" w:color="CCCCCC"/>
+            </w:tcBorders>
+            <w:shd w:val="clear" w:color="auto" w:fill="FFFFFF" w:themeFill="background1"/>
+            <w:tcMar>
+              <w:top w:w="80" w:type="dxa"/>
+              <w:left w:w="120" w:type="dxa"/>
+              <w:bottom w:w="80" w:type="dxa"/>
+              <w:right w:w="120" w:type="dxa"/>
+            </w:tcMar>
+          </w:tcPr>
+          <w:p>
+            <w:pPr>
+              <w:jc w:val="both"/>
+            </w:pPr>
+            <w:r>
+              <w:rPr>
+                <w:sz w:val="22"/>
+                <w:szCs w:val="22"/>
+              </w:rPr>
+              <w:t>Selected development frameworks (React, Node.js, PostgreSQL) may be unfamiliar to team members.</w:t>
+            </w:r>
+          </w:p>
+        </w:tc>
+        <w:tc>
+          <w:tcPr>
+            <w:tcW w:w="1035" w:type="dxa"/>
+            <w:tcBorders>
+              <w:top w:val="single" w:sz="4" w:space="0" w:color="CCCCCC"/>
+              <w:left w:val="single" w:sz="4" w:space="0" w:color="CCCCCC"/>
+              <w:bottom w:val="single" w:sz="4" w:space="0" w:color="CCCCCC"/>
+              <w:right w:val="single" w:sz="4" w:space="0" w:color="CCCCCC"/>
+            </w:tcBorders>
+            <w:shd w:val="clear" w:color="auto" w:fill="FFFFFF" w:themeFill="background1"/>
+            <w:tcMar>
+              <w:top w:w="80" w:type="dxa"/>
+              <w:left w:w="120" w:type="dxa"/>
+              <w:bottom w:w="80" w:type="dxa"/>
+              <w:right w:w="120" w:type="dxa"/>
+            </w:tcMar>
+          </w:tcPr>
+          <w:p>
+            <w:pPr>
+              <w:jc w:val="both"/>
+            </w:pPr>
+            <w:r>
+              <w:rPr>
+                <w:sz w:val="22"/>
+                <w:szCs w:val="22"/>
+              </w:rPr>
+              <w:t>M</w:t>
+            </w:r>
+          </w:p>
+        </w:tc>
+        <w:tc>
+          <w:tcPr>
+            <w:tcW w:w="986" w:type="dxa"/>
+            <w:tcBorders>
+              <w:top w:val="single" w:sz="4" w:space="0" w:color="CCCCCC"/>
+              <w:left w:val="single" w:sz="4" w:space="0" w:color="CCCCCC"/>
+              <w:bottom w:val="single" w:sz="4" w:space="0" w:color="CCCCCC"/>
+              <w:right w:val="single" w:sz="4" w:space="0" w:color="CCCCCC"/>
+            </w:tcBorders>
+            <w:shd w:val="clear" w:color="auto" w:fill="FFFFFF" w:themeFill="background1"/>
+            <w:tcMar>
+              <w:top w:w="80" w:type="dxa"/>
+              <w:left w:w="120" w:type="dxa"/>
+              <w:bottom w:w="80" w:type="dxa"/>
+              <w:right w:w="120" w:type="dxa"/>
+            </w:tcMar>
+          </w:tcPr>
+          <w:p>
+            <w:pPr>
+              <w:jc w:val="both"/>
+            </w:pPr>
+            <w:r>
+              <w:rPr>
+                <w:sz w:val="22"/>
+                <w:szCs w:val="22"/>
+              </w:rPr>
+              <w:t>Medium</w:t>
+            </w:r>
+          </w:p>
+        </w:tc>
+        <w:tc>
+          <w:tcPr>
+            <w:tcW w:w="2072" w:type="dxa"/>
+            <w:tcBorders>
+              <w:top w:val="single" w:sz="4" w:space="0" w:color="CCCCCC"/>
+              <w:left w:val="single" w:sz="4" w:space="0" w:color="CCCCCC"/>
+              <w:bottom w:val="single" w:sz="4" w:space="0" w:color="CCCCCC"/>
+              <w:right w:val="single" w:sz="4" w:space="0" w:color="CCCCCC"/>
+            </w:tcBorders>
+            <w:shd w:val="clear" w:color="auto" w:fill="FFFFFF" w:themeFill="background1"/>
+            <w:tcMar>
+              <w:top w:w="80" w:type="dxa"/>
+              <w:left w:w="120" w:type="dxa"/>
+              <w:bottom w:w="80" w:type="dxa"/>
+              <w:right w:w="120" w:type="dxa"/>
+            </w:tcMar>
+          </w:tcPr>
+          <w:p>
+            <w:pPr>
+              <w:jc w:val="both"/>
+            </w:pPr>
+            <w:r>
+              <w:rPr>
+                <w:sz w:val="22"/>
+                <w:szCs w:val="22"/>
+              </w:rPr>
+              <w:t>Set aside the first weeks for research on technology; rely on official documentation and tutorials.</w:t>
+            </w:r>
+          </w:p>
+        </w:tc>
+        <w:tc>
+          <w:tcPr>
+            <w:tcW w:w="1701" w:type="dxa"/>
+            <w:tcBorders>
+              <w:top w:val="single" w:sz="4" w:space="0" w:color="CCCCCC"/>
+              <w:left w:val="single" w:sz="4" w:space="0" w:color="CCCCCC"/>
+              <w:bottom w:val="single" w:sz="4" w:space="0" w:color="CCCCCC"/>
+              <w:right w:val="single" w:sz="4" w:space="0" w:color="CCCCCC"/>
+            </w:tcBorders>
+            <w:shd w:val="clear" w:color="auto" w:fill="FFFFFF" w:themeFill="background1"/>
+            <w:tcMar>
+              <w:top w:w="80" w:type="dxa"/>
+              <w:left w:w="120" w:type="dxa"/>
+              <w:bottom w:w="80" w:type="dxa"/>
+              <w:right w:w="120" w:type="dxa"/>
+            </w:tcMar>
+          </w:tcPr>
+          <w:p>
+            <w:pPr>
+              <w:jc w:val="both"/>
+            </w:pPr>
+            <w:r>
+              <w:rPr>
+                <w:sz w:val="22"/>
+                <w:szCs w:val="22"/>
+              </w:rPr>
+              <w:t>Use familiar alternatives to simplify the tech stack.</w:t>
+            </w:r>
+          </w:p>
+        </w:tc>
+        <w:bookmarkStart w:id="71" w:name="_GoBack"/>
+        <w:bookmarkEnd w:id="71"/>
+      </w:tr>
+    </w:tbl>
     <w:p/>
     <w:sectPr>
       <w:pgSz w:w="12240" w:h="15840"/>

</xml_diff>

<commit_message>
Added two Risk plan: Integration Failures and Data Privacy & Security Breach
</commit_message>
<xml_diff>
--- a/BIT 216 Assignment 1 (Task 1).docx
+++ b/BIT 216 Assignment 1 (Task 1).docx
@@ -14659,6 +14659,8 @@
               </w:rPr>
               <w:t>M</w:t>
             </w:r>
+            <w:bookmarkStart w:id="71" w:name="_GoBack"/>
+            <w:bookmarkEnd w:id="71"/>
           </w:p>
         </w:tc>
         <w:tc>
@@ -14933,8 +14935,378 @@
             </w:r>
           </w:p>
         </w:tc>
-        <w:bookmarkStart w:id="71" w:name="_GoBack"/>
-        <w:bookmarkEnd w:id="71"/>
+      </w:tr>
+      <w:tr>
+        <w:tc>
+          <w:tcPr>
+            <w:tcW w:w="1511" w:type="dxa"/>
+            <w:tcBorders>
+              <w:top w:val="single" w:sz="4" w:space="0" w:color="CCCCCC"/>
+              <w:left w:val="single" w:sz="4" w:space="0" w:color="CCCCCC"/>
+              <w:bottom w:val="single" w:sz="4" w:space="0" w:color="CCCCCC"/>
+              <w:right w:val="single" w:sz="4" w:space="0" w:color="CCCCCC"/>
+            </w:tcBorders>
+            <w:shd w:val="clear" w:color="auto" w:fill="FFFFFF" w:themeFill="background1"/>
+            <w:tcMar>
+              <w:top w:w="80" w:type="dxa"/>
+              <w:left w:w="120" w:type="dxa"/>
+              <w:bottom w:w="80" w:type="dxa"/>
+              <w:right w:w="120" w:type="dxa"/>
+            </w:tcMar>
+          </w:tcPr>
+          <w:p>
+            <w:pPr>
+              <w:jc w:val="both"/>
+            </w:pPr>
+            <w:r>
+              <w:rPr>
+                <w:sz w:val="22"/>
+                <w:szCs w:val="22"/>
+              </w:rPr>
+              <w:t>Integration Failures</w:t>
+            </w:r>
+          </w:p>
+        </w:tc>
+        <w:tc>
+          <w:tcPr>
+            <w:tcW w:w="2055" w:type="dxa"/>
+            <w:tcBorders>
+              <w:top w:val="single" w:sz="4" w:space="0" w:color="CCCCCC"/>
+              <w:left w:val="single" w:sz="4" w:space="0" w:color="CCCCCC"/>
+              <w:bottom w:val="single" w:sz="4" w:space="0" w:color="CCCCCC"/>
+              <w:right w:val="single" w:sz="4" w:space="0" w:color="CCCCCC"/>
+            </w:tcBorders>
+            <w:shd w:val="clear" w:color="auto" w:fill="FFFFFF" w:themeFill="background1"/>
+            <w:tcMar>
+              <w:top w:w="80" w:type="dxa"/>
+              <w:left w:w="120" w:type="dxa"/>
+              <w:bottom w:w="80" w:type="dxa"/>
+              <w:right w:w="120" w:type="dxa"/>
+            </w:tcMar>
+          </w:tcPr>
+          <w:p>
+            <w:pPr>
+              <w:jc w:val="both"/>
+              <w:rPr>
+                <w:sz w:val="22"/>
+                <w:szCs w:val="22"/>
+              </w:rPr>
+            </w:pPr>
+            <w:r>
+              <w:rPr>
+                <w:sz w:val="22"/>
+                <w:szCs w:val="22"/>
+              </w:rPr>
+              <w:t>The integration of the backend API and frontend might not succeed, leading to postponements in testing and deployment.</w:t>
+            </w:r>
+          </w:p>
+        </w:tc>
+        <w:tc>
+          <w:tcPr>
+            <w:tcW w:w="1035" w:type="dxa"/>
+            <w:tcBorders>
+              <w:top w:val="single" w:sz="4" w:space="0" w:color="CCCCCC"/>
+              <w:left w:val="single" w:sz="4" w:space="0" w:color="CCCCCC"/>
+              <w:bottom w:val="single" w:sz="4" w:space="0" w:color="CCCCCC"/>
+              <w:right w:val="single" w:sz="4" w:space="0" w:color="CCCCCC"/>
+            </w:tcBorders>
+            <w:shd w:val="clear" w:color="auto" w:fill="FFFFFF" w:themeFill="background1"/>
+            <w:tcMar>
+              <w:top w:w="80" w:type="dxa"/>
+              <w:left w:w="120" w:type="dxa"/>
+              <w:bottom w:w="80" w:type="dxa"/>
+              <w:right w:w="120" w:type="dxa"/>
+            </w:tcMar>
+          </w:tcPr>
+          <w:p>
+            <w:pPr>
+              <w:jc w:val="both"/>
+            </w:pPr>
+            <w:r>
+              <w:rPr>
+                <w:sz w:val="22"/>
+                <w:szCs w:val="22"/>
+              </w:rPr>
+              <w:t>M</w:t>
+            </w:r>
+          </w:p>
+        </w:tc>
+        <w:tc>
+          <w:tcPr>
+            <w:tcW w:w="986" w:type="dxa"/>
+            <w:tcBorders>
+              <w:top w:val="single" w:sz="4" w:space="0" w:color="CCCCCC"/>
+              <w:left w:val="single" w:sz="4" w:space="0" w:color="CCCCCC"/>
+              <w:bottom w:val="single" w:sz="4" w:space="0" w:color="CCCCCC"/>
+              <w:right w:val="single" w:sz="4" w:space="0" w:color="CCCCCC"/>
+            </w:tcBorders>
+            <w:shd w:val="clear" w:color="auto" w:fill="FFFFFF" w:themeFill="background1"/>
+            <w:tcMar>
+              <w:top w:w="80" w:type="dxa"/>
+              <w:left w:w="120" w:type="dxa"/>
+              <w:bottom w:w="80" w:type="dxa"/>
+              <w:right w:w="120" w:type="dxa"/>
+            </w:tcMar>
+          </w:tcPr>
+          <w:p>
+            <w:pPr>
+              <w:jc w:val="both"/>
+            </w:pPr>
+            <w:r>
+              <w:rPr>
+                <w:sz w:val="22"/>
+                <w:szCs w:val="22"/>
+              </w:rPr>
+              <w:t>High</w:t>
+            </w:r>
+          </w:p>
+        </w:tc>
+        <w:tc>
+          <w:tcPr>
+            <w:tcW w:w="2072" w:type="dxa"/>
+            <w:tcBorders>
+              <w:top w:val="single" w:sz="4" w:space="0" w:color="CCCCCC"/>
+              <w:left w:val="single" w:sz="4" w:space="0" w:color="CCCCCC"/>
+              <w:bottom w:val="single" w:sz="4" w:space="0" w:color="CCCCCC"/>
+              <w:right w:val="single" w:sz="4" w:space="0" w:color="CCCCCC"/>
+            </w:tcBorders>
+            <w:shd w:val="clear" w:color="auto" w:fill="FFFFFF" w:themeFill="background1"/>
+            <w:tcMar>
+              <w:top w:w="80" w:type="dxa"/>
+              <w:left w:w="120" w:type="dxa"/>
+              <w:bottom w:w="80" w:type="dxa"/>
+              <w:right w:w="120" w:type="dxa"/>
+            </w:tcMar>
+          </w:tcPr>
+          <w:p>
+            <w:pPr>
+              <w:jc w:val="both"/>
+              <w:rPr>
+                <w:sz w:val="22"/>
+                <w:szCs w:val="22"/>
+              </w:rPr>
+            </w:pPr>
+            <w:r>
+              <w:rPr>
+                <w:sz w:val="22"/>
+                <w:szCs w:val="22"/>
+              </w:rPr>
+              <w:t>Utilize an API-first design approach; carry out integration testing at the start of development cycles.</w:t>
+            </w:r>
+          </w:p>
+        </w:tc>
+        <w:tc>
+          <w:tcPr>
+            <w:tcW w:w="1701" w:type="dxa"/>
+            <w:tcBorders>
+              <w:top w:val="single" w:sz="4" w:space="0" w:color="CCCCCC"/>
+              <w:left w:val="single" w:sz="4" w:space="0" w:color="CCCCCC"/>
+              <w:bottom w:val="single" w:sz="4" w:space="0" w:color="CCCCCC"/>
+              <w:right w:val="single" w:sz="4" w:space="0" w:color="CCCCCC"/>
+            </w:tcBorders>
+            <w:shd w:val="clear" w:color="auto" w:fill="FFFFFF" w:themeFill="background1"/>
+            <w:tcMar>
+              <w:top w:w="80" w:type="dxa"/>
+              <w:left w:w="120" w:type="dxa"/>
+              <w:bottom w:w="80" w:type="dxa"/>
+              <w:right w:w="120" w:type="dxa"/>
+            </w:tcMar>
+          </w:tcPr>
+          <w:p>
+            <w:pPr>
+              <w:jc w:val="both"/>
+            </w:pPr>
+            <w:r>
+              <w:rPr>
+                <w:sz w:val="22"/>
+                <w:szCs w:val="22"/>
+              </w:rPr>
+              <w:t>Utilize mock APIs; identify and correct modules that are failing.</w:t>
+            </w:r>
+          </w:p>
+        </w:tc>
+      </w:tr>
+      <w:tr>
+        <w:tc>
+          <w:tcPr>
+            <w:tcW w:w="1511" w:type="dxa"/>
+            <w:tcBorders>
+              <w:top w:val="single" w:sz="4" w:space="0" w:color="CCCCCC"/>
+              <w:left w:val="single" w:sz="4" w:space="0" w:color="CCCCCC"/>
+              <w:bottom w:val="single" w:sz="4" w:space="0" w:color="CCCCCC"/>
+              <w:right w:val="single" w:sz="4" w:space="0" w:color="CCCCCC"/>
+            </w:tcBorders>
+            <w:shd w:val="clear" w:color="auto" w:fill="FFFFFF" w:themeFill="background1"/>
+            <w:tcMar>
+              <w:top w:w="80" w:type="dxa"/>
+              <w:left w:w="120" w:type="dxa"/>
+              <w:bottom w:w="80" w:type="dxa"/>
+              <w:right w:w="120" w:type="dxa"/>
+            </w:tcMar>
+          </w:tcPr>
+          <w:p>
+            <w:pPr>
+              <w:jc w:val="both"/>
+            </w:pPr>
+            <w:r>
+              <w:rPr>
+                <w:sz w:val="22"/>
+                <w:szCs w:val="22"/>
+              </w:rPr>
+              <w:t>Data Privacy &amp; Security Breach</w:t>
+            </w:r>
+          </w:p>
+        </w:tc>
+        <w:tc>
+          <w:tcPr>
+            <w:tcW w:w="2055" w:type="dxa"/>
+            <w:tcBorders>
+              <w:top w:val="single" w:sz="4" w:space="0" w:color="CCCCCC"/>
+              <w:left w:val="single" w:sz="4" w:space="0" w:color="CCCCCC"/>
+              <w:bottom w:val="single" w:sz="4" w:space="0" w:color="CCCCCC"/>
+              <w:right w:val="single" w:sz="4" w:space="0" w:color="CCCCCC"/>
+            </w:tcBorders>
+            <w:shd w:val="clear" w:color="auto" w:fill="FFFFFF" w:themeFill="background1"/>
+            <w:tcMar>
+              <w:top w:w="80" w:type="dxa"/>
+              <w:left w:w="120" w:type="dxa"/>
+              <w:bottom w:w="80" w:type="dxa"/>
+              <w:right w:w="120" w:type="dxa"/>
+            </w:tcMar>
+          </w:tcPr>
+          <w:p>
+            <w:pPr>
+              <w:jc w:val="both"/>
+            </w:pPr>
+            <w:r>
+              <w:rPr>
+                <w:sz w:val="22"/>
+                <w:szCs w:val="22"/>
+              </w:rPr>
+              <w:t>User data (such as email and household information) could be exposed because of insufficient security practices.</w:t>
+            </w:r>
+          </w:p>
+        </w:tc>
+        <w:tc>
+          <w:tcPr>
+            <w:tcW w:w="1035" w:type="dxa"/>
+            <w:tcBorders>
+              <w:top w:val="single" w:sz="4" w:space="0" w:color="CCCCCC"/>
+              <w:left w:val="single" w:sz="4" w:space="0" w:color="CCCCCC"/>
+              <w:bottom w:val="single" w:sz="4" w:space="0" w:color="CCCCCC"/>
+              <w:right w:val="single" w:sz="4" w:space="0" w:color="CCCCCC"/>
+            </w:tcBorders>
+            <w:shd w:val="clear" w:color="auto" w:fill="FFFFFF" w:themeFill="background1"/>
+            <w:tcMar>
+              <w:top w:w="80" w:type="dxa"/>
+              <w:left w:w="120" w:type="dxa"/>
+              <w:bottom w:w="80" w:type="dxa"/>
+              <w:right w:w="120" w:type="dxa"/>
+            </w:tcMar>
+          </w:tcPr>
+          <w:p>
+            <w:pPr>
+              <w:jc w:val="both"/>
+            </w:pPr>
+            <w:r>
+              <w:rPr>
+                <w:sz w:val="22"/>
+                <w:szCs w:val="22"/>
+              </w:rPr>
+              <w:t>L</w:t>
+            </w:r>
+          </w:p>
+        </w:tc>
+        <w:tc>
+          <w:tcPr>
+            <w:tcW w:w="986" w:type="dxa"/>
+            <w:tcBorders>
+              <w:top w:val="single" w:sz="4" w:space="0" w:color="CCCCCC"/>
+              <w:left w:val="single" w:sz="4" w:space="0" w:color="CCCCCC"/>
+              <w:bottom w:val="single" w:sz="4" w:space="0" w:color="CCCCCC"/>
+              <w:right w:val="single" w:sz="4" w:space="0" w:color="CCCCCC"/>
+            </w:tcBorders>
+            <w:shd w:val="clear" w:color="auto" w:fill="FFFFFF" w:themeFill="background1"/>
+            <w:tcMar>
+              <w:top w:w="80" w:type="dxa"/>
+              <w:left w:w="120" w:type="dxa"/>
+              <w:bottom w:w="80" w:type="dxa"/>
+              <w:right w:w="120" w:type="dxa"/>
+            </w:tcMar>
+          </w:tcPr>
+          <w:p>
+            <w:pPr>
+              <w:jc w:val="both"/>
+            </w:pPr>
+            <w:r>
+              <w:rPr>
+                <w:sz w:val="22"/>
+                <w:szCs w:val="22"/>
+              </w:rPr>
+              <w:t>Very High</w:t>
+            </w:r>
+          </w:p>
+        </w:tc>
+        <w:tc>
+          <w:tcPr>
+            <w:tcW w:w="2072" w:type="dxa"/>
+            <w:tcBorders>
+              <w:top w:val="single" w:sz="4" w:space="0" w:color="CCCCCC"/>
+              <w:left w:val="single" w:sz="4" w:space="0" w:color="CCCCCC"/>
+              <w:bottom w:val="single" w:sz="4" w:space="0" w:color="CCCCCC"/>
+              <w:right w:val="single" w:sz="4" w:space="0" w:color="CCCCCC"/>
+            </w:tcBorders>
+            <w:shd w:val="clear" w:color="auto" w:fill="FFFFFF" w:themeFill="background1"/>
+            <w:tcMar>
+              <w:top w:w="80" w:type="dxa"/>
+              <w:left w:w="120" w:type="dxa"/>
+              <w:bottom w:w="80" w:type="dxa"/>
+              <w:right w:w="120" w:type="dxa"/>
+            </w:tcMar>
+          </w:tcPr>
+          <w:p>
+            <w:pPr>
+              <w:jc w:val="both"/>
+            </w:pPr>
+            <w:r>
+              <w:rPr>
+                <w:sz w:val="22"/>
+                <w:szCs w:val="22"/>
+              </w:rPr>
+              <w:t>From the beginning, implement 2FA, encrypt data, and use secure coding practices; conduct security reviews.</w:t>
+            </w:r>
+          </w:p>
+        </w:tc>
+        <w:tc>
+          <w:tcPr>
+            <w:tcW w:w="1701" w:type="dxa"/>
+            <w:tcBorders>
+              <w:top w:val="single" w:sz="4" w:space="0" w:color="CCCCCC"/>
+              <w:left w:val="single" w:sz="4" w:space="0" w:color="CCCCCC"/>
+              <w:bottom w:val="single" w:sz="4" w:space="0" w:color="CCCCCC"/>
+              <w:right w:val="single" w:sz="4" w:space="0" w:color="CCCCCC"/>
+            </w:tcBorders>
+            <w:shd w:val="clear" w:color="auto" w:fill="FFFFFF" w:themeFill="background1"/>
+            <w:tcMar>
+              <w:top w:w="80" w:type="dxa"/>
+              <w:left w:w="120" w:type="dxa"/>
+              <w:bottom w:w="80" w:type="dxa"/>
+              <w:right w:w="120" w:type="dxa"/>
+            </w:tcMar>
+          </w:tcPr>
+          <w:p>
+            <w:pPr>
+              <w:jc w:val="both"/>
+            </w:pPr>
+            <w:r>
+              <w:rPr>
+                <w:sz w:val="22"/>
+                <w:szCs w:val="22"/>
+              </w:rPr>
+              <w:t>Inform users; review code; fix vulnerabilities at once.</w:t>
+            </w:r>
+          </w:p>
+        </w:tc>
       </w:tr>
     </w:tbl>
     <w:p/>

</xml_diff>

<commit_message>
Added Two Risk plan: Inaccurate Time Estimation and Tool/Software Issues
</commit_message>
<xml_diff>
--- a/BIT 216 Assignment 1 (Task 1).docx
+++ b/BIT 216 Assignment 1 (Task 1).docx
@@ -14659,8 +14659,6 @@
               </w:rPr>
               <w:t>M</w:t>
             </w:r>
-            <w:bookmarkStart w:id="71" w:name="_GoBack"/>
-            <w:bookmarkEnd w:id="71"/>
           </w:p>
         </w:tc>
         <w:tc>
@@ -15304,12 +15302,399 @@
                 <w:szCs w:val="22"/>
               </w:rPr>
               <w:t>Inform users; review code; fix vulnerabilities at once.</w:t>
+            </w:r>
+          </w:p>
+        </w:tc>
+      </w:tr>
+      <w:tr>
+        <w:tc>
+          <w:tcPr>
+            <w:tcW w:w="1511" w:type="dxa"/>
+            <w:tcBorders>
+              <w:top w:val="single" w:sz="4" w:space="0" w:color="CCCCCC"/>
+              <w:left w:val="single" w:sz="4" w:space="0" w:color="CCCCCC"/>
+              <w:bottom w:val="single" w:sz="4" w:space="0" w:color="CCCCCC"/>
+              <w:right w:val="single" w:sz="4" w:space="0" w:color="CCCCCC"/>
+            </w:tcBorders>
+            <w:shd w:val="clear" w:color="auto" w:fill="FFFFFF" w:themeFill="background1"/>
+            <w:tcMar>
+              <w:top w:w="80" w:type="dxa"/>
+              <w:left w:w="120" w:type="dxa"/>
+              <w:bottom w:w="80" w:type="dxa"/>
+              <w:right w:w="120" w:type="dxa"/>
+            </w:tcMar>
+          </w:tcPr>
+          <w:p>
+            <w:pPr>
+              <w:jc w:val="both"/>
+            </w:pPr>
+            <w:r>
+              <w:rPr>
+                <w:sz w:val="22"/>
+                <w:szCs w:val="22"/>
+              </w:rPr>
+              <w:t>Inaccurate Time Estimation</w:t>
+            </w:r>
+          </w:p>
+        </w:tc>
+        <w:tc>
+          <w:tcPr>
+            <w:tcW w:w="2055" w:type="dxa"/>
+            <w:tcBorders>
+              <w:top w:val="single" w:sz="4" w:space="0" w:color="CCCCCC"/>
+              <w:left w:val="single" w:sz="4" w:space="0" w:color="CCCCCC"/>
+              <w:bottom w:val="single" w:sz="4" w:space="0" w:color="CCCCCC"/>
+              <w:right w:val="single" w:sz="4" w:space="0" w:color="CCCCCC"/>
+            </w:tcBorders>
+            <w:shd w:val="clear" w:color="auto" w:fill="FFFFFF" w:themeFill="background1"/>
+            <w:tcMar>
+              <w:top w:w="80" w:type="dxa"/>
+              <w:left w:w="120" w:type="dxa"/>
+              <w:bottom w:w="80" w:type="dxa"/>
+              <w:right w:w="120" w:type="dxa"/>
+            </w:tcMar>
+          </w:tcPr>
+          <w:p>
+            <w:pPr>
+              <w:jc w:val="both"/>
+            </w:pPr>
+            <w:r>
+              <w:rPr>
+                <w:sz w:val="22"/>
+                <w:szCs w:val="22"/>
+              </w:rPr>
+              <w:t>Tasks might require much more time than anticipated, which affects the project timeline.</w:t>
+            </w:r>
+          </w:p>
+        </w:tc>
+        <w:tc>
+          <w:tcPr>
+            <w:tcW w:w="1035" w:type="dxa"/>
+            <w:tcBorders>
+              <w:top w:val="single" w:sz="4" w:space="0" w:color="CCCCCC"/>
+              <w:left w:val="single" w:sz="4" w:space="0" w:color="CCCCCC"/>
+              <w:bottom w:val="single" w:sz="4" w:space="0" w:color="CCCCCC"/>
+              <w:right w:val="single" w:sz="4" w:space="0" w:color="CCCCCC"/>
+            </w:tcBorders>
+            <w:shd w:val="clear" w:color="auto" w:fill="FFFFFF" w:themeFill="background1"/>
+            <w:tcMar>
+              <w:top w:w="80" w:type="dxa"/>
+              <w:left w:w="120" w:type="dxa"/>
+              <w:bottom w:w="80" w:type="dxa"/>
+              <w:right w:w="120" w:type="dxa"/>
+            </w:tcMar>
+          </w:tcPr>
+          <w:p>
+            <w:pPr>
+              <w:jc w:val="both"/>
+            </w:pPr>
+            <w:r>
+              <w:rPr>
+                <w:sz w:val="22"/>
+                <w:szCs w:val="22"/>
+              </w:rPr>
+              <w:t>H</w:t>
+            </w:r>
+          </w:p>
+        </w:tc>
+        <w:tc>
+          <w:tcPr>
+            <w:tcW w:w="986" w:type="dxa"/>
+            <w:tcBorders>
+              <w:top w:val="single" w:sz="4" w:space="0" w:color="CCCCCC"/>
+              <w:left w:val="single" w:sz="4" w:space="0" w:color="CCCCCC"/>
+              <w:bottom w:val="single" w:sz="4" w:space="0" w:color="CCCCCC"/>
+              <w:right w:val="single" w:sz="4" w:space="0" w:color="CCCCCC"/>
+            </w:tcBorders>
+            <w:shd w:val="clear" w:color="auto" w:fill="FFFFFF" w:themeFill="background1"/>
+            <w:tcMar>
+              <w:top w:w="80" w:type="dxa"/>
+              <w:left w:w="120" w:type="dxa"/>
+              <w:bottom w:w="80" w:type="dxa"/>
+              <w:right w:w="120" w:type="dxa"/>
+            </w:tcMar>
+          </w:tcPr>
+          <w:p>
+            <w:pPr>
+              <w:jc w:val="both"/>
+            </w:pPr>
+            <w:r>
+              <w:rPr>
+                <w:sz w:val="22"/>
+                <w:szCs w:val="22"/>
+              </w:rPr>
+              <w:t>Medium</w:t>
+            </w:r>
+          </w:p>
+        </w:tc>
+        <w:tc>
+          <w:tcPr>
+            <w:tcW w:w="2072" w:type="dxa"/>
+            <w:tcBorders>
+              <w:top w:val="single" w:sz="4" w:space="0" w:color="CCCCCC"/>
+              <w:left w:val="single" w:sz="4" w:space="0" w:color="CCCCCC"/>
+              <w:bottom w:val="single" w:sz="4" w:space="0" w:color="CCCCCC"/>
+              <w:right w:val="single" w:sz="4" w:space="0" w:color="CCCCCC"/>
+            </w:tcBorders>
+            <w:shd w:val="clear" w:color="auto" w:fill="FFFFFF" w:themeFill="background1"/>
+            <w:tcMar>
+              <w:top w:w="80" w:type="dxa"/>
+              <w:left w:w="120" w:type="dxa"/>
+              <w:bottom w:w="80" w:type="dxa"/>
+              <w:right w:w="120" w:type="dxa"/>
+            </w:tcMar>
+          </w:tcPr>
+          <w:p>
+            <w:pPr>
+              <w:jc w:val="both"/>
+            </w:pPr>
+            <w:r>
+              <w:rPr>
+                <w:sz w:val="22"/>
+                <w:szCs w:val="22"/>
+              </w:rPr>
+              <w:t>Utilize buffer time in the Gantt Chart and conduct weekly progress reviews against the baseline.</w:t>
+            </w:r>
+          </w:p>
+        </w:tc>
+        <w:tc>
+          <w:tcPr>
+            <w:tcW w:w="1701" w:type="dxa"/>
+            <w:tcBorders>
+              <w:top w:val="single" w:sz="4" w:space="0" w:color="CCCCCC"/>
+              <w:left w:val="single" w:sz="4" w:space="0" w:color="CCCCCC"/>
+              <w:bottom w:val="single" w:sz="4" w:space="0" w:color="CCCCCC"/>
+              <w:right w:val="single" w:sz="4" w:space="0" w:color="CCCCCC"/>
+            </w:tcBorders>
+            <w:shd w:val="clear" w:color="auto" w:fill="FFFFFF" w:themeFill="background1"/>
+            <w:tcMar>
+              <w:top w:w="80" w:type="dxa"/>
+              <w:left w:w="120" w:type="dxa"/>
+              <w:bottom w:w="80" w:type="dxa"/>
+              <w:right w:w="120" w:type="dxa"/>
+            </w:tcMar>
+          </w:tcPr>
+          <w:p>
+            <w:pPr>
+              <w:jc w:val="both"/>
+            </w:pPr>
+            <w:r>
+              <w:rPr>
+                <w:sz w:val="22"/>
+                <w:szCs w:val="22"/>
+              </w:rPr>
+              <w:t>Focus on tasks that are on the critical path; if needed, reduce the scope.</w:t>
+            </w:r>
+          </w:p>
+        </w:tc>
+      </w:tr>
+      <w:tr>
+        <w:tc>
+          <w:tcPr>
+            <w:tcW w:w="1511" w:type="dxa"/>
+            <w:tcBorders>
+              <w:top w:val="single" w:sz="4" w:space="0" w:color="CCCCCC"/>
+              <w:left w:val="single" w:sz="4" w:space="0" w:color="CCCCCC"/>
+              <w:bottom w:val="single" w:sz="4" w:space="0" w:color="CCCCCC"/>
+              <w:right w:val="single" w:sz="4" w:space="0" w:color="CCCCCC"/>
+            </w:tcBorders>
+            <w:shd w:val="clear" w:color="auto" w:fill="FFFFFF" w:themeFill="background1"/>
+            <w:tcMar>
+              <w:top w:w="80" w:type="dxa"/>
+              <w:left w:w="120" w:type="dxa"/>
+              <w:bottom w:w="80" w:type="dxa"/>
+              <w:right w:w="120" w:type="dxa"/>
+            </w:tcMar>
+          </w:tcPr>
+          <w:p>
+            <w:pPr>
+              <w:jc w:val="both"/>
+            </w:pPr>
+            <w:r>
+              <w:rPr>
+                <w:sz w:val="22"/>
+                <w:szCs w:val="22"/>
+              </w:rPr>
+              <w:t>Tool/Software Issues</w:t>
+            </w:r>
+          </w:p>
+        </w:tc>
+        <w:tc>
+          <w:tcPr>
+            <w:tcW w:w="2055" w:type="dxa"/>
+            <w:tcBorders>
+              <w:top w:val="single" w:sz="4" w:space="0" w:color="CCCCCC"/>
+              <w:left w:val="single" w:sz="4" w:space="0" w:color="CCCCCC"/>
+              <w:bottom w:val="single" w:sz="4" w:space="0" w:color="CCCCCC"/>
+              <w:right w:val="single" w:sz="4" w:space="0" w:color="CCCCCC"/>
+            </w:tcBorders>
+            <w:shd w:val="clear" w:color="auto" w:fill="FFFFFF" w:themeFill="background1"/>
+            <w:tcMar>
+              <w:top w:w="80" w:type="dxa"/>
+              <w:left w:w="120" w:type="dxa"/>
+              <w:bottom w:w="80" w:type="dxa"/>
+              <w:right w:w="120" w:type="dxa"/>
+            </w:tcMar>
+          </w:tcPr>
+          <w:p>
+            <w:pPr>
+              <w:jc w:val="both"/>
+            </w:pPr>
+            <w:r>
+              <w:rPr>
+                <w:sz w:val="22"/>
+                <w:szCs w:val="22"/>
+              </w:rPr>
+              <w:t>Development tools or collaboration platforms might not be accessible or could be defective.</w:t>
+            </w:r>
+          </w:p>
+        </w:tc>
+        <w:tc>
+          <w:tcPr>
+            <w:tcW w:w="1035" w:type="dxa"/>
+            <w:tcBorders>
+              <w:top w:val="single" w:sz="4" w:space="0" w:color="CCCCCC"/>
+              <w:left w:val="single" w:sz="4" w:space="0" w:color="CCCCCC"/>
+              <w:bottom w:val="single" w:sz="4" w:space="0" w:color="CCCCCC"/>
+              <w:right w:val="single" w:sz="4" w:space="0" w:color="CCCCCC"/>
+            </w:tcBorders>
+            <w:shd w:val="clear" w:color="auto" w:fill="FFFFFF" w:themeFill="background1"/>
+            <w:tcMar>
+              <w:top w:w="80" w:type="dxa"/>
+              <w:left w:w="120" w:type="dxa"/>
+              <w:bottom w:w="80" w:type="dxa"/>
+              <w:right w:w="120" w:type="dxa"/>
+            </w:tcMar>
+          </w:tcPr>
+          <w:p>
+            <w:pPr>
+              <w:jc w:val="both"/>
+              <w:rPr>
+                <w:sz w:val="22"/>
+                <w:szCs w:val="22"/>
+              </w:rPr>
+            </w:pPr>
+            <w:r>
+              <w:rPr>
+                <w:sz w:val="22"/>
+                <w:szCs w:val="22"/>
+              </w:rPr>
+              <w:t>L</w:t>
+            </w:r>
+          </w:p>
+        </w:tc>
+        <w:tc>
+          <w:tcPr>
+            <w:tcW w:w="986" w:type="dxa"/>
+            <w:tcBorders>
+              <w:top w:val="single" w:sz="4" w:space="0" w:color="CCCCCC"/>
+              <w:left w:val="single" w:sz="4" w:space="0" w:color="CCCCCC"/>
+              <w:bottom w:val="single" w:sz="4" w:space="0" w:color="CCCCCC"/>
+              <w:right w:val="single" w:sz="4" w:space="0" w:color="CCCCCC"/>
+            </w:tcBorders>
+            <w:shd w:val="clear" w:color="auto" w:fill="FFFFFF" w:themeFill="background1"/>
+            <w:tcMar>
+              <w:top w:w="80" w:type="dxa"/>
+              <w:left w:w="120" w:type="dxa"/>
+              <w:bottom w:w="80" w:type="dxa"/>
+              <w:right w:w="120" w:type="dxa"/>
+            </w:tcMar>
+          </w:tcPr>
+          <w:p>
+            <w:pPr>
+              <w:jc w:val="both"/>
+            </w:pPr>
+            <w:r>
+              <w:rPr>
+                <w:sz w:val="22"/>
+                <w:szCs w:val="22"/>
+              </w:rPr>
+              <w:t>Medium</w:t>
+            </w:r>
+          </w:p>
+        </w:tc>
+        <w:tc>
+          <w:tcPr>
+            <w:tcW w:w="2072" w:type="dxa"/>
+            <w:tcBorders>
+              <w:top w:val="single" w:sz="4" w:space="0" w:color="CCCCCC"/>
+              <w:left w:val="single" w:sz="4" w:space="0" w:color="CCCCCC"/>
+              <w:bottom w:val="single" w:sz="4" w:space="0" w:color="CCCCCC"/>
+              <w:right w:val="single" w:sz="4" w:space="0" w:color="CCCCCC"/>
+            </w:tcBorders>
+            <w:shd w:val="clear" w:color="auto" w:fill="FFFFFF" w:themeFill="background1"/>
+            <w:tcMar>
+              <w:top w:w="80" w:type="dxa"/>
+              <w:left w:w="120" w:type="dxa"/>
+              <w:bottom w:w="80" w:type="dxa"/>
+              <w:right w:w="120" w:type="dxa"/>
+            </w:tcMar>
+          </w:tcPr>
+          <w:p>
+            <w:pPr>
+              <w:jc w:val="both"/>
+            </w:pPr>
+            <w:r>
+              <w:rPr>
+                <w:sz w:val="22"/>
+                <w:szCs w:val="22"/>
+              </w:rPr>
+              <w:t>Utilize cloud-based applications (GitHub, VS Code, Figma) and keep backups.</w:t>
+            </w:r>
+          </w:p>
+        </w:tc>
+        <w:tc>
+          <w:tcPr>
+            <w:tcW w:w="1701" w:type="dxa"/>
+            <w:tcBorders>
+              <w:top w:val="single" w:sz="4" w:space="0" w:color="CCCCCC"/>
+              <w:left w:val="single" w:sz="4" w:space="0" w:color="CCCCCC"/>
+              <w:bottom w:val="single" w:sz="4" w:space="0" w:color="CCCCCC"/>
+              <w:right w:val="single" w:sz="4" w:space="0" w:color="CCCCCC"/>
+            </w:tcBorders>
+            <w:shd w:val="clear" w:color="auto" w:fill="FFFFFF" w:themeFill="background1"/>
+            <w:tcMar>
+              <w:top w:w="80" w:type="dxa"/>
+              <w:left w:w="120" w:type="dxa"/>
+              <w:bottom w:w="80" w:type="dxa"/>
+              <w:right w:w="120" w:type="dxa"/>
+            </w:tcMar>
+          </w:tcPr>
+          <w:p>
+            <w:pPr>
+              <w:jc w:val="both"/>
+            </w:pPr>
+            <w:r>
+              <w:rPr>
+                <w:sz w:val="22"/>
+                <w:szCs w:val="22"/>
+              </w:rPr>
+              <w:t>Change to different tools; recover from backup repositories.</w:t>
             </w:r>
           </w:p>
         </w:tc>
       </w:tr>
     </w:tbl>
     <w:p/>
+    <w:p>
+      <w:pPr>
+        <w:spacing w:after="160" w:line="360" w:lineRule="auto"/>
+        <w:jc w:val="both"/>
+      </w:pPr>
+      <w:r>
+        <w:t>During team meetings, the risk register will be reviewed on a weekly basis and updated if new risks are identified or if there are changes in the probability or impact of existing risks. The entire project team serves as the risk owner for all items, while the team leader (Aaditya Chaudhary) is tasked with escalating critical risks to the module lecturer.</w:t>
+      </w:r>
+    </w:p>
+    <w:p>
+      <w:pPr>
+        <w:spacing w:after="160" w:line="360" w:lineRule="auto"/>
+        <w:jc w:val="both"/>
+      </w:pPr>
+    </w:p>
+    <w:p>
+      <w:bookmarkStart w:id="71" w:name="_GoBack"/>
+      <w:bookmarkEnd w:id="71"/>
+    </w:p>
     <w:sectPr>
       <w:pgSz w:w="12240" w:h="15840"/>
       <w:pgMar w:top="1440" w:right="1440" w:bottom="1440" w:left="1440" w:header="720" w:footer="720" w:gutter="0"/>

</xml_diff>

<commit_message>
Reviewed the Conclusion and Added References
</commit_message>
<xml_diff>
--- a/BIT 216 Assignment 1 (Task 1).docx
+++ b/BIT 216 Assignment 1 (Task 1).docx
@@ -15711,13 +15711,91 @@
         <w:jc w:val="both"/>
       </w:pPr>
       <w:r>
-        <w:t xml:space="preserve">The SavePlate project is developed wanting to offering a practical and simple solution that the users can adjust to easily to minimize the amount of food wasted in their homes through accurate inventory management, tracking expiration dates, planning meals, and donation of food. Utilizing the latest web technologies and the proper software engineering principles, this project intends to encourage people to consume food responsibly and at the same time, support the community-based food sharing initiatives. This project plan includes the project goals boundaries timeline, technical strategy, work products, and risk handling measures.The Iterative and Incremental software development lifecycle approach is used in this project. The project team will be able to move forward through the requirements analysis and design phases systematically while ensuring quality and maintainability. Once done, SavePlate is expected to show a well-structured system design that solves a real-world problem and offers a </w:t>
+        <w:t>The SavePlate project is developed wanting to offering a practical and simple solution that the users can adjust to easily to minimize the amount of food wasted in their homes through accurate inventory management, tracking expiration dates, planning meals, and donation of food. Utilizing the latest web technologies and the proper software engineering principles, this project intends to encourage people to consume food responsibly and at the same time, support the community-based food sharing initiatives. This project plan includes the project goals boundaries timeline, technical strategy, work products, and risk handling measures.The Iterative and Incremental software development lifecycle approach is used in this project. The project team will be able to move forward through the requirements analysis and design phases systematically while ensuring quality and maintainability. Once done, SavePlate is expected to show a well-structured system design that solves a real-world problem and offers a solid base for further development and implementation.</w:t>
       </w:r>
-      <w:bookmarkStart w:id="73" w:name="_GoBack"/>
+    </w:p>
+    <w:p>
+      <w:pPr>
+        <w:pStyle w:val="Heading1"/>
+        <w:spacing w:line="360" w:lineRule="auto"/>
+        <w:rPr>
+          <w:color w:val="auto"/>
+        </w:rPr>
+      </w:pPr>
+      <w:bookmarkStart w:id="73" w:name="_Toc232158136"/>
+      <w:bookmarkStart w:id="74" w:name="_Toc232158739"/>
+      <w:bookmarkStart w:id="75" w:name="_Toc232158897"/>
+      <w:r>
+        <w:rPr>
+          <w:color w:val="auto"/>
+        </w:rPr>
+        <w:t>9.0  References</w:t>
+      </w:r>
       <w:bookmarkEnd w:id="73"/>
+      <w:bookmarkEnd w:id="74"/>
+      <w:bookmarkEnd w:id="75"/>
+    </w:p>
+    <w:p>
+      <w:pPr>
+        <w:spacing w:after="200" w:line="360" w:lineRule="auto"/>
+        <w:ind w:left="720" w:hanging="720"/>
+      </w:pPr>
       <w:r>
-        <w:t>solid base for further development and implementation.</w:t>
+        <w:t>Food and Agriculture Organization of the United Nations. (2019). The state of food and agriculture 2019: Moving forward on food loss and waste reduction. FAO. https://www.fao.org/3/ca6030en/ca6030en.pdf</w:t>
       </w:r>
+    </w:p>
+    <w:p>
+      <w:pPr>
+        <w:spacing w:after="200" w:line="360" w:lineRule="auto"/>
+        <w:ind w:left="720" w:hanging="720"/>
+      </w:pPr>
+      <w:r>
+        <w:t>Pressman, R. S., &amp; Maxim, B. R. (2020). Software engineering: A practitioner's approach (9th ed.). McGraw-Hill Education.</w:t>
+      </w:r>
+    </w:p>
+    <w:p>
+      <w:pPr>
+        <w:spacing w:after="200" w:line="360" w:lineRule="auto"/>
+        <w:ind w:left="720" w:hanging="720"/>
+      </w:pPr>
+      <w:r>
+        <w:t>Sommerville, I. (2016). Software engineering (10th ed.). Pearson Education.</w:t>
+      </w:r>
+    </w:p>
+    <w:p>
+      <w:pPr>
+        <w:spacing w:after="200" w:line="360" w:lineRule="auto"/>
+        <w:ind w:left="720" w:hanging="720"/>
+      </w:pPr>
+      <w:r>
+        <w:t>United Nations. (2015). Sustainable development goals: Goal 12 – Responsible consumption and production. https://www.un.org/sustainabledevelopment/sustainable-consumption-production/</w:t>
+      </w:r>
+    </w:p>
+    <w:p>
+      <w:pPr>
+        <w:spacing w:after="200" w:line="360" w:lineRule="auto"/>
+        <w:ind w:left="720" w:hanging="720"/>
+      </w:pPr>
+      <w:r>
+        <w:t xml:space="preserve">Beck, K., Beedle, M., van Bennekum, A., Cockburn, A., Cunningham, W., Fowler, M., Grenning, J., Highsmith, J., Hunt, A., Jeffries, R., Kern, J., Marick, B., Martin, R. C., Mellor, S., Schwaber, K., Sutherland, J., &amp; Thomas, D. (2001). Manifesto for agile software development. </w:t>
+      </w:r>
+      <w:hyperlink r:id="rId10" w:history="1">
+        <w:r>
+          <w:rPr>
+            <w:rStyle w:val="Hyperlink"/>
+          </w:rPr>
+          <w:t>https://agilemanifesto.org/</w:t>
+        </w:r>
+      </w:hyperlink>
+    </w:p>
+    <w:p>
+      <w:pPr>
+        <w:pStyle w:val="NormalWeb"/>
+        <w:spacing w:line="360" w:lineRule="auto"/>
+        <w:jc w:val="both"/>
+      </w:pPr>
+      <w:bookmarkStart w:id="76" w:name="_GoBack"/>
+      <w:bookmarkEnd w:id="76"/>
     </w:p>
     <w:p/>
     <w:sectPr>
@@ -16807,6 +16885,16 @@
       <w:spacing w:before="100" w:beforeAutospacing="1" w:after="100" w:afterAutospacing="1"/>
     </w:pPr>
   </w:style>
+  <w:style w:type="character" w:styleId="Hyperlink">
+    <w:name w:val="Hyperlink"/>
+    <w:uiPriority w:val="99"/>
+    <w:unhideWhenUsed/>
+    <w:rsid w:val="00C3089B"/>
+    <w:rPr>
+      <w:color w:val="0563C1"/>
+      <w:u w:val="single"/>
+    </w:rPr>
+  </w:style>
 </w:styles>
 </file>
 

</xml_diff>

<commit_message>
Added table of Contents
</commit_message>
<xml_diff>
--- a/BIT 216 Assignment 1 (Task 1).docx
+++ b/BIT 216 Assignment 1 (Task 1).docx
@@ -2448,7 +2448,1710 @@
     <w:p/>
     <w:p/>
     <w:p/>
-    <w:p/>
+    <w:sdt>
+      <w:sdtPr>
+        <w:rPr>
+          <w:rFonts w:ascii="Times New Roman" w:eastAsia="Times New Roman" w:hAnsi="Times New Roman" w:cs="Times New Roman"/>
+          <w:color w:val="auto"/>
+          <w:sz w:val="24"/>
+          <w:szCs w:val="24"/>
+        </w:rPr>
+        <w:id w:val="57298128"/>
+        <w:docPartObj>
+          <w:docPartGallery w:val="Table of Contents"/>
+          <w:docPartUnique/>
+        </w:docPartObj>
+      </w:sdtPr>
+      <w:sdtEndPr>
+        <w:rPr>
+          <w:b/>
+          <w:bCs/>
+          <w:noProof/>
+        </w:rPr>
+      </w:sdtEndPr>
+      <w:sdtContent>
+        <w:p>
+          <w:pPr>
+            <w:pStyle w:val="TOCHeading"/>
+          </w:pPr>
+          <w:r>
+            <w:t>Table of Contents</w:t>
+          </w:r>
+        </w:p>
+        <w:p>
+          <w:pPr>
+            <w:pStyle w:val="TOC1"/>
+            <w:tabs>
+              <w:tab w:val="right" w:leader="dot" w:pos="9350"/>
+            </w:tabs>
+            <w:rPr>
+              <w:rFonts w:asciiTheme="minorHAnsi" w:eastAsiaTheme="minorEastAsia" w:hAnsiTheme="minorHAnsi" w:cstheme="minorBidi"/>
+              <w:noProof/>
+              <w:sz w:val="22"/>
+              <w:szCs w:val="22"/>
+            </w:rPr>
+          </w:pPr>
+          <w:r>
+            <w:fldChar w:fldCharType="begin"/>
+          </w:r>
+          <w:r>
+            <w:instrText xml:space="preserve"> TOC \o "1-3" \h \z \u </w:instrText>
+          </w:r>
+          <w:r>
+            <w:fldChar w:fldCharType="separate"/>
+          </w:r>
+          <w:hyperlink w:anchor="_Toc232158875" w:history="1">
+            <w:r>
+              <w:rPr>
+                <w:rStyle w:val="Hyperlink"/>
+                <w:noProof/>
+              </w:rPr>
+              <w:t>1.0  Overview</w:t>
+            </w:r>
+            <w:r>
+              <w:rPr>
+                <w:noProof/>
+                <w:webHidden/>
+              </w:rPr>
+              <w:tab/>
+            </w:r>
+            <w:r>
+              <w:rPr>
+                <w:noProof/>
+                <w:webHidden/>
+              </w:rPr>
+              <w:fldChar w:fldCharType="begin"/>
+            </w:r>
+            <w:r>
+              <w:rPr>
+                <w:noProof/>
+                <w:webHidden/>
+              </w:rPr>
+              <w:instrText xml:space="preserve"> PAGEREF _Toc232158875 \h </w:instrText>
+            </w:r>
+            <w:r>
+              <w:rPr>
+                <w:noProof/>
+                <w:webHidden/>
+              </w:rPr>
+            </w:r>
+            <w:r>
+              <w:rPr>
+                <w:noProof/>
+                <w:webHidden/>
+              </w:rPr>
+              <w:fldChar w:fldCharType="separate"/>
+            </w:r>
+            <w:r>
+              <w:rPr>
+                <w:noProof/>
+                <w:webHidden/>
+              </w:rPr>
+              <w:t>4</w:t>
+            </w:r>
+            <w:r>
+              <w:rPr>
+                <w:noProof/>
+                <w:webHidden/>
+              </w:rPr>
+              <w:fldChar w:fldCharType="end"/>
+            </w:r>
+          </w:hyperlink>
+        </w:p>
+        <w:p>
+          <w:pPr>
+            <w:pStyle w:val="TOC2"/>
+            <w:tabs>
+              <w:tab w:val="right" w:leader="dot" w:pos="9350"/>
+            </w:tabs>
+            <w:rPr>
+              <w:rFonts w:asciiTheme="minorHAnsi" w:eastAsiaTheme="minorEastAsia" w:hAnsiTheme="minorHAnsi" w:cstheme="minorBidi"/>
+              <w:noProof/>
+              <w:sz w:val="22"/>
+              <w:szCs w:val="22"/>
+            </w:rPr>
+          </w:pPr>
+          <w:hyperlink w:anchor="_Toc232158876" w:history="1">
+            <w:r>
+              <w:rPr>
+                <w:rStyle w:val="Hyperlink"/>
+                <w:noProof/>
+              </w:rPr>
+              <w:t>1.1  Background of the poroject</w:t>
+            </w:r>
+            <w:r>
+              <w:rPr>
+                <w:noProof/>
+                <w:webHidden/>
+              </w:rPr>
+              <w:tab/>
+            </w:r>
+            <w:r>
+              <w:rPr>
+                <w:noProof/>
+                <w:webHidden/>
+              </w:rPr>
+              <w:fldChar w:fldCharType="begin"/>
+            </w:r>
+            <w:r>
+              <w:rPr>
+                <w:noProof/>
+                <w:webHidden/>
+              </w:rPr>
+              <w:instrText xml:space="preserve"> PAGEREF _Toc232158876 \h </w:instrText>
+            </w:r>
+            <w:r>
+              <w:rPr>
+                <w:noProof/>
+                <w:webHidden/>
+              </w:rPr>
+            </w:r>
+            <w:r>
+              <w:rPr>
+                <w:noProof/>
+                <w:webHidden/>
+              </w:rPr>
+              <w:fldChar w:fldCharType="separate"/>
+            </w:r>
+            <w:r>
+              <w:rPr>
+                <w:noProof/>
+                <w:webHidden/>
+              </w:rPr>
+              <w:t>4</w:t>
+            </w:r>
+            <w:r>
+              <w:rPr>
+                <w:noProof/>
+                <w:webHidden/>
+              </w:rPr>
+              <w:fldChar w:fldCharType="end"/>
+            </w:r>
+          </w:hyperlink>
+        </w:p>
+        <w:p>
+          <w:pPr>
+            <w:pStyle w:val="TOC2"/>
+            <w:tabs>
+              <w:tab w:val="right" w:leader="dot" w:pos="9350"/>
+            </w:tabs>
+            <w:rPr>
+              <w:rFonts w:asciiTheme="minorHAnsi" w:eastAsiaTheme="minorEastAsia" w:hAnsiTheme="minorHAnsi" w:cstheme="minorBidi"/>
+              <w:noProof/>
+              <w:sz w:val="22"/>
+              <w:szCs w:val="22"/>
+            </w:rPr>
+          </w:pPr>
+          <w:hyperlink w:anchor="_Toc232158877" w:history="1">
+            <w:r>
+              <w:rPr>
+                <w:rStyle w:val="Hyperlink"/>
+                <w:noProof/>
+              </w:rPr>
+              <w:t>1.2  Customer and User Profile</w:t>
+            </w:r>
+            <w:r>
+              <w:rPr>
+                <w:noProof/>
+                <w:webHidden/>
+              </w:rPr>
+              <w:tab/>
+            </w:r>
+            <w:r>
+              <w:rPr>
+                <w:noProof/>
+                <w:webHidden/>
+              </w:rPr>
+              <w:fldChar w:fldCharType="begin"/>
+            </w:r>
+            <w:r>
+              <w:rPr>
+                <w:noProof/>
+                <w:webHidden/>
+              </w:rPr>
+              <w:instrText xml:space="preserve"> PAGEREF _Toc232158877 \h </w:instrText>
+            </w:r>
+            <w:r>
+              <w:rPr>
+                <w:noProof/>
+                <w:webHidden/>
+              </w:rPr>
+            </w:r>
+            <w:r>
+              <w:rPr>
+                <w:noProof/>
+                <w:webHidden/>
+              </w:rPr>
+              <w:fldChar w:fldCharType="separate"/>
+            </w:r>
+            <w:r>
+              <w:rPr>
+                <w:noProof/>
+                <w:webHidden/>
+              </w:rPr>
+              <w:t>5</w:t>
+            </w:r>
+            <w:r>
+              <w:rPr>
+                <w:noProof/>
+                <w:webHidden/>
+              </w:rPr>
+              <w:fldChar w:fldCharType="end"/>
+            </w:r>
+          </w:hyperlink>
+        </w:p>
+        <w:p>
+          <w:pPr>
+            <w:pStyle w:val="TOC2"/>
+            <w:tabs>
+              <w:tab w:val="right" w:leader="dot" w:pos="9350"/>
+            </w:tabs>
+            <w:rPr>
+              <w:rFonts w:asciiTheme="minorHAnsi" w:eastAsiaTheme="minorEastAsia" w:hAnsiTheme="minorHAnsi" w:cstheme="minorBidi"/>
+              <w:noProof/>
+              <w:sz w:val="22"/>
+              <w:szCs w:val="22"/>
+            </w:rPr>
+          </w:pPr>
+          <w:hyperlink w:anchor="_Toc232158878" w:history="1">
+            <w:r>
+              <w:rPr>
+                <w:rStyle w:val="Hyperlink"/>
+                <w:noProof/>
+              </w:rPr>
+              <w:t>1.3  Project Deliverables</w:t>
+            </w:r>
+            <w:r>
+              <w:rPr>
+                <w:noProof/>
+                <w:webHidden/>
+              </w:rPr>
+              <w:tab/>
+            </w:r>
+            <w:r>
+              <w:rPr>
+                <w:noProof/>
+                <w:webHidden/>
+              </w:rPr>
+              <w:fldChar w:fldCharType="begin"/>
+            </w:r>
+            <w:r>
+              <w:rPr>
+                <w:noProof/>
+                <w:webHidden/>
+              </w:rPr>
+              <w:instrText xml:space="preserve"> PAGEREF _Toc232158878 \h </w:instrText>
+            </w:r>
+            <w:r>
+              <w:rPr>
+                <w:noProof/>
+                <w:webHidden/>
+              </w:rPr>
+            </w:r>
+            <w:r>
+              <w:rPr>
+                <w:noProof/>
+                <w:webHidden/>
+              </w:rPr>
+              <w:fldChar w:fldCharType="separate"/>
+            </w:r>
+            <w:r>
+              <w:rPr>
+                <w:noProof/>
+                <w:webHidden/>
+              </w:rPr>
+              <w:t>5</w:t>
+            </w:r>
+            <w:r>
+              <w:rPr>
+                <w:noProof/>
+                <w:webHidden/>
+              </w:rPr>
+              <w:fldChar w:fldCharType="end"/>
+            </w:r>
+          </w:hyperlink>
+        </w:p>
+        <w:p>
+          <w:pPr>
+            <w:pStyle w:val="TOC2"/>
+            <w:tabs>
+              <w:tab w:val="right" w:leader="dot" w:pos="9350"/>
+            </w:tabs>
+            <w:rPr>
+              <w:rFonts w:asciiTheme="minorHAnsi" w:eastAsiaTheme="minorEastAsia" w:hAnsiTheme="minorHAnsi" w:cstheme="minorBidi"/>
+              <w:noProof/>
+              <w:sz w:val="22"/>
+              <w:szCs w:val="22"/>
+            </w:rPr>
+          </w:pPr>
+          <w:hyperlink w:anchor="_Toc232158879" w:history="1">
+            <w:r>
+              <w:rPr>
+                <w:rStyle w:val="Hyperlink"/>
+                <w:noProof/>
+              </w:rPr>
+              <w:t>1.4  Product Type</w:t>
+            </w:r>
+            <w:r>
+              <w:rPr>
+                <w:noProof/>
+                <w:webHidden/>
+              </w:rPr>
+              <w:tab/>
+            </w:r>
+            <w:r>
+              <w:rPr>
+                <w:noProof/>
+                <w:webHidden/>
+              </w:rPr>
+              <w:fldChar w:fldCharType="begin"/>
+            </w:r>
+            <w:r>
+              <w:rPr>
+                <w:noProof/>
+                <w:webHidden/>
+              </w:rPr>
+              <w:instrText xml:space="preserve"> PAGEREF _Toc232158879 \h </w:instrText>
+            </w:r>
+            <w:r>
+              <w:rPr>
+                <w:noProof/>
+                <w:webHidden/>
+              </w:rPr>
+            </w:r>
+            <w:r>
+              <w:rPr>
+                <w:noProof/>
+                <w:webHidden/>
+              </w:rPr>
+              <w:fldChar w:fldCharType="separate"/>
+            </w:r>
+            <w:r>
+              <w:rPr>
+                <w:noProof/>
+                <w:webHidden/>
+              </w:rPr>
+              <w:t>6</w:t>
+            </w:r>
+            <w:r>
+              <w:rPr>
+                <w:noProof/>
+                <w:webHidden/>
+              </w:rPr>
+              <w:fldChar w:fldCharType="end"/>
+            </w:r>
+          </w:hyperlink>
+        </w:p>
+        <w:p>
+          <w:pPr>
+            <w:pStyle w:val="TOC2"/>
+            <w:tabs>
+              <w:tab w:val="right" w:leader="dot" w:pos="9350"/>
+            </w:tabs>
+            <w:rPr>
+              <w:rFonts w:asciiTheme="minorHAnsi" w:eastAsiaTheme="minorEastAsia" w:hAnsiTheme="minorHAnsi" w:cstheme="minorBidi"/>
+              <w:noProof/>
+              <w:sz w:val="22"/>
+              <w:szCs w:val="22"/>
+            </w:rPr>
+          </w:pPr>
+          <w:hyperlink w:anchor="_Toc232158880" w:history="1">
+            <w:r>
+              <w:rPr>
+                <w:rStyle w:val="Hyperlink"/>
+                <w:noProof/>
+              </w:rPr>
+              <w:t>1.5  Estimated Cost</w:t>
+            </w:r>
+            <w:r>
+              <w:rPr>
+                <w:noProof/>
+                <w:webHidden/>
+              </w:rPr>
+              <w:tab/>
+            </w:r>
+            <w:r>
+              <w:rPr>
+                <w:noProof/>
+                <w:webHidden/>
+              </w:rPr>
+              <w:fldChar w:fldCharType="begin"/>
+            </w:r>
+            <w:r>
+              <w:rPr>
+                <w:noProof/>
+                <w:webHidden/>
+              </w:rPr>
+              <w:instrText xml:space="preserve"> PAGEREF _Toc232158880 \h </w:instrText>
+            </w:r>
+            <w:r>
+              <w:rPr>
+                <w:noProof/>
+                <w:webHidden/>
+              </w:rPr>
+            </w:r>
+            <w:r>
+              <w:rPr>
+                <w:noProof/>
+                <w:webHidden/>
+              </w:rPr>
+              <w:fldChar w:fldCharType="separate"/>
+            </w:r>
+            <w:r>
+              <w:rPr>
+                <w:noProof/>
+                <w:webHidden/>
+              </w:rPr>
+              <w:t>6</w:t>
+            </w:r>
+            <w:r>
+              <w:rPr>
+                <w:noProof/>
+                <w:webHidden/>
+              </w:rPr>
+              <w:fldChar w:fldCharType="end"/>
+            </w:r>
+          </w:hyperlink>
+        </w:p>
+        <w:p>
+          <w:pPr>
+            <w:pStyle w:val="TOC2"/>
+            <w:tabs>
+              <w:tab w:val="right" w:leader="dot" w:pos="9350"/>
+            </w:tabs>
+            <w:rPr>
+              <w:rFonts w:asciiTheme="minorHAnsi" w:eastAsiaTheme="minorEastAsia" w:hAnsiTheme="minorHAnsi" w:cstheme="minorBidi"/>
+              <w:noProof/>
+              <w:sz w:val="22"/>
+              <w:szCs w:val="22"/>
+            </w:rPr>
+          </w:pPr>
+          <w:hyperlink w:anchor="_Toc232158881" w:history="1">
+            <w:r>
+              <w:rPr>
+                <w:rStyle w:val="Hyperlink"/>
+                <w:noProof/>
+              </w:rPr>
+              <w:t>1.6  Timeline</w:t>
+            </w:r>
+            <w:r>
+              <w:rPr>
+                <w:noProof/>
+                <w:webHidden/>
+              </w:rPr>
+              <w:tab/>
+            </w:r>
+            <w:r>
+              <w:rPr>
+                <w:noProof/>
+                <w:webHidden/>
+              </w:rPr>
+              <w:fldChar w:fldCharType="begin"/>
+            </w:r>
+            <w:r>
+              <w:rPr>
+                <w:noProof/>
+                <w:webHidden/>
+              </w:rPr>
+              <w:instrText xml:space="preserve"> PAGEREF _Toc232158881 \h </w:instrText>
+            </w:r>
+            <w:r>
+              <w:rPr>
+                <w:noProof/>
+                <w:webHidden/>
+              </w:rPr>
+            </w:r>
+            <w:r>
+              <w:rPr>
+                <w:noProof/>
+                <w:webHidden/>
+              </w:rPr>
+              <w:fldChar w:fldCharType="separate"/>
+            </w:r>
+            <w:r>
+              <w:rPr>
+                <w:noProof/>
+                <w:webHidden/>
+              </w:rPr>
+              <w:t>6</w:t>
+            </w:r>
+            <w:r>
+              <w:rPr>
+                <w:noProof/>
+                <w:webHidden/>
+              </w:rPr>
+              <w:fldChar w:fldCharType="end"/>
+            </w:r>
+          </w:hyperlink>
+        </w:p>
+        <w:p>
+          <w:pPr>
+            <w:pStyle w:val="TOC1"/>
+            <w:tabs>
+              <w:tab w:val="right" w:leader="dot" w:pos="9350"/>
+            </w:tabs>
+            <w:rPr>
+              <w:rFonts w:asciiTheme="minorHAnsi" w:eastAsiaTheme="minorEastAsia" w:hAnsiTheme="minorHAnsi" w:cstheme="minorBidi"/>
+              <w:noProof/>
+              <w:sz w:val="22"/>
+              <w:szCs w:val="22"/>
+            </w:rPr>
+          </w:pPr>
+          <w:hyperlink w:anchor="_Toc232158882" w:history="1">
+            <w:r>
+              <w:rPr>
+                <w:rStyle w:val="Hyperlink"/>
+                <w:noProof/>
+              </w:rPr>
+              <w:t>2.0  Project Aims</w:t>
+            </w:r>
+            <w:r>
+              <w:rPr>
+                <w:noProof/>
+                <w:webHidden/>
+              </w:rPr>
+              <w:tab/>
+            </w:r>
+            <w:r>
+              <w:rPr>
+                <w:noProof/>
+                <w:webHidden/>
+              </w:rPr>
+              <w:fldChar w:fldCharType="begin"/>
+            </w:r>
+            <w:r>
+              <w:rPr>
+                <w:noProof/>
+                <w:webHidden/>
+              </w:rPr>
+              <w:instrText xml:space="preserve"> PAGEREF _Toc232158882 \h </w:instrText>
+            </w:r>
+            <w:r>
+              <w:rPr>
+                <w:noProof/>
+                <w:webHidden/>
+              </w:rPr>
+            </w:r>
+            <w:r>
+              <w:rPr>
+                <w:noProof/>
+                <w:webHidden/>
+              </w:rPr>
+              <w:fldChar w:fldCharType="separate"/>
+            </w:r>
+            <w:r>
+              <w:rPr>
+                <w:noProof/>
+                <w:webHidden/>
+              </w:rPr>
+              <w:t>7</w:t>
+            </w:r>
+            <w:r>
+              <w:rPr>
+                <w:noProof/>
+                <w:webHidden/>
+              </w:rPr>
+              <w:fldChar w:fldCharType="end"/>
+            </w:r>
+          </w:hyperlink>
+        </w:p>
+        <w:p>
+          <w:pPr>
+            <w:pStyle w:val="TOC1"/>
+            <w:tabs>
+              <w:tab w:val="right" w:leader="dot" w:pos="9350"/>
+            </w:tabs>
+            <w:rPr>
+              <w:rFonts w:asciiTheme="minorHAnsi" w:eastAsiaTheme="minorEastAsia" w:hAnsiTheme="minorHAnsi" w:cstheme="minorBidi"/>
+              <w:noProof/>
+              <w:sz w:val="22"/>
+              <w:szCs w:val="22"/>
+            </w:rPr>
+          </w:pPr>
+          <w:hyperlink w:anchor="_Toc232158883" w:history="1">
+            <w:r>
+              <w:rPr>
+                <w:rStyle w:val="Hyperlink"/>
+                <w:noProof/>
+              </w:rPr>
+              <w:t>3.0  Project Objectives</w:t>
+            </w:r>
+            <w:r>
+              <w:rPr>
+                <w:noProof/>
+                <w:webHidden/>
+              </w:rPr>
+              <w:tab/>
+            </w:r>
+            <w:r>
+              <w:rPr>
+                <w:noProof/>
+                <w:webHidden/>
+              </w:rPr>
+              <w:fldChar w:fldCharType="begin"/>
+            </w:r>
+            <w:r>
+              <w:rPr>
+                <w:noProof/>
+                <w:webHidden/>
+              </w:rPr>
+              <w:instrText xml:space="preserve"> PAGEREF _Toc232158883 \h </w:instrText>
+            </w:r>
+            <w:r>
+              <w:rPr>
+                <w:noProof/>
+                <w:webHidden/>
+              </w:rPr>
+            </w:r>
+            <w:r>
+              <w:rPr>
+                <w:noProof/>
+                <w:webHidden/>
+              </w:rPr>
+              <w:fldChar w:fldCharType="separate"/>
+            </w:r>
+            <w:r>
+              <w:rPr>
+                <w:noProof/>
+                <w:webHidden/>
+              </w:rPr>
+              <w:t>8</w:t>
+            </w:r>
+            <w:r>
+              <w:rPr>
+                <w:noProof/>
+                <w:webHidden/>
+              </w:rPr>
+              <w:fldChar w:fldCharType="end"/>
+            </w:r>
+          </w:hyperlink>
+        </w:p>
+        <w:p>
+          <w:pPr>
+            <w:pStyle w:val="TOC1"/>
+            <w:tabs>
+              <w:tab w:val="right" w:leader="dot" w:pos="9350"/>
+            </w:tabs>
+            <w:rPr>
+              <w:rFonts w:asciiTheme="minorHAnsi" w:eastAsiaTheme="minorEastAsia" w:hAnsiTheme="minorHAnsi" w:cstheme="minorBidi"/>
+              <w:noProof/>
+              <w:sz w:val="22"/>
+              <w:szCs w:val="22"/>
+            </w:rPr>
+          </w:pPr>
+          <w:hyperlink w:anchor="_Toc232158884" w:history="1">
+            <w:r>
+              <w:rPr>
+                <w:rStyle w:val="Hyperlink"/>
+                <w:noProof/>
+              </w:rPr>
+              <w:t>4.0  Project Scope</w:t>
+            </w:r>
+            <w:r>
+              <w:rPr>
+                <w:noProof/>
+                <w:webHidden/>
+              </w:rPr>
+              <w:tab/>
+            </w:r>
+            <w:r>
+              <w:rPr>
+                <w:noProof/>
+                <w:webHidden/>
+              </w:rPr>
+              <w:fldChar w:fldCharType="begin"/>
+            </w:r>
+            <w:r>
+              <w:rPr>
+                <w:noProof/>
+                <w:webHidden/>
+              </w:rPr>
+              <w:instrText xml:space="preserve"> PAGEREF _Toc232158884 \h </w:instrText>
+            </w:r>
+            <w:r>
+              <w:rPr>
+                <w:noProof/>
+                <w:webHidden/>
+              </w:rPr>
+            </w:r>
+            <w:r>
+              <w:rPr>
+                <w:noProof/>
+                <w:webHidden/>
+              </w:rPr>
+              <w:fldChar w:fldCharType="separate"/>
+            </w:r>
+            <w:r>
+              <w:rPr>
+                <w:noProof/>
+                <w:webHidden/>
+              </w:rPr>
+              <w:t>9</w:t>
+            </w:r>
+            <w:r>
+              <w:rPr>
+                <w:noProof/>
+                <w:webHidden/>
+              </w:rPr>
+              <w:fldChar w:fldCharType="end"/>
+            </w:r>
+          </w:hyperlink>
+        </w:p>
+        <w:p>
+          <w:pPr>
+            <w:pStyle w:val="TOC2"/>
+            <w:tabs>
+              <w:tab w:val="right" w:leader="dot" w:pos="9350"/>
+            </w:tabs>
+            <w:rPr>
+              <w:rFonts w:asciiTheme="minorHAnsi" w:eastAsiaTheme="minorEastAsia" w:hAnsiTheme="minorHAnsi" w:cstheme="minorBidi"/>
+              <w:noProof/>
+              <w:sz w:val="22"/>
+              <w:szCs w:val="22"/>
+            </w:rPr>
+          </w:pPr>
+          <w:hyperlink w:anchor="_Toc232158885" w:history="1">
+            <w:r>
+              <w:rPr>
+                <w:rStyle w:val="Hyperlink"/>
+                <w:noProof/>
+              </w:rPr>
+              <w:t>4.1  In-Scope Features</w:t>
+            </w:r>
+            <w:r>
+              <w:rPr>
+                <w:noProof/>
+                <w:webHidden/>
+              </w:rPr>
+              <w:tab/>
+            </w:r>
+            <w:r>
+              <w:rPr>
+                <w:noProof/>
+                <w:webHidden/>
+              </w:rPr>
+              <w:fldChar w:fldCharType="begin"/>
+            </w:r>
+            <w:r>
+              <w:rPr>
+                <w:noProof/>
+                <w:webHidden/>
+              </w:rPr>
+              <w:instrText xml:space="preserve"> PAGEREF _Toc232158885 \h </w:instrText>
+            </w:r>
+            <w:r>
+              <w:rPr>
+                <w:noProof/>
+                <w:webHidden/>
+              </w:rPr>
+            </w:r>
+            <w:r>
+              <w:rPr>
+                <w:noProof/>
+                <w:webHidden/>
+              </w:rPr>
+              <w:fldChar w:fldCharType="separate"/>
+            </w:r>
+            <w:r>
+              <w:rPr>
+                <w:noProof/>
+                <w:webHidden/>
+              </w:rPr>
+              <w:t>9</w:t>
+            </w:r>
+            <w:r>
+              <w:rPr>
+                <w:noProof/>
+                <w:webHidden/>
+              </w:rPr>
+              <w:fldChar w:fldCharType="end"/>
+            </w:r>
+          </w:hyperlink>
+        </w:p>
+        <w:p>
+          <w:pPr>
+            <w:pStyle w:val="TOC2"/>
+            <w:tabs>
+              <w:tab w:val="right" w:leader="dot" w:pos="9350"/>
+            </w:tabs>
+            <w:rPr>
+              <w:rFonts w:asciiTheme="minorHAnsi" w:eastAsiaTheme="minorEastAsia" w:hAnsiTheme="minorHAnsi" w:cstheme="minorBidi"/>
+              <w:noProof/>
+              <w:sz w:val="22"/>
+              <w:szCs w:val="22"/>
+            </w:rPr>
+          </w:pPr>
+          <w:hyperlink w:anchor="_Toc232158886" w:history="1">
+            <w:r>
+              <w:rPr>
+                <w:rStyle w:val="Hyperlink"/>
+                <w:noProof/>
+              </w:rPr>
+              <w:t>4.2  Out-of-Scope Features</w:t>
+            </w:r>
+            <w:r>
+              <w:rPr>
+                <w:noProof/>
+                <w:webHidden/>
+              </w:rPr>
+              <w:tab/>
+            </w:r>
+            <w:r>
+              <w:rPr>
+                <w:noProof/>
+                <w:webHidden/>
+              </w:rPr>
+              <w:fldChar w:fldCharType="begin"/>
+            </w:r>
+            <w:r>
+              <w:rPr>
+                <w:noProof/>
+                <w:webHidden/>
+              </w:rPr>
+              <w:instrText xml:space="preserve"> PAGEREF _Toc232158886 \h </w:instrText>
+            </w:r>
+            <w:r>
+              <w:rPr>
+                <w:noProof/>
+                <w:webHidden/>
+              </w:rPr>
+            </w:r>
+            <w:r>
+              <w:rPr>
+                <w:noProof/>
+                <w:webHidden/>
+              </w:rPr>
+              <w:fldChar w:fldCharType="separate"/>
+            </w:r>
+            <w:r>
+              <w:rPr>
+                <w:noProof/>
+                <w:webHidden/>
+              </w:rPr>
+              <w:t>9</w:t>
+            </w:r>
+            <w:r>
+              <w:rPr>
+                <w:noProof/>
+                <w:webHidden/>
+              </w:rPr>
+              <w:fldChar w:fldCharType="end"/>
+            </w:r>
+          </w:hyperlink>
+        </w:p>
+        <w:p>
+          <w:pPr>
+            <w:pStyle w:val="TOC2"/>
+            <w:tabs>
+              <w:tab w:val="right" w:leader="dot" w:pos="9350"/>
+            </w:tabs>
+            <w:rPr>
+              <w:rFonts w:asciiTheme="minorHAnsi" w:eastAsiaTheme="minorEastAsia" w:hAnsiTheme="minorHAnsi" w:cstheme="minorBidi"/>
+              <w:noProof/>
+              <w:sz w:val="22"/>
+              <w:szCs w:val="22"/>
+            </w:rPr>
+          </w:pPr>
+          <w:hyperlink w:anchor="_Toc232158887" w:history="1">
+            <w:r>
+              <w:rPr>
+                <w:rStyle w:val="Hyperlink"/>
+                <w:noProof/>
+              </w:rPr>
+              <w:t>4.3  Scope Justification</w:t>
+            </w:r>
+            <w:r>
+              <w:rPr>
+                <w:noProof/>
+                <w:webHidden/>
+              </w:rPr>
+              <w:tab/>
+            </w:r>
+            <w:r>
+              <w:rPr>
+                <w:noProof/>
+                <w:webHidden/>
+              </w:rPr>
+              <w:fldChar w:fldCharType="begin"/>
+            </w:r>
+            <w:r>
+              <w:rPr>
+                <w:noProof/>
+                <w:webHidden/>
+              </w:rPr>
+              <w:instrText xml:space="preserve"> PAGEREF _Toc232158887 \h </w:instrText>
+            </w:r>
+            <w:r>
+              <w:rPr>
+                <w:noProof/>
+                <w:webHidden/>
+              </w:rPr>
+            </w:r>
+            <w:r>
+              <w:rPr>
+                <w:noProof/>
+                <w:webHidden/>
+              </w:rPr>
+              <w:fldChar w:fldCharType="separate"/>
+            </w:r>
+            <w:r>
+              <w:rPr>
+                <w:noProof/>
+                <w:webHidden/>
+              </w:rPr>
+              <w:t>10</w:t>
+            </w:r>
+            <w:r>
+              <w:rPr>
+                <w:noProof/>
+                <w:webHidden/>
+              </w:rPr>
+              <w:fldChar w:fldCharType="end"/>
+            </w:r>
+          </w:hyperlink>
+        </w:p>
+        <w:p>
+          <w:pPr>
+            <w:pStyle w:val="TOC1"/>
+            <w:tabs>
+              <w:tab w:val="right" w:leader="dot" w:pos="9350"/>
+            </w:tabs>
+            <w:rPr>
+              <w:rFonts w:asciiTheme="minorHAnsi" w:eastAsiaTheme="minorEastAsia" w:hAnsiTheme="minorHAnsi" w:cstheme="minorBidi"/>
+              <w:noProof/>
+              <w:sz w:val="22"/>
+              <w:szCs w:val="22"/>
+            </w:rPr>
+          </w:pPr>
+          <w:hyperlink w:anchor="_Toc232158888" w:history="1">
+            <w:r>
+              <w:rPr>
+                <w:rStyle w:val="Hyperlink"/>
+                <w:noProof/>
+              </w:rPr>
+              <w:t>5.0  Project Schedule</w:t>
+            </w:r>
+            <w:r>
+              <w:rPr>
+                <w:noProof/>
+                <w:webHidden/>
+              </w:rPr>
+              <w:tab/>
+            </w:r>
+            <w:r>
+              <w:rPr>
+                <w:noProof/>
+                <w:webHidden/>
+              </w:rPr>
+              <w:fldChar w:fldCharType="begin"/>
+            </w:r>
+            <w:r>
+              <w:rPr>
+                <w:noProof/>
+                <w:webHidden/>
+              </w:rPr>
+              <w:instrText xml:space="preserve"> PAGEREF _Toc232158888 \h </w:instrText>
+            </w:r>
+            <w:r>
+              <w:rPr>
+                <w:noProof/>
+                <w:webHidden/>
+              </w:rPr>
+            </w:r>
+            <w:r>
+              <w:rPr>
+                <w:noProof/>
+                <w:webHidden/>
+              </w:rPr>
+              <w:fldChar w:fldCharType="separate"/>
+            </w:r>
+            <w:r>
+              <w:rPr>
+                <w:noProof/>
+                <w:webHidden/>
+              </w:rPr>
+              <w:t>11</w:t>
+            </w:r>
+            <w:r>
+              <w:rPr>
+                <w:noProof/>
+                <w:webHidden/>
+              </w:rPr>
+              <w:fldChar w:fldCharType="end"/>
+            </w:r>
+          </w:hyperlink>
+        </w:p>
+        <w:p>
+          <w:pPr>
+            <w:pStyle w:val="TOC2"/>
+            <w:tabs>
+              <w:tab w:val="right" w:leader="dot" w:pos="9350"/>
+            </w:tabs>
+            <w:rPr>
+              <w:rFonts w:asciiTheme="minorHAnsi" w:eastAsiaTheme="minorEastAsia" w:hAnsiTheme="minorHAnsi" w:cstheme="minorBidi"/>
+              <w:noProof/>
+              <w:sz w:val="22"/>
+              <w:szCs w:val="22"/>
+            </w:rPr>
+          </w:pPr>
+          <w:hyperlink w:anchor="_Toc232158889" w:history="1">
+            <w:r>
+              <w:rPr>
+                <w:rStyle w:val="Hyperlink"/>
+                <w:noProof/>
+              </w:rPr>
+              <w:t>5.1  Work Breakdown Structure (WBS)</w:t>
+            </w:r>
+            <w:r>
+              <w:rPr>
+                <w:noProof/>
+                <w:webHidden/>
+              </w:rPr>
+              <w:tab/>
+            </w:r>
+            <w:r>
+              <w:rPr>
+                <w:noProof/>
+                <w:webHidden/>
+              </w:rPr>
+              <w:fldChar w:fldCharType="begin"/>
+            </w:r>
+            <w:r>
+              <w:rPr>
+                <w:noProof/>
+                <w:webHidden/>
+              </w:rPr>
+              <w:instrText xml:space="preserve"> PAGEREF _Toc232158889 \h </w:instrText>
+            </w:r>
+            <w:r>
+              <w:rPr>
+                <w:noProof/>
+                <w:webHidden/>
+              </w:rPr>
+            </w:r>
+            <w:r>
+              <w:rPr>
+                <w:noProof/>
+                <w:webHidden/>
+              </w:rPr>
+              <w:fldChar w:fldCharType="separate"/>
+            </w:r>
+            <w:r>
+              <w:rPr>
+                <w:noProof/>
+                <w:webHidden/>
+              </w:rPr>
+              <w:t>11</w:t>
+            </w:r>
+            <w:r>
+              <w:rPr>
+                <w:noProof/>
+                <w:webHidden/>
+              </w:rPr>
+              <w:fldChar w:fldCharType="end"/>
+            </w:r>
+          </w:hyperlink>
+        </w:p>
+        <w:p>
+          <w:pPr>
+            <w:pStyle w:val="TOC2"/>
+            <w:tabs>
+              <w:tab w:val="right" w:leader="dot" w:pos="9350"/>
+            </w:tabs>
+            <w:rPr>
+              <w:rFonts w:asciiTheme="minorHAnsi" w:eastAsiaTheme="minorEastAsia" w:hAnsiTheme="minorHAnsi" w:cstheme="minorBidi"/>
+              <w:noProof/>
+              <w:sz w:val="22"/>
+              <w:szCs w:val="22"/>
+            </w:rPr>
+          </w:pPr>
+          <w:hyperlink w:anchor="_Toc232158890" w:history="1">
+            <w:r>
+              <w:rPr>
+                <w:rStyle w:val="Hyperlink"/>
+                <w:noProof/>
+              </w:rPr>
+              <w:t>5.2  Milestones and Deliverables</w:t>
+            </w:r>
+            <w:r>
+              <w:rPr>
+                <w:noProof/>
+                <w:webHidden/>
+              </w:rPr>
+              <w:tab/>
+            </w:r>
+            <w:r>
+              <w:rPr>
+                <w:noProof/>
+                <w:webHidden/>
+              </w:rPr>
+              <w:fldChar w:fldCharType="begin"/>
+            </w:r>
+            <w:r>
+              <w:rPr>
+                <w:noProof/>
+                <w:webHidden/>
+              </w:rPr>
+              <w:instrText xml:space="preserve"> PAGEREF _Toc232158890 \h </w:instrText>
+            </w:r>
+            <w:r>
+              <w:rPr>
+                <w:noProof/>
+                <w:webHidden/>
+              </w:rPr>
+            </w:r>
+            <w:r>
+              <w:rPr>
+                <w:noProof/>
+                <w:webHidden/>
+              </w:rPr>
+              <w:fldChar w:fldCharType="separate"/>
+            </w:r>
+            <w:r>
+              <w:rPr>
+                <w:noProof/>
+                <w:webHidden/>
+              </w:rPr>
+              <w:t>13</w:t>
+            </w:r>
+            <w:r>
+              <w:rPr>
+                <w:noProof/>
+                <w:webHidden/>
+              </w:rPr>
+              <w:fldChar w:fldCharType="end"/>
+            </w:r>
+          </w:hyperlink>
+        </w:p>
+        <w:p>
+          <w:pPr>
+            <w:pStyle w:val="TOC2"/>
+            <w:tabs>
+              <w:tab w:val="right" w:leader="dot" w:pos="9350"/>
+            </w:tabs>
+            <w:rPr>
+              <w:rFonts w:asciiTheme="minorHAnsi" w:eastAsiaTheme="minorEastAsia" w:hAnsiTheme="minorHAnsi" w:cstheme="minorBidi"/>
+              <w:noProof/>
+              <w:sz w:val="22"/>
+              <w:szCs w:val="22"/>
+            </w:rPr>
+          </w:pPr>
+          <w:hyperlink w:anchor="_Toc232158891" w:history="1">
+            <w:r>
+              <w:rPr>
+                <w:rStyle w:val="Hyperlink"/>
+                <w:noProof/>
+              </w:rPr>
+              <w:t>5.3  Gantt Chart</w:t>
+            </w:r>
+            <w:r>
+              <w:rPr>
+                <w:noProof/>
+                <w:webHidden/>
+              </w:rPr>
+              <w:tab/>
+            </w:r>
+            <w:r>
+              <w:rPr>
+                <w:noProof/>
+                <w:webHidden/>
+              </w:rPr>
+              <w:fldChar w:fldCharType="begin"/>
+            </w:r>
+            <w:r>
+              <w:rPr>
+                <w:noProof/>
+                <w:webHidden/>
+              </w:rPr>
+              <w:instrText xml:space="preserve"> PAGEREF _Toc232158891 \h </w:instrText>
+            </w:r>
+            <w:r>
+              <w:rPr>
+                <w:noProof/>
+                <w:webHidden/>
+              </w:rPr>
+            </w:r>
+            <w:r>
+              <w:rPr>
+                <w:noProof/>
+                <w:webHidden/>
+              </w:rPr>
+              <w:fldChar w:fldCharType="separate"/>
+            </w:r>
+            <w:r>
+              <w:rPr>
+                <w:noProof/>
+                <w:webHidden/>
+              </w:rPr>
+              <w:t>14</w:t>
+            </w:r>
+            <w:r>
+              <w:rPr>
+                <w:noProof/>
+                <w:webHidden/>
+              </w:rPr>
+              <w:fldChar w:fldCharType="end"/>
+            </w:r>
+          </w:hyperlink>
+        </w:p>
+        <w:p>
+          <w:pPr>
+            <w:pStyle w:val="TOC1"/>
+            <w:tabs>
+              <w:tab w:val="right" w:leader="dot" w:pos="9350"/>
+            </w:tabs>
+            <w:rPr>
+              <w:rFonts w:asciiTheme="minorHAnsi" w:eastAsiaTheme="minorEastAsia" w:hAnsiTheme="minorHAnsi" w:cstheme="minorBidi"/>
+              <w:noProof/>
+              <w:sz w:val="22"/>
+              <w:szCs w:val="22"/>
+            </w:rPr>
+          </w:pPr>
+          <w:hyperlink w:anchor="_Toc232158892" w:history="1">
+            <w:r>
+              <w:rPr>
+                <w:rStyle w:val="Hyperlink"/>
+                <w:noProof/>
+              </w:rPr>
+              <w:t>6.0  Technical Description of the Proposed System</w:t>
+            </w:r>
+            <w:r>
+              <w:rPr>
+                <w:noProof/>
+                <w:webHidden/>
+              </w:rPr>
+              <w:tab/>
+            </w:r>
+            <w:r>
+              <w:rPr>
+                <w:noProof/>
+                <w:webHidden/>
+              </w:rPr>
+              <w:fldChar w:fldCharType="begin"/>
+            </w:r>
+            <w:r>
+              <w:rPr>
+                <w:noProof/>
+                <w:webHidden/>
+              </w:rPr>
+              <w:instrText xml:space="preserve"> PAGEREF _Toc232158892 \h </w:instrText>
+            </w:r>
+            <w:r>
+              <w:rPr>
+                <w:noProof/>
+                <w:webHidden/>
+              </w:rPr>
+            </w:r>
+            <w:r>
+              <w:rPr>
+                <w:noProof/>
+                <w:webHidden/>
+              </w:rPr>
+              <w:fldChar w:fldCharType="separate"/>
+            </w:r>
+            <w:r>
+              <w:rPr>
+                <w:noProof/>
+                <w:webHidden/>
+              </w:rPr>
+              <w:t>15</w:t>
+            </w:r>
+            <w:r>
+              <w:rPr>
+                <w:noProof/>
+                <w:webHidden/>
+              </w:rPr>
+              <w:fldChar w:fldCharType="end"/>
+            </w:r>
+          </w:hyperlink>
+        </w:p>
+        <w:p>
+          <w:pPr>
+            <w:pStyle w:val="TOC2"/>
+            <w:tabs>
+              <w:tab w:val="right" w:leader="dot" w:pos="9350"/>
+            </w:tabs>
+            <w:rPr>
+              <w:rFonts w:asciiTheme="minorHAnsi" w:eastAsiaTheme="minorEastAsia" w:hAnsiTheme="minorHAnsi" w:cstheme="minorBidi"/>
+              <w:noProof/>
+              <w:sz w:val="22"/>
+              <w:szCs w:val="22"/>
+            </w:rPr>
+          </w:pPr>
+          <w:hyperlink w:anchor="_Toc232158893" w:history="1">
+            <w:r>
+              <w:rPr>
+                <w:rStyle w:val="Hyperlink"/>
+                <w:noProof/>
+              </w:rPr>
+              <w:t>6.1  Development Platform</w:t>
+            </w:r>
+            <w:r>
+              <w:rPr>
+                <w:noProof/>
+                <w:webHidden/>
+              </w:rPr>
+              <w:tab/>
+            </w:r>
+            <w:r>
+              <w:rPr>
+                <w:noProof/>
+                <w:webHidden/>
+              </w:rPr>
+              <w:fldChar w:fldCharType="begin"/>
+            </w:r>
+            <w:r>
+              <w:rPr>
+                <w:noProof/>
+                <w:webHidden/>
+              </w:rPr>
+              <w:instrText xml:space="preserve"> PAGEREF _Toc232158893 \h </w:instrText>
+            </w:r>
+            <w:r>
+              <w:rPr>
+                <w:noProof/>
+                <w:webHidden/>
+              </w:rPr>
+            </w:r>
+            <w:r>
+              <w:rPr>
+                <w:noProof/>
+                <w:webHidden/>
+              </w:rPr>
+              <w:fldChar w:fldCharType="separate"/>
+            </w:r>
+            <w:r>
+              <w:rPr>
+                <w:noProof/>
+                <w:webHidden/>
+              </w:rPr>
+              <w:t>16</w:t>
+            </w:r>
+            <w:r>
+              <w:rPr>
+                <w:noProof/>
+                <w:webHidden/>
+              </w:rPr>
+              <w:fldChar w:fldCharType="end"/>
+            </w:r>
+          </w:hyperlink>
+        </w:p>
+        <w:p>
+          <w:pPr>
+            <w:pStyle w:val="TOC2"/>
+            <w:tabs>
+              <w:tab w:val="right" w:leader="dot" w:pos="9350"/>
+            </w:tabs>
+            <w:rPr>
+              <w:rFonts w:asciiTheme="minorHAnsi" w:eastAsiaTheme="minorEastAsia" w:hAnsiTheme="minorHAnsi" w:cstheme="minorBidi"/>
+              <w:noProof/>
+              <w:sz w:val="22"/>
+              <w:szCs w:val="22"/>
+            </w:rPr>
+          </w:pPr>
+          <w:hyperlink w:anchor="_Toc232158894" w:history="1">
+            <w:r>
+              <w:rPr>
+                <w:rStyle w:val="Hyperlink"/>
+                <w:noProof/>
+              </w:rPr>
+              <w:t>6.2  Demonstration Platform</w:t>
+            </w:r>
+            <w:r>
+              <w:rPr>
+                <w:noProof/>
+                <w:webHidden/>
+              </w:rPr>
+              <w:tab/>
+            </w:r>
+            <w:r>
+              <w:rPr>
+                <w:noProof/>
+                <w:webHidden/>
+              </w:rPr>
+              <w:fldChar w:fldCharType="begin"/>
+            </w:r>
+            <w:r>
+              <w:rPr>
+                <w:noProof/>
+                <w:webHidden/>
+              </w:rPr>
+              <w:instrText xml:space="preserve"> PAGEREF _Toc232158894 \h </w:instrText>
+            </w:r>
+            <w:r>
+              <w:rPr>
+                <w:noProof/>
+                <w:webHidden/>
+              </w:rPr>
+            </w:r>
+            <w:r>
+              <w:rPr>
+                <w:noProof/>
+                <w:webHidden/>
+              </w:rPr>
+              <w:fldChar w:fldCharType="separate"/>
+            </w:r>
+            <w:r>
+              <w:rPr>
+                <w:noProof/>
+                <w:webHidden/>
+              </w:rPr>
+              <w:t>18</w:t>
+            </w:r>
+            <w:r>
+              <w:rPr>
+                <w:noProof/>
+                <w:webHidden/>
+              </w:rPr>
+              <w:fldChar w:fldCharType="end"/>
+            </w:r>
+          </w:hyperlink>
+        </w:p>
+        <w:p>
+          <w:pPr>
+            <w:pStyle w:val="TOC1"/>
+            <w:tabs>
+              <w:tab w:val="right" w:leader="dot" w:pos="9350"/>
+            </w:tabs>
+            <w:rPr>
+              <w:rFonts w:asciiTheme="minorHAnsi" w:eastAsiaTheme="minorEastAsia" w:hAnsiTheme="minorHAnsi" w:cstheme="minorBidi"/>
+              <w:noProof/>
+              <w:sz w:val="22"/>
+              <w:szCs w:val="22"/>
+            </w:rPr>
+          </w:pPr>
+          <w:hyperlink w:anchor="_Toc232158895" w:history="1">
+            <w:r>
+              <w:rPr>
+                <w:rStyle w:val="Hyperlink"/>
+                <w:noProof/>
+              </w:rPr>
+              <w:t>7.0  Risk Management Plan</w:t>
+            </w:r>
+            <w:r>
+              <w:rPr>
+                <w:noProof/>
+                <w:webHidden/>
+              </w:rPr>
+              <w:tab/>
+            </w:r>
+            <w:r>
+              <w:rPr>
+                <w:noProof/>
+                <w:webHidden/>
+              </w:rPr>
+              <w:fldChar w:fldCharType="begin"/>
+            </w:r>
+            <w:r>
+              <w:rPr>
+                <w:noProof/>
+                <w:webHidden/>
+              </w:rPr>
+              <w:instrText xml:space="preserve"> PAGEREF _Toc232158895 \h </w:instrText>
+            </w:r>
+            <w:r>
+              <w:rPr>
+                <w:noProof/>
+                <w:webHidden/>
+              </w:rPr>
+            </w:r>
+            <w:r>
+              <w:rPr>
+                <w:noProof/>
+                <w:webHidden/>
+              </w:rPr>
+              <w:fldChar w:fldCharType="separate"/>
+            </w:r>
+            <w:r>
+              <w:rPr>
+                <w:noProof/>
+                <w:webHidden/>
+              </w:rPr>
+              <w:t>19</w:t>
+            </w:r>
+            <w:r>
+              <w:rPr>
+                <w:noProof/>
+                <w:webHidden/>
+              </w:rPr>
+              <w:fldChar w:fldCharType="end"/>
+            </w:r>
+          </w:hyperlink>
+        </w:p>
+        <w:p>
+          <w:pPr>
+            <w:pStyle w:val="TOC1"/>
+            <w:tabs>
+              <w:tab w:val="right" w:leader="dot" w:pos="9350"/>
+            </w:tabs>
+            <w:rPr>
+              <w:rFonts w:asciiTheme="minorHAnsi" w:eastAsiaTheme="minorEastAsia" w:hAnsiTheme="minorHAnsi" w:cstheme="minorBidi"/>
+              <w:noProof/>
+              <w:sz w:val="22"/>
+              <w:szCs w:val="22"/>
+            </w:rPr>
+          </w:pPr>
+          <w:hyperlink w:anchor="_Toc232158896" w:history="1">
+            <w:r>
+              <w:rPr>
+                <w:rStyle w:val="Hyperlink"/>
+                <w:noProof/>
+              </w:rPr>
+              <w:t>8.0 Conclusion</w:t>
+            </w:r>
+            <w:r>
+              <w:rPr>
+                <w:noProof/>
+                <w:webHidden/>
+              </w:rPr>
+              <w:tab/>
+            </w:r>
+            <w:r>
+              <w:rPr>
+                <w:noProof/>
+                <w:webHidden/>
+              </w:rPr>
+              <w:fldChar w:fldCharType="begin"/>
+            </w:r>
+            <w:r>
+              <w:rPr>
+                <w:noProof/>
+                <w:webHidden/>
+              </w:rPr>
+              <w:instrText xml:space="preserve"> PAGEREF _Toc232158896 \h </w:instrText>
+            </w:r>
+            <w:r>
+              <w:rPr>
+                <w:noProof/>
+                <w:webHidden/>
+              </w:rPr>
+            </w:r>
+            <w:r>
+              <w:rPr>
+                <w:noProof/>
+                <w:webHidden/>
+              </w:rPr>
+              <w:fldChar w:fldCharType="separate"/>
+            </w:r>
+            <w:r>
+              <w:rPr>
+                <w:noProof/>
+                <w:webHidden/>
+              </w:rPr>
+              <w:t>20</w:t>
+            </w:r>
+            <w:r>
+              <w:rPr>
+                <w:noProof/>
+                <w:webHidden/>
+              </w:rPr>
+              <w:fldChar w:fldCharType="end"/>
+            </w:r>
+          </w:hyperlink>
+        </w:p>
+        <w:p>
+          <w:pPr>
+            <w:pStyle w:val="TOC1"/>
+            <w:tabs>
+              <w:tab w:val="right" w:leader="dot" w:pos="9350"/>
+            </w:tabs>
+            <w:rPr>
+              <w:rFonts w:asciiTheme="minorHAnsi" w:eastAsiaTheme="minorEastAsia" w:hAnsiTheme="minorHAnsi" w:cstheme="minorBidi"/>
+              <w:noProof/>
+              <w:sz w:val="22"/>
+              <w:szCs w:val="22"/>
+            </w:rPr>
+          </w:pPr>
+          <w:hyperlink w:anchor="_Toc232158897" w:history="1">
+            <w:r>
+              <w:rPr>
+                <w:rStyle w:val="Hyperlink"/>
+                <w:noProof/>
+              </w:rPr>
+              <w:t>9.0  References</w:t>
+            </w:r>
+            <w:r>
+              <w:rPr>
+                <w:noProof/>
+                <w:webHidden/>
+              </w:rPr>
+              <w:tab/>
+            </w:r>
+            <w:r>
+              <w:rPr>
+                <w:noProof/>
+                <w:webHidden/>
+              </w:rPr>
+              <w:fldChar w:fldCharType="begin"/>
+            </w:r>
+            <w:r>
+              <w:rPr>
+                <w:noProof/>
+                <w:webHidden/>
+              </w:rPr>
+              <w:instrText xml:space="preserve"> PAGEREF _Toc232158897 \h </w:instrText>
+            </w:r>
+            <w:r>
+              <w:rPr>
+                <w:noProof/>
+                <w:webHidden/>
+              </w:rPr>
+            </w:r>
+            <w:r>
+              <w:rPr>
+                <w:noProof/>
+                <w:webHidden/>
+              </w:rPr>
+              <w:fldChar w:fldCharType="separate"/>
+            </w:r>
+            <w:r>
+              <w:rPr>
+                <w:noProof/>
+                <w:webHidden/>
+              </w:rPr>
+              <w:t>21</w:t>
+            </w:r>
+            <w:r>
+              <w:rPr>
+                <w:noProof/>
+                <w:webHidden/>
+              </w:rPr>
+              <w:fldChar w:fldCharType="end"/>
+            </w:r>
+          </w:hyperlink>
+        </w:p>
+        <w:p>
+          <w:r>
+            <w:rPr>
+              <w:b/>
+              <w:bCs/>
+              <w:noProof/>
+            </w:rPr>
+            <w:fldChar w:fldCharType="end"/>
+          </w:r>
+        </w:p>
+      </w:sdtContent>
+    </w:sdt>
+    <w:p>
+      <w:pPr>
+        <w:pStyle w:val="Heading1"/>
+        <w:rPr>
+          <w:color w:val="auto"/>
+        </w:rPr>
+      </w:pPr>
+    </w:p>
+    <w:p>
+      <w:pPr>
+        <w:pStyle w:val="Heading1"/>
+        <w:rPr>
+          <w:color w:val="auto"/>
+        </w:rPr>
+      </w:pPr>
+    </w:p>
+    <w:p>
+      <w:bookmarkStart w:id="0" w:name="_GoBack"/>
+      <w:bookmarkEnd w:id="0"/>
+    </w:p>
     <w:p/>
     <w:p/>
     <w:p/>
@@ -2501,18 +4204,18 @@
           <w:color w:val="auto"/>
         </w:rPr>
       </w:pPr>
-      <w:bookmarkStart w:id="0" w:name="_Toc232158107"/>
-      <w:bookmarkStart w:id="1" w:name="_Toc232158717"/>
-      <w:bookmarkStart w:id="2" w:name="_Toc232158875"/>
+      <w:bookmarkStart w:id="1" w:name="_Toc232158107"/>
+      <w:bookmarkStart w:id="2" w:name="_Toc232158717"/>
+      <w:bookmarkStart w:id="3" w:name="_Toc232158875"/>
       <w:r>
         <w:rPr>
           <w:color w:val="auto"/>
         </w:rPr>
         <w:t>1.0  Overview</w:t>
       </w:r>
-      <w:bookmarkEnd w:id="0"/>
       <w:bookmarkEnd w:id="1"/>
       <w:bookmarkEnd w:id="2"/>
+      <w:bookmarkEnd w:id="3"/>
     </w:p>
     <w:p>
       <w:pPr>
@@ -2558,9 +4261,9 @@
           <w:color w:val="auto"/>
         </w:rPr>
       </w:pPr>
-      <w:bookmarkStart w:id="3" w:name="_Toc232158108"/>
-      <w:bookmarkStart w:id="4" w:name="_Toc232158718"/>
-      <w:bookmarkStart w:id="5" w:name="_Toc232158876"/>
+      <w:bookmarkStart w:id="4" w:name="_Toc232158108"/>
+      <w:bookmarkStart w:id="5" w:name="_Toc232158718"/>
+      <w:bookmarkStart w:id="6" w:name="_Toc232158876"/>
       <w:r>
         <w:rPr>
           <w:color w:val="auto"/>
@@ -2573,15 +4276,15 @@
         </w:rPr>
         <w:t xml:space="preserve">Background of </w:t>
       </w:r>
-      <w:bookmarkEnd w:id="3"/>
       <w:bookmarkEnd w:id="4"/>
+      <w:bookmarkEnd w:id="5"/>
       <w:r>
         <w:rPr>
           <w:color w:val="auto"/>
         </w:rPr>
         <w:t>the poroject</w:t>
       </w:r>
-      <w:bookmarkEnd w:id="5"/>
+      <w:bookmarkEnd w:id="6"/>
     </w:p>
     <w:p>
       <w:pPr>
@@ -2645,18 +4348,18 @@
           <w:color w:val="auto"/>
         </w:rPr>
       </w:pPr>
-      <w:bookmarkStart w:id="6" w:name="_Toc232158109"/>
-      <w:bookmarkStart w:id="7" w:name="_Toc232158719"/>
-      <w:bookmarkStart w:id="8" w:name="_Toc232158877"/>
+      <w:bookmarkStart w:id="7" w:name="_Toc232158109"/>
+      <w:bookmarkStart w:id="8" w:name="_Toc232158719"/>
+      <w:bookmarkStart w:id="9" w:name="_Toc232158877"/>
       <w:r>
         <w:rPr>
           <w:color w:val="auto"/>
         </w:rPr>
         <w:t>1.2  Customer and User Profile</w:t>
       </w:r>
-      <w:bookmarkEnd w:id="6"/>
       <w:bookmarkEnd w:id="7"/>
       <w:bookmarkEnd w:id="8"/>
+      <w:bookmarkEnd w:id="9"/>
     </w:p>
     <w:p>
       <w:pPr>
@@ -2678,18 +4381,18 @@
           <w:color w:val="auto"/>
         </w:rPr>
       </w:pPr>
-      <w:bookmarkStart w:id="9" w:name="_Toc232158110"/>
-      <w:bookmarkStart w:id="10" w:name="_Toc232158720"/>
-      <w:bookmarkStart w:id="11" w:name="_Toc232158878"/>
+      <w:bookmarkStart w:id="10" w:name="_Toc232158110"/>
+      <w:bookmarkStart w:id="11" w:name="_Toc232158720"/>
+      <w:bookmarkStart w:id="12" w:name="_Toc232158878"/>
       <w:r>
         <w:rPr>
           <w:color w:val="auto"/>
         </w:rPr>
         <w:t>1.3  Project Deliverables</w:t>
       </w:r>
-      <w:bookmarkEnd w:id="9"/>
       <w:bookmarkEnd w:id="10"/>
       <w:bookmarkEnd w:id="11"/>
+      <w:bookmarkEnd w:id="12"/>
     </w:p>
     <w:p>
       <w:pPr>
@@ -2778,18 +4481,18 @@
           <w:color w:val="auto"/>
         </w:rPr>
       </w:pPr>
-      <w:bookmarkStart w:id="12" w:name="_Toc232158111"/>
-      <w:bookmarkStart w:id="13" w:name="_Toc232158721"/>
-      <w:bookmarkStart w:id="14" w:name="_Toc232158879"/>
+      <w:bookmarkStart w:id="13" w:name="_Toc232158111"/>
+      <w:bookmarkStart w:id="14" w:name="_Toc232158721"/>
+      <w:bookmarkStart w:id="15" w:name="_Toc232158879"/>
       <w:r>
         <w:rPr>
           <w:color w:val="auto"/>
         </w:rPr>
         <w:t>1.4  Product Type</w:t>
       </w:r>
-      <w:bookmarkEnd w:id="12"/>
       <w:bookmarkEnd w:id="13"/>
       <w:bookmarkEnd w:id="14"/>
+      <w:bookmarkEnd w:id="15"/>
     </w:p>
     <w:p>
       <w:pPr>
@@ -2811,18 +4514,18 @@
           <w:color w:val="auto"/>
         </w:rPr>
       </w:pPr>
-      <w:bookmarkStart w:id="15" w:name="_Toc232158112"/>
-      <w:bookmarkStart w:id="16" w:name="_Toc232158722"/>
-      <w:bookmarkStart w:id="17" w:name="_Toc232158880"/>
+      <w:bookmarkStart w:id="16" w:name="_Toc232158112"/>
+      <w:bookmarkStart w:id="17" w:name="_Toc232158722"/>
+      <w:bookmarkStart w:id="18" w:name="_Toc232158880"/>
       <w:r>
         <w:rPr>
           <w:color w:val="auto"/>
         </w:rPr>
         <w:t>1.5  Estimated Cost</w:t>
       </w:r>
-      <w:bookmarkEnd w:id="15"/>
       <w:bookmarkEnd w:id="16"/>
       <w:bookmarkEnd w:id="17"/>
+      <w:bookmarkEnd w:id="18"/>
     </w:p>
     <w:p>
       <w:pPr>
@@ -2850,18 +4553,18 @@
           <w:color w:val="auto"/>
         </w:rPr>
       </w:pPr>
-      <w:bookmarkStart w:id="18" w:name="_Toc232158113"/>
-      <w:bookmarkStart w:id="19" w:name="_Toc232158723"/>
-      <w:bookmarkStart w:id="20" w:name="_Toc232158881"/>
+      <w:bookmarkStart w:id="19" w:name="_Toc232158113"/>
+      <w:bookmarkStart w:id="20" w:name="_Toc232158723"/>
+      <w:bookmarkStart w:id="21" w:name="_Toc232158881"/>
       <w:r>
         <w:rPr>
           <w:color w:val="auto"/>
         </w:rPr>
         <w:t>1.6  Timeline</w:t>
       </w:r>
-      <w:bookmarkEnd w:id="18"/>
       <w:bookmarkEnd w:id="19"/>
       <w:bookmarkEnd w:id="20"/>
+      <w:bookmarkEnd w:id="21"/>
     </w:p>
     <w:p>
       <w:pPr>
@@ -2892,18 +4595,18 @@
           <w:color w:val="auto"/>
         </w:rPr>
       </w:pPr>
-      <w:bookmarkStart w:id="21" w:name="_Toc232158114"/>
-      <w:bookmarkStart w:id="22" w:name="_Toc232158724"/>
-      <w:bookmarkStart w:id="23" w:name="_Toc232158882"/>
+      <w:bookmarkStart w:id="22" w:name="_Toc232158114"/>
+      <w:bookmarkStart w:id="23" w:name="_Toc232158724"/>
+      <w:bookmarkStart w:id="24" w:name="_Toc232158882"/>
       <w:r>
         <w:rPr>
           <w:color w:val="auto"/>
         </w:rPr>
         <w:t>2.0  Project Aims</w:t>
       </w:r>
-      <w:bookmarkEnd w:id="21"/>
       <w:bookmarkEnd w:id="22"/>
       <w:bookmarkEnd w:id="23"/>
+      <w:bookmarkEnd w:id="24"/>
     </w:p>
     <w:p>
       <w:pPr>
@@ -3008,18 +4711,18 @@
           <w:color w:val="auto"/>
         </w:rPr>
       </w:pPr>
-      <w:bookmarkStart w:id="24" w:name="_Toc232158115"/>
-      <w:bookmarkStart w:id="25" w:name="_Toc232158725"/>
-      <w:bookmarkStart w:id="26" w:name="_Toc232158883"/>
+      <w:bookmarkStart w:id="25" w:name="_Toc232158115"/>
+      <w:bookmarkStart w:id="26" w:name="_Toc232158725"/>
+      <w:bookmarkStart w:id="27" w:name="_Toc232158883"/>
       <w:r>
         <w:rPr>
           <w:color w:val="auto"/>
         </w:rPr>
         <w:t>3.0  Project Objectives</w:t>
       </w:r>
-      <w:bookmarkEnd w:id="24"/>
       <w:bookmarkEnd w:id="25"/>
       <w:bookmarkEnd w:id="26"/>
+      <w:bookmarkEnd w:id="27"/>
     </w:p>
     <w:p>
       <w:pPr>
@@ -3150,18 +4853,18 @@
           <w:color w:val="auto"/>
         </w:rPr>
       </w:pPr>
-      <w:bookmarkStart w:id="27" w:name="_Toc232158116"/>
-      <w:bookmarkStart w:id="28" w:name="_Toc232158726"/>
-      <w:bookmarkStart w:id="29" w:name="_Toc232158884"/>
+      <w:bookmarkStart w:id="28" w:name="_Toc232158116"/>
+      <w:bookmarkStart w:id="29" w:name="_Toc232158726"/>
+      <w:bookmarkStart w:id="30" w:name="_Toc232158884"/>
       <w:r>
         <w:rPr>
           <w:color w:val="auto"/>
         </w:rPr>
         <w:t>4.0  Project Scope</w:t>
       </w:r>
-      <w:bookmarkEnd w:id="27"/>
       <w:bookmarkEnd w:id="28"/>
       <w:bookmarkEnd w:id="29"/>
+      <w:bookmarkEnd w:id="30"/>
     </w:p>
     <w:p>
       <w:pPr>
@@ -3170,18 +4873,18 @@
           <w:color w:val="auto"/>
         </w:rPr>
       </w:pPr>
-      <w:bookmarkStart w:id="30" w:name="_Toc232158117"/>
-      <w:bookmarkStart w:id="31" w:name="_Toc232158727"/>
-      <w:bookmarkStart w:id="32" w:name="_Toc232158885"/>
+      <w:bookmarkStart w:id="31" w:name="_Toc232158117"/>
+      <w:bookmarkStart w:id="32" w:name="_Toc232158727"/>
+      <w:bookmarkStart w:id="33" w:name="_Toc232158885"/>
       <w:r>
         <w:rPr>
           <w:color w:val="auto"/>
         </w:rPr>
         <w:t>4.1  In-Scope Features</w:t>
       </w:r>
-      <w:bookmarkEnd w:id="30"/>
       <w:bookmarkEnd w:id="31"/>
       <w:bookmarkEnd w:id="32"/>
+      <w:bookmarkEnd w:id="33"/>
     </w:p>
     <w:p>
       <w:pPr>
@@ -3206,11 +4909,11 @@
           <w:bCs/>
         </w:rPr>
       </w:pPr>
-      <w:bookmarkStart w:id="33" w:name="_Toc232158118"/>
+      <w:bookmarkStart w:id="34" w:name="_Toc232158118"/>
       <w:r>
         <w:t>User Registration and Authentication: New household members can sign up by providing their full name, email, and password. The system is equipped with two-factor authentication (2FA) through email verification. Users have the option to adjust their privacy settings in the account dashboard.</w:t>
       </w:r>
-      <w:bookmarkEnd w:id="33"/>
+      <w:bookmarkEnd w:id="34"/>
     </w:p>
     <w:p>
       <w:pPr>
@@ -3226,11 +4929,11 @@
           <w:bCs/>
         </w:rPr>
       </w:pPr>
-      <w:bookmarkStart w:id="34" w:name="_Toc232158119"/>
+      <w:bookmarkStart w:id="35" w:name="_Toc232158119"/>
       <w:r>
         <w:t>Food Inventory Management: Once logged in, users can add food products to their own inventory by entering the product name quantity expiry date, category like canned frozen fresh, and storage location. Products can be changed, marked as consumed, or set aside for donation.</w:t>
       </w:r>
-      <w:bookmarkEnd w:id="34"/>
+      <w:bookmarkEnd w:id="35"/>
     </w:p>
     <w:p>
       <w:pPr>
@@ -3246,11 +4949,11 @@
           <w:bCs/>
         </w:rPr>
       </w:pPr>
-      <w:bookmarkStart w:id="35" w:name="_Toc232158120"/>
+      <w:bookmarkStart w:id="36" w:name="_Toc232158120"/>
       <w:r>
         <w:t>Food Donation Facilitation: Users that want to donate can change items in the inventory that are close to their expiration into donation offers listing pickup location, availability, and item details. Other users can see and claim the donation items.</w:t>
       </w:r>
-      <w:bookmarkEnd w:id="35"/>
+      <w:bookmarkEnd w:id="36"/>
     </w:p>
     <w:p>
       <w:pPr>
@@ -3266,11 +4969,11 @@
           <w:bCs/>
         </w:rPr>
       </w:pPr>
-      <w:bookmarkStart w:id="36" w:name="_Toc232158121"/>
+      <w:bookmarkStart w:id="37" w:name="_Toc232158121"/>
       <w:r>
         <w:t>Browse Food Items: Users can use the food listings search tool to filter results by category, expiry date, storage type, and inventory ownership. From the search page, they can view all the details of a particular item.</w:t>
       </w:r>
-      <w:bookmarkEnd w:id="36"/>
+      <w:bookmarkEnd w:id="37"/>
     </w:p>
     <w:p>
       <w:pPr>
@@ -3286,11 +4989,11 @@
           <w:bCs/>
         </w:rPr>
       </w:pPr>
-      <w:bookmarkStart w:id="37" w:name="_Toc232158122"/>
+      <w:bookmarkStart w:id="38" w:name="_Toc232158122"/>
       <w:r>
         <w:t>Food Analytics and Reporting: Users can get visual charts from the system illustrating the amount of food that was kept from being wasted, as well as the number of times a user has donated by filtering results via period and category.</w:t>
       </w:r>
-      <w:bookmarkEnd w:id="37"/>
+      <w:bookmarkEnd w:id="38"/>
     </w:p>
     <w:p>
       <w:pPr>
@@ -3306,11 +5009,11 @@
           <w:bCs/>
         </w:rPr>
       </w:pPr>
-      <w:bookmarkStart w:id="38" w:name="_Toc232158123"/>
+      <w:bookmarkStart w:id="39" w:name="_Toc232158123"/>
       <w:r>
         <w:t>Notification System: The system will send automatic notifications on expiry dates, already claimed or posted donations, meal plan reminders, and account/privacy alerts.</w:t>
       </w:r>
-      <w:bookmarkEnd w:id="38"/>
+      <w:bookmarkEnd w:id="39"/>
     </w:p>
     <w:p>
       <w:pPr>
@@ -3326,11 +5029,11 @@
           <w:bCs/>
         </w:rPr>
       </w:pPr>
-      <w:bookmarkStart w:id="39" w:name="_Toc232158124"/>
+      <w:bookmarkStart w:id="40" w:name="_Toc232158124"/>
       <w:r>
         <w:t>Weekly Meal Planning: Users can choose recipes for seven days, get their inventory and near-expiry ingredients matched with the system, and receive recipe suggestions.</w:t>
       </w:r>
-      <w:bookmarkEnd w:id="39"/>
+      <w:bookmarkEnd w:id="40"/>
     </w:p>
     <w:p>
       <w:pPr>
@@ -3348,18 +5051,18 @@
           <w:color w:val="auto"/>
         </w:rPr>
       </w:pPr>
-      <w:bookmarkStart w:id="40" w:name="_Toc232158125"/>
-      <w:bookmarkStart w:id="41" w:name="_Toc232158728"/>
-      <w:bookmarkStart w:id="42" w:name="_Toc232158886"/>
+      <w:bookmarkStart w:id="41" w:name="_Toc232158125"/>
+      <w:bookmarkStart w:id="42" w:name="_Toc232158728"/>
+      <w:bookmarkStart w:id="43" w:name="_Toc232158886"/>
       <w:r>
         <w:rPr>
           <w:color w:val="auto"/>
         </w:rPr>
         <w:t>4.2  Out-of-Scope Features</w:t>
       </w:r>
-      <w:bookmarkEnd w:id="40"/>
       <w:bookmarkEnd w:id="41"/>
       <w:bookmarkEnd w:id="42"/>
+      <w:bookmarkEnd w:id="43"/>
     </w:p>
     <w:p>
       <w:pPr>
@@ -3625,18 +5328,18 @@
           <w:color w:val="auto"/>
         </w:rPr>
       </w:pPr>
-      <w:bookmarkStart w:id="43" w:name="_Toc232158126"/>
-      <w:bookmarkStart w:id="44" w:name="_Toc232158729"/>
-      <w:bookmarkStart w:id="45" w:name="_Toc232158887"/>
+      <w:bookmarkStart w:id="44" w:name="_Toc232158126"/>
+      <w:bookmarkStart w:id="45" w:name="_Toc232158729"/>
+      <w:bookmarkStart w:id="46" w:name="_Toc232158887"/>
       <w:r>
         <w:rPr>
           <w:color w:val="auto"/>
         </w:rPr>
         <w:t>4.3  Scope Justification</w:t>
       </w:r>
-      <w:bookmarkEnd w:id="43"/>
       <w:bookmarkEnd w:id="44"/>
       <w:bookmarkEnd w:id="45"/>
+      <w:bookmarkEnd w:id="46"/>
     </w:p>
     <w:p>
       <w:pPr>
@@ -3666,18 +5369,18 @@
           <w:color w:val="auto"/>
         </w:rPr>
       </w:pPr>
-      <w:bookmarkStart w:id="46" w:name="_Toc232158127"/>
-      <w:bookmarkStart w:id="47" w:name="_Toc232158730"/>
-      <w:bookmarkStart w:id="48" w:name="_Toc232158888"/>
+      <w:bookmarkStart w:id="47" w:name="_Toc232158127"/>
+      <w:bookmarkStart w:id="48" w:name="_Toc232158730"/>
+      <w:bookmarkStart w:id="49" w:name="_Toc232158888"/>
       <w:r>
         <w:rPr>
           <w:color w:val="auto"/>
         </w:rPr>
         <w:t>5.0  Project Schedule</w:t>
       </w:r>
-      <w:bookmarkEnd w:id="46"/>
       <w:bookmarkEnd w:id="47"/>
       <w:bookmarkEnd w:id="48"/>
+      <w:bookmarkEnd w:id="49"/>
     </w:p>
     <w:p>
       <w:pPr>
@@ -3688,11 +5391,11 @@
           <w:bCs/>
         </w:rPr>
       </w:pPr>
-      <w:bookmarkStart w:id="49" w:name="_Toc232158128"/>
+      <w:bookmarkStart w:id="50" w:name="_Toc232158128"/>
       <w:r>
         <w:t>The project schedule has been done using an iterative and incremental approach. The whole project is split into two main iterations which correspond to the two assignment task submissions. In each iteration, there is planning, development, and review phases.</w:t>
       </w:r>
-      <w:bookmarkEnd w:id="49"/>
+      <w:bookmarkEnd w:id="50"/>
     </w:p>
     <w:p>
       <w:pPr>
@@ -3701,18 +5404,18 @@
           <w:color w:val="auto"/>
         </w:rPr>
       </w:pPr>
-      <w:bookmarkStart w:id="50" w:name="_Toc232158129"/>
-      <w:bookmarkStart w:id="51" w:name="_Toc232158731"/>
-      <w:bookmarkStart w:id="52" w:name="_Toc232158889"/>
+      <w:bookmarkStart w:id="51" w:name="_Toc232158129"/>
+      <w:bookmarkStart w:id="52" w:name="_Toc232158731"/>
+      <w:bookmarkStart w:id="53" w:name="_Toc232158889"/>
       <w:r>
         <w:rPr>
           <w:color w:val="auto"/>
         </w:rPr>
         <w:t>5.1  Work Breakdown Structure (WBS)</w:t>
       </w:r>
-      <w:bookmarkEnd w:id="50"/>
       <w:bookmarkEnd w:id="51"/>
       <w:bookmarkEnd w:id="52"/>
+      <w:bookmarkEnd w:id="53"/>
     </w:p>
     <w:p>
       <w:pPr>
@@ -9454,18 +11157,18 @@
           <w:color w:val="auto"/>
         </w:rPr>
       </w:pPr>
-      <w:bookmarkStart w:id="53" w:name="_Toc232158130"/>
-      <w:bookmarkStart w:id="54" w:name="_Toc232158732"/>
-      <w:bookmarkStart w:id="55" w:name="_Toc232158890"/>
+      <w:bookmarkStart w:id="54" w:name="_Toc232158130"/>
+      <w:bookmarkStart w:id="55" w:name="_Toc232158732"/>
+      <w:bookmarkStart w:id="56" w:name="_Toc232158890"/>
       <w:r>
         <w:rPr>
           <w:color w:val="auto"/>
         </w:rPr>
         <w:t>5.2  Milestones and Deliverables</w:t>
       </w:r>
-      <w:bookmarkEnd w:id="53"/>
       <w:bookmarkEnd w:id="54"/>
       <w:bookmarkEnd w:id="55"/>
+      <w:bookmarkEnd w:id="56"/>
     </w:p>
     <w:p>
       <w:pPr>
@@ -10443,18 +12146,18 @@
           <w:color w:val="auto"/>
         </w:rPr>
       </w:pPr>
-      <w:bookmarkStart w:id="56" w:name="_Toc232158131"/>
-      <w:bookmarkStart w:id="57" w:name="_Toc232158733"/>
-      <w:bookmarkStart w:id="58" w:name="_Toc232158891"/>
+      <w:bookmarkStart w:id="57" w:name="_Toc232158131"/>
+      <w:bookmarkStart w:id="58" w:name="_Toc232158733"/>
+      <w:bookmarkStart w:id="59" w:name="_Toc232158891"/>
       <w:r>
         <w:rPr>
           <w:color w:val="auto"/>
         </w:rPr>
         <w:t>5.3  Gantt Chart</w:t>
       </w:r>
-      <w:bookmarkEnd w:id="56"/>
       <w:bookmarkEnd w:id="57"/>
       <w:bookmarkEnd w:id="58"/>
+      <w:bookmarkEnd w:id="59"/>
     </w:p>
     <w:p>
       <w:pPr>
@@ -10690,18 +12393,18 @@
           <w:color w:val="auto"/>
         </w:rPr>
       </w:pPr>
-      <w:bookmarkStart w:id="59" w:name="_Toc232158132"/>
-      <w:bookmarkStart w:id="60" w:name="_Toc232158734"/>
-      <w:bookmarkStart w:id="61" w:name="_Toc232158892"/>
+      <w:bookmarkStart w:id="60" w:name="_Toc232158132"/>
+      <w:bookmarkStart w:id="61" w:name="_Toc232158734"/>
+      <w:bookmarkStart w:id="62" w:name="_Toc232158892"/>
       <w:r>
         <w:rPr>
           <w:color w:val="auto"/>
         </w:rPr>
         <w:t>6.0  Technical Description of the Proposed System</w:t>
       </w:r>
-      <w:bookmarkEnd w:id="59"/>
       <w:bookmarkEnd w:id="60"/>
       <w:bookmarkEnd w:id="61"/>
+      <w:bookmarkEnd w:id="62"/>
     </w:p>
     <w:p>
       <w:pPr>
@@ -10749,18 +12452,18 @@
           <w:color w:val="auto"/>
         </w:rPr>
       </w:pPr>
-      <w:bookmarkStart w:id="62" w:name="_Toc232158133"/>
-      <w:bookmarkStart w:id="63" w:name="_Toc232158735"/>
-      <w:bookmarkStart w:id="64" w:name="_Toc232158893"/>
+      <w:bookmarkStart w:id="63" w:name="_Toc232158133"/>
+      <w:bookmarkStart w:id="64" w:name="_Toc232158735"/>
+      <w:bookmarkStart w:id="65" w:name="_Toc232158893"/>
       <w:r>
         <w:rPr>
           <w:color w:val="auto"/>
         </w:rPr>
         <w:t>6.1  Development Platform</w:t>
       </w:r>
-      <w:bookmarkEnd w:id="62"/>
       <w:bookmarkEnd w:id="63"/>
       <w:bookmarkEnd w:id="64"/>
+      <w:bookmarkEnd w:id="65"/>
     </w:p>
     <w:p>
       <w:pPr>
@@ -13303,18 +15006,18 @@
           <w:color w:val="auto"/>
         </w:rPr>
       </w:pPr>
-      <w:bookmarkStart w:id="65" w:name="_Toc232158134"/>
-      <w:bookmarkStart w:id="66" w:name="_Toc232158736"/>
-      <w:bookmarkStart w:id="67" w:name="_Toc232158894"/>
+      <w:bookmarkStart w:id="66" w:name="_Toc232158134"/>
+      <w:bookmarkStart w:id="67" w:name="_Toc232158736"/>
+      <w:bookmarkStart w:id="68" w:name="_Toc232158894"/>
       <w:r>
         <w:rPr>
           <w:color w:val="auto"/>
         </w:rPr>
         <w:t>6.2  Demonstration Platform</w:t>
       </w:r>
-      <w:bookmarkEnd w:id="65"/>
       <w:bookmarkEnd w:id="66"/>
       <w:bookmarkEnd w:id="67"/>
+      <w:bookmarkEnd w:id="68"/>
     </w:p>
     <w:p>
       <w:pPr>
@@ -14130,18 +15833,18 @@
           <w:color w:val="auto"/>
         </w:rPr>
       </w:pPr>
-      <w:bookmarkStart w:id="68" w:name="_Toc232158135"/>
-      <w:bookmarkStart w:id="69" w:name="_Toc232158737"/>
-      <w:bookmarkStart w:id="70" w:name="_Toc232158895"/>
+      <w:bookmarkStart w:id="69" w:name="_Toc232158135"/>
+      <w:bookmarkStart w:id="70" w:name="_Toc232158737"/>
+      <w:bookmarkStart w:id="71" w:name="_Toc232158895"/>
       <w:r>
         <w:rPr>
           <w:color w:val="auto"/>
         </w:rPr>
         <w:t>7.0  Risk Management Plan</w:t>
       </w:r>
-      <w:bookmarkEnd w:id="68"/>
       <w:bookmarkEnd w:id="69"/>
       <w:bookmarkEnd w:id="70"/>
+      <w:bookmarkEnd w:id="71"/>
     </w:p>
     <w:p>
       <w:pPr>
@@ -15693,16 +17396,16 @@
           <w:color w:val="auto"/>
         </w:rPr>
       </w:pPr>
-      <w:bookmarkStart w:id="71" w:name="_Toc232158738"/>
-      <w:bookmarkStart w:id="72" w:name="_Toc232158896"/>
+      <w:bookmarkStart w:id="72" w:name="_Toc232158738"/>
+      <w:bookmarkStart w:id="73" w:name="_Toc232158896"/>
       <w:r>
         <w:rPr>
           <w:color w:val="auto"/>
         </w:rPr>
         <w:t>8.0 Conclusion</w:t>
       </w:r>
-      <w:bookmarkEnd w:id="71"/>
       <w:bookmarkEnd w:id="72"/>
+      <w:bookmarkEnd w:id="73"/>
     </w:p>
     <w:p>
       <w:pPr>
@@ -15722,18 +17425,18 @@
           <w:color w:val="auto"/>
         </w:rPr>
       </w:pPr>
-      <w:bookmarkStart w:id="73" w:name="_Toc232158136"/>
-      <w:bookmarkStart w:id="74" w:name="_Toc232158739"/>
-      <w:bookmarkStart w:id="75" w:name="_Toc232158897"/>
+      <w:bookmarkStart w:id="74" w:name="_Toc232158136"/>
+      <w:bookmarkStart w:id="75" w:name="_Toc232158739"/>
+      <w:bookmarkStart w:id="76" w:name="_Toc232158897"/>
       <w:r>
         <w:rPr>
           <w:color w:val="auto"/>
         </w:rPr>
         <w:t>9.0  References</w:t>
       </w:r>
-      <w:bookmarkEnd w:id="73"/>
       <w:bookmarkEnd w:id="74"/>
       <w:bookmarkEnd w:id="75"/>
+      <w:bookmarkEnd w:id="76"/>
     </w:p>
     <w:p>
       <w:pPr>
@@ -15794,8 +17497,6 @@
         <w:spacing w:line="360" w:lineRule="auto"/>
         <w:jc w:val="both"/>
       </w:pPr>
-      <w:bookmarkStart w:id="76" w:name="_GoBack"/>
-      <w:bookmarkEnd w:id="76"/>
     </w:p>
     <w:p/>
     <w:sectPr>
@@ -16895,6 +18596,52 @@
       <w:u w:val="single"/>
     </w:rPr>
   </w:style>
+  <w:style w:type="paragraph" w:styleId="TOCHeading">
+    <w:name w:val="TOC Heading"/>
+    <w:basedOn w:val="Heading1"/>
+    <w:next w:val="Normal"/>
+    <w:uiPriority w:val="39"/>
+    <w:unhideWhenUsed/>
+    <w:qFormat/>
+    <w:rsid w:val="00AE109D"/>
+    <w:pPr>
+      <w:keepNext/>
+      <w:keepLines/>
+      <w:spacing w:before="240" w:after="0" w:line="259" w:lineRule="auto"/>
+      <w:outlineLvl w:val="9"/>
+    </w:pPr>
+    <w:rPr>
+      <w:rFonts w:asciiTheme="majorHAnsi" w:eastAsiaTheme="majorEastAsia" w:hAnsiTheme="majorHAnsi" w:cstheme="majorBidi"/>
+      <w:b w:val="0"/>
+      <w:bCs w:val="0"/>
+      <w:color w:val="2E74B5" w:themeColor="accent1" w:themeShade="BF"/>
+    </w:rPr>
+  </w:style>
+  <w:style w:type="paragraph" w:styleId="TOC1">
+    <w:name w:val="toc 1"/>
+    <w:basedOn w:val="Normal"/>
+    <w:next w:val="Normal"/>
+    <w:autoRedefine/>
+    <w:uiPriority w:val="39"/>
+    <w:unhideWhenUsed/>
+    <w:rsid w:val="00AE109D"/>
+    <w:pPr>
+      <w:spacing w:after="100"/>
+    </w:pPr>
+  </w:style>
+  <w:style w:type="paragraph" w:styleId="TOC2">
+    <w:name w:val="toc 2"/>
+    <w:basedOn w:val="Normal"/>
+    <w:next w:val="Normal"/>
+    <w:autoRedefine/>
+    <w:uiPriority w:val="39"/>
+    <w:unhideWhenUsed/>
+    <w:rsid w:val="00AE109D"/>
+    <w:pPr>
+      <w:spacing w:after="100"/>
+      <w:ind w:left="240"/>
+    </w:pPr>
+  </w:style>
 </w:styles>
 </file>
 

</xml_diff>

<commit_message>
Task - 1 of Assignment 1 is Completed
</commit_message>
<xml_diff>
--- a/BIT 216 Assignment 1 (Task 1).docx
+++ b/BIT 216 Assignment 1 (Task 1).docx
@@ -4148,55 +4148,14 @@
         </w:rPr>
       </w:pPr>
     </w:p>
+    <w:p/>
+    <w:p/>
+    <w:p/>
+    <w:p/>
     <w:p>
       <w:bookmarkStart w:id="0" w:name="_GoBack"/>
       <w:bookmarkEnd w:id="0"/>
     </w:p>
-    <w:p/>
-    <w:p/>
-    <w:p/>
-    <w:p/>
-    <w:p/>
-    <w:p/>
-    <w:p/>
-    <w:p/>
-    <w:p/>
-    <w:p/>
-    <w:p/>
-    <w:p/>
-    <w:p/>
-    <w:p/>
-    <w:p/>
-    <w:p/>
-    <w:p/>
-    <w:p/>
-    <w:p/>
-    <w:p/>
-    <w:p/>
-    <w:p/>
-    <w:p/>
-    <w:p/>
-    <w:p/>
-    <w:p/>
-    <w:p/>
-    <w:p/>
-    <w:p/>
-    <w:p/>
-    <w:p/>
-    <w:p/>
-    <w:p/>
-    <w:p/>
-    <w:p/>
-    <w:p/>
-    <w:p/>
-    <w:p/>
-    <w:p/>
-    <w:p/>
-    <w:p/>
-    <w:p/>
-    <w:p/>
-    <w:p/>
-    <w:p/>
     <w:p>
       <w:pPr>
         <w:pStyle w:val="Heading1"/>

</xml_diff>